<commit_message>
refactor: isolate coordinated-direction metadata (AR-02M)
</commit_message>
<xml_diff>
--- a/docs/VESKIFY_DEVELOPMENT_DELIVERY_TRACKER_v1.3.0.docx
+++ b/docs/VESKIFY_DEVELOPMENT_DELIVERY_TRACKER_v1.3.0.docx
@@ -51,7 +51,7 @@
         <w:rPr>
           <w:rFonts w:ascii="Calibri" w:hAnsi="Calibri" w:cs="Calibri"/>
         </w:rPr>
-        <w:t>Effective upon independently verified AR-02L acceptance/merge: AR-02A through AR-02L Baseline / closed; AR-02 Partial with the coordinated-direction metadata path remaining; AR-03 and AR-03A through AR-03E remain closed; AR-04/AR-05 dependency-blocked and unstarted; AR-06 depends on AR-05; AR-23 eligible / unstarted; BATCH-09 complete after L merge and safe closeout; no next task</w:t>
+        <w:t>Effective upon independently verified AR-02M acceptance/merge: AR-02 and AR-02A through AR-02M Baseline / closed; AR-03 and AR-03A through AR-03E remain closed; AR-04/AR-05 eligible / unstarted after that merge; AR-06 depends on AR-05; AR-23 eligible / unstarted; BATCH-10 complete after M merge and safe closeout; no next task</w:t>
       </w:r>
     </w:p>
     <w:p>
@@ -118,7 +118,7 @@
           <w:b/>
           <w:bCs/>
         </w:rPr>
-        <w:t>Candidate status effective upon explicit owner acceptance/merge of AR-02L:</w:t>
+        <w:t>Candidate status effective upon explicit owner acceptance/merge of AR-02M:</w:t>
       </w:r>
       <w:r>
         <w:rPr>
@@ -328,6 +328,20 @@
           <w:b/>
           <w:bCs/>
         </w:rPr>
+        <w:t>Baseline / closed.</w:t>
+      </w:r>
+      <w:r>
+        <w:rPr>
+          <w:rFonts w:ascii="Calibri" w:hAnsi="Calibri" w:cs="Calibri"/>
+        </w:rPr>
+        <w:t xml:space="preserve"> AR-02M is </w:t>
+      </w:r>
+      <w:r>
+        <w:rPr>
+          <w:rFonts w:ascii="Calibri" w:hAnsi="Calibri" w:cs="Calibri"/>
+          <w:b/>
+          <w:bCs/>
+        </w:rPr>
         <w:t>Baseline / closed upon explicit owner acceptance/merge.</w:t>
       </w:r>
       <w:r>
@@ -342,13 +356,13 @@
           <w:b/>
           <w:bCs/>
         </w:rPr>
-        <w:t>Partial</w:t>
-      </w:r>
-      <w:r>
-        <w:rPr>
-          <w:rFonts w:ascii="Calibri" w:hAnsi="Calibri" w:cs="Calibri"/>
-        </w:rPr>
-        <w:t xml:space="preserve">; the coordinated-direction metadata dependency remains mapped in AR_02_BOUNDARY_ACCEPTANCE.md. AR-04/AR-05 remain dependency-blocked. AR-03 is </w:t>
+        <w:t>Baseline / closed upon explicit owner acceptance/merge</w:t>
+      </w:r>
+      <w:r>
+        <w:rPr>
+          <w:rFonts w:ascii="Calibri" w:hAnsi="Calibri" w:cs="Calibri"/>
+        </w:rPr>
+        <w:t xml:space="preserve">; complete original acceptance is mapped in AR_02_BOUNDARY_ACCEPTANCE.md. AR-04/AR-05 are eligible / unstarted after that merge; AR-06 remains dependent on AR-05. AR-03 is </w:t>
       </w:r>
       <w:r>
         <w:rPr>
@@ -446,7 +460,7 @@
         <w:rPr>
           <w:rFonts w:ascii="Calibri" w:hAnsi="Calibri" w:cs="Calibri"/>
         </w:rPr>
-        <w:t xml:space="preserve">. AR-23 depends on AR-01 and is not serialized behind visual work. BATCH-03 is complete. BATCH-04 is complete. BATCH-05 is complete. BATCH-06 is complete. BATCH-07 is complete. BATCH-08 is complete. BATCH-09 is complete upon AR-02L acceptance/merge and safe closeout. No next reset task is selected. No third task is authorized. This tracker owns current status; the roadmap owns dependency order. Retained B01 exact-next, fixed-two-call/mandatory-three-concept, transient-only, and 73-child future-sequence statements are </w:t>
+        <w:t xml:space="preserve">. AR-23 depends on AR-01 and is not serialized behind visual work. BATCH-03 is complete. BATCH-04 is complete. BATCH-05 is complete. BATCH-06 is complete. BATCH-07 is complete. BATCH-08 is complete. BATCH-09 is complete. BATCH-10 is complete upon AR-02M acceptance/merge and safe closeout. No next reset task is selected. No third task is authorized. This tracker owns current status; the roadmap owns dependency order. Retained B01 exact-next, fixed-two-call/mandatory-three-concept, transient-only, and 73-child future-sequence statements are </w:t>
       </w:r>
       <w:r>
         <w:rPr>
@@ -983,7 +997,7 @@
               <w:rPr>
                 <w:rFonts w:ascii="Calibri" w:hAnsi="Calibri" w:cs="Calibri"/>
               </w:rPr>
-              <w:t>Status; L conditional on independent acceptance/merge</w:t>
+              <w:t>Status; M conditional on independent acceptance/merge</w:t>
             </w:r>
           </w:p>
         </w:tc>
@@ -2364,7 +2378,7 @@
                 <w:b/>
                 <w:bCs/>
               </w:rPr>
-              <w:t>Baseline / closed upon explicit owner acceptance/merge</w:t>
+              <w:t>Baseline / closed</w:t>
             </w:r>
           </w:p>
         </w:tc>
@@ -2387,7 +2401,7 @@
               <w:rPr>
                 <w:rFonts w:ascii="Calibri" w:hAnsi="Calibri" w:cs="Calibri"/>
               </w:rPr>
-              <w:t>AR-03B</w:t>
+              <w:t>AR-02M</w:t>
             </w:r>
           </w:p>
         </w:tc>
@@ -2405,7 +2419,7 @@
               <w:rPr>
                 <w:rFonts w:ascii="Calibri" w:hAnsi="Calibri" w:cs="Calibri"/>
               </w:rPr>
-              <w:t>AR-03</w:t>
+              <w:t>AR-02</w:t>
             </w:r>
           </w:p>
         </w:tc>
@@ -2423,7 +2437,7 @@
               <w:rPr>
                 <w:rFonts w:ascii="Calibri" w:hAnsi="Calibri" w:cs="Calibri"/>
               </w:rPr>
-              <w:t xml:space="preserve">Renderer-free presentation construction and exact historical compatibility; </w:t>
+              <w:t xml:space="preserve">Coordinated schema, direction, eligibility and actual semantic resolver metadata; </w:t>
             </w:r>
             <w:hyperlink r:id="rIdHyperlink30" w:history="1">
               <w:r>
@@ -2451,6 +2465,22 @@
                 <w:t>report</w:t>
               </w:r>
             </w:hyperlink>
+            <w:r>
+              <w:rPr>
+                <w:rFonts w:ascii="Calibri" w:hAnsi="Calibri" w:cs="Calibri"/>
+              </w:rPr>
+              <w:t xml:space="preserve">, </w:t>
+            </w:r>
+            <w:hyperlink r:id="rIdHyperlink23" w:history="1">
+              <w:r>
+                <w:rPr>
+                  <w:rFonts w:ascii="Calibri" w:hAnsi="Calibri" w:cs="Calibri"/>
+                  <w:color w:val="2E74B5"/>
+                  <w:u w:val="single"/>
+                </w:rPr>
+                <w:t>parent evidence</w:t>
+              </w:r>
+            </w:hyperlink>
           </w:p>
         </w:tc>
         <w:tc>
@@ -2469,7 +2499,7 @@
                 <w:b/>
                 <w:bCs/>
               </w:rPr>
-              <w:t>Baseline / closed</w:t>
+              <w:t>Baseline / closed upon explicit owner acceptance/merge</w:t>
             </w:r>
           </w:p>
         </w:tc>
@@ -2492,7 +2522,7 @@
               <w:rPr>
                 <w:rFonts w:ascii="Calibri" w:hAnsi="Calibri" w:cs="Calibri"/>
               </w:rPr>
-              <w:t>AR-03C</w:t>
+              <w:t>AR-03B</w:t>
             </w:r>
           </w:p>
         </w:tc>
@@ -2528,7 +2558,7 @@
               <w:rPr>
                 <w:rFonts w:ascii="Calibri" w:hAnsi="Calibri" w:cs="Calibri"/>
               </w:rPr>
-              <w:t xml:space="preserve">Current-authority validation, route projection/resolution and four preview import cutovers; </w:t>
+              <w:t xml:space="preserve">Renderer-free presentation construction and exact historical compatibility; </w:t>
             </w:r>
             <w:hyperlink r:id="rIdHyperlink32" w:history="1">
               <w:r>
@@ -2597,7 +2627,7 @@
               <w:rPr>
                 <w:rFonts w:ascii="Calibri" w:hAnsi="Calibri" w:cs="Calibri"/>
               </w:rPr>
-              <w:t>AR-03D</w:t>
+              <w:t>AR-03C</w:t>
             </w:r>
           </w:p>
         </w:tc>
@@ -2633,7 +2663,7 @@
               <w:rPr>
                 <w:rFonts w:ascii="Calibri" w:hAnsi="Calibri" w:cs="Calibri"/>
               </w:rPr>
-              <w:t xml:space="preserve">Design-selection contracts/operations and editor projection with three named consumer cutovers; </w:t>
+              <w:t xml:space="preserve">Current-authority validation, route projection/resolution and four preview import cutovers; </w:t>
             </w:r>
             <w:hyperlink r:id="rIdHyperlink34" w:history="1">
               <w:r>
@@ -2702,7 +2732,7 @@
               <w:rPr>
                 <w:rFonts w:ascii="Calibri" w:hAnsi="Calibri" w:cs="Calibri"/>
               </w:rPr>
-              <w:t>AR-03E</w:t>
+              <w:t>AR-03D</w:t>
             </w:r>
           </w:p>
         </w:tc>
@@ -2738,7 +2768,7 @@
               <w:rPr>
                 <w:rFonts w:ascii="Calibri" w:hAnsi="Calibri" w:cs="Calibri"/>
               </w:rPr>
-              <w:t xml:space="preserve">Legacy migration, distinct transient projections and shared bridge schemas; </w:t>
+              <w:t xml:space="preserve">Design-selection contracts/operations and editor projection with three named consumer cutovers; </w:t>
             </w:r>
             <w:hyperlink r:id="rIdHyperlink36" w:history="1">
               <w:r>
@@ -2766,13 +2796,118 @@
                 <w:t>report</w:t>
               </w:r>
             </w:hyperlink>
+          </w:p>
+        </w:tc>
+        <w:tc>
+          <w:tcPr>
+            <w:tcW w:w="8460" w:type="dxa"/>
+            <w:vAlign w:val="center"/>
+          </w:tcPr>
+          <w:p>
+            <w:pPr>
+              <w:pStyle w:val="TableText"/>
+              <w:widowControl/>
+            </w:pPr>
+            <w:r>
+              <w:rPr>
+                <w:rFonts w:ascii="Calibri" w:hAnsi="Calibri" w:cs="Calibri"/>
+                <w:b/>
+                <w:bCs/>
+              </w:rPr>
+              <w:t>Baseline / closed</w:t>
+            </w:r>
+          </w:p>
+        </w:tc>
+      </w:tr>
+      <w:tr>
+        <w:trPr>
+          <w:cantSplit/>
+        </w:trPr>
+        <w:tc>
+          <w:tcPr>
+            <w:tcW w:w="1000" w:type="dxa"/>
+            <w:vAlign w:val="center"/>
+          </w:tcPr>
+          <w:p>
+            <w:pPr>
+              <w:pStyle w:val="TableText"/>
+              <w:widowControl/>
+            </w:pPr>
+            <w:r>
+              <w:rPr>
+                <w:rFonts w:ascii="Calibri" w:hAnsi="Calibri" w:cs="Calibri"/>
+              </w:rPr>
+              <w:t>AR-03E</w:t>
+            </w:r>
+          </w:p>
+        </w:tc>
+        <w:tc>
+          <w:tcPr>
+            <w:tcW w:w="1500" w:type="dxa"/>
+            <w:vAlign w:val="center"/>
+          </w:tcPr>
+          <w:p>
+            <w:pPr>
+              <w:pStyle w:val="TableText"/>
+              <w:widowControl/>
+            </w:pPr>
+            <w:r>
+              <w:rPr>
+                <w:rFonts w:ascii="Calibri" w:hAnsi="Calibri" w:cs="Calibri"/>
+              </w:rPr>
+              <w:t>AR-03</w:t>
+            </w:r>
+          </w:p>
+        </w:tc>
+        <w:tc>
+          <w:tcPr>
+            <w:tcW w:w="2000" w:type="dxa"/>
+            <w:vAlign w:val="center"/>
+          </w:tcPr>
+          <w:p>
+            <w:pPr>
+              <w:pStyle w:val="TableText"/>
+              <w:widowControl/>
+            </w:pPr>
+            <w:r>
+              <w:rPr>
+                <w:rFonts w:ascii="Calibri" w:hAnsi="Calibri" w:cs="Calibri"/>
+              </w:rPr>
+              <w:t xml:space="preserve">Legacy migration, distinct transient projections and shared bridge schemas; </w:t>
+            </w:r>
+            <w:hyperlink r:id="rIdHyperlink38" w:history="1">
+              <w:r>
+                <w:rPr>
+                  <w:rFonts w:ascii="Calibri" w:hAnsi="Calibri" w:cs="Calibri"/>
+                  <w:color w:val="2E74B5"/>
+                  <w:u w:val="single"/>
+                </w:rPr>
+                <w:t>contract</w:t>
+              </w:r>
+            </w:hyperlink>
             <w:r>
               <w:rPr>
                 <w:rFonts w:ascii="Calibri" w:hAnsi="Calibri" w:cs="Calibri"/>
               </w:rPr>
               <w:t xml:space="preserve">, </w:t>
             </w:r>
-            <w:hyperlink r:id="rIdHyperlink38" w:history="1">
+            <w:hyperlink r:id="rIdHyperlink39" w:history="1">
+              <w:r>
+                <w:rPr>
+                  <w:rFonts w:ascii="Calibri" w:hAnsi="Calibri" w:cs="Calibri"/>
+                  <w:color w:val="2E74B5"/>
+                  <w:u w:val="single"/>
+                </w:rPr>
+                <w:t>report</w:t>
+              </w:r>
+            </w:hyperlink>
+            <w:r>
+              <w:rPr>
+                <w:rFonts w:ascii="Calibri" w:hAnsi="Calibri" w:cs="Calibri"/>
+              </w:rPr>
+              <w:t xml:space="preserve">, </w:t>
+            </w:r>
+            <w:hyperlink r:id="rIdHyperlink40" w:history="1">
               <w:r>
                 <w:rPr>
                   <w:rFonts w:ascii="Calibri" w:hAnsi="Calibri" w:cs="Calibri"/>
@@ -22736,7 +22871,7 @@
         </w:rPr>
         <w:t xml:space="preserve">. Completed 7 August 2026; see </w:t>
       </w:r>
-      <w:hyperlink r:id="rIdHyperlink39" w:history="1">
+      <w:hyperlink r:id="rIdHyperlink41" w:history="1">
         <w:r>
           <w:rPr>
             <w:rFonts w:ascii="Calibri" w:hAnsi="Calibri" w:cs="Calibri"/>
@@ -22873,7 +23008,7 @@
         </w:rPr>
         <w:t xml:space="preserve">The binding details and minimum coverage are in </w:t>
       </w:r>
-      <w:hyperlink r:id="rIdHyperlink40" w:history="1">
+      <w:hyperlink r:id="rIdHyperlink42" w:history="1">
         <w:r>
           <w:rPr>
             <w:rFonts w:ascii="Calibri" w:hAnsi="Calibri" w:cs="Calibri"/>
@@ -23071,7 +23206,7 @@
         </w:rPr>
         <w:t xml:space="preserve">. P10B-16P-04 acceptance evidence is retained in </w:t>
       </w:r>
-      <w:hyperlink r:id="rIdHyperlink41" w:history="1">
+      <w:hyperlink r:id="rIdHyperlink43" w:history="1">
         <w:r>
           <w:rPr>
             <w:rFonts w:ascii="Calibri" w:hAnsi="Calibri" w:cs="Calibri"/>
@@ -23320,7 +23455,7 @@
         </w:rPr>
         <w:t xml:space="preserve">. See </w:t>
       </w:r>
-      <w:hyperlink r:id="rIdHyperlink42" w:history="1">
+      <w:hyperlink r:id="rIdHyperlink44" w:history="1">
         <w:r>
           <w:rPr>
             <w:rFonts w:ascii="Calibri" w:hAnsi="Calibri" w:cs="Calibri"/>
@@ -23569,7 +23704,7 @@
         </w:rPr>
         <w:t xml:space="preserve">. See </w:t>
       </w:r>
-      <w:hyperlink r:id="rIdHyperlink43" w:history="1">
+      <w:hyperlink r:id="rIdHyperlink45" w:history="1">
         <w:r>
           <w:rPr>
             <w:rFonts w:ascii="Calibri" w:hAnsi="Calibri" w:cs="Calibri"/>
@@ -23818,7 +23953,7 @@
         </w:rPr>
         <w:t xml:space="preserve">. At P10B-03 delivery, all then-current 25 V2 definitions and 91 variants were classified explicitly without false commercial-ready promotion. Later family tasks extend that same authority rather than replacing it. See </w:t>
       </w:r>
-      <w:hyperlink r:id="rIdHyperlink44" w:history="1">
+      <w:hyperlink r:id="rIdHyperlink46" w:history="1">
         <w:r>
           <w:rPr>
             <w:rFonts w:ascii="Calibri" w:hAnsi="Calibri" w:cs="Calibri"/>
@@ -24067,7 +24202,7 @@
         </w:rPr>
         <w:t xml:space="preserve"> embeds exact lineage and bounded treatment in the existing approved presentation, consumes Design DNA and registered anatomy, projects protected same-product media, preserves authority through lifecycle/compiler boundaries, and renders semantic four-breakpoint evidence. Production CDN transforms and retained commercial visual acceptance remain deferred. See </w:t>
       </w:r>
-      <w:hyperlink r:id="rIdHyperlink45" w:history="1">
+      <w:hyperlink r:id="rIdHyperlink47" w:history="1">
         <w:r>
           <w:rPr>
             <w:rFonts w:ascii="Calibri" w:hAnsi="Calibri" w:cs="Calibri"/>
@@ -24316,7 +24451,7 @@
         </w:rPr>
         <w:t xml:space="preserve">. See </w:t>
       </w:r>
-      <w:hyperlink r:id="rIdHyperlink46" w:history="1">
+      <w:hyperlink r:id="rIdHyperlink48" w:history="1">
         <w:r>
           <w:rPr>
             <w:rFonts w:ascii="Calibri" w:hAnsi="Calibri" w:cs="Calibri"/>
@@ -24551,7 +24686,7 @@
         </w:rPr>
         <w:t xml:space="preserve">. Four exact root-frame profiles, three mobile modes, and four footer compositions preserve canonical navigation and frame identity through snapshot, save/reload, Puck root, preview, publication compilation, EN/FI, and 375/768/1024/1440 px evidence. See </w:t>
       </w:r>
-      <w:hyperlink r:id="rIdHyperlink47" w:history="1">
+      <w:hyperlink r:id="rIdHyperlink49" w:history="1">
         <w:r>
           <w:rPr>
             <w:rFonts w:ascii="Calibri" w:hAnsi="Calibri" w:cs="Calibri"/>
@@ -24786,7 +24921,7 @@
         </w:rPr>
         <w:t xml:space="preserve">. Six meaningful hero anatomies, five editorial/story anatomies, five campaign/promotion anatomies and three evidence-grounded proof/service anatomies are registered, PageBlueprint-selectable, deterministically generated, snapshot/publish preserved and rendered through one shared implementation. Focused deterministic coverage and a zero-provider Chromium scenario retain evidence at 375, 768, 1024 and 1440 px. See </w:t>
       </w:r>
-      <w:hyperlink r:id="rIdHyperlink48" w:history="1">
+      <w:hyperlink r:id="rIdHyperlink50" w:history="1">
         <w:r>
           <w:rPr>
             <w:rFonts w:ascii="Calibri" w:hAnsi="Calibri" w:cs="Calibri"/>
@@ -24835,7 +24970,7 @@
         </w:rPr>
         <w:t xml:space="preserve"> Baseline. One fingerprinted authority and renderer now serve homepage merchandising, collection/results, related products, and legacy compatibility. Five meaningful anatomies preserve canonical facts and P10B-04 media lineage through plan, proposal, snapshot, save/reload, publish, and responsive browser evidence. See </w:t>
       </w:r>
-      <w:hyperlink r:id="rIdHyperlink49" w:history="1">
+      <w:hyperlink r:id="rIdHyperlink51" w:history="1">
         <w:r>
           <w:rPr>
             <w:rFonts w:ascii="Calibri" w:hAnsi="Calibri" w:cs="Calibri"/>
@@ -25052,7 +25187,7 @@
         </w:rPr>
         <w:t xml:space="preserve"> Baseline. Six versioned, structurally fingerprinted homepage PageBlueprint profiles compose current shared-frame, commercial storytelling, canonical product-card, approved-media, and Design DNA authority. Evidence/cardinality guards fail closed; deterministic lifecycle and 24 retained four-width browser images pass. See </w:t>
       </w:r>
-      <w:hyperlink r:id="rIdHyperlink50" w:history="1">
+      <w:hyperlink r:id="rIdHyperlink52" w:history="1">
         <w:r>
           <w:rPr>
             <w:rFonts w:ascii="Calibri" w:hAnsi="Calibri" w:cs="Calibri"/>
@@ -25283,7 +25418,7 @@
         </w:rPr>
         <w:t xml:space="preserve"> anatomy, P10B-08 canonical card anatomy, and P10B-04 approved media treatment. Exact canonical catalogue bindings preserve product membership/order, facts, product media, filters/sort state, and child-collection order. Campaign media is approved collection/editorial media, not a product-media replacement. A transient revision-checked zero-result context keeps the query without fabricating products. Deterministic lifecycle and 16-view Chromium evidence pass with zero provider calls. See </w:t>
       </w:r>
-      <w:hyperlink r:id="rIdHyperlink51" w:history="1">
+      <w:hyperlink r:id="rIdHyperlink53" w:history="1">
         <w:r>
           <w:rPr>
             <w:rFonts w:ascii="Calibri" w:hAnsi="Calibri" w:cs="Calibri"/>
@@ -25813,7 +25948,7 @@
         </w:rPr>
         <w:t xml:space="preserve">. Fifteen structurally distinct registered profiles resolve exact current approved brief evidence into strict localized fact documents. P10B-05 preserves page-set, route, locale, and transitive navigation authority; P10B-06 frames and P10B-07 editorial/campaign renderers are reused. Snapshot save/reload and deterministic publication preserve the exact document. See </w:t>
       </w:r>
-      <w:hyperlink r:id="rIdHyperlink52" w:history="1">
+      <w:hyperlink r:id="rIdHyperlink54" w:history="1">
         <w:r>
           <w:rPr>
             <w:rFonts w:ascii="Calibri" w:hAnsi="Calibri" w:cs="Calibri"/>
@@ -26024,7 +26159,7 @@
         </w:rPr>
         <w:t xml:space="preserve"> component through the P10B-05 family page; registered loading state renders on its pending route instead of replacing the 404 singleton. Read-only runtime state supplies canonical cart facts, checkout continuation, P10B-10 query/filter context, and bounded recovery actions while the snapshot preserves presentation only. Shared-frame/Design DNA, save/reload, publication, four- width browser evidence, and no-provider behavior are covered under </w:t>
       </w:r>
-      <w:hyperlink r:id="rIdHyperlink53" w:history="1">
+      <w:hyperlink r:id="rIdHyperlink55" w:history="1">
         <w:r>
           <w:rPr>
             <w:rFonts w:ascii="Calibri" w:hAnsi="Calibri" w:cs="Calibri"/>
@@ -26235,7 +26370,7 @@
         </w:rPr>
         <w:t xml:space="preserve"> frame span all pages; simple/configurable PDP, factual content, utility states, 15 four-width/representative screenshots and the passing 160-scenario human record are retained in </w:t>
       </w:r>
-      <w:hyperlink r:id="rIdHyperlink54" w:history="1">
+      <w:hyperlink r:id="rIdHyperlink56" w:history="1">
         <w:r>
           <w:rPr>
             <w:rFonts w:ascii="Calibri" w:hAnsi="Calibri" w:cs="Calibri"/>
@@ -26446,7 +26581,7 @@
         </w:rPr>
         <w:t xml:space="preserve"> One versioned deterministic synthesis contract binds exact merchant, evidence, commerce, asset, Design DNA, site-map, frame, PageBlueprint/profile, component/anatomy, narrative, density, art-direction, responsive, planner, registry and recipe authority. The same approved fixture produces editorial-heavy, commerce/discovery-heavy and restrained/minimal complete 17-route stores through the existing whole-storefront proposal, snapshot, save/reload, renderer and immutable publication chain. Details are retained in </w:t>
       </w:r>
-      <w:hyperlink r:id="rIdHyperlink55" w:history="1">
+      <w:hyperlink r:id="rIdHyperlink57" w:history="1">
         <w:r>
           <w:rPr>
             <w:rFonts w:ascii="Calibri" w:hAnsi="Calibri" w:cs="Calibri"/>
@@ -26691,7 +26826,7 @@
         </w:rPr>
         <w:t xml:space="preserve"> 31 focused unit/integration cases; nine representative complete outcomes; exact save/reload and compiled publication; protected commerce/evidence/media parity; dedicated 375/768/1024/1440 browser coverage; three retained human commercial reviews and one exact evidence manifest. See </w:t>
       </w:r>
-      <w:hyperlink r:id="rIdHyperlink56" w:history="1">
+      <w:hyperlink r:id="rIdHyperlink58" w:history="1">
         <w:r>
           <w:rPr>
             <w:rFonts w:ascii="Calibri" w:hAnsi="Calibri" w:cs="Calibri"/>
@@ -26868,7 +27003,7 @@
         </w:rPr>
         <w:t xml:space="preserve"> A compact route inventory, four collection/search archetypes, four maintained PDP profiles plus generic fallback, exact collection and product-type mappings, bounded matching rules, transient editor/runtime projection, deterministic legacy convergence, and complete snapshot/lifecycle/publication preservation. Exact primary and related-product bindings survive convergence. A server-owned, storefront-scoped proposal transition binds legacy and reviewed canonical projections for deterministic acceptance replay. Storefront Studio lists archetypes rather than one page per commerce URL; representative context is not persisted. See </w:t>
       </w:r>
-      <w:hyperlink r:id="rIdHyperlink57" w:history="1">
+      <w:hyperlink r:id="rIdHyperlink59" w:history="1">
         <w:r>
           <w:rPr>
             <w:rFonts w:ascii="Calibri" w:hAnsi="Calibri" w:cs="Calibri"/>
@@ -27336,7 +27471,7 @@
         </w:rPr>
         <w:t xml:space="preserve"> </w:t>
       </w:r>
-      <w:hyperlink r:id="rIdHyperlink58" w:history="1">
+      <w:hyperlink r:id="rIdHyperlink60" w:history="1">
         <w:r>
           <w:rPr>
             <w:rFonts w:ascii="Calibri" w:hAnsi="Calibri" w:cs="Calibri"/>
@@ -27797,7 +27932,7 @@
         </w:rPr>
         <w:t xml:space="preserve">. Completed 15 August 2026; see </w:t>
       </w:r>
-      <w:hyperlink r:id="rIdHyperlink41" w:history="1">
+      <w:hyperlink r:id="rIdHyperlink43" w:history="1">
         <w:r>
           <w:rPr>
             <w:rFonts w:ascii="Calibri" w:hAnsi="Calibri" w:cs="Calibri"/>
@@ -29059,7 +29194,7 @@
         </w:rPr>
         <w:t xml:space="preserve">. Accepted by the product owner on 16 August 2026 under </w:t>
       </w:r>
-      <w:hyperlink r:id="rIdHyperlink59" w:history="1">
+      <w:hyperlink r:id="rIdHyperlink61" w:history="1">
         <w:r>
           <w:rPr>
             <w:rFonts w:ascii="Calibri" w:hAnsi="Calibri" w:cs="Calibri"/>
@@ -29417,7 +29552,7 @@
         </w:rPr>
         <w:t xml:space="preserve">. Accepted by the product owner on 17 August 2026 under </w:t>
       </w:r>
-      <w:hyperlink r:id="rIdHyperlink59" w:history="1">
+      <w:hyperlink r:id="rIdHyperlink61" w:history="1">
         <w:r>
           <w:rPr>
             <w:rFonts w:ascii="Calibri" w:hAnsi="Calibri" w:cs="Calibri"/>
@@ -32557,7 +32692,7 @@
         </w:rPr>
         <w:t xml:space="preserve"> </w:t>
       </w:r>
-      <w:hyperlink r:id="rIdHyperlink60" w:history="1">
+      <w:hyperlink r:id="rIdHyperlink62" w:history="1">
         <w:r>
           <w:rPr>
             <w:rFonts w:ascii="Calibri" w:hAnsi="Calibri" w:cs="Calibri"/>
@@ -32573,7 +32708,7 @@
         </w:rPr>
         <w:t xml:space="preserve"> and </w:t>
       </w:r>
-      <w:hyperlink r:id="rIdHyperlink61" w:history="1">
+      <w:hyperlink r:id="rIdHyperlink63" w:history="1">
         <w:r>
           <w:rPr>
             <w:rFonts w:ascii="Calibri" w:hAnsi="Calibri" w:cs="Calibri"/>

</xml_diff>

<commit_message>
refactor: isolate coordinated-direction metadata (AR-02M) (#255)
</commit_message>
<xml_diff>
--- a/docs/VESKIFY_DEVELOPMENT_DELIVERY_TRACKER_v1.3.0.docx
+++ b/docs/VESKIFY_DEVELOPMENT_DELIVERY_TRACKER_v1.3.0.docx
@@ -51,7 +51,7 @@
         <w:rPr>
           <w:rFonts w:ascii="Calibri" w:hAnsi="Calibri" w:cs="Calibri"/>
         </w:rPr>
-        <w:t>Effective upon independently verified AR-02L acceptance/merge: AR-02A through AR-02L Baseline / closed; AR-02 Partial with the coordinated-direction metadata path remaining; AR-03 and AR-03A through AR-03E remain closed; AR-04/AR-05 dependency-blocked and unstarted; AR-06 depends on AR-05; AR-23 eligible / unstarted; BATCH-09 complete after L merge and safe closeout; no next task</w:t>
+        <w:t>Effective upon independently verified AR-02M acceptance/merge: AR-02 and AR-02A through AR-02M Baseline / closed; AR-03 and AR-03A through AR-03E remain closed; AR-04/AR-05 eligible / unstarted after that merge; AR-06 depends on AR-05; AR-23 eligible / unstarted; BATCH-10 complete after M merge and safe closeout; no next task</w:t>
       </w:r>
     </w:p>
     <w:p>
@@ -118,7 +118,7 @@
           <w:b/>
           <w:bCs/>
         </w:rPr>
-        <w:t>Candidate status effective upon explicit owner acceptance/merge of AR-02L:</w:t>
+        <w:t>Candidate status effective upon explicit owner acceptance/merge of AR-02M:</w:t>
       </w:r>
       <w:r>
         <w:rPr>
@@ -328,6 +328,20 @@
           <w:b/>
           <w:bCs/>
         </w:rPr>
+        <w:t>Baseline / closed.</w:t>
+      </w:r>
+      <w:r>
+        <w:rPr>
+          <w:rFonts w:ascii="Calibri" w:hAnsi="Calibri" w:cs="Calibri"/>
+        </w:rPr>
+        <w:t xml:space="preserve"> AR-02M is </w:t>
+      </w:r>
+      <w:r>
+        <w:rPr>
+          <w:rFonts w:ascii="Calibri" w:hAnsi="Calibri" w:cs="Calibri"/>
+          <w:b/>
+          <w:bCs/>
+        </w:rPr>
         <w:t>Baseline / closed upon explicit owner acceptance/merge.</w:t>
       </w:r>
       <w:r>
@@ -342,13 +356,13 @@
           <w:b/>
           <w:bCs/>
         </w:rPr>
-        <w:t>Partial</w:t>
-      </w:r>
-      <w:r>
-        <w:rPr>
-          <w:rFonts w:ascii="Calibri" w:hAnsi="Calibri" w:cs="Calibri"/>
-        </w:rPr>
-        <w:t xml:space="preserve">; the coordinated-direction metadata dependency remains mapped in AR_02_BOUNDARY_ACCEPTANCE.md. AR-04/AR-05 remain dependency-blocked. AR-03 is </w:t>
+        <w:t>Baseline / closed upon explicit owner acceptance/merge</w:t>
+      </w:r>
+      <w:r>
+        <w:rPr>
+          <w:rFonts w:ascii="Calibri" w:hAnsi="Calibri" w:cs="Calibri"/>
+        </w:rPr>
+        <w:t xml:space="preserve">; complete original acceptance is mapped in AR_02_BOUNDARY_ACCEPTANCE.md. AR-04/AR-05 are eligible / unstarted after that merge; AR-06 remains dependent on AR-05. AR-03 is </w:t>
       </w:r>
       <w:r>
         <w:rPr>
@@ -446,7 +460,7 @@
         <w:rPr>
           <w:rFonts w:ascii="Calibri" w:hAnsi="Calibri" w:cs="Calibri"/>
         </w:rPr>
-        <w:t xml:space="preserve">. AR-23 depends on AR-01 and is not serialized behind visual work. BATCH-03 is complete. BATCH-04 is complete. BATCH-05 is complete. BATCH-06 is complete. BATCH-07 is complete. BATCH-08 is complete. BATCH-09 is complete upon AR-02L acceptance/merge and safe closeout. No next reset task is selected. No third task is authorized. This tracker owns current status; the roadmap owns dependency order. Retained B01 exact-next, fixed-two-call/mandatory-three-concept, transient-only, and 73-child future-sequence statements are </w:t>
+        <w:t xml:space="preserve">. AR-23 depends on AR-01 and is not serialized behind visual work. BATCH-03 is complete. BATCH-04 is complete. BATCH-05 is complete. BATCH-06 is complete. BATCH-07 is complete. BATCH-08 is complete. BATCH-09 is complete. BATCH-10 is complete upon AR-02M acceptance/merge and safe closeout. No next reset task is selected. No third task is authorized. This tracker owns current status; the roadmap owns dependency order. Retained B01 exact-next, fixed-two-call/mandatory-three-concept, transient-only, and 73-child future-sequence statements are </w:t>
       </w:r>
       <w:r>
         <w:rPr>
@@ -983,7 +997,7 @@
               <w:rPr>
                 <w:rFonts w:ascii="Calibri" w:hAnsi="Calibri" w:cs="Calibri"/>
               </w:rPr>
-              <w:t>Status; L conditional on independent acceptance/merge</w:t>
+              <w:t>Status; M conditional on independent acceptance/merge</w:t>
             </w:r>
           </w:p>
         </w:tc>
@@ -2364,7 +2378,7 @@
                 <w:b/>
                 <w:bCs/>
               </w:rPr>
-              <w:t>Baseline / closed upon explicit owner acceptance/merge</w:t>
+              <w:t>Baseline / closed</w:t>
             </w:r>
           </w:p>
         </w:tc>
@@ -2387,7 +2401,7 @@
               <w:rPr>
                 <w:rFonts w:ascii="Calibri" w:hAnsi="Calibri" w:cs="Calibri"/>
               </w:rPr>
-              <w:t>AR-03B</w:t>
+              <w:t>AR-02M</w:t>
             </w:r>
           </w:p>
         </w:tc>
@@ -2405,7 +2419,7 @@
               <w:rPr>
                 <w:rFonts w:ascii="Calibri" w:hAnsi="Calibri" w:cs="Calibri"/>
               </w:rPr>
-              <w:t>AR-03</w:t>
+              <w:t>AR-02</w:t>
             </w:r>
           </w:p>
         </w:tc>
@@ -2423,7 +2437,7 @@
               <w:rPr>
                 <w:rFonts w:ascii="Calibri" w:hAnsi="Calibri" w:cs="Calibri"/>
               </w:rPr>
-              <w:t xml:space="preserve">Renderer-free presentation construction and exact historical compatibility; </w:t>
+              <w:t xml:space="preserve">Coordinated schema, direction, eligibility and actual semantic resolver metadata; </w:t>
             </w:r>
             <w:hyperlink r:id="rIdHyperlink30" w:history="1">
               <w:r>
@@ -2451,6 +2465,22 @@
                 <w:t>report</w:t>
               </w:r>
             </w:hyperlink>
+            <w:r>
+              <w:rPr>
+                <w:rFonts w:ascii="Calibri" w:hAnsi="Calibri" w:cs="Calibri"/>
+              </w:rPr>
+              <w:t xml:space="preserve">, </w:t>
+            </w:r>
+            <w:hyperlink r:id="rIdHyperlink23" w:history="1">
+              <w:r>
+                <w:rPr>
+                  <w:rFonts w:ascii="Calibri" w:hAnsi="Calibri" w:cs="Calibri"/>
+                  <w:color w:val="2E74B5"/>
+                  <w:u w:val="single"/>
+                </w:rPr>
+                <w:t>parent evidence</w:t>
+              </w:r>
+            </w:hyperlink>
           </w:p>
         </w:tc>
         <w:tc>
@@ -2469,7 +2499,7 @@
                 <w:b/>
                 <w:bCs/>
               </w:rPr>
-              <w:t>Baseline / closed</w:t>
+              <w:t>Baseline / closed upon explicit owner acceptance/merge</w:t>
             </w:r>
           </w:p>
         </w:tc>
@@ -2492,7 +2522,7 @@
               <w:rPr>
                 <w:rFonts w:ascii="Calibri" w:hAnsi="Calibri" w:cs="Calibri"/>
               </w:rPr>
-              <w:t>AR-03C</w:t>
+              <w:t>AR-03B</w:t>
             </w:r>
           </w:p>
         </w:tc>
@@ -2528,7 +2558,7 @@
               <w:rPr>
                 <w:rFonts w:ascii="Calibri" w:hAnsi="Calibri" w:cs="Calibri"/>
               </w:rPr>
-              <w:t xml:space="preserve">Current-authority validation, route projection/resolution and four preview import cutovers; </w:t>
+              <w:t xml:space="preserve">Renderer-free presentation construction and exact historical compatibility; </w:t>
             </w:r>
             <w:hyperlink r:id="rIdHyperlink32" w:history="1">
               <w:r>
@@ -2597,7 +2627,7 @@
               <w:rPr>
                 <w:rFonts w:ascii="Calibri" w:hAnsi="Calibri" w:cs="Calibri"/>
               </w:rPr>
-              <w:t>AR-03D</w:t>
+              <w:t>AR-03C</w:t>
             </w:r>
           </w:p>
         </w:tc>
@@ -2633,7 +2663,7 @@
               <w:rPr>
                 <w:rFonts w:ascii="Calibri" w:hAnsi="Calibri" w:cs="Calibri"/>
               </w:rPr>
-              <w:t xml:space="preserve">Design-selection contracts/operations and editor projection with three named consumer cutovers; </w:t>
+              <w:t xml:space="preserve">Current-authority validation, route projection/resolution and four preview import cutovers; </w:t>
             </w:r>
             <w:hyperlink r:id="rIdHyperlink34" w:history="1">
               <w:r>
@@ -2702,7 +2732,7 @@
               <w:rPr>
                 <w:rFonts w:ascii="Calibri" w:hAnsi="Calibri" w:cs="Calibri"/>
               </w:rPr>
-              <w:t>AR-03E</w:t>
+              <w:t>AR-03D</w:t>
             </w:r>
           </w:p>
         </w:tc>
@@ -2738,7 +2768,7 @@
               <w:rPr>
                 <w:rFonts w:ascii="Calibri" w:hAnsi="Calibri" w:cs="Calibri"/>
               </w:rPr>
-              <w:t xml:space="preserve">Legacy migration, distinct transient projections and shared bridge schemas; </w:t>
+              <w:t xml:space="preserve">Design-selection contracts/operations and editor projection with three named consumer cutovers; </w:t>
             </w:r>
             <w:hyperlink r:id="rIdHyperlink36" w:history="1">
               <w:r>
@@ -2766,13 +2796,118 @@
                 <w:t>report</w:t>
               </w:r>
             </w:hyperlink>
+          </w:p>
+        </w:tc>
+        <w:tc>
+          <w:tcPr>
+            <w:tcW w:w="8460" w:type="dxa"/>
+            <w:vAlign w:val="center"/>
+          </w:tcPr>
+          <w:p>
+            <w:pPr>
+              <w:pStyle w:val="TableText"/>
+              <w:widowControl/>
+            </w:pPr>
+            <w:r>
+              <w:rPr>
+                <w:rFonts w:ascii="Calibri" w:hAnsi="Calibri" w:cs="Calibri"/>
+                <w:b/>
+                <w:bCs/>
+              </w:rPr>
+              <w:t>Baseline / closed</w:t>
+            </w:r>
+          </w:p>
+        </w:tc>
+      </w:tr>
+      <w:tr>
+        <w:trPr>
+          <w:cantSplit/>
+        </w:trPr>
+        <w:tc>
+          <w:tcPr>
+            <w:tcW w:w="1000" w:type="dxa"/>
+            <w:vAlign w:val="center"/>
+          </w:tcPr>
+          <w:p>
+            <w:pPr>
+              <w:pStyle w:val="TableText"/>
+              <w:widowControl/>
+            </w:pPr>
+            <w:r>
+              <w:rPr>
+                <w:rFonts w:ascii="Calibri" w:hAnsi="Calibri" w:cs="Calibri"/>
+              </w:rPr>
+              <w:t>AR-03E</w:t>
+            </w:r>
+          </w:p>
+        </w:tc>
+        <w:tc>
+          <w:tcPr>
+            <w:tcW w:w="1500" w:type="dxa"/>
+            <w:vAlign w:val="center"/>
+          </w:tcPr>
+          <w:p>
+            <w:pPr>
+              <w:pStyle w:val="TableText"/>
+              <w:widowControl/>
+            </w:pPr>
+            <w:r>
+              <w:rPr>
+                <w:rFonts w:ascii="Calibri" w:hAnsi="Calibri" w:cs="Calibri"/>
+              </w:rPr>
+              <w:t>AR-03</w:t>
+            </w:r>
+          </w:p>
+        </w:tc>
+        <w:tc>
+          <w:tcPr>
+            <w:tcW w:w="2000" w:type="dxa"/>
+            <w:vAlign w:val="center"/>
+          </w:tcPr>
+          <w:p>
+            <w:pPr>
+              <w:pStyle w:val="TableText"/>
+              <w:widowControl/>
+            </w:pPr>
+            <w:r>
+              <w:rPr>
+                <w:rFonts w:ascii="Calibri" w:hAnsi="Calibri" w:cs="Calibri"/>
+              </w:rPr>
+              <w:t xml:space="preserve">Legacy migration, distinct transient projections and shared bridge schemas; </w:t>
+            </w:r>
+            <w:hyperlink r:id="rIdHyperlink38" w:history="1">
+              <w:r>
+                <w:rPr>
+                  <w:rFonts w:ascii="Calibri" w:hAnsi="Calibri" w:cs="Calibri"/>
+                  <w:color w:val="2E74B5"/>
+                  <w:u w:val="single"/>
+                </w:rPr>
+                <w:t>contract</w:t>
+              </w:r>
+            </w:hyperlink>
             <w:r>
               <w:rPr>
                 <w:rFonts w:ascii="Calibri" w:hAnsi="Calibri" w:cs="Calibri"/>
               </w:rPr>
               <w:t xml:space="preserve">, </w:t>
             </w:r>
-            <w:hyperlink r:id="rIdHyperlink38" w:history="1">
+            <w:hyperlink r:id="rIdHyperlink39" w:history="1">
+              <w:r>
+                <w:rPr>
+                  <w:rFonts w:ascii="Calibri" w:hAnsi="Calibri" w:cs="Calibri"/>
+                  <w:color w:val="2E74B5"/>
+                  <w:u w:val="single"/>
+                </w:rPr>
+                <w:t>report</w:t>
+              </w:r>
+            </w:hyperlink>
+            <w:r>
+              <w:rPr>
+                <w:rFonts w:ascii="Calibri" w:hAnsi="Calibri" w:cs="Calibri"/>
+              </w:rPr>
+              <w:t xml:space="preserve">, </w:t>
+            </w:r>
+            <w:hyperlink r:id="rIdHyperlink40" w:history="1">
               <w:r>
                 <w:rPr>
                   <w:rFonts w:ascii="Calibri" w:hAnsi="Calibri" w:cs="Calibri"/>
@@ -22736,7 +22871,7 @@
         </w:rPr>
         <w:t xml:space="preserve">. Completed 7 August 2026; see </w:t>
       </w:r>
-      <w:hyperlink r:id="rIdHyperlink39" w:history="1">
+      <w:hyperlink r:id="rIdHyperlink41" w:history="1">
         <w:r>
           <w:rPr>
             <w:rFonts w:ascii="Calibri" w:hAnsi="Calibri" w:cs="Calibri"/>
@@ -22873,7 +23008,7 @@
         </w:rPr>
         <w:t xml:space="preserve">The binding details and minimum coverage are in </w:t>
       </w:r>
-      <w:hyperlink r:id="rIdHyperlink40" w:history="1">
+      <w:hyperlink r:id="rIdHyperlink42" w:history="1">
         <w:r>
           <w:rPr>
             <w:rFonts w:ascii="Calibri" w:hAnsi="Calibri" w:cs="Calibri"/>
@@ -23071,7 +23206,7 @@
         </w:rPr>
         <w:t xml:space="preserve">. P10B-16P-04 acceptance evidence is retained in </w:t>
       </w:r>
-      <w:hyperlink r:id="rIdHyperlink41" w:history="1">
+      <w:hyperlink r:id="rIdHyperlink43" w:history="1">
         <w:r>
           <w:rPr>
             <w:rFonts w:ascii="Calibri" w:hAnsi="Calibri" w:cs="Calibri"/>
@@ -23320,7 +23455,7 @@
         </w:rPr>
         <w:t xml:space="preserve">. See </w:t>
       </w:r>
-      <w:hyperlink r:id="rIdHyperlink42" w:history="1">
+      <w:hyperlink r:id="rIdHyperlink44" w:history="1">
         <w:r>
           <w:rPr>
             <w:rFonts w:ascii="Calibri" w:hAnsi="Calibri" w:cs="Calibri"/>
@@ -23569,7 +23704,7 @@
         </w:rPr>
         <w:t xml:space="preserve">. See </w:t>
       </w:r>
-      <w:hyperlink r:id="rIdHyperlink43" w:history="1">
+      <w:hyperlink r:id="rIdHyperlink45" w:history="1">
         <w:r>
           <w:rPr>
             <w:rFonts w:ascii="Calibri" w:hAnsi="Calibri" w:cs="Calibri"/>
@@ -23818,7 +23953,7 @@
         </w:rPr>
         <w:t xml:space="preserve">. At P10B-03 delivery, all then-current 25 V2 definitions and 91 variants were classified explicitly without false commercial-ready promotion. Later family tasks extend that same authority rather than replacing it. See </w:t>
       </w:r>
-      <w:hyperlink r:id="rIdHyperlink44" w:history="1">
+      <w:hyperlink r:id="rIdHyperlink46" w:history="1">
         <w:r>
           <w:rPr>
             <w:rFonts w:ascii="Calibri" w:hAnsi="Calibri" w:cs="Calibri"/>
@@ -24067,7 +24202,7 @@
         </w:rPr>
         <w:t xml:space="preserve"> embeds exact lineage and bounded treatment in the existing approved presentation, consumes Design DNA and registered anatomy, projects protected same-product media, preserves authority through lifecycle/compiler boundaries, and renders semantic four-breakpoint evidence. Production CDN transforms and retained commercial visual acceptance remain deferred. See </w:t>
       </w:r>
-      <w:hyperlink r:id="rIdHyperlink45" w:history="1">
+      <w:hyperlink r:id="rIdHyperlink47" w:history="1">
         <w:r>
           <w:rPr>
             <w:rFonts w:ascii="Calibri" w:hAnsi="Calibri" w:cs="Calibri"/>
@@ -24316,7 +24451,7 @@
         </w:rPr>
         <w:t xml:space="preserve">. See </w:t>
       </w:r>
-      <w:hyperlink r:id="rIdHyperlink46" w:history="1">
+      <w:hyperlink r:id="rIdHyperlink48" w:history="1">
         <w:r>
           <w:rPr>
             <w:rFonts w:ascii="Calibri" w:hAnsi="Calibri" w:cs="Calibri"/>
@@ -24551,7 +24686,7 @@
         </w:rPr>
         <w:t xml:space="preserve">. Four exact root-frame profiles, three mobile modes, and four footer compositions preserve canonical navigation and frame identity through snapshot, save/reload, Puck root, preview, publication compilation, EN/FI, and 375/768/1024/1440 px evidence. See </w:t>
       </w:r>
-      <w:hyperlink r:id="rIdHyperlink47" w:history="1">
+      <w:hyperlink r:id="rIdHyperlink49" w:history="1">
         <w:r>
           <w:rPr>
             <w:rFonts w:ascii="Calibri" w:hAnsi="Calibri" w:cs="Calibri"/>
@@ -24786,7 +24921,7 @@
         </w:rPr>
         <w:t xml:space="preserve">. Six meaningful hero anatomies, five editorial/story anatomies, five campaign/promotion anatomies and three evidence-grounded proof/service anatomies are registered, PageBlueprint-selectable, deterministically generated, snapshot/publish preserved and rendered through one shared implementation. Focused deterministic coverage and a zero-provider Chromium scenario retain evidence at 375, 768, 1024 and 1440 px. See </w:t>
       </w:r>
-      <w:hyperlink r:id="rIdHyperlink48" w:history="1">
+      <w:hyperlink r:id="rIdHyperlink50" w:history="1">
         <w:r>
           <w:rPr>
             <w:rFonts w:ascii="Calibri" w:hAnsi="Calibri" w:cs="Calibri"/>
@@ -24835,7 +24970,7 @@
         </w:rPr>
         <w:t xml:space="preserve"> Baseline. One fingerprinted authority and renderer now serve homepage merchandising, collection/results, related products, and legacy compatibility. Five meaningful anatomies preserve canonical facts and P10B-04 media lineage through plan, proposal, snapshot, save/reload, publish, and responsive browser evidence. See </w:t>
       </w:r>
-      <w:hyperlink r:id="rIdHyperlink49" w:history="1">
+      <w:hyperlink r:id="rIdHyperlink51" w:history="1">
         <w:r>
           <w:rPr>
             <w:rFonts w:ascii="Calibri" w:hAnsi="Calibri" w:cs="Calibri"/>
@@ -25052,7 +25187,7 @@
         </w:rPr>
         <w:t xml:space="preserve"> Baseline. Six versioned, structurally fingerprinted homepage PageBlueprint profiles compose current shared-frame, commercial storytelling, canonical product-card, approved-media, and Design DNA authority. Evidence/cardinality guards fail closed; deterministic lifecycle and 24 retained four-width browser images pass. See </w:t>
       </w:r>
-      <w:hyperlink r:id="rIdHyperlink50" w:history="1">
+      <w:hyperlink r:id="rIdHyperlink52" w:history="1">
         <w:r>
           <w:rPr>
             <w:rFonts w:ascii="Calibri" w:hAnsi="Calibri" w:cs="Calibri"/>
@@ -25283,7 +25418,7 @@
         </w:rPr>
         <w:t xml:space="preserve"> anatomy, P10B-08 canonical card anatomy, and P10B-04 approved media treatment. Exact canonical catalogue bindings preserve product membership/order, facts, product media, filters/sort state, and child-collection order. Campaign media is approved collection/editorial media, not a product-media replacement. A transient revision-checked zero-result context keeps the query without fabricating products. Deterministic lifecycle and 16-view Chromium evidence pass with zero provider calls. See </w:t>
       </w:r>
-      <w:hyperlink r:id="rIdHyperlink51" w:history="1">
+      <w:hyperlink r:id="rIdHyperlink53" w:history="1">
         <w:r>
           <w:rPr>
             <w:rFonts w:ascii="Calibri" w:hAnsi="Calibri" w:cs="Calibri"/>
@@ -25813,7 +25948,7 @@
         </w:rPr>
         <w:t xml:space="preserve">. Fifteen structurally distinct registered profiles resolve exact current approved brief evidence into strict localized fact documents. P10B-05 preserves page-set, route, locale, and transitive navigation authority; P10B-06 frames and P10B-07 editorial/campaign renderers are reused. Snapshot save/reload and deterministic publication preserve the exact document. See </w:t>
       </w:r>
-      <w:hyperlink r:id="rIdHyperlink52" w:history="1">
+      <w:hyperlink r:id="rIdHyperlink54" w:history="1">
         <w:r>
           <w:rPr>
             <w:rFonts w:ascii="Calibri" w:hAnsi="Calibri" w:cs="Calibri"/>
@@ -26024,7 +26159,7 @@
         </w:rPr>
         <w:t xml:space="preserve"> component through the P10B-05 family page; registered loading state renders on its pending route instead of replacing the 404 singleton. Read-only runtime state supplies canonical cart facts, checkout continuation, P10B-10 query/filter context, and bounded recovery actions while the snapshot preserves presentation only. Shared-frame/Design DNA, save/reload, publication, four- width browser evidence, and no-provider behavior are covered under </w:t>
       </w:r>
-      <w:hyperlink r:id="rIdHyperlink53" w:history="1">
+      <w:hyperlink r:id="rIdHyperlink55" w:history="1">
         <w:r>
           <w:rPr>
             <w:rFonts w:ascii="Calibri" w:hAnsi="Calibri" w:cs="Calibri"/>
@@ -26235,7 +26370,7 @@
         </w:rPr>
         <w:t xml:space="preserve"> frame span all pages; simple/configurable PDP, factual content, utility states, 15 four-width/representative screenshots and the passing 160-scenario human record are retained in </w:t>
       </w:r>
-      <w:hyperlink r:id="rIdHyperlink54" w:history="1">
+      <w:hyperlink r:id="rIdHyperlink56" w:history="1">
         <w:r>
           <w:rPr>
             <w:rFonts w:ascii="Calibri" w:hAnsi="Calibri" w:cs="Calibri"/>
@@ -26446,7 +26581,7 @@
         </w:rPr>
         <w:t xml:space="preserve"> One versioned deterministic synthesis contract binds exact merchant, evidence, commerce, asset, Design DNA, site-map, frame, PageBlueprint/profile, component/anatomy, narrative, density, art-direction, responsive, planner, registry and recipe authority. The same approved fixture produces editorial-heavy, commerce/discovery-heavy and restrained/minimal complete 17-route stores through the existing whole-storefront proposal, snapshot, save/reload, renderer and immutable publication chain. Details are retained in </w:t>
       </w:r>
-      <w:hyperlink r:id="rIdHyperlink55" w:history="1">
+      <w:hyperlink r:id="rIdHyperlink57" w:history="1">
         <w:r>
           <w:rPr>
             <w:rFonts w:ascii="Calibri" w:hAnsi="Calibri" w:cs="Calibri"/>
@@ -26691,7 +26826,7 @@
         </w:rPr>
         <w:t xml:space="preserve"> 31 focused unit/integration cases; nine representative complete outcomes; exact save/reload and compiled publication; protected commerce/evidence/media parity; dedicated 375/768/1024/1440 browser coverage; three retained human commercial reviews and one exact evidence manifest. See </w:t>
       </w:r>
-      <w:hyperlink r:id="rIdHyperlink56" w:history="1">
+      <w:hyperlink r:id="rIdHyperlink58" w:history="1">
         <w:r>
           <w:rPr>
             <w:rFonts w:ascii="Calibri" w:hAnsi="Calibri" w:cs="Calibri"/>
@@ -26868,7 +27003,7 @@
         </w:rPr>
         <w:t xml:space="preserve"> A compact route inventory, four collection/search archetypes, four maintained PDP profiles plus generic fallback, exact collection and product-type mappings, bounded matching rules, transient editor/runtime projection, deterministic legacy convergence, and complete snapshot/lifecycle/publication preservation. Exact primary and related-product bindings survive convergence. A server-owned, storefront-scoped proposal transition binds legacy and reviewed canonical projections for deterministic acceptance replay. Storefront Studio lists archetypes rather than one page per commerce URL; representative context is not persisted. See </w:t>
       </w:r>
-      <w:hyperlink r:id="rIdHyperlink57" w:history="1">
+      <w:hyperlink r:id="rIdHyperlink59" w:history="1">
         <w:r>
           <w:rPr>
             <w:rFonts w:ascii="Calibri" w:hAnsi="Calibri" w:cs="Calibri"/>
@@ -27336,7 +27471,7 @@
         </w:rPr>
         <w:t xml:space="preserve"> </w:t>
       </w:r>
-      <w:hyperlink r:id="rIdHyperlink58" w:history="1">
+      <w:hyperlink r:id="rIdHyperlink60" w:history="1">
         <w:r>
           <w:rPr>
             <w:rFonts w:ascii="Calibri" w:hAnsi="Calibri" w:cs="Calibri"/>
@@ -27797,7 +27932,7 @@
         </w:rPr>
         <w:t xml:space="preserve">. Completed 15 August 2026; see </w:t>
       </w:r>
-      <w:hyperlink r:id="rIdHyperlink41" w:history="1">
+      <w:hyperlink r:id="rIdHyperlink43" w:history="1">
         <w:r>
           <w:rPr>
             <w:rFonts w:ascii="Calibri" w:hAnsi="Calibri" w:cs="Calibri"/>
@@ -29059,7 +29194,7 @@
         </w:rPr>
         <w:t xml:space="preserve">. Accepted by the product owner on 16 August 2026 under </w:t>
       </w:r>
-      <w:hyperlink r:id="rIdHyperlink59" w:history="1">
+      <w:hyperlink r:id="rIdHyperlink61" w:history="1">
         <w:r>
           <w:rPr>
             <w:rFonts w:ascii="Calibri" w:hAnsi="Calibri" w:cs="Calibri"/>
@@ -29417,7 +29552,7 @@
         </w:rPr>
         <w:t xml:space="preserve">. Accepted by the product owner on 17 August 2026 under </w:t>
       </w:r>
-      <w:hyperlink r:id="rIdHyperlink59" w:history="1">
+      <w:hyperlink r:id="rIdHyperlink61" w:history="1">
         <w:r>
           <w:rPr>
             <w:rFonts w:ascii="Calibri" w:hAnsi="Calibri" w:cs="Calibri"/>
@@ -32557,7 +32692,7 @@
         </w:rPr>
         <w:t xml:space="preserve"> </w:t>
       </w:r>
-      <w:hyperlink r:id="rIdHyperlink60" w:history="1">
+      <w:hyperlink r:id="rIdHyperlink62" w:history="1">
         <w:r>
           <w:rPr>
             <w:rFonts w:ascii="Calibri" w:hAnsi="Calibri" w:cs="Calibri"/>
@@ -32573,7 +32708,7 @@
         </w:rPr>
         <w:t xml:space="preserve"> and </w:t>
       </w:r>
-      <w:hyperlink r:id="rIdHyperlink61" w:history="1">
+      <w:hyperlink r:id="rIdHyperlink63" w:history="1">
         <w:r>
           <w:rPr>
             <w:rFonts w:ascii="Calibri" w:hAnsi="Calibri" w:cs="Calibri"/>

</xml_diff>

<commit_message>
Isolate normal storefront generation composition
</commit_message>
<xml_diff>
--- a/docs/VESKIFY_DEVELOPMENT_DELIVERY_TRACKER_v1.3.0.docx
+++ b/docs/VESKIFY_DEVELOPMENT_DELIVERY_TRACKER_v1.3.0.docx
@@ -51,7 +51,7 @@
         <w:rPr>
           <w:rFonts w:ascii="Calibri" w:hAnsi="Calibri" w:cs="Calibri"/>
         </w:rPr>
-        <w:t>Effective upon independently verified AR-02M acceptance/merge: AR-02 and AR-02A through AR-02M Baseline / closed; AR-03 and AR-03A through AR-03E remain closed; AR-04/AR-05 eligible / unstarted after that merge; AR-06 depends on AR-05; AR-23 eligible / unstarted; BATCH-10 complete after M merge and safe closeout; no next task</w:t>
+        <w:t>AR-02 and AR-02A through AR-02M Baseline / closed; AR-03 and AR-03A through AR-03E remain closed; AR-04 Baseline / closed effective upon accepted merge; AR-05 eligible / unstarted; AR-06 depends on AR-05; AR-23 eligible / unstarted; BATCH-10 complete; BATCH-11 complete upon AR-04 acceptance/merge and safe closeout; no next task</w:t>
       </w:r>
     </w:p>
     <w:p>
@@ -342,7 +342,7 @@
           <w:b/>
           <w:bCs/>
         </w:rPr>
-        <w:t>Baseline / closed upon explicit owner acceptance/merge.</w:t>
+        <w:t>Baseline / closed.</w:t>
       </w:r>
       <w:r>
         <w:rPr>
@@ -356,26 +356,26 @@
           <w:b/>
           <w:bCs/>
         </w:rPr>
-        <w:t>Baseline / closed upon explicit owner acceptance/merge</w:t>
-      </w:r>
-      <w:r>
-        <w:rPr>
-          <w:rFonts w:ascii="Calibri" w:hAnsi="Calibri" w:cs="Calibri"/>
-        </w:rPr>
-        <w:t xml:space="preserve">; complete original acceptance is mapped in AR_02_BOUNDARY_ACCEPTANCE.md. AR-04/AR-05 are eligible / unstarted after that merge; AR-06 remains dependent on AR-05. AR-03 is </w:t>
-      </w:r>
-      <w:r>
-        <w:rPr>
-          <w:rFonts w:ascii="Calibri" w:hAnsi="Calibri" w:cs="Calibri"/>
-          <w:b/>
-          <w:bCs/>
-        </w:rPr>
         <w:t>Baseline / closed</w:t>
       </w:r>
       <w:r>
         <w:rPr>
           <w:rFonts w:ascii="Calibri" w:hAnsi="Calibri" w:cs="Calibri"/>
         </w:rPr>
+        <w:t xml:space="preserve">; complete original acceptance is mapped in AR_02_BOUNDARY_ACCEPTANCE.md. AR-04 is Baseline / closed effective upon accepted merge. AR-05 is eligible / unstarted; AR-06 remains dependent on AR-05. AR-03 is </w:t>
+      </w:r>
+      <w:r>
+        <w:rPr>
+          <w:rFonts w:ascii="Calibri" w:hAnsi="Calibri" w:cs="Calibri"/>
+          <w:b/>
+          <w:bCs/>
+        </w:rPr>
+        <w:t>Baseline / closed</w:t>
+      </w:r>
+      <w:r>
+        <w:rPr>
+          <w:rFonts w:ascii="Calibri" w:hAnsi="Calibri" w:cs="Calibri"/>
+        </w:rPr>
         <w:t xml:space="preserve">; original same-input characterization and separate ownership are verified. AR-03A is </w:t>
       </w:r>
       <w:r>
@@ -460,7 +460,7 @@
         <w:rPr>
           <w:rFonts w:ascii="Calibri" w:hAnsi="Calibri" w:cs="Calibri"/>
         </w:rPr>
-        <w:t xml:space="preserve">. AR-23 depends on AR-01 and is not serialized behind visual work. BATCH-03 is complete. BATCH-04 is complete. BATCH-05 is complete. BATCH-06 is complete. BATCH-07 is complete. BATCH-08 is complete. BATCH-09 is complete. BATCH-10 is complete upon AR-02M acceptance/merge and safe closeout. No next reset task is selected. No third task is authorized. This tracker owns current status; the roadmap owns dependency order. Retained B01 exact-next, fixed-two-call/mandatory-three-concept, transient-only, and 73-child future-sequence statements are </w:t>
+        <w:t xml:space="preserve">. AR-23 depends on AR-01 and is not serialized behind visual work. BATCH-03 is complete. BATCH-04 is complete. BATCH-05 is complete. BATCH-06 is complete. BATCH-07 is complete. BATCH-08 is complete. BATCH-09 is complete. BATCH-10 is complete. BATCH-11 is complete upon AR-04 acceptance/merge and safe closeout. No next reset task is selected. No third task is authorized. This tracker owns current status; the roadmap owns dependency order. Retained B01 exact-next, fixed-two-call/mandatory-three-concept, transient-only, and 73-child future-sequence statements are </w:t>
       </w:r>
       <w:r>
         <w:rPr>

</xml_diff>

<commit_message>
Align current status projections with AR-04 acceptance
</commit_message>
<xml_diff>
--- a/docs/VESKIFY_DEVELOPMENT_DELIVERY_TRACKER_v1.3.0.docx
+++ b/docs/VESKIFY_DEVELOPMENT_DELIVERY_TRACKER_v1.3.0.docx
@@ -118,7 +118,7 @@
           <w:b/>
           <w:bCs/>
         </w:rPr>
-        <w:t>Candidate status effective upon explicit owner acceptance/merge of AR-02M:</w:t>
+        <w:t>Candidate status effective upon explicit owner acceptance/merge of AR-04:</w:t>
       </w:r>
       <w:r>
         <w:rPr>
@@ -997,7 +997,7 @@
               <w:rPr>
                 <w:rFonts w:ascii="Calibri" w:hAnsi="Calibri" w:cs="Calibri"/>
               </w:rPr>
-              <w:t>Status; M conditional on independent acceptance/merge</w:t>
+              <w:t>Status</w:t>
             </w:r>
           </w:p>
         </w:tc>
@@ -1094,6 +1094,7 @@
           <w:p>
             <w:pPr>
               <w:pStyle w:val="TableText"/>
+              <w:jc w:val="center"/>
               <w:widowControl/>
             </w:pPr>
             <w:r>
@@ -1199,6 +1200,7 @@
           <w:p>
             <w:pPr>
               <w:pStyle w:val="TableText"/>
+              <w:jc w:val="center"/>
               <w:widowControl/>
             </w:pPr>
             <w:r>
@@ -1304,6 +1306,7 @@
           <w:p>
             <w:pPr>
               <w:pStyle w:val="TableText"/>
+              <w:jc w:val="center"/>
               <w:widowControl/>
             </w:pPr>
             <w:r>
@@ -1409,6 +1412,7 @@
           <w:p>
             <w:pPr>
               <w:pStyle w:val="TableText"/>
+              <w:jc w:val="center"/>
               <w:widowControl/>
             </w:pPr>
             <w:r>
@@ -1514,6 +1518,7 @@
           <w:p>
             <w:pPr>
               <w:pStyle w:val="TableText"/>
+              <w:jc w:val="center"/>
               <w:widowControl/>
             </w:pPr>
             <w:r>
@@ -1619,6 +1624,7 @@
           <w:p>
             <w:pPr>
               <w:pStyle w:val="TableText"/>
+              <w:jc w:val="center"/>
               <w:widowControl/>
             </w:pPr>
             <w:r>
@@ -1724,6 +1730,7 @@
           <w:p>
             <w:pPr>
               <w:pStyle w:val="TableText"/>
+              <w:jc w:val="center"/>
               <w:widowControl/>
             </w:pPr>
             <w:r>
@@ -1829,6 +1836,7 @@
           <w:p>
             <w:pPr>
               <w:pStyle w:val="TableText"/>
+              <w:jc w:val="center"/>
               <w:widowControl/>
             </w:pPr>
             <w:r>
@@ -1934,6 +1942,7 @@
           <w:p>
             <w:pPr>
               <w:pStyle w:val="TableText"/>
+              <w:jc w:val="center"/>
               <w:widowControl/>
             </w:pPr>
             <w:r>
@@ -2055,6 +2064,7 @@
           <w:p>
             <w:pPr>
               <w:pStyle w:val="TableText"/>
+              <w:jc w:val="center"/>
               <w:widowControl/>
             </w:pPr>
             <w:r>
@@ -2160,6 +2170,7 @@
           <w:p>
             <w:pPr>
               <w:pStyle w:val="TableText"/>
+              <w:jc w:val="center"/>
               <w:widowControl/>
             </w:pPr>
             <w:r>
@@ -2265,6 +2276,7 @@
           <w:p>
             <w:pPr>
               <w:pStyle w:val="TableText"/>
+              <w:jc w:val="center"/>
               <w:widowControl/>
             </w:pPr>
             <w:r>
@@ -2370,6 +2382,7 @@
           <w:p>
             <w:pPr>
               <w:pStyle w:val="TableText"/>
+              <w:jc w:val="center"/>
               <w:widowControl/>
             </w:pPr>
             <w:r>
@@ -2491,6 +2504,7 @@
           <w:p>
             <w:pPr>
               <w:pStyle w:val="TableText"/>
+              <w:jc w:val="center"/>
               <w:widowControl/>
             </w:pPr>
             <w:r>
@@ -2499,7 +2513,7 @@
                 <w:b/>
                 <w:bCs/>
               </w:rPr>
-              <w:t>Baseline / closed upon explicit owner acceptance/merge</w:t>
+              <w:t>Baseline / closed</w:t>
             </w:r>
           </w:p>
         </w:tc>
@@ -2596,6 +2610,7 @@
           <w:p>
             <w:pPr>
               <w:pStyle w:val="TableText"/>
+              <w:jc w:val="center"/>
               <w:widowControl/>
             </w:pPr>
             <w:r>
@@ -2701,6 +2716,7 @@
           <w:p>
             <w:pPr>
               <w:pStyle w:val="TableText"/>
+              <w:jc w:val="center"/>
               <w:widowControl/>
             </w:pPr>
             <w:r>
@@ -2806,6 +2822,7 @@
           <w:p>
             <w:pPr>
               <w:pStyle w:val="TableText"/>
+              <w:jc w:val="center"/>
               <w:widowControl/>
             </w:pPr>
             <w:r>
@@ -2927,6 +2944,7 @@
           <w:p>
             <w:pPr>
               <w:pStyle w:val="TableText"/>
+              <w:jc w:val="center"/>
               <w:widowControl/>
             </w:pPr>
             <w:r>

</xml_diff>

<commit_message>
Isolate normal storefront generation composition (#256)
* Isolate normal storefront generation composition

* Align current status projections with AR-04 acceptance

* test: prepare AR-04 routes before Studio browser journeys
</commit_message>
<xml_diff>
--- a/docs/VESKIFY_DEVELOPMENT_DELIVERY_TRACKER_v1.3.0.docx
+++ b/docs/VESKIFY_DEVELOPMENT_DELIVERY_TRACKER_v1.3.0.docx
@@ -51,7 +51,7 @@
         <w:rPr>
           <w:rFonts w:ascii="Calibri" w:hAnsi="Calibri" w:cs="Calibri"/>
         </w:rPr>
-        <w:t>Effective upon independently verified AR-02M acceptance/merge: AR-02 and AR-02A through AR-02M Baseline / closed; AR-03 and AR-03A through AR-03E remain closed; AR-04/AR-05 eligible / unstarted after that merge; AR-06 depends on AR-05; AR-23 eligible / unstarted; BATCH-10 complete after M merge and safe closeout; no next task</w:t>
+        <w:t>AR-02 and AR-02A through AR-02M Baseline / closed; AR-03 and AR-03A through AR-03E remain closed; AR-04 Baseline / closed effective upon accepted merge; AR-05 eligible / unstarted; AR-06 depends on AR-05; AR-23 eligible / unstarted; BATCH-10 complete; BATCH-11 complete upon AR-04 acceptance/merge and safe closeout; no next task</w:t>
       </w:r>
     </w:p>
     <w:p>
@@ -118,7 +118,7 @@
           <w:b/>
           <w:bCs/>
         </w:rPr>
-        <w:t>Candidate status effective upon explicit owner acceptance/merge of AR-02M:</w:t>
+        <w:t>Candidate status effective upon explicit owner acceptance/merge of AR-04:</w:t>
       </w:r>
       <w:r>
         <w:rPr>
@@ -342,7 +342,7 @@
           <w:b/>
           <w:bCs/>
         </w:rPr>
-        <w:t>Baseline / closed upon explicit owner acceptance/merge.</w:t>
+        <w:t>Baseline / closed.</w:t>
       </w:r>
       <w:r>
         <w:rPr>
@@ -356,26 +356,26 @@
           <w:b/>
           <w:bCs/>
         </w:rPr>
-        <w:t>Baseline / closed upon explicit owner acceptance/merge</w:t>
-      </w:r>
-      <w:r>
-        <w:rPr>
-          <w:rFonts w:ascii="Calibri" w:hAnsi="Calibri" w:cs="Calibri"/>
-        </w:rPr>
-        <w:t xml:space="preserve">; complete original acceptance is mapped in AR_02_BOUNDARY_ACCEPTANCE.md. AR-04/AR-05 are eligible / unstarted after that merge; AR-06 remains dependent on AR-05. AR-03 is </w:t>
-      </w:r>
-      <w:r>
-        <w:rPr>
-          <w:rFonts w:ascii="Calibri" w:hAnsi="Calibri" w:cs="Calibri"/>
-          <w:b/>
-          <w:bCs/>
-        </w:rPr>
         <w:t>Baseline / closed</w:t>
       </w:r>
       <w:r>
         <w:rPr>
           <w:rFonts w:ascii="Calibri" w:hAnsi="Calibri" w:cs="Calibri"/>
         </w:rPr>
+        <w:t xml:space="preserve">; complete original acceptance is mapped in AR_02_BOUNDARY_ACCEPTANCE.md. AR-04 is Baseline / closed effective upon accepted merge. AR-05 is eligible / unstarted; AR-06 remains dependent on AR-05. AR-03 is </w:t>
+      </w:r>
+      <w:r>
+        <w:rPr>
+          <w:rFonts w:ascii="Calibri" w:hAnsi="Calibri" w:cs="Calibri"/>
+          <w:b/>
+          <w:bCs/>
+        </w:rPr>
+        <w:t>Baseline / closed</w:t>
+      </w:r>
+      <w:r>
+        <w:rPr>
+          <w:rFonts w:ascii="Calibri" w:hAnsi="Calibri" w:cs="Calibri"/>
+        </w:rPr>
         <w:t xml:space="preserve">; original same-input characterization and separate ownership are verified. AR-03A is </w:t>
       </w:r>
       <w:r>
@@ -460,7 +460,7 @@
         <w:rPr>
           <w:rFonts w:ascii="Calibri" w:hAnsi="Calibri" w:cs="Calibri"/>
         </w:rPr>
-        <w:t xml:space="preserve">. AR-23 depends on AR-01 and is not serialized behind visual work. BATCH-03 is complete. BATCH-04 is complete. BATCH-05 is complete. BATCH-06 is complete. BATCH-07 is complete. BATCH-08 is complete. BATCH-09 is complete. BATCH-10 is complete upon AR-02M acceptance/merge and safe closeout. No next reset task is selected. No third task is authorized. This tracker owns current status; the roadmap owns dependency order. Retained B01 exact-next, fixed-two-call/mandatory-three-concept, transient-only, and 73-child future-sequence statements are </w:t>
+        <w:t xml:space="preserve">. AR-23 depends on AR-01 and is not serialized behind visual work. BATCH-03 is complete. BATCH-04 is complete. BATCH-05 is complete. BATCH-06 is complete. BATCH-07 is complete. BATCH-08 is complete. BATCH-09 is complete. BATCH-10 is complete. BATCH-11 is complete upon AR-04 acceptance/merge and safe closeout. No next reset task is selected. No third task is authorized. This tracker owns current status; the roadmap owns dependency order. Retained B01 exact-next, fixed-two-call/mandatory-three-concept, transient-only, and 73-child future-sequence statements are </w:t>
       </w:r>
       <w:r>
         <w:rPr>
@@ -997,7 +997,7 @@
               <w:rPr>
                 <w:rFonts w:ascii="Calibri" w:hAnsi="Calibri" w:cs="Calibri"/>
               </w:rPr>
-              <w:t>Status; M conditional on independent acceptance/merge</w:t>
+              <w:t>Status</w:t>
             </w:r>
           </w:p>
         </w:tc>
@@ -1094,6 +1094,7 @@
           <w:p>
             <w:pPr>
               <w:pStyle w:val="TableText"/>
+              <w:jc w:val="center"/>
               <w:widowControl/>
             </w:pPr>
             <w:r>
@@ -1199,6 +1200,7 @@
           <w:p>
             <w:pPr>
               <w:pStyle w:val="TableText"/>
+              <w:jc w:val="center"/>
               <w:widowControl/>
             </w:pPr>
             <w:r>
@@ -1304,6 +1306,7 @@
           <w:p>
             <w:pPr>
               <w:pStyle w:val="TableText"/>
+              <w:jc w:val="center"/>
               <w:widowControl/>
             </w:pPr>
             <w:r>
@@ -1409,6 +1412,7 @@
           <w:p>
             <w:pPr>
               <w:pStyle w:val="TableText"/>
+              <w:jc w:val="center"/>
               <w:widowControl/>
             </w:pPr>
             <w:r>
@@ -1514,6 +1518,7 @@
           <w:p>
             <w:pPr>
               <w:pStyle w:val="TableText"/>
+              <w:jc w:val="center"/>
               <w:widowControl/>
             </w:pPr>
             <w:r>
@@ -1619,6 +1624,7 @@
           <w:p>
             <w:pPr>
               <w:pStyle w:val="TableText"/>
+              <w:jc w:val="center"/>
               <w:widowControl/>
             </w:pPr>
             <w:r>
@@ -1724,6 +1730,7 @@
           <w:p>
             <w:pPr>
               <w:pStyle w:val="TableText"/>
+              <w:jc w:val="center"/>
               <w:widowControl/>
             </w:pPr>
             <w:r>
@@ -1829,6 +1836,7 @@
           <w:p>
             <w:pPr>
               <w:pStyle w:val="TableText"/>
+              <w:jc w:val="center"/>
               <w:widowControl/>
             </w:pPr>
             <w:r>
@@ -1934,6 +1942,7 @@
           <w:p>
             <w:pPr>
               <w:pStyle w:val="TableText"/>
+              <w:jc w:val="center"/>
               <w:widowControl/>
             </w:pPr>
             <w:r>
@@ -2055,6 +2064,7 @@
           <w:p>
             <w:pPr>
               <w:pStyle w:val="TableText"/>
+              <w:jc w:val="center"/>
               <w:widowControl/>
             </w:pPr>
             <w:r>
@@ -2160,6 +2170,7 @@
           <w:p>
             <w:pPr>
               <w:pStyle w:val="TableText"/>
+              <w:jc w:val="center"/>
               <w:widowControl/>
             </w:pPr>
             <w:r>
@@ -2265,6 +2276,7 @@
           <w:p>
             <w:pPr>
               <w:pStyle w:val="TableText"/>
+              <w:jc w:val="center"/>
               <w:widowControl/>
             </w:pPr>
             <w:r>
@@ -2370,6 +2382,7 @@
           <w:p>
             <w:pPr>
               <w:pStyle w:val="TableText"/>
+              <w:jc w:val="center"/>
               <w:widowControl/>
             </w:pPr>
             <w:r>
@@ -2491,6 +2504,7 @@
           <w:p>
             <w:pPr>
               <w:pStyle w:val="TableText"/>
+              <w:jc w:val="center"/>
               <w:widowControl/>
             </w:pPr>
             <w:r>
@@ -2499,7 +2513,7 @@
                 <w:b/>
                 <w:bCs/>
               </w:rPr>
-              <w:t>Baseline / closed upon explicit owner acceptance/merge</w:t>
+              <w:t>Baseline / closed</w:t>
             </w:r>
           </w:p>
         </w:tc>
@@ -2596,6 +2610,7 @@
           <w:p>
             <w:pPr>
               <w:pStyle w:val="TableText"/>
+              <w:jc w:val="center"/>
               <w:widowControl/>
             </w:pPr>
             <w:r>
@@ -2701,6 +2716,7 @@
           <w:p>
             <w:pPr>
               <w:pStyle w:val="TableText"/>
+              <w:jc w:val="center"/>
               <w:widowControl/>
             </w:pPr>
             <w:r>
@@ -2806,6 +2822,7 @@
           <w:p>
             <w:pPr>
               <w:pStyle w:val="TableText"/>
+              <w:jc w:val="center"/>
               <w:widowControl/>
             </w:pPr>
             <w:r>
@@ -2927,6 +2944,7 @@
           <w:p>
             <w:pPr>
               <w:pStyle w:val="TableText"/>
+              <w:jc w:val="center"/>
               <w:widowControl/>
             </w:pPr>
             <w:r>

</xml_diff>

<commit_message>
feat: validate compiled PageBlueprint composition authority
</commit_message>
<xml_diff>
--- a/docs/VESKIFY_DEVELOPMENT_DELIVERY_TRACKER_v1.3.0.docx
+++ b/docs/VESKIFY_DEVELOPMENT_DELIVERY_TRACKER_v1.3.0.docx
@@ -51,7 +51,7 @@
         <w:rPr>
           <w:rFonts w:ascii="Calibri" w:hAnsi="Calibri" w:cs="Calibri"/>
         </w:rPr>
-        <w:t>AR-02 and AR-02A through AR-02M Baseline / closed; AR-03 and AR-03A through AR-03E remain closed; AR-04 Baseline / closed effective upon accepted merge; AR-05 eligible / unstarted; AR-06 depends on AR-05; AR-23 eligible / unstarted; BATCH-10 complete; BATCH-11 complete upon AR-04 acceptance/merge and safe closeout; no next task</w:t>
+        <w:t>AR-02 and AR-02A through AR-02M Baseline / closed; AR-03 and AR-03A through AR-03E remain closed; AR-04 Baseline / closed; AR-05 Partial pending AR-05B nesting/version dispatch; AR-05A Baseline / closed effective upon accepted merge; AR-06 depends on AR-05 and owns positive dynamic composition proof before enablement; AR-23 eligible / unstarted; BATCH-10 complete; BATCH-11 complete; BATCH-12 complete upon AR-05A acceptance/merge and safe closeout; no next task</w:t>
       </w:r>
     </w:p>
     <w:p>
@@ -118,7 +118,7 @@
           <w:b/>
           <w:bCs/>
         </w:rPr>
-        <w:t>Candidate status effective upon explicit owner acceptance/merge of AR-04:</w:t>
+        <w:t>Candidate status effective upon explicit owner acceptance/merge of AR-05A:</w:t>
       </w:r>
       <w:r>
         <w:rPr>
@@ -362,7 +362,7 @@
         <w:rPr>
           <w:rFonts w:ascii="Calibri" w:hAnsi="Calibri" w:cs="Calibri"/>
         </w:rPr>
-        <w:t xml:space="preserve">; complete original acceptance is mapped in AR_02_BOUNDARY_ACCEPTANCE.md. AR-04 is Baseline / closed effective upon accepted merge. AR-05 is eligible / unstarted; AR-06 remains dependent on AR-05. AR-03 is </w:t>
+        <w:t xml:space="preserve">; complete original acceptance is mapped in AR_02_BOUNDARY_ACCEPTANCE.md. AR-04 is Baseline / closed. AR-05 is Partial; canonical nesting/version dispatch remains AR-05B work. AR-05A is Baseline / closed effective upon accepted merge. AR-06 remains dependent on AR-05; positive collection/search and PDP composition must be proven by its executable commerce support before enablement. AR-03 is </w:t>
       </w:r>
       <w:r>
         <w:rPr>
@@ -460,7 +460,7 @@
         <w:rPr>
           <w:rFonts w:ascii="Calibri" w:hAnsi="Calibri" w:cs="Calibri"/>
         </w:rPr>
-        <w:t xml:space="preserve">. AR-23 depends on AR-01 and is not serialized behind visual work. BATCH-03 is complete. BATCH-04 is complete. BATCH-05 is complete. BATCH-06 is complete. BATCH-07 is complete. BATCH-08 is complete. BATCH-09 is complete. BATCH-10 is complete. BATCH-11 is complete upon AR-04 acceptance/merge and safe closeout. No next reset task is selected. No third task is authorized. This tracker owns current status; the roadmap owns dependency order. Retained B01 exact-next, fixed-two-call/mandatory-three-concept, transient-only, and 73-child future-sequence statements are </w:t>
+        <w:t xml:space="preserve">. AR-23 depends on AR-01 and is not serialized behind visual work. BATCH-03 is complete. BATCH-04 is complete. BATCH-05 is complete. BATCH-06 is complete. BATCH-07 is complete. BATCH-08 is complete. BATCH-09 is complete. BATCH-10 is complete. BATCH-11 is complete. BATCH-12 is complete upon AR-05A acceptance/merge and safe closeout. No next reset task is selected. No third task is authorized. This tracker owns current status; the roadmap owns dependency order. Retained B01 exact-next, fixed-two-call/mandatory-three-concept, transient-only, and 73-child future-sequence statements are </w:t>
       </w:r>
       <w:r>
         <w:rPr>
@@ -475,6 +475,50 @@
           <w:rFonts w:ascii="Calibri" w:hAnsi="Calibri" w:cs="Calibri"/>
         </w:rPr>
         <w:t xml:space="preserve"> superseded by the incorporated addendum; accepted history, functional requirements, and current capability truth remain binding.</w:t>
+      </w:r>
+    </w:p>
+    <w:p>
+      <w:pPr>
+        <w:pStyle w:val="Normal"/>
+        <w:widowControl/>
+      </w:pPr>
+      <w:r>
+        <w:rPr>
+          <w:rFonts w:ascii="Calibri" w:hAnsi="Calibri" w:cs="Calibri"/>
+        </w:rPr>
+        <w:t xml:space="preserve">AR-05 decomposition: </w:t>
+      </w:r>
+      <w:hyperlink r:id="rIdHyperlink1" w:history="1">
+        <w:r>
+          <w:rPr>
+            <w:rFonts w:ascii="Calibri" w:hAnsi="Calibri" w:cs="Calibri"/>
+            <w:color w:val="2E74B5"/>
+            <w:u w:val="single"/>
+          </w:rPr>
+          <w:t>AR-05A design</w:t>
+        </w:r>
+      </w:hyperlink>
+      <w:r>
+        <w:rPr>
+          <w:rFonts w:ascii="Calibri" w:hAnsi="Calibri" w:cs="Calibri"/>
+        </w:rPr>
+        <w:t xml:space="preserve"> and </w:t>
+      </w:r>
+      <w:hyperlink r:id="rIdHyperlink2" w:history="1">
+        <w:r>
+          <w:rPr>
+            <w:rFonts w:ascii="Calibri" w:hAnsi="Calibri" w:cs="Calibri"/>
+            <w:color w:val="2E74B5"/>
+            <w:u w:val="single"/>
+          </w:rPr>
+          <w:t>implementation evidence</w:t>
+        </w:r>
+      </w:hyperlink>
+      <w:r>
+        <w:rPr>
+          <w:rFonts w:ascii="Calibri" w:hAnsi="Calibri" w:cs="Calibri"/>
+        </w:rPr>
+        <w:t xml:space="preserve"> cover the strict compiled value, positive static binding and specific rejection of current indivisible dynamic inventories. T01/T02 snapshot nesting, explicit version dispatch and combined fingerprint participation remain AR-05B obligations. AR-06 executable commerce support, or its explicitly scoped child, must prove positive collection/search and PDP composition before composed dynamic templates are enabled. No dynamic or rendered-fidelity proof is claimed by A, and no successor implementation is authorized.</w:t>
       </w:r>
     </w:p>
     <w:p>
@@ -772,7 +816,7 @@
               <w:pStyle w:val="TableText"/>
               <w:widowControl/>
             </w:pPr>
-            <w:hyperlink r:id="rIdHyperlink1" w:history="1">
+            <w:hyperlink r:id="rIdHyperlink3" w:history="1">
               <w:r>
                 <w:rPr>
                   <w:rFonts w:ascii="Calibri" w:hAnsi="Calibri" w:cs="Calibri"/>
@@ -817,7 +861,7 @@
               <w:pStyle w:val="TableText"/>
               <w:widowControl/>
             </w:pPr>
-            <w:hyperlink r:id="rIdHyperlink2" w:history="1">
+            <w:hyperlink r:id="rIdHyperlink4" w:history="1">
               <w:r>
                 <w:rPr>
                   <w:rFonts w:ascii="Calibri" w:hAnsi="Calibri" w:cs="Calibri"/>
@@ -1058,112 +1102,6 @@
               </w:rPr>
               <w:t xml:space="preserve">Separate live renderer observation and composition; </w:t>
             </w:r>
-            <w:hyperlink r:id="rIdHyperlink3" w:history="1">
-              <w:r>
-                <w:rPr>
-                  <w:rFonts w:ascii="Calibri" w:hAnsi="Calibri" w:cs="Calibri"/>
-                  <w:color w:val="2E74B5"/>
-                  <w:u w:val="single"/>
-                </w:rPr>
-                <w:t>contract</w:t>
-              </w:r>
-            </w:hyperlink>
-            <w:r>
-              <w:rPr>
-                <w:rFonts w:ascii="Calibri" w:hAnsi="Calibri" w:cs="Calibri"/>
-              </w:rPr>
-              <w:t xml:space="preserve">, </w:t>
-            </w:r>
-            <w:hyperlink r:id="rIdHyperlink4" w:history="1">
-              <w:r>
-                <w:rPr>
-                  <w:rFonts w:ascii="Calibri" w:hAnsi="Calibri" w:cs="Calibri"/>
-                  <w:color w:val="2E74B5"/>
-                  <w:u w:val="single"/>
-                </w:rPr>
-                <w:t>report</w:t>
-              </w:r>
-            </w:hyperlink>
-          </w:p>
-        </w:tc>
-        <w:tc>
-          <w:tcPr>
-            <w:tcW w:w="8460" w:type="dxa"/>
-            <w:vAlign w:val="center"/>
-          </w:tcPr>
-          <w:p>
-            <w:pPr>
-              <w:pStyle w:val="TableText"/>
-              <w:jc w:val="center"/>
-              <w:widowControl/>
-            </w:pPr>
-            <w:r>
-              <w:rPr>
-                <w:rFonts w:ascii="Calibri" w:hAnsi="Calibri" w:cs="Calibri"/>
-                <w:b/>
-                <w:bCs/>
-              </w:rPr>
-              <w:t>Baseline / closed</w:t>
-            </w:r>
-          </w:p>
-        </w:tc>
-      </w:tr>
-      <w:tr>
-        <w:trPr>
-          <w:cantSplit/>
-        </w:trPr>
-        <w:tc>
-          <w:tcPr>
-            <w:tcW w:w="1000" w:type="dxa"/>
-            <w:vAlign w:val="center"/>
-          </w:tcPr>
-          <w:p>
-            <w:pPr>
-              <w:pStyle w:val="TableText"/>
-              <w:widowControl/>
-            </w:pPr>
-            <w:r>
-              <w:rPr>
-                <w:rFonts w:ascii="Calibri" w:hAnsi="Calibri" w:cs="Calibri"/>
-              </w:rPr>
-              <w:t>AR-02B</w:t>
-            </w:r>
-          </w:p>
-        </w:tc>
-        <w:tc>
-          <w:tcPr>
-            <w:tcW w:w="1500" w:type="dxa"/>
-            <w:vAlign w:val="center"/>
-          </w:tcPr>
-          <w:p>
-            <w:pPr>
-              <w:pStyle w:val="TableText"/>
-              <w:widowControl/>
-            </w:pPr>
-            <w:r>
-              <w:rPr>
-                <w:rFonts w:ascii="Calibri" w:hAnsi="Calibri" w:cs="Calibri"/>
-              </w:rPr>
-              <w:t>AR-02</w:t>
-            </w:r>
-          </w:p>
-        </w:tc>
-        <w:tc>
-          <w:tcPr>
-            <w:tcW w:w="2000" w:type="dxa"/>
-            <w:vAlign w:val="center"/>
-          </w:tcPr>
-          <w:p>
-            <w:pPr>
-              <w:pStyle w:val="TableText"/>
-              <w:widowControl/>
-            </w:pPr>
-            <w:r>
-              <w:rPr>
-                <w:rFonts w:ascii="Calibri" w:hAnsi="Calibri" w:cs="Calibri"/>
-              </w:rPr>
-              <w:t xml:space="preserve">Extract renderer-free deterministic conformance evaluation; </w:t>
-            </w:r>
             <w:hyperlink r:id="rIdHyperlink5" w:history="1">
               <w:r>
                 <w:rPr>
@@ -1232,7 +1170,7 @@
               <w:rPr>
                 <w:rFonts w:ascii="Calibri" w:hAnsi="Calibri" w:cs="Calibri"/>
               </w:rPr>
-              <w:t>AR-03A</w:t>
+              <w:t>AR-02B</w:t>
             </w:r>
           </w:p>
         </w:tc>
@@ -1250,7 +1188,7 @@
               <w:rPr>
                 <w:rFonts w:ascii="Calibri" w:hAnsi="Calibri" w:cs="Calibri"/>
               </w:rPr>
-              <w:t>AR-03</w:t>
+              <w:t>AR-02</w:t>
             </w:r>
           </w:p>
         </w:tc>
@@ -1268,7 +1206,7 @@
               <w:rPr>
                 <w:rFonts w:ascii="Calibri" w:hAnsi="Calibri" w:cs="Calibri"/>
               </w:rPr>
-              <w:t xml:space="preserve">Extract route matching and errors; </w:t>
+              <w:t xml:space="preserve">Extract renderer-free deterministic conformance evaluation; </w:t>
             </w:r>
             <w:hyperlink r:id="rIdHyperlink7" w:history="1">
               <w:r>
@@ -1338,7 +1276,7 @@
               <w:rPr>
                 <w:rFonts w:ascii="Calibri" w:hAnsi="Calibri" w:cs="Calibri"/>
               </w:rPr>
-              <w:t>AR-02C</w:t>
+              <w:t>AR-03A</w:t>
             </w:r>
           </w:p>
         </w:tc>
@@ -1356,7 +1294,7 @@
               <w:rPr>
                 <w:rFonts w:ascii="Calibri" w:hAnsi="Calibri" w:cs="Calibri"/>
               </w:rPr>
-              <w:t>AR-02</w:t>
+              <w:t>AR-03</w:t>
             </w:r>
           </w:p>
         </w:tc>
@@ -1374,7 +1312,7 @@
               <w:rPr>
                 <w:rFonts w:ascii="Calibri" w:hAnsi="Calibri" w:cs="Calibri"/>
               </w:rPr>
-              <w:t xml:space="preserve">Extract utility metadata and remove the supported-vocabulary renderer edge; </w:t>
+              <w:t xml:space="preserve">Extract route matching and errors; </w:t>
             </w:r>
             <w:hyperlink r:id="rIdHyperlink9" w:history="1">
               <w:r>
@@ -1444,7 +1382,7 @@
               <w:rPr>
                 <w:rFonts w:ascii="Calibri" w:hAnsi="Calibri" w:cs="Calibri"/>
               </w:rPr>
-              <w:t>AR-02D</w:t>
+              <w:t>AR-02C</w:t>
             </w:r>
           </w:p>
         </w:tc>
@@ -1480,7 +1418,7 @@
               <w:rPr>
                 <w:rFonts w:ascii="Calibri" w:hAnsi="Calibri" w:cs="Calibri"/>
               </w:rPr>
-              <w:t xml:space="preserve">Extract homepage and hero renderer-free metadata; </w:t>
+              <w:t xml:space="preserve">Extract utility metadata and remove the supported-vocabulary renderer edge; </w:t>
             </w:r>
             <w:hyperlink r:id="rIdHyperlink11" w:history="1">
               <w:r>
@@ -1550,7 +1488,7 @@
               <w:rPr>
                 <w:rFonts w:ascii="Calibri" w:hAnsi="Calibri" w:cs="Calibri"/>
               </w:rPr>
-              <w:t>AR-02E</w:t>
+              <w:t>AR-02D</w:t>
             </w:r>
           </w:p>
         </w:tc>
@@ -1586,7 +1524,7 @@
               <w:rPr>
                 <w:rFonts w:ascii="Calibri" w:hAnsi="Calibri" w:cs="Calibri"/>
               </w:rPr>
-              <w:t xml:space="preserve">Extract collection and product renderer-free metadata; </w:t>
+              <w:t xml:space="preserve">Extract homepage and hero renderer-free metadata; </w:t>
             </w:r>
             <w:hyperlink r:id="rIdHyperlink13" w:history="1">
               <w:r>
@@ -1656,7 +1594,7 @@
               <w:rPr>
                 <w:rFonts w:ascii="Calibri" w:hAnsi="Calibri" w:cs="Calibri"/>
               </w:rPr>
-              <w:t>AR-02F</w:t>
+              <w:t>AR-02E</w:t>
             </w:r>
           </w:p>
         </w:tc>
@@ -1692,7 +1630,7 @@
               <w:rPr>
                 <w:rFonts w:ascii="Calibri" w:hAnsi="Calibri" w:cs="Calibri"/>
               </w:rPr>
-              <w:t xml:space="preserve">Adapt V2 definitions from shared renderer-free metadata; </w:t>
+              <w:t xml:space="preserve">Extract collection and product renderer-free metadata; </w:t>
             </w:r>
             <w:hyperlink r:id="rIdHyperlink15" w:history="1">
               <w:r>
@@ -1762,7 +1700,7 @@
               <w:rPr>
                 <w:rFonts w:ascii="Calibri" w:hAnsi="Calibri" w:cs="Calibri"/>
               </w:rPr>
-              <w:t>AR-02G</w:t>
+              <w:t>AR-02F</w:t>
             </w:r>
           </w:p>
         </w:tc>
@@ -1798,7 +1736,7 @@
               <w:rPr>
                 <w:rFonts w:ascii="Calibri" w:hAnsi="Calibri" w:cs="Calibri"/>
               </w:rPr>
-              <w:t xml:space="preserve">Renderer-free template capability boundary and explicit utility historical-source transition; </w:t>
+              <w:t xml:space="preserve">Adapt V2 definitions from shared renderer-free metadata; </w:t>
             </w:r>
             <w:hyperlink r:id="rIdHyperlink17" w:history="1">
               <w:r>
@@ -1868,7 +1806,7 @@
               <w:rPr>
                 <w:rFonts w:ascii="Calibri" w:hAnsi="Calibri" w:cs="Calibri"/>
               </w:rPr>
-              <w:t>AR-02H</w:t>
+              <w:t>AR-02G</w:t>
             </w:r>
           </w:p>
         </w:tc>
@@ -1904,7 +1842,7 @@
               <w:rPr>
                 <w:rFonts w:ascii="Calibri" w:hAnsi="Calibri" w:cs="Calibri"/>
               </w:rPr>
-              <w:t xml:space="preserve">Semantic request boundary and explicit direction historical-source transition; </w:t>
+              <w:t xml:space="preserve">Renderer-free template capability boundary and explicit utility historical-source transition; </w:t>
             </w:r>
             <w:hyperlink r:id="rIdHyperlink19" w:history="1">
               <w:r>
@@ -1974,7 +1912,7 @@
               <w:rPr>
                 <w:rFonts w:ascii="Calibri" w:hAnsi="Calibri" w:cs="Calibri"/>
               </w:rPr>
-              <w:t>AR-02I</w:t>
+              <w:t>AR-02H</w:t>
             </w:r>
           </w:p>
         </w:tc>
@@ -2010,7 +1948,7 @@
               <w:rPr>
                 <w:rFonts w:ascii="Calibri" w:hAnsi="Calibri" w:cs="Calibri"/>
               </w:rPr>
-              <w:t xml:space="preserve">Renderer-free existing planner, recipe and provider metadata consumption; </w:t>
+              <w:t xml:space="preserve">Semantic request boundary and explicit direction historical-source transition; </w:t>
             </w:r>
             <w:hyperlink r:id="rIdHyperlink21" w:history="1">
               <w:r>
@@ -2038,13 +1976,119 @@
                 <w:t>report</w:t>
               </w:r>
             </w:hyperlink>
+          </w:p>
+        </w:tc>
+        <w:tc>
+          <w:tcPr>
+            <w:tcW w:w="8460" w:type="dxa"/>
+            <w:vAlign w:val="center"/>
+          </w:tcPr>
+          <w:p>
+            <w:pPr>
+              <w:pStyle w:val="TableText"/>
+              <w:jc w:val="center"/>
+              <w:widowControl/>
+            </w:pPr>
+            <w:r>
+              <w:rPr>
+                <w:rFonts w:ascii="Calibri" w:hAnsi="Calibri" w:cs="Calibri"/>
+                <w:b/>
+                <w:bCs/>
+              </w:rPr>
+              <w:t>Baseline / closed</w:t>
+            </w:r>
+          </w:p>
+        </w:tc>
+      </w:tr>
+      <w:tr>
+        <w:trPr>
+          <w:cantSplit/>
+        </w:trPr>
+        <w:tc>
+          <w:tcPr>
+            <w:tcW w:w="1000" w:type="dxa"/>
+            <w:vAlign w:val="center"/>
+          </w:tcPr>
+          <w:p>
+            <w:pPr>
+              <w:pStyle w:val="TableText"/>
+              <w:widowControl/>
+            </w:pPr>
+            <w:r>
+              <w:rPr>
+                <w:rFonts w:ascii="Calibri" w:hAnsi="Calibri" w:cs="Calibri"/>
+              </w:rPr>
+              <w:t>AR-02I</w:t>
+            </w:r>
+          </w:p>
+        </w:tc>
+        <w:tc>
+          <w:tcPr>
+            <w:tcW w:w="1500" w:type="dxa"/>
+            <w:vAlign w:val="center"/>
+          </w:tcPr>
+          <w:p>
+            <w:pPr>
+              <w:pStyle w:val="TableText"/>
+              <w:widowControl/>
+            </w:pPr>
+            <w:r>
+              <w:rPr>
+                <w:rFonts w:ascii="Calibri" w:hAnsi="Calibri" w:cs="Calibri"/>
+              </w:rPr>
+              <w:t>AR-02</w:t>
+            </w:r>
+          </w:p>
+        </w:tc>
+        <w:tc>
+          <w:tcPr>
+            <w:tcW w:w="2000" w:type="dxa"/>
+            <w:vAlign w:val="center"/>
+          </w:tcPr>
+          <w:p>
+            <w:pPr>
+              <w:pStyle w:val="TableText"/>
+              <w:widowControl/>
+            </w:pPr>
+            <w:r>
+              <w:rPr>
+                <w:rFonts w:ascii="Calibri" w:hAnsi="Calibri" w:cs="Calibri"/>
+              </w:rPr>
+              <w:t xml:space="preserve">Renderer-free existing planner, recipe and provider metadata consumption; </w:t>
+            </w:r>
+            <w:hyperlink r:id="rIdHyperlink23" w:history="1">
+              <w:r>
+                <w:rPr>
+                  <w:rFonts w:ascii="Calibri" w:hAnsi="Calibri" w:cs="Calibri"/>
+                  <w:color w:val="2E74B5"/>
+                  <w:u w:val="single"/>
+                </w:rPr>
+                <w:t>contract</w:t>
+              </w:r>
+            </w:hyperlink>
             <w:r>
               <w:rPr>
                 <w:rFonts w:ascii="Calibri" w:hAnsi="Calibri" w:cs="Calibri"/>
               </w:rPr>
               <w:t xml:space="preserve">, </w:t>
             </w:r>
-            <w:hyperlink r:id="rIdHyperlink23" w:history="1">
+            <w:hyperlink r:id="rIdHyperlink24" w:history="1">
+              <w:r>
+                <w:rPr>
+                  <w:rFonts w:ascii="Calibri" w:hAnsi="Calibri" w:cs="Calibri"/>
+                  <w:color w:val="2E74B5"/>
+                  <w:u w:val="single"/>
+                </w:rPr>
+                <w:t>report</w:t>
+              </w:r>
+            </w:hyperlink>
+            <w:r>
+              <w:rPr>
+                <w:rFonts w:ascii="Calibri" w:hAnsi="Calibri" w:cs="Calibri"/>
+              </w:rPr>
+              <w:t xml:space="preserve">, </w:t>
+            </w:r>
+            <w:hyperlink r:id="rIdHyperlink25" w:history="1">
               <w:r>
                 <w:rPr>
                   <w:rFonts w:ascii="Calibri" w:hAnsi="Calibri" w:cs="Calibri"/>
@@ -2133,112 +2177,6 @@
                 <w:rFonts w:ascii="Calibri" w:hAnsi="Calibri" w:cs="Calibri"/>
               </w:rPr>
               <w:t xml:space="preserve">Renderer-free actual provider descriptions and operation schemas; </w:t>
-            </w:r>
-            <w:hyperlink r:id="rIdHyperlink24" w:history="1">
-              <w:r>
-                <w:rPr>
-                  <w:rFonts w:ascii="Calibri" w:hAnsi="Calibri" w:cs="Calibri"/>
-                  <w:color w:val="2E74B5"/>
-                  <w:u w:val="single"/>
-                </w:rPr>
-                <w:t>contract</w:t>
-              </w:r>
-            </w:hyperlink>
-            <w:r>
-              <w:rPr>
-                <w:rFonts w:ascii="Calibri" w:hAnsi="Calibri" w:cs="Calibri"/>
-              </w:rPr>
-              <w:t xml:space="preserve">, </w:t>
-            </w:r>
-            <w:hyperlink r:id="rIdHyperlink25" w:history="1">
-              <w:r>
-                <w:rPr>
-                  <w:rFonts w:ascii="Calibri" w:hAnsi="Calibri" w:cs="Calibri"/>
-                  <w:color w:val="2E74B5"/>
-                  <w:u w:val="single"/>
-                </w:rPr>
-                <w:t>report</w:t>
-              </w:r>
-            </w:hyperlink>
-          </w:p>
-        </w:tc>
-        <w:tc>
-          <w:tcPr>
-            <w:tcW w:w="8460" w:type="dxa"/>
-            <w:vAlign w:val="center"/>
-          </w:tcPr>
-          <w:p>
-            <w:pPr>
-              <w:pStyle w:val="TableText"/>
-              <w:jc w:val="center"/>
-              <w:widowControl/>
-            </w:pPr>
-            <w:r>
-              <w:rPr>
-                <w:rFonts w:ascii="Calibri" w:hAnsi="Calibri" w:cs="Calibri"/>
-                <w:b/>
-                <w:bCs/>
-              </w:rPr>
-              <w:t>Baseline / closed</w:t>
-            </w:r>
-          </w:p>
-        </w:tc>
-      </w:tr>
-      <w:tr>
-        <w:trPr>
-          <w:cantSplit/>
-        </w:trPr>
-        <w:tc>
-          <w:tcPr>
-            <w:tcW w:w="1000" w:type="dxa"/>
-            <w:vAlign w:val="center"/>
-          </w:tcPr>
-          <w:p>
-            <w:pPr>
-              <w:pStyle w:val="TableText"/>
-              <w:widowControl/>
-            </w:pPr>
-            <w:r>
-              <w:rPr>
-                <w:rFonts w:ascii="Calibri" w:hAnsi="Calibri" w:cs="Calibri"/>
-              </w:rPr>
-              <w:t>AR-02K</w:t>
-            </w:r>
-          </w:p>
-        </w:tc>
-        <w:tc>
-          <w:tcPr>
-            <w:tcW w:w="1500" w:type="dxa"/>
-            <w:vAlign w:val="center"/>
-          </w:tcPr>
-          <w:p>
-            <w:pPr>
-              <w:pStyle w:val="TableText"/>
-              <w:widowControl/>
-            </w:pPr>
-            <w:r>
-              <w:rPr>
-                <w:rFonts w:ascii="Calibri" w:hAnsi="Calibri" w:cs="Calibri"/>
-              </w:rPr>
-              <w:t>AR-02</w:t>
-            </w:r>
-          </w:p>
-        </w:tc>
-        <w:tc>
-          <w:tcPr>
-            <w:tcW w:w="2000" w:type="dxa"/>
-            <w:vAlign w:val="center"/>
-          </w:tcPr>
-          <w:p>
-            <w:pPr>
-              <w:pStyle w:val="TableText"/>
-              <w:widowControl/>
-            </w:pPr>
-            <w:r>
-              <w:rPr>
-                <w:rFonts w:ascii="Calibri" w:hAnsi="Calibri" w:cs="Calibri"/>
-              </w:rPr>
-              <w:t xml:space="preserve">Renderer-free actual governed capability and commercial grammar consumers; </w:t>
             </w:r>
             <w:hyperlink r:id="rIdHyperlink26" w:history="1">
               <w:r>
@@ -2308,7 +2246,7 @@
               <w:rPr>
                 <w:rFonts w:ascii="Calibri" w:hAnsi="Calibri" w:cs="Calibri"/>
               </w:rPr>
-              <w:t>AR-02L</w:t>
+              <w:t>AR-02K</w:t>
             </w:r>
           </w:p>
         </w:tc>
@@ -2344,7 +2282,7 @@
               <w:rPr>
                 <w:rFonts w:ascii="Calibri" w:hAnsi="Calibri" w:cs="Calibri"/>
               </w:rPr>
-              <w:t xml:space="preserve">Renderer-free semantic feature metadata; </w:t>
+              <w:t xml:space="preserve">Renderer-free actual governed capability and commercial grammar consumers; </w:t>
             </w:r>
             <w:hyperlink r:id="rIdHyperlink28" w:history="1">
               <w:r>
@@ -2414,7 +2352,7 @@
               <w:rPr>
                 <w:rFonts w:ascii="Calibri" w:hAnsi="Calibri" w:cs="Calibri"/>
               </w:rPr>
-              <w:t>AR-02M</w:t>
+              <w:t>AR-02L</w:t>
             </w:r>
           </w:p>
         </w:tc>
@@ -2450,7 +2388,7 @@
               <w:rPr>
                 <w:rFonts w:ascii="Calibri" w:hAnsi="Calibri" w:cs="Calibri"/>
               </w:rPr>
-              <w:t xml:space="preserve">Coordinated schema, direction, eligibility and actual semantic resolver metadata; </w:t>
+              <w:t xml:space="preserve">Renderer-free semantic feature metadata; </w:t>
             </w:r>
             <w:hyperlink r:id="rIdHyperlink30" w:history="1">
               <w:r>
@@ -2478,22 +2416,6 @@
                 <w:t>report</w:t>
               </w:r>
             </w:hyperlink>
-            <w:r>
-              <w:rPr>
-                <w:rFonts w:ascii="Calibri" w:hAnsi="Calibri" w:cs="Calibri"/>
-              </w:rPr>
-              <w:t xml:space="preserve">, </w:t>
-            </w:r>
-            <w:hyperlink r:id="rIdHyperlink23" w:history="1">
-              <w:r>
-                <w:rPr>
-                  <w:rFonts w:ascii="Calibri" w:hAnsi="Calibri" w:cs="Calibri"/>
-                  <w:color w:val="2E74B5"/>
-                  <w:u w:val="single"/>
-                </w:rPr>
-                <w:t>parent evidence</w:t>
-              </w:r>
-            </w:hyperlink>
           </w:p>
         </w:tc>
         <w:tc>
@@ -2536,7 +2458,7 @@
               <w:rPr>
                 <w:rFonts w:ascii="Calibri" w:hAnsi="Calibri" w:cs="Calibri"/>
               </w:rPr>
-              <w:t>AR-03B</w:t>
+              <w:t>AR-02M</w:t>
             </w:r>
           </w:p>
         </w:tc>
@@ -2554,7 +2476,7 @@
               <w:rPr>
                 <w:rFonts w:ascii="Calibri" w:hAnsi="Calibri" w:cs="Calibri"/>
               </w:rPr>
-              <w:t>AR-03</w:t>
+              <w:t>AR-02</w:t>
             </w:r>
           </w:p>
         </w:tc>
@@ -2572,7 +2494,7 @@
               <w:rPr>
                 <w:rFonts w:ascii="Calibri" w:hAnsi="Calibri" w:cs="Calibri"/>
               </w:rPr>
-              <w:t xml:space="preserve">Renderer-free presentation construction and exact historical compatibility; </w:t>
+              <w:t xml:space="preserve">Coordinated schema, direction, eligibility and actual semantic resolver metadata; </w:t>
             </w:r>
             <w:hyperlink r:id="rIdHyperlink32" w:history="1">
               <w:r>
@@ -2600,6 +2522,22 @@
                 <w:t>report</w:t>
               </w:r>
             </w:hyperlink>
+            <w:r>
+              <w:rPr>
+                <w:rFonts w:ascii="Calibri" w:hAnsi="Calibri" w:cs="Calibri"/>
+              </w:rPr>
+              <w:t xml:space="preserve">, </w:t>
+            </w:r>
+            <w:hyperlink r:id="rIdHyperlink25" w:history="1">
+              <w:r>
+                <w:rPr>
+                  <w:rFonts w:ascii="Calibri" w:hAnsi="Calibri" w:cs="Calibri"/>
+                  <w:color w:val="2E74B5"/>
+                  <w:u w:val="single"/>
+                </w:rPr>
+                <w:t>parent evidence</w:t>
+              </w:r>
+            </w:hyperlink>
           </w:p>
         </w:tc>
         <w:tc>
@@ -2642,7 +2580,7 @@
               <w:rPr>
                 <w:rFonts w:ascii="Calibri" w:hAnsi="Calibri" w:cs="Calibri"/>
               </w:rPr>
-              <w:t>AR-03C</w:t>
+              <w:t>AR-03B</w:t>
             </w:r>
           </w:p>
         </w:tc>
@@ -2678,7 +2616,7 @@
               <w:rPr>
                 <w:rFonts w:ascii="Calibri" w:hAnsi="Calibri" w:cs="Calibri"/>
               </w:rPr>
-              <w:t xml:space="preserve">Current-authority validation, route projection/resolution and four preview import cutovers; </w:t>
+              <w:t xml:space="preserve">Renderer-free presentation construction and exact historical compatibility; </w:t>
             </w:r>
             <w:hyperlink r:id="rIdHyperlink34" w:history="1">
               <w:r>
@@ -2748,7 +2686,7 @@
               <w:rPr>
                 <w:rFonts w:ascii="Calibri" w:hAnsi="Calibri" w:cs="Calibri"/>
               </w:rPr>
-              <w:t>AR-03D</w:t>
+              <w:t>AR-03C</w:t>
             </w:r>
           </w:p>
         </w:tc>
@@ -2784,7 +2722,7 @@
               <w:rPr>
                 <w:rFonts w:ascii="Calibri" w:hAnsi="Calibri" w:cs="Calibri"/>
               </w:rPr>
-              <w:t xml:space="preserve">Design-selection contracts/operations and editor projection with three named consumer cutovers; </w:t>
+              <w:t xml:space="preserve">Current-authority validation, route projection/resolution and four preview import cutovers; </w:t>
             </w:r>
             <w:hyperlink r:id="rIdHyperlink36" w:history="1">
               <w:r>
@@ -2854,7 +2792,7 @@
               <w:rPr>
                 <w:rFonts w:ascii="Calibri" w:hAnsi="Calibri" w:cs="Calibri"/>
               </w:rPr>
-              <w:t>AR-03E</w:t>
+              <w:t>AR-03D</w:t>
             </w:r>
           </w:p>
         </w:tc>
@@ -2890,7 +2828,7 @@
               <w:rPr>
                 <w:rFonts w:ascii="Calibri" w:hAnsi="Calibri" w:cs="Calibri"/>
               </w:rPr>
-              <w:t xml:space="preserve">Legacy migration, distinct transient projections and shared bridge schemas; </w:t>
+              <w:t xml:space="preserve">Design-selection contracts/operations and editor projection with three named consumer cutovers; </w:t>
             </w:r>
             <w:hyperlink r:id="rIdHyperlink38" w:history="1">
               <w:r>
@@ -2918,13 +2856,119 @@
                 <w:t>report</w:t>
               </w:r>
             </w:hyperlink>
+          </w:p>
+        </w:tc>
+        <w:tc>
+          <w:tcPr>
+            <w:tcW w:w="8460" w:type="dxa"/>
+            <w:vAlign w:val="center"/>
+          </w:tcPr>
+          <w:p>
+            <w:pPr>
+              <w:pStyle w:val="TableText"/>
+              <w:jc w:val="center"/>
+              <w:widowControl/>
+            </w:pPr>
+            <w:r>
+              <w:rPr>
+                <w:rFonts w:ascii="Calibri" w:hAnsi="Calibri" w:cs="Calibri"/>
+                <w:b/>
+                <w:bCs/>
+              </w:rPr>
+              <w:t>Baseline / closed</w:t>
+            </w:r>
+          </w:p>
+        </w:tc>
+      </w:tr>
+      <w:tr>
+        <w:trPr>
+          <w:cantSplit/>
+        </w:trPr>
+        <w:tc>
+          <w:tcPr>
+            <w:tcW w:w="1000" w:type="dxa"/>
+            <w:vAlign w:val="center"/>
+          </w:tcPr>
+          <w:p>
+            <w:pPr>
+              <w:pStyle w:val="TableText"/>
+              <w:widowControl/>
+            </w:pPr>
+            <w:r>
+              <w:rPr>
+                <w:rFonts w:ascii="Calibri" w:hAnsi="Calibri" w:cs="Calibri"/>
+              </w:rPr>
+              <w:t>AR-03E</w:t>
+            </w:r>
+          </w:p>
+        </w:tc>
+        <w:tc>
+          <w:tcPr>
+            <w:tcW w:w="1500" w:type="dxa"/>
+            <w:vAlign w:val="center"/>
+          </w:tcPr>
+          <w:p>
+            <w:pPr>
+              <w:pStyle w:val="TableText"/>
+              <w:widowControl/>
+            </w:pPr>
+            <w:r>
+              <w:rPr>
+                <w:rFonts w:ascii="Calibri" w:hAnsi="Calibri" w:cs="Calibri"/>
+              </w:rPr>
+              <w:t>AR-03</w:t>
+            </w:r>
+          </w:p>
+        </w:tc>
+        <w:tc>
+          <w:tcPr>
+            <w:tcW w:w="2000" w:type="dxa"/>
+            <w:vAlign w:val="center"/>
+          </w:tcPr>
+          <w:p>
+            <w:pPr>
+              <w:pStyle w:val="TableText"/>
+              <w:widowControl/>
+            </w:pPr>
+            <w:r>
+              <w:rPr>
+                <w:rFonts w:ascii="Calibri" w:hAnsi="Calibri" w:cs="Calibri"/>
+              </w:rPr>
+              <w:t xml:space="preserve">Legacy migration, distinct transient projections and shared bridge schemas; </w:t>
+            </w:r>
+            <w:hyperlink r:id="rIdHyperlink40" w:history="1">
+              <w:r>
+                <w:rPr>
+                  <w:rFonts w:ascii="Calibri" w:hAnsi="Calibri" w:cs="Calibri"/>
+                  <w:color w:val="2E74B5"/>
+                  <w:u w:val="single"/>
+                </w:rPr>
+                <w:t>contract</w:t>
+              </w:r>
+            </w:hyperlink>
             <w:r>
               <w:rPr>
                 <w:rFonts w:ascii="Calibri" w:hAnsi="Calibri" w:cs="Calibri"/>
               </w:rPr>
               <w:t xml:space="preserve">, </w:t>
             </w:r>
-            <w:hyperlink r:id="rIdHyperlink40" w:history="1">
+            <w:hyperlink r:id="rIdHyperlink41" w:history="1">
+              <w:r>
+                <w:rPr>
+                  <w:rFonts w:ascii="Calibri" w:hAnsi="Calibri" w:cs="Calibri"/>
+                  <w:color w:val="2E74B5"/>
+                  <w:u w:val="single"/>
+                </w:rPr>
+                <w:t>report</w:t>
+              </w:r>
+            </w:hyperlink>
+            <w:r>
+              <w:rPr>
+                <w:rFonts w:ascii="Calibri" w:hAnsi="Calibri" w:cs="Calibri"/>
+              </w:rPr>
+              <w:t xml:space="preserve">, </w:t>
+            </w:r>
+            <w:hyperlink r:id="rIdHyperlink42" w:history="1">
               <w:r>
                 <w:rPr>
                   <w:rFonts w:ascii="Calibri" w:hAnsi="Calibri" w:cs="Calibri"/>
@@ -22889,7 +22933,7 @@
         </w:rPr>
         <w:t xml:space="preserve">. Completed 7 August 2026; see </w:t>
       </w:r>
-      <w:hyperlink r:id="rIdHyperlink41" w:history="1">
+      <w:hyperlink r:id="rIdHyperlink43" w:history="1">
         <w:r>
           <w:rPr>
             <w:rFonts w:ascii="Calibri" w:hAnsi="Calibri" w:cs="Calibri"/>
@@ -23026,7 +23070,7 @@
         </w:rPr>
         <w:t xml:space="preserve">The binding details and minimum coverage are in </w:t>
       </w:r>
-      <w:hyperlink r:id="rIdHyperlink42" w:history="1">
+      <w:hyperlink r:id="rIdHyperlink44" w:history="1">
         <w:r>
           <w:rPr>
             <w:rFonts w:ascii="Calibri" w:hAnsi="Calibri" w:cs="Calibri"/>
@@ -23224,7 +23268,7 @@
         </w:rPr>
         <w:t xml:space="preserve">. P10B-16P-04 acceptance evidence is retained in </w:t>
       </w:r>
-      <w:hyperlink r:id="rIdHyperlink43" w:history="1">
+      <w:hyperlink r:id="rIdHyperlink45" w:history="1">
         <w:r>
           <w:rPr>
             <w:rFonts w:ascii="Calibri" w:hAnsi="Calibri" w:cs="Calibri"/>
@@ -23473,7 +23517,7 @@
         </w:rPr>
         <w:t xml:space="preserve">. See </w:t>
       </w:r>
-      <w:hyperlink r:id="rIdHyperlink44" w:history="1">
+      <w:hyperlink r:id="rIdHyperlink46" w:history="1">
         <w:r>
           <w:rPr>
             <w:rFonts w:ascii="Calibri" w:hAnsi="Calibri" w:cs="Calibri"/>
@@ -23722,7 +23766,7 @@
         </w:rPr>
         <w:t xml:space="preserve">. See </w:t>
       </w:r>
-      <w:hyperlink r:id="rIdHyperlink45" w:history="1">
+      <w:hyperlink r:id="rIdHyperlink47" w:history="1">
         <w:r>
           <w:rPr>
             <w:rFonts w:ascii="Calibri" w:hAnsi="Calibri" w:cs="Calibri"/>
@@ -23971,7 +24015,7 @@
         </w:rPr>
         <w:t xml:space="preserve">. At P10B-03 delivery, all then-current 25 V2 definitions and 91 variants were classified explicitly without false commercial-ready promotion. Later family tasks extend that same authority rather than replacing it. See </w:t>
       </w:r>
-      <w:hyperlink r:id="rIdHyperlink46" w:history="1">
+      <w:hyperlink r:id="rIdHyperlink48" w:history="1">
         <w:r>
           <w:rPr>
             <w:rFonts w:ascii="Calibri" w:hAnsi="Calibri" w:cs="Calibri"/>
@@ -24220,7 +24264,7 @@
         </w:rPr>
         <w:t xml:space="preserve"> embeds exact lineage and bounded treatment in the existing approved presentation, consumes Design DNA and registered anatomy, projects protected same-product media, preserves authority through lifecycle/compiler boundaries, and renders semantic four-breakpoint evidence. Production CDN transforms and retained commercial visual acceptance remain deferred. See </w:t>
       </w:r>
-      <w:hyperlink r:id="rIdHyperlink47" w:history="1">
+      <w:hyperlink r:id="rIdHyperlink49" w:history="1">
         <w:r>
           <w:rPr>
             <w:rFonts w:ascii="Calibri" w:hAnsi="Calibri" w:cs="Calibri"/>
@@ -24469,7 +24513,7 @@
         </w:rPr>
         <w:t xml:space="preserve">. See </w:t>
       </w:r>
-      <w:hyperlink r:id="rIdHyperlink48" w:history="1">
+      <w:hyperlink r:id="rIdHyperlink50" w:history="1">
         <w:r>
           <w:rPr>
             <w:rFonts w:ascii="Calibri" w:hAnsi="Calibri" w:cs="Calibri"/>
@@ -24704,7 +24748,7 @@
         </w:rPr>
         <w:t xml:space="preserve">. Four exact root-frame profiles, three mobile modes, and four footer compositions preserve canonical navigation and frame identity through snapshot, save/reload, Puck root, preview, publication compilation, EN/FI, and 375/768/1024/1440 px evidence. See </w:t>
       </w:r>
-      <w:hyperlink r:id="rIdHyperlink49" w:history="1">
+      <w:hyperlink r:id="rIdHyperlink51" w:history="1">
         <w:r>
           <w:rPr>
             <w:rFonts w:ascii="Calibri" w:hAnsi="Calibri" w:cs="Calibri"/>
@@ -24939,7 +24983,7 @@
         </w:rPr>
         <w:t xml:space="preserve">. Six meaningful hero anatomies, five editorial/story anatomies, five campaign/promotion anatomies and three evidence-grounded proof/service anatomies are registered, PageBlueprint-selectable, deterministically generated, snapshot/publish preserved and rendered through one shared implementation. Focused deterministic coverage and a zero-provider Chromium scenario retain evidence at 375, 768, 1024 and 1440 px. See </w:t>
       </w:r>
-      <w:hyperlink r:id="rIdHyperlink50" w:history="1">
+      <w:hyperlink r:id="rIdHyperlink52" w:history="1">
         <w:r>
           <w:rPr>
             <w:rFonts w:ascii="Calibri" w:hAnsi="Calibri" w:cs="Calibri"/>
@@ -24988,7 +25032,7 @@
         </w:rPr>
         <w:t xml:space="preserve"> Baseline. One fingerprinted authority and renderer now serve homepage merchandising, collection/results, related products, and legacy compatibility. Five meaningful anatomies preserve canonical facts and P10B-04 media lineage through plan, proposal, snapshot, save/reload, publish, and responsive browser evidence. See </w:t>
       </w:r>
-      <w:hyperlink r:id="rIdHyperlink51" w:history="1">
+      <w:hyperlink r:id="rIdHyperlink53" w:history="1">
         <w:r>
           <w:rPr>
             <w:rFonts w:ascii="Calibri" w:hAnsi="Calibri" w:cs="Calibri"/>
@@ -25205,7 +25249,7 @@
         </w:rPr>
         <w:t xml:space="preserve"> Baseline. Six versioned, structurally fingerprinted homepage PageBlueprint profiles compose current shared-frame, commercial storytelling, canonical product-card, approved-media, and Design DNA authority. Evidence/cardinality guards fail closed; deterministic lifecycle and 24 retained four-width browser images pass. See </w:t>
       </w:r>
-      <w:hyperlink r:id="rIdHyperlink52" w:history="1">
+      <w:hyperlink r:id="rIdHyperlink54" w:history="1">
         <w:r>
           <w:rPr>
             <w:rFonts w:ascii="Calibri" w:hAnsi="Calibri" w:cs="Calibri"/>
@@ -25436,7 +25480,7 @@
         </w:rPr>
         <w:t xml:space="preserve"> anatomy, P10B-08 canonical card anatomy, and P10B-04 approved media treatment. Exact canonical catalogue bindings preserve product membership/order, facts, product media, filters/sort state, and child-collection order. Campaign media is approved collection/editorial media, not a product-media replacement. A transient revision-checked zero-result context keeps the query without fabricating products. Deterministic lifecycle and 16-view Chromium evidence pass with zero provider calls. See </w:t>
       </w:r>
-      <w:hyperlink r:id="rIdHyperlink53" w:history="1">
+      <w:hyperlink r:id="rIdHyperlink55" w:history="1">
         <w:r>
           <w:rPr>
             <w:rFonts w:ascii="Calibri" w:hAnsi="Calibri" w:cs="Calibri"/>
@@ -25966,7 +26010,7 @@
         </w:rPr>
         <w:t xml:space="preserve">. Fifteen structurally distinct registered profiles resolve exact current approved brief evidence into strict localized fact documents. P10B-05 preserves page-set, route, locale, and transitive navigation authority; P10B-06 frames and P10B-07 editorial/campaign renderers are reused. Snapshot save/reload and deterministic publication preserve the exact document. See </w:t>
       </w:r>
-      <w:hyperlink r:id="rIdHyperlink54" w:history="1">
+      <w:hyperlink r:id="rIdHyperlink56" w:history="1">
         <w:r>
           <w:rPr>
             <w:rFonts w:ascii="Calibri" w:hAnsi="Calibri" w:cs="Calibri"/>
@@ -26177,7 +26221,7 @@
         </w:rPr>
         <w:t xml:space="preserve"> component through the P10B-05 family page; registered loading state renders on its pending route instead of replacing the 404 singleton. Read-only runtime state supplies canonical cart facts, checkout continuation, P10B-10 query/filter context, and bounded recovery actions while the snapshot preserves presentation only. Shared-frame/Design DNA, save/reload, publication, four- width browser evidence, and no-provider behavior are covered under </w:t>
       </w:r>
-      <w:hyperlink r:id="rIdHyperlink55" w:history="1">
+      <w:hyperlink r:id="rIdHyperlink57" w:history="1">
         <w:r>
           <w:rPr>
             <w:rFonts w:ascii="Calibri" w:hAnsi="Calibri" w:cs="Calibri"/>
@@ -26388,7 +26432,7 @@
         </w:rPr>
         <w:t xml:space="preserve"> frame span all pages; simple/configurable PDP, factual content, utility states, 15 four-width/representative screenshots and the passing 160-scenario human record are retained in </w:t>
       </w:r>
-      <w:hyperlink r:id="rIdHyperlink56" w:history="1">
+      <w:hyperlink r:id="rIdHyperlink58" w:history="1">
         <w:r>
           <w:rPr>
             <w:rFonts w:ascii="Calibri" w:hAnsi="Calibri" w:cs="Calibri"/>
@@ -26599,7 +26643,7 @@
         </w:rPr>
         <w:t xml:space="preserve"> One versioned deterministic synthesis contract binds exact merchant, evidence, commerce, asset, Design DNA, site-map, frame, PageBlueprint/profile, component/anatomy, narrative, density, art-direction, responsive, planner, registry and recipe authority. The same approved fixture produces editorial-heavy, commerce/discovery-heavy and restrained/minimal complete 17-route stores through the existing whole-storefront proposal, snapshot, save/reload, renderer and immutable publication chain. Details are retained in </w:t>
       </w:r>
-      <w:hyperlink r:id="rIdHyperlink57" w:history="1">
+      <w:hyperlink r:id="rIdHyperlink59" w:history="1">
         <w:r>
           <w:rPr>
             <w:rFonts w:ascii="Calibri" w:hAnsi="Calibri" w:cs="Calibri"/>
@@ -26844,7 +26888,7 @@
         </w:rPr>
         <w:t xml:space="preserve"> 31 focused unit/integration cases; nine representative complete outcomes; exact save/reload and compiled publication; protected commerce/evidence/media parity; dedicated 375/768/1024/1440 browser coverage; three retained human commercial reviews and one exact evidence manifest. See </w:t>
       </w:r>
-      <w:hyperlink r:id="rIdHyperlink58" w:history="1">
+      <w:hyperlink r:id="rIdHyperlink60" w:history="1">
         <w:r>
           <w:rPr>
             <w:rFonts w:ascii="Calibri" w:hAnsi="Calibri" w:cs="Calibri"/>
@@ -27021,7 +27065,7 @@
         </w:rPr>
         <w:t xml:space="preserve"> A compact route inventory, four collection/search archetypes, four maintained PDP profiles plus generic fallback, exact collection and product-type mappings, bounded matching rules, transient editor/runtime projection, deterministic legacy convergence, and complete snapshot/lifecycle/publication preservation. Exact primary and related-product bindings survive convergence. A server-owned, storefront-scoped proposal transition binds legacy and reviewed canonical projections for deterministic acceptance replay. Storefront Studio lists archetypes rather than one page per commerce URL; representative context is not persisted. See </w:t>
       </w:r>
-      <w:hyperlink r:id="rIdHyperlink59" w:history="1">
+      <w:hyperlink r:id="rIdHyperlink61" w:history="1">
         <w:r>
           <w:rPr>
             <w:rFonts w:ascii="Calibri" w:hAnsi="Calibri" w:cs="Calibri"/>
@@ -27489,7 +27533,7 @@
         </w:rPr>
         <w:t xml:space="preserve"> </w:t>
       </w:r>
-      <w:hyperlink r:id="rIdHyperlink60" w:history="1">
+      <w:hyperlink r:id="rIdHyperlink62" w:history="1">
         <w:r>
           <w:rPr>
             <w:rFonts w:ascii="Calibri" w:hAnsi="Calibri" w:cs="Calibri"/>
@@ -27950,7 +27994,7 @@
         </w:rPr>
         <w:t xml:space="preserve">. Completed 15 August 2026; see </w:t>
       </w:r>
-      <w:hyperlink r:id="rIdHyperlink43" w:history="1">
+      <w:hyperlink r:id="rIdHyperlink45" w:history="1">
         <w:r>
           <w:rPr>
             <w:rFonts w:ascii="Calibri" w:hAnsi="Calibri" w:cs="Calibri"/>
@@ -29212,7 +29256,7 @@
         </w:rPr>
         <w:t xml:space="preserve">. Accepted by the product owner on 16 August 2026 under </w:t>
       </w:r>
-      <w:hyperlink r:id="rIdHyperlink61" w:history="1">
+      <w:hyperlink r:id="rIdHyperlink63" w:history="1">
         <w:r>
           <w:rPr>
             <w:rFonts w:ascii="Calibri" w:hAnsi="Calibri" w:cs="Calibri"/>
@@ -29570,7 +29614,7 @@
         </w:rPr>
         <w:t xml:space="preserve">. Accepted by the product owner on 17 August 2026 under </w:t>
       </w:r>
-      <w:hyperlink r:id="rIdHyperlink61" w:history="1">
+      <w:hyperlink r:id="rIdHyperlink63" w:history="1">
         <w:r>
           <w:rPr>
             <w:rFonts w:ascii="Calibri" w:hAnsi="Calibri" w:cs="Calibri"/>
@@ -32710,7 +32754,7 @@
         </w:rPr>
         <w:t xml:space="preserve"> </w:t>
       </w:r>
-      <w:hyperlink r:id="rIdHyperlink62" w:history="1">
+      <w:hyperlink r:id="rIdHyperlink64" w:history="1">
         <w:r>
           <w:rPr>
             <w:rFonts w:ascii="Calibri" w:hAnsi="Calibri" w:cs="Calibri"/>
@@ -32726,7 +32770,7 @@
         </w:rPr>
         <w:t xml:space="preserve"> and </w:t>
       </w:r>
-      <w:hyperlink r:id="rIdHyperlink63" w:history="1">
+      <w:hyperlink r:id="rIdHyperlink65" w:history="1">
         <w:r>
           <w:rPr>
             <w:rFonts w:ascii="Calibri" w:hAnsi="Calibri" w:cs="Calibri"/>

</xml_diff>

<commit_message>
Validate compiled PageBlueprint composition authority (#257)
* feat: validate compiled PageBlueprint composition authority

* fix: enforce component visual weight in composition binding
</commit_message>
<xml_diff>
--- a/docs/VESKIFY_DEVELOPMENT_DELIVERY_TRACKER_v1.3.0.docx
+++ b/docs/VESKIFY_DEVELOPMENT_DELIVERY_TRACKER_v1.3.0.docx
@@ -51,7 +51,7 @@
         <w:rPr>
           <w:rFonts w:ascii="Calibri" w:hAnsi="Calibri" w:cs="Calibri"/>
         </w:rPr>
-        <w:t>AR-02 and AR-02A through AR-02M Baseline / closed; AR-03 and AR-03A through AR-03E remain closed; AR-04 Baseline / closed effective upon accepted merge; AR-05 eligible / unstarted; AR-06 depends on AR-05; AR-23 eligible / unstarted; BATCH-10 complete; BATCH-11 complete upon AR-04 acceptance/merge and safe closeout; no next task</w:t>
+        <w:t>AR-02 and AR-02A through AR-02M Baseline / closed; AR-03 and AR-03A through AR-03E remain closed; AR-04 Baseline / closed; AR-05 Partial pending AR-05B nesting/version dispatch; AR-05A Baseline / closed effective upon accepted merge; AR-06 depends on AR-05 and owns positive dynamic composition proof before enablement; AR-23 eligible / unstarted; BATCH-10 complete; BATCH-11 complete; BATCH-12 complete upon AR-05A acceptance/merge and safe closeout; no next task</w:t>
       </w:r>
     </w:p>
     <w:p>
@@ -118,7 +118,7 @@
           <w:b/>
           <w:bCs/>
         </w:rPr>
-        <w:t>Candidate status effective upon explicit owner acceptance/merge of AR-04:</w:t>
+        <w:t>Candidate status effective upon explicit owner acceptance/merge of AR-05A:</w:t>
       </w:r>
       <w:r>
         <w:rPr>
@@ -362,7 +362,7 @@
         <w:rPr>
           <w:rFonts w:ascii="Calibri" w:hAnsi="Calibri" w:cs="Calibri"/>
         </w:rPr>
-        <w:t xml:space="preserve">; complete original acceptance is mapped in AR_02_BOUNDARY_ACCEPTANCE.md. AR-04 is Baseline / closed effective upon accepted merge. AR-05 is eligible / unstarted; AR-06 remains dependent on AR-05. AR-03 is </w:t>
+        <w:t xml:space="preserve">; complete original acceptance is mapped in AR_02_BOUNDARY_ACCEPTANCE.md. AR-04 is Baseline / closed. AR-05 is Partial; canonical nesting/version dispatch remains AR-05B work. AR-05A is Baseline / closed effective upon accepted merge. AR-06 remains dependent on AR-05; positive collection/search and PDP composition must be proven by its executable commerce support before enablement. AR-03 is </w:t>
       </w:r>
       <w:r>
         <w:rPr>
@@ -460,7 +460,7 @@
         <w:rPr>
           <w:rFonts w:ascii="Calibri" w:hAnsi="Calibri" w:cs="Calibri"/>
         </w:rPr>
-        <w:t xml:space="preserve">. AR-23 depends on AR-01 and is not serialized behind visual work. BATCH-03 is complete. BATCH-04 is complete. BATCH-05 is complete. BATCH-06 is complete. BATCH-07 is complete. BATCH-08 is complete. BATCH-09 is complete. BATCH-10 is complete. BATCH-11 is complete upon AR-04 acceptance/merge and safe closeout. No next reset task is selected. No third task is authorized. This tracker owns current status; the roadmap owns dependency order. Retained B01 exact-next, fixed-two-call/mandatory-three-concept, transient-only, and 73-child future-sequence statements are </w:t>
+        <w:t xml:space="preserve">. AR-23 depends on AR-01 and is not serialized behind visual work. BATCH-03 is complete. BATCH-04 is complete. BATCH-05 is complete. BATCH-06 is complete. BATCH-07 is complete. BATCH-08 is complete. BATCH-09 is complete. BATCH-10 is complete. BATCH-11 is complete. BATCH-12 is complete upon AR-05A acceptance/merge and safe closeout. No next reset task is selected. No third task is authorized. This tracker owns current status; the roadmap owns dependency order. Retained B01 exact-next, fixed-two-call/mandatory-three-concept, transient-only, and 73-child future-sequence statements are </w:t>
       </w:r>
       <w:r>
         <w:rPr>
@@ -475,6 +475,50 @@
           <w:rFonts w:ascii="Calibri" w:hAnsi="Calibri" w:cs="Calibri"/>
         </w:rPr>
         <w:t xml:space="preserve"> superseded by the incorporated addendum; accepted history, functional requirements, and current capability truth remain binding.</w:t>
+      </w:r>
+    </w:p>
+    <w:p>
+      <w:pPr>
+        <w:pStyle w:val="Normal"/>
+        <w:widowControl/>
+      </w:pPr>
+      <w:r>
+        <w:rPr>
+          <w:rFonts w:ascii="Calibri" w:hAnsi="Calibri" w:cs="Calibri"/>
+        </w:rPr>
+        <w:t xml:space="preserve">AR-05 decomposition: </w:t>
+      </w:r>
+      <w:hyperlink r:id="rIdHyperlink1" w:history="1">
+        <w:r>
+          <w:rPr>
+            <w:rFonts w:ascii="Calibri" w:hAnsi="Calibri" w:cs="Calibri"/>
+            <w:color w:val="2E74B5"/>
+            <w:u w:val="single"/>
+          </w:rPr>
+          <w:t>AR-05A design</w:t>
+        </w:r>
+      </w:hyperlink>
+      <w:r>
+        <w:rPr>
+          <w:rFonts w:ascii="Calibri" w:hAnsi="Calibri" w:cs="Calibri"/>
+        </w:rPr>
+        <w:t xml:space="preserve"> and </w:t>
+      </w:r>
+      <w:hyperlink r:id="rIdHyperlink2" w:history="1">
+        <w:r>
+          <w:rPr>
+            <w:rFonts w:ascii="Calibri" w:hAnsi="Calibri" w:cs="Calibri"/>
+            <w:color w:val="2E74B5"/>
+            <w:u w:val="single"/>
+          </w:rPr>
+          <w:t>implementation evidence</w:t>
+        </w:r>
+      </w:hyperlink>
+      <w:r>
+        <w:rPr>
+          <w:rFonts w:ascii="Calibri" w:hAnsi="Calibri" w:cs="Calibri"/>
+        </w:rPr>
+        <w:t xml:space="preserve"> cover the strict compiled value, positive static binding and specific rejection of current indivisible dynamic inventories. T01/T02 snapshot nesting, explicit version dispatch and combined fingerprint participation remain AR-05B obligations. AR-06 executable commerce support, or its explicitly scoped child, must prove positive collection/search and PDP composition before composed dynamic templates are enabled. No dynamic or rendered-fidelity proof is claimed by A, and no successor implementation is authorized.</w:t>
       </w:r>
     </w:p>
     <w:p>
@@ -772,7 +816,7 @@
               <w:pStyle w:val="TableText"/>
               <w:widowControl/>
             </w:pPr>
-            <w:hyperlink r:id="rIdHyperlink1" w:history="1">
+            <w:hyperlink r:id="rIdHyperlink3" w:history="1">
               <w:r>
                 <w:rPr>
                   <w:rFonts w:ascii="Calibri" w:hAnsi="Calibri" w:cs="Calibri"/>
@@ -817,7 +861,7 @@
               <w:pStyle w:val="TableText"/>
               <w:widowControl/>
             </w:pPr>
-            <w:hyperlink r:id="rIdHyperlink2" w:history="1">
+            <w:hyperlink r:id="rIdHyperlink4" w:history="1">
               <w:r>
                 <w:rPr>
                   <w:rFonts w:ascii="Calibri" w:hAnsi="Calibri" w:cs="Calibri"/>
@@ -1058,112 +1102,6 @@
               </w:rPr>
               <w:t xml:space="preserve">Separate live renderer observation and composition; </w:t>
             </w:r>
-            <w:hyperlink r:id="rIdHyperlink3" w:history="1">
-              <w:r>
-                <w:rPr>
-                  <w:rFonts w:ascii="Calibri" w:hAnsi="Calibri" w:cs="Calibri"/>
-                  <w:color w:val="2E74B5"/>
-                  <w:u w:val="single"/>
-                </w:rPr>
-                <w:t>contract</w:t>
-              </w:r>
-            </w:hyperlink>
-            <w:r>
-              <w:rPr>
-                <w:rFonts w:ascii="Calibri" w:hAnsi="Calibri" w:cs="Calibri"/>
-              </w:rPr>
-              <w:t xml:space="preserve">, </w:t>
-            </w:r>
-            <w:hyperlink r:id="rIdHyperlink4" w:history="1">
-              <w:r>
-                <w:rPr>
-                  <w:rFonts w:ascii="Calibri" w:hAnsi="Calibri" w:cs="Calibri"/>
-                  <w:color w:val="2E74B5"/>
-                  <w:u w:val="single"/>
-                </w:rPr>
-                <w:t>report</w:t>
-              </w:r>
-            </w:hyperlink>
-          </w:p>
-        </w:tc>
-        <w:tc>
-          <w:tcPr>
-            <w:tcW w:w="8460" w:type="dxa"/>
-            <w:vAlign w:val="center"/>
-          </w:tcPr>
-          <w:p>
-            <w:pPr>
-              <w:pStyle w:val="TableText"/>
-              <w:jc w:val="center"/>
-              <w:widowControl/>
-            </w:pPr>
-            <w:r>
-              <w:rPr>
-                <w:rFonts w:ascii="Calibri" w:hAnsi="Calibri" w:cs="Calibri"/>
-                <w:b/>
-                <w:bCs/>
-              </w:rPr>
-              <w:t>Baseline / closed</w:t>
-            </w:r>
-          </w:p>
-        </w:tc>
-      </w:tr>
-      <w:tr>
-        <w:trPr>
-          <w:cantSplit/>
-        </w:trPr>
-        <w:tc>
-          <w:tcPr>
-            <w:tcW w:w="1000" w:type="dxa"/>
-            <w:vAlign w:val="center"/>
-          </w:tcPr>
-          <w:p>
-            <w:pPr>
-              <w:pStyle w:val="TableText"/>
-              <w:widowControl/>
-            </w:pPr>
-            <w:r>
-              <w:rPr>
-                <w:rFonts w:ascii="Calibri" w:hAnsi="Calibri" w:cs="Calibri"/>
-              </w:rPr>
-              <w:t>AR-02B</w:t>
-            </w:r>
-          </w:p>
-        </w:tc>
-        <w:tc>
-          <w:tcPr>
-            <w:tcW w:w="1500" w:type="dxa"/>
-            <w:vAlign w:val="center"/>
-          </w:tcPr>
-          <w:p>
-            <w:pPr>
-              <w:pStyle w:val="TableText"/>
-              <w:widowControl/>
-            </w:pPr>
-            <w:r>
-              <w:rPr>
-                <w:rFonts w:ascii="Calibri" w:hAnsi="Calibri" w:cs="Calibri"/>
-              </w:rPr>
-              <w:t>AR-02</w:t>
-            </w:r>
-          </w:p>
-        </w:tc>
-        <w:tc>
-          <w:tcPr>
-            <w:tcW w:w="2000" w:type="dxa"/>
-            <w:vAlign w:val="center"/>
-          </w:tcPr>
-          <w:p>
-            <w:pPr>
-              <w:pStyle w:val="TableText"/>
-              <w:widowControl/>
-            </w:pPr>
-            <w:r>
-              <w:rPr>
-                <w:rFonts w:ascii="Calibri" w:hAnsi="Calibri" w:cs="Calibri"/>
-              </w:rPr>
-              <w:t xml:space="preserve">Extract renderer-free deterministic conformance evaluation; </w:t>
-            </w:r>
             <w:hyperlink r:id="rIdHyperlink5" w:history="1">
               <w:r>
                 <w:rPr>
@@ -1232,7 +1170,7 @@
               <w:rPr>
                 <w:rFonts w:ascii="Calibri" w:hAnsi="Calibri" w:cs="Calibri"/>
               </w:rPr>
-              <w:t>AR-03A</w:t>
+              <w:t>AR-02B</w:t>
             </w:r>
           </w:p>
         </w:tc>
@@ -1250,7 +1188,7 @@
               <w:rPr>
                 <w:rFonts w:ascii="Calibri" w:hAnsi="Calibri" w:cs="Calibri"/>
               </w:rPr>
-              <w:t>AR-03</w:t>
+              <w:t>AR-02</w:t>
             </w:r>
           </w:p>
         </w:tc>
@@ -1268,7 +1206,7 @@
               <w:rPr>
                 <w:rFonts w:ascii="Calibri" w:hAnsi="Calibri" w:cs="Calibri"/>
               </w:rPr>
-              <w:t xml:space="preserve">Extract route matching and errors; </w:t>
+              <w:t xml:space="preserve">Extract renderer-free deterministic conformance evaluation; </w:t>
             </w:r>
             <w:hyperlink r:id="rIdHyperlink7" w:history="1">
               <w:r>
@@ -1338,7 +1276,7 @@
               <w:rPr>
                 <w:rFonts w:ascii="Calibri" w:hAnsi="Calibri" w:cs="Calibri"/>
               </w:rPr>
-              <w:t>AR-02C</w:t>
+              <w:t>AR-03A</w:t>
             </w:r>
           </w:p>
         </w:tc>
@@ -1356,7 +1294,7 @@
               <w:rPr>
                 <w:rFonts w:ascii="Calibri" w:hAnsi="Calibri" w:cs="Calibri"/>
               </w:rPr>
-              <w:t>AR-02</w:t>
+              <w:t>AR-03</w:t>
             </w:r>
           </w:p>
         </w:tc>
@@ -1374,7 +1312,7 @@
               <w:rPr>
                 <w:rFonts w:ascii="Calibri" w:hAnsi="Calibri" w:cs="Calibri"/>
               </w:rPr>
-              <w:t xml:space="preserve">Extract utility metadata and remove the supported-vocabulary renderer edge; </w:t>
+              <w:t xml:space="preserve">Extract route matching and errors; </w:t>
             </w:r>
             <w:hyperlink r:id="rIdHyperlink9" w:history="1">
               <w:r>
@@ -1444,7 +1382,7 @@
               <w:rPr>
                 <w:rFonts w:ascii="Calibri" w:hAnsi="Calibri" w:cs="Calibri"/>
               </w:rPr>
-              <w:t>AR-02D</w:t>
+              <w:t>AR-02C</w:t>
             </w:r>
           </w:p>
         </w:tc>
@@ -1480,7 +1418,7 @@
               <w:rPr>
                 <w:rFonts w:ascii="Calibri" w:hAnsi="Calibri" w:cs="Calibri"/>
               </w:rPr>
-              <w:t xml:space="preserve">Extract homepage and hero renderer-free metadata; </w:t>
+              <w:t xml:space="preserve">Extract utility metadata and remove the supported-vocabulary renderer edge; </w:t>
             </w:r>
             <w:hyperlink r:id="rIdHyperlink11" w:history="1">
               <w:r>
@@ -1550,7 +1488,7 @@
               <w:rPr>
                 <w:rFonts w:ascii="Calibri" w:hAnsi="Calibri" w:cs="Calibri"/>
               </w:rPr>
-              <w:t>AR-02E</w:t>
+              <w:t>AR-02D</w:t>
             </w:r>
           </w:p>
         </w:tc>
@@ -1586,7 +1524,7 @@
               <w:rPr>
                 <w:rFonts w:ascii="Calibri" w:hAnsi="Calibri" w:cs="Calibri"/>
               </w:rPr>
-              <w:t xml:space="preserve">Extract collection and product renderer-free metadata; </w:t>
+              <w:t xml:space="preserve">Extract homepage and hero renderer-free metadata; </w:t>
             </w:r>
             <w:hyperlink r:id="rIdHyperlink13" w:history="1">
               <w:r>
@@ -1656,7 +1594,7 @@
               <w:rPr>
                 <w:rFonts w:ascii="Calibri" w:hAnsi="Calibri" w:cs="Calibri"/>
               </w:rPr>
-              <w:t>AR-02F</w:t>
+              <w:t>AR-02E</w:t>
             </w:r>
           </w:p>
         </w:tc>
@@ -1692,7 +1630,7 @@
               <w:rPr>
                 <w:rFonts w:ascii="Calibri" w:hAnsi="Calibri" w:cs="Calibri"/>
               </w:rPr>
-              <w:t xml:space="preserve">Adapt V2 definitions from shared renderer-free metadata; </w:t>
+              <w:t xml:space="preserve">Extract collection and product renderer-free metadata; </w:t>
             </w:r>
             <w:hyperlink r:id="rIdHyperlink15" w:history="1">
               <w:r>
@@ -1762,7 +1700,7 @@
               <w:rPr>
                 <w:rFonts w:ascii="Calibri" w:hAnsi="Calibri" w:cs="Calibri"/>
               </w:rPr>
-              <w:t>AR-02G</w:t>
+              <w:t>AR-02F</w:t>
             </w:r>
           </w:p>
         </w:tc>
@@ -1798,7 +1736,7 @@
               <w:rPr>
                 <w:rFonts w:ascii="Calibri" w:hAnsi="Calibri" w:cs="Calibri"/>
               </w:rPr>
-              <w:t xml:space="preserve">Renderer-free template capability boundary and explicit utility historical-source transition; </w:t>
+              <w:t xml:space="preserve">Adapt V2 definitions from shared renderer-free metadata; </w:t>
             </w:r>
             <w:hyperlink r:id="rIdHyperlink17" w:history="1">
               <w:r>
@@ -1868,7 +1806,7 @@
               <w:rPr>
                 <w:rFonts w:ascii="Calibri" w:hAnsi="Calibri" w:cs="Calibri"/>
               </w:rPr>
-              <w:t>AR-02H</w:t>
+              <w:t>AR-02G</w:t>
             </w:r>
           </w:p>
         </w:tc>
@@ -1904,7 +1842,7 @@
               <w:rPr>
                 <w:rFonts w:ascii="Calibri" w:hAnsi="Calibri" w:cs="Calibri"/>
               </w:rPr>
-              <w:t xml:space="preserve">Semantic request boundary and explicit direction historical-source transition; </w:t>
+              <w:t xml:space="preserve">Renderer-free template capability boundary and explicit utility historical-source transition; </w:t>
             </w:r>
             <w:hyperlink r:id="rIdHyperlink19" w:history="1">
               <w:r>
@@ -1974,7 +1912,7 @@
               <w:rPr>
                 <w:rFonts w:ascii="Calibri" w:hAnsi="Calibri" w:cs="Calibri"/>
               </w:rPr>
-              <w:t>AR-02I</w:t>
+              <w:t>AR-02H</w:t>
             </w:r>
           </w:p>
         </w:tc>
@@ -2010,7 +1948,7 @@
               <w:rPr>
                 <w:rFonts w:ascii="Calibri" w:hAnsi="Calibri" w:cs="Calibri"/>
               </w:rPr>
-              <w:t xml:space="preserve">Renderer-free existing planner, recipe and provider metadata consumption; </w:t>
+              <w:t xml:space="preserve">Semantic request boundary and explicit direction historical-source transition; </w:t>
             </w:r>
             <w:hyperlink r:id="rIdHyperlink21" w:history="1">
               <w:r>
@@ -2038,13 +1976,119 @@
                 <w:t>report</w:t>
               </w:r>
             </w:hyperlink>
+          </w:p>
+        </w:tc>
+        <w:tc>
+          <w:tcPr>
+            <w:tcW w:w="8460" w:type="dxa"/>
+            <w:vAlign w:val="center"/>
+          </w:tcPr>
+          <w:p>
+            <w:pPr>
+              <w:pStyle w:val="TableText"/>
+              <w:jc w:val="center"/>
+              <w:widowControl/>
+            </w:pPr>
+            <w:r>
+              <w:rPr>
+                <w:rFonts w:ascii="Calibri" w:hAnsi="Calibri" w:cs="Calibri"/>
+                <w:b/>
+                <w:bCs/>
+              </w:rPr>
+              <w:t>Baseline / closed</w:t>
+            </w:r>
+          </w:p>
+        </w:tc>
+      </w:tr>
+      <w:tr>
+        <w:trPr>
+          <w:cantSplit/>
+        </w:trPr>
+        <w:tc>
+          <w:tcPr>
+            <w:tcW w:w="1000" w:type="dxa"/>
+            <w:vAlign w:val="center"/>
+          </w:tcPr>
+          <w:p>
+            <w:pPr>
+              <w:pStyle w:val="TableText"/>
+              <w:widowControl/>
+            </w:pPr>
+            <w:r>
+              <w:rPr>
+                <w:rFonts w:ascii="Calibri" w:hAnsi="Calibri" w:cs="Calibri"/>
+              </w:rPr>
+              <w:t>AR-02I</w:t>
+            </w:r>
+          </w:p>
+        </w:tc>
+        <w:tc>
+          <w:tcPr>
+            <w:tcW w:w="1500" w:type="dxa"/>
+            <w:vAlign w:val="center"/>
+          </w:tcPr>
+          <w:p>
+            <w:pPr>
+              <w:pStyle w:val="TableText"/>
+              <w:widowControl/>
+            </w:pPr>
+            <w:r>
+              <w:rPr>
+                <w:rFonts w:ascii="Calibri" w:hAnsi="Calibri" w:cs="Calibri"/>
+              </w:rPr>
+              <w:t>AR-02</w:t>
+            </w:r>
+          </w:p>
+        </w:tc>
+        <w:tc>
+          <w:tcPr>
+            <w:tcW w:w="2000" w:type="dxa"/>
+            <w:vAlign w:val="center"/>
+          </w:tcPr>
+          <w:p>
+            <w:pPr>
+              <w:pStyle w:val="TableText"/>
+              <w:widowControl/>
+            </w:pPr>
+            <w:r>
+              <w:rPr>
+                <w:rFonts w:ascii="Calibri" w:hAnsi="Calibri" w:cs="Calibri"/>
+              </w:rPr>
+              <w:t xml:space="preserve">Renderer-free existing planner, recipe and provider metadata consumption; </w:t>
+            </w:r>
+            <w:hyperlink r:id="rIdHyperlink23" w:history="1">
+              <w:r>
+                <w:rPr>
+                  <w:rFonts w:ascii="Calibri" w:hAnsi="Calibri" w:cs="Calibri"/>
+                  <w:color w:val="2E74B5"/>
+                  <w:u w:val="single"/>
+                </w:rPr>
+                <w:t>contract</w:t>
+              </w:r>
+            </w:hyperlink>
             <w:r>
               <w:rPr>
                 <w:rFonts w:ascii="Calibri" w:hAnsi="Calibri" w:cs="Calibri"/>
               </w:rPr>
               <w:t xml:space="preserve">, </w:t>
             </w:r>
-            <w:hyperlink r:id="rIdHyperlink23" w:history="1">
+            <w:hyperlink r:id="rIdHyperlink24" w:history="1">
+              <w:r>
+                <w:rPr>
+                  <w:rFonts w:ascii="Calibri" w:hAnsi="Calibri" w:cs="Calibri"/>
+                  <w:color w:val="2E74B5"/>
+                  <w:u w:val="single"/>
+                </w:rPr>
+                <w:t>report</w:t>
+              </w:r>
+            </w:hyperlink>
+            <w:r>
+              <w:rPr>
+                <w:rFonts w:ascii="Calibri" w:hAnsi="Calibri" w:cs="Calibri"/>
+              </w:rPr>
+              <w:t xml:space="preserve">, </w:t>
+            </w:r>
+            <w:hyperlink r:id="rIdHyperlink25" w:history="1">
               <w:r>
                 <w:rPr>
                   <w:rFonts w:ascii="Calibri" w:hAnsi="Calibri" w:cs="Calibri"/>
@@ -2133,112 +2177,6 @@
                 <w:rFonts w:ascii="Calibri" w:hAnsi="Calibri" w:cs="Calibri"/>
               </w:rPr>
               <w:t xml:space="preserve">Renderer-free actual provider descriptions and operation schemas; </w:t>
-            </w:r>
-            <w:hyperlink r:id="rIdHyperlink24" w:history="1">
-              <w:r>
-                <w:rPr>
-                  <w:rFonts w:ascii="Calibri" w:hAnsi="Calibri" w:cs="Calibri"/>
-                  <w:color w:val="2E74B5"/>
-                  <w:u w:val="single"/>
-                </w:rPr>
-                <w:t>contract</w:t>
-              </w:r>
-            </w:hyperlink>
-            <w:r>
-              <w:rPr>
-                <w:rFonts w:ascii="Calibri" w:hAnsi="Calibri" w:cs="Calibri"/>
-              </w:rPr>
-              <w:t xml:space="preserve">, </w:t>
-            </w:r>
-            <w:hyperlink r:id="rIdHyperlink25" w:history="1">
-              <w:r>
-                <w:rPr>
-                  <w:rFonts w:ascii="Calibri" w:hAnsi="Calibri" w:cs="Calibri"/>
-                  <w:color w:val="2E74B5"/>
-                  <w:u w:val="single"/>
-                </w:rPr>
-                <w:t>report</w:t>
-              </w:r>
-            </w:hyperlink>
-          </w:p>
-        </w:tc>
-        <w:tc>
-          <w:tcPr>
-            <w:tcW w:w="8460" w:type="dxa"/>
-            <w:vAlign w:val="center"/>
-          </w:tcPr>
-          <w:p>
-            <w:pPr>
-              <w:pStyle w:val="TableText"/>
-              <w:jc w:val="center"/>
-              <w:widowControl/>
-            </w:pPr>
-            <w:r>
-              <w:rPr>
-                <w:rFonts w:ascii="Calibri" w:hAnsi="Calibri" w:cs="Calibri"/>
-                <w:b/>
-                <w:bCs/>
-              </w:rPr>
-              <w:t>Baseline / closed</w:t>
-            </w:r>
-          </w:p>
-        </w:tc>
-      </w:tr>
-      <w:tr>
-        <w:trPr>
-          <w:cantSplit/>
-        </w:trPr>
-        <w:tc>
-          <w:tcPr>
-            <w:tcW w:w="1000" w:type="dxa"/>
-            <w:vAlign w:val="center"/>
-          </w:tcPr>
-          <w:p>
-            <w:pPr>
-              <w:pStyle w:val="TableText"/>
-              <w:widowControl/>
-            </w:pPr>
-            <w:r>
-              <w:rPr>
-                <w:rFonts w:ascii="Calibri" w:hAnsi="Calibri" w:cs="Calibri"/>
-              </w:rPr>
-              <w:t>AR-02K</w:t>
-            </w:r>
-          </w:p>
-        </w:tc>
-        <w:tc>
-          <w:tcPr>
-            <w:tcW w:w="1500" w:type="dxa"/>
-            <w:vAlign w:val="center"/>
-          </w:tcPr>
-          <w:p>
-            <w:pPr>
-              <w:pStyle w:val="TableText"/>
-              <w:widowControl/>
-            </w:pPr>
-            <w:r>
-              <w:rPr>
-                <w:rFonts w:ascii="Calibri" w:hAnsi="Calibri" w:cs="Calibri"/>
-              </w:rPr>
-              <w:t>AR-02</w:t>
-            </w:r>
-          </w:p>
-        </w:tc>
-        <w:tc>
-          <w:tcPr>
-            <w:tcW w:w="2000" w:type="dxa"/>
-            <w:vAlign w:val="center"/>
-          </w:tcPr>
-          <w:p>
-            <w:pPr>
-              <w:pStyle w:val="TableText"/>
-              <w:widowControl/>
-            </w:pPr>
-            <w:r>
-              <w:rPr>
-                <w:rFonts w:ascii="Calibri" w:hAnsi="Calibri" w:cs="Calibri"/>
-              </w:rPr>
-              <w:t xml:space="preserve">Renderer-free actual governed capability and commercial grammar consumers; </w:t>
             </w:r>
             <w:hyperlink r:id="rIdHyperlink26" w:history="1">
               <w:r>
@@ -2308,7 +2246,7 @@
               <w:rPr>
                 <w:rFonts w:ascii="Calibri" w:hAnsi="Calibri" w:cs="Calibri"/>
               </w:rPr>
-              <w:t>AR-02L</w:t>
+              <w:t>AR-02K</w:t>
             </w:r>
           </w:p>
         </w:tc>
@@ -2344,7 +2282,7 @@
               <w:rPr>
                 <w:rFonts w:ascii="Calibri" w:hAnsi="Calibri" w:cs="Calibri"/>
               </w:rPr>
-              <w:t xml:space="preserve">Renderer-free semantic feature metadata; </w:t>
+              <w:t xml:space="preserve">Renderer-free actual governed capability and commercial grammar consumers; </w:t>
             </w:r>
             <w:hyperlink r:id="rIdHyperlink28" w:history="1">
               <w:r>
@@ -2414,7 +2352,7 @@
               <w:rPr>
                 <w:rFonts w:ascii="Calibri" w:hAnsi="Calibri" w:cs="Calibri"/>
               </w:rPr>
-              <w:t>AR-02M</w:t>
+              <w:t>AR-02L</w:t>
             </w:r>
           </w:p>
         </w:tc>
@@ -2450,7 +2388,7 @@
               <w:rPr>
                 <w:rFonts w:ascii="Calibri" w:hAnsi="Calibri" w:cs="Calibri"/>
               </w:rPr>
-              <w:t xml:space="preserve">Coordinated schema, direction, eligibility and actual semantic resolver metadata; </w:t>
+              <w:t xml:space="preserve">Renderer-free semantic feature metadata; </w:t>
             </w:r>
             <w:hyperlink r:id="rIdHyperlink30" w:history="1">
               <w:r>
@@ -2478,22 +2416,6 @@
                 <w:t>report</w:t>
               </w:r>
             </w:hyperlink>
-            <w:r>
-              <w:rPr>
-                <w:rFonts w:ascii="Calibri" w:hAnsi="Calibri" w:cs="Calibri"/>
-              </w:rPr>
-              <w:t xml:space="preserve">, </w:t>
-            </w:r>
-            <w:hyperlink r:id="rIdHyperlink23" w:history="1">
-              <w:r>
-                <w:rPr>
-                  <w:rFonts w:ascii="Calibri" w:hAnsi="Calibri" w:cs="Calibri"/>
-                  <w:color w:val="2E74B5"/>
-                  <w:u w:val="single"/>
-                </w:rPr>
-                <w:t>parent evidence</w:t>
-              </w:r>
-            </w:hyperlink>
           </w:p>
         </w:tc>
         <w:tc>
@@ -2536,7 +2458,7 @@
               <w:rPr>
                 <w:rFonts w:ascii="Calibri" w:hAnsi="Calibri" w:cs="Calibri"/>
               </w:rPr>
-              <w:t>AR-03B</w:t>
+              <w:t>AR-02M</w:t>
             </w:r>
           </w:p>
         </w:tc>
@@ -2554,7 +2476,7 @@
               <w:rPr>
                 <w:rFonts w:ascii="Calibri" w:hAnsi="Calibri" w:cs="Calibri"/>
               </w:rPr>
-              <w:t>AR-03</w:t>
+              <w:t>AR-02</w:t>
             </w:r>
           </w:p>
         </w:tc>
@@ -2572,7 +2494,7 @@
               <w:rPr>
                 <w:rFonts w:ascii="Calibri" w:hAnsi="Calibri" w:cs="Calibri"/>
               </w:rPr>
-              <w:t xml:space="preserve">Renderer-free presentation construction and exact historical compatibility; </w:t>
+              <w:t xml:space="preserve">Coordinated schema, direction, eligibility and actual semantic resolver metadata; </w:t>
             </w:r>
             <w:hyperlink r:id="rIdHyperlink32" w:history="1">
               <w:r>
@@ -2600,6 +2522,22 @@
                 <w:t>report</w:t>
               </w:r>
             </w:hyperlink>
+            <w:r>
+              <w:rPr>
+                <w:rFonts w:ascii="Calibri" w:hAnsi="Calibri" w:cs="Calibri"/>
+              </w:rPr>
+              <w:t xml:space="preserve">, </w:t>
+            </w:r>
+            <w:hyperlink r:id="rIdHyperlink25" w:history="1">
+              <w:r>
+                <w:rPr>
+                  <w:rFonts w:ascii="Calibri" w:hAnsi="Calibri" w:cs="Calibri"/>
+                  <w:color w:val="2E74B5"/>
+                  <w:u w:val="single"/>
+                </w:rPr>
+                <w:t>parent evidence</w:t>
+              </w:r>
+            </w:hyperlink>
           </w:p>
         </w:tc>
         <w:tc>
@@ -2642,7 +2580,7 @@
               <w:rPr>
                 <w:rFonts w:ascii="Calibri" w:hAnsi="Calibri" w:cs="Calibri"/>
               </w:rPr>
-              <w:t>AR-03C</w:t>
+              <w:t>AR-03B</w:t>
             </w:r>
           </w:p>
         </w:tc>
@@ -2678,7 +2616,7 @@
               <w:rPr>
                 <w:rFonts w:ascii="Calibri" w:hAnsi="Calibri" w:cs="Calibri"/>
               </w:rPr>
-              <w:t xml:space="preserve">Current-authority validation, route projection/resolution and four preview import cutovers; </w:t>
+              <w:t xml:space="preserve">Renderer-free presentation construction and exact historical compatibility; </w:t>
             </w:r>
             <w:hyperlink r:id="rIdHyperlink34" w:history="1">
               <w:r>
@@ -2748,7 +2686,7 @@
               <w:rPr>
                 <w:rFonts w:ascii="Calibri" w:hAnsi="Calibri" w:cs="Calibri"/>
               </w:rPr>
-              <w:t>AR-03D</w:t>
+              <w:t>AR-03C</w:t>
             </w:r>
           </w:p>
         </w:tc>
@@ -2784,7 +2722,7 @@
               <w:rPr>
                 <w:rFonts w:ascii="Calibri" w:hAnsi="Calibri" w:cs="Calibri"/>
               </w:rPr>
-              <w:t xml:space="preserve">Design-selection contracts/operations and editor projection with three named consumer cutovers; </w:t>
+              <w:t xml:space="preserve">Current-authority validation, route projection/resolution and four preview import cutovers; </w:t>
             </w:r>
             <w:hyperlink r:id="rIdHyperlink36" w:history="1">
               <w:r>
@@ -2854,7 +2792,7 @@
               <w:rPr>
                 <w:rFonts w:ascii="Calibri" w:hAnsi="Calibri" w:cs="Calibri"/>
               </w:rPr>
-              <w:t>AR-03E</w:t>
+              <w:t>AR-03D</w:t>
             </w:r>
           </w:p>
         </w:tc>
@@ -2890,7 +2828,7 @@
               <w:rPr>
                 <w:rFonts w:ascii="Calibri" w:hAnsi="Calibri" w:cs="Calibri"/>
               </w:rPr>
-              <w:t xml:space="preserve">Legacy migration, distinct transient projections and shared bridge schemas; </w:t>
+              <w:t xml:space="preserve">Design-selection contracts/operations and editor projection with three named consumer cutovers; </w:t>
             </w:r>
             <w:hyperlink r:id="rIdHyperlink38" w:history="1">
               <w:r>
@@ -2918,13 +2856,119 @@
                 <w:t>report</w:t>
               </w:r>
             </w:hyperlink>
+          </w:p>
+        </w:tc>
+        <w:tc>
+          <w:tcPr>
+            <w:tcW w:w="8460" w:type="dxa"/>
+            <w:vAlign w:val="center"/>
+          </w:tcPr>
+          <w:p>
+            <w:pPr>
+              <w:pStyle w:val="TableText"/>
+              <w:jc w:val="center"/>
+              <w:widowControl/>
+            </w:pPr>
+            <w:r>
+              <w:rPr>
+                <w:rFonts w:ascii="Calibri" w:hAnsi="Calibri" w:cs="Calibri"/>
+                <w:b/>
+                <w:bCs/>
+              </w:rPr>
+              <w:t>Baseline / closed</w:t>
+            </w:r>
+          </w:p>
+        </w:tc>
+      </w:tr>
+      <w:tr>
+        <w:trPr>
+          <w:cantSplit/>
+        </w:trPr>
+        <w:tc>
+          <w:tcPr>
+            <w:tcW w:w="1000" w:type="dxa"/>
+            <w:vAlign w:val="center"/>
+          </w:tcPr>
+          <w:p>
+            <w:pPr>
+              <w:pStyle w:val="TableText"/>
+              <w:widowControl/>
+            </w:pPr>
+            <w:r>
+              <w:rPr>
+                <w:rFonts w:ascii="Calibri" w:hAnsi="Calibri" w:cs="Calibri"/>
+              </w:rPr>
+              <w:t>AR-03E</w:t>
+            </w:r>
+          </w:p>
+        </w:tc>
+        <w:tc>
+          <w:tcPr>
+            <w:tcW w:w="1500" w:type="dxa"/>
+            <w:vAlign w:val="center"/>
+          </w:tcPr>
+          <w:p>
+            <w:pPr>
+              <w:pStyle w:val="TableText"/>
+              <w:widowControl/>
+            </w:pPr>
+            <w:r>
+              <w:rPr>
+                <w:rFonts w:ascii="Calibri" w:hAnsi="Calibri" w:cs="Calibri"/>
+              </w:rPr>
+              <w:t>AR-03</w:t>
+            </w:r>
+          </w:p>
+        </w:tc>
+        <w:tc>
+          <w:tcPr>
+            <w:tcW w:w="2000" w:type="dxa"/>
+            <w:vAlign w:val="center"/>
+          </w:tcPr>
+          <w:p>
+            <w:pPr>
+              <w:pStyle w:val="TableText"/>
+              <w:widowControl/>
+            </w:pPr>
+            <w:r>
+              <w:rPr>
+                <w:rFonts w:ascii="Calibri" w:hAnsi="Calibri" w:cs="Calibri"/>
+              </w:rPr>
+              <w:t xml:space="preserve">Legacy migration, distinct transient projections and shared bridge schemas; </w:t>
+            </w:r>
+            <w:hyperlink r:id="rIdHyperlink40" w:history="1">
+              <w:r>
+                <w:rPr>
+                  <w:rFonts w:ascii="Calibri" w:hAnsi="Calibri" w:cs="Calibri"/>
+                  <w:color w:val="2E74B5"/>
+                  <w:u w:val="single"/>
+                </w:rPr>
+                <w:t>contract</w:t>
+              </w:r>
+            </w:hyperlink>
             <w:r>
               <w:rPr>
                 <w:rFonts w:ascii="Calibri" w:hAnsi="Calibri" w:cs="Calibri"/>
               </w:rPr>
               <w:t xml:space="preserve">, </w:t>
             </w:r>
-            <w:hyperlink r:id="rIdHyperlink40" w:history="1">
+            <w:hyperlink r:id="rIdHyperlink41" w:history="1">
+              <w:r>
+                <w:rPr>
+                  <w:rFonts w:ascii="Calibri" w:hAnsi="Calibri" w:cs="Calibri"/>
+                  <w:color w:val="2E74B5"/>
+                  <w:u w:val="single"/>
+                </w:rPr>
+                <w:t>report</w:t>
+              </w:r>
+            </w:hyperlink>
+            <w:r>
+              <w:rPr>
+                <w:rFonts w:ascii="Calibri" w:hAnsi="Calibri" w:cs="Calibri"/>
+              </w:rPr>
+              <w:t xml:space="preserve">, </w:t>
+            </w:r>
+            <w:hyperlink r:id="rIdHyperlink42" w:history="1">
               <w:r>
                 <w:rPr>
                   <w:rFonts w:ascii="Calibri" w:hAnsi="Calibri" w:cs="Calibri"/>
@@ -22889,7 +22933,7 @@
         </w:rPr>
         <w:t xml:space="preserve">. Completed 7 August 2026; see </w:t>
       </w:r>
-      <w:hyperlink r:id="rIdHyperlink41" w:history="1">
+      <w:hyperlink r:id="rIdHyperlink43" w:history="1">
         <w:r>
           <w:rPr>
             <w:rFonts w:ascii="Calibri" w:hAnsi="Calibri" w:cs="Calibri"/>
@@ -23026,7 +23070,7 @@
         </w:rPr>
         <w:t xml:space="preserve">The binding details and minimum coverage are in </w:t>
       </w:r>
-      <w:hyperlink r:id="rIdHyperlink42" w:history="1">
+      <w:hyperlink r:id="rIdHyperlink44" w:history="1">
         <w:r>
           <w:rPr>
             <w:rFonts w:ascii="Calibri" w:hAnsi="Calibri" w:cs="Calibri"/>
@@ -23224,7 +23268,7 @@
         </w:rPr>
         <w:t xml:space="preserve">. P10B-16P-04 acceptance evidence is retained in </w:t>
       </w:r>
-      <w:hyperlink r:id="rIdHyperlink43" w:history="1">
+      <w:hyperlink r:id="rIdHyperlink45" w:history="1">
         <w:r>
           <w:rPr>
             <w:rFonts w:ascii="Calibri" w:hAnsi="Calibri" w:cs="Calibri"/>
@@ -23473,7 +23517,7 @@
         </w:rPr>
         <w:t xml:space="preserve">. See </w:t>
       </w:r>
-      <w:hyperlink r:id="rIdHyperlink44" w:history="1">
+      <w:hyperlink r:id="rIdHyperlink46" w:history="1">
         <w:r>
           <w:rPr>
             <w:rFonts w:ascii="Calibri" w:hAnsi="Calibri" w:cs="Calibri"/>
@@ -23722,7 +23766,7 @@
         </w:rPr>
         <w:t xml:space="preserve">. See </w:t>
       </w:r>
-      <w:hyperlink r:id="rIdHyperlink45" w:history="1">
+      <w:hyperlink r:id="rIdHyperlink47" w:history="1">
         <w:r>
           <w:rPr>
             <w:rFonts w:ascii="Calibri" w:hAnsi="Calibri" w:cs="Calibri"/>
@@ -23971,7 +24015,7 @@
         </w:rPr>
         <w:t xml:space="preserve">. At P10B-03 delivery, all then-current 25 V2 definitions and 91 variants were classified explicitly without false commercial-ready promotion. Later family tasks extend that same authority rather than replacing it. See </w:t>
       </w:r>
-      <w:hyperlink r:id="rIdHyperlink46" w:history="1">
+      <w:hyperlink r:id="rIdHyperlink48" w:history="1">
         <w:r>
           <w:rPr>
             <w:rFonts w:ascii="Calibri" w:hAnsi="Calibri" w:cs="Calibri"/>
@@ -24220,7 +24264,7 @@
         </w:rPr>
         <w:t xml:space="preserve"> embeds exact lineage and bounded treatment in the existing approved presentation, consumes Design DNA and registered anatomy, projects protected same-product media, preserves authority through lifecycle/compiler boundaries, and renders semantic four-breakpoint evidence. Production CDN transforms and retained commercial visual acceptance remain deferred. See </w:t>
       </w:r>
-      <w:hyperlink r:id="rIdHyperlink47" w:history="1">
+      <w:hyperlink r:id="rIdHyperlink49" w:history="1">
         <w:r>
           <w:rPr>
             <w:rFonts w:ascii="Calibri" w:hAnsi="Calibri" w:cs="Calibri"/>
@@ -24469,7 +24513,7 @@
         </w:rPr>
         <w:t xml:space="preserve">. See </w:t>
       </w:r>
-      <w:hyperlink r:id="rIdHyperlink48" w:history="1">
+      <w:hyperlink r:id="rIdHyperlink50" w:history="1">
         <w:r>
           <w:rPr>
             <w:rFonts w:ascii="Calibri" w:hAnsi="Calibri" w:cs="Calibri"/>
@@ -24704,7 +24748,7 @@
         </w:rPr>
         <w:t xml:space="preserve">. Four exact root-frame profiles, three mobile modes, and four footer compositions preserve canonical navigation and frame identity through snapshot, save/reload, Puck root, preview, publication compilation, EN/FI, and 375/768/1024/1440 px evidence. See </w:t>
       </w:r>
-      <w:hyperlink r:id="rIdHyperlink49" w:history="1">
+      <w:hyperlink r:id="rIdHyperlink51" w:history="1">
         <w:r>
           <w:rPr>
             <w:rFonts w:ascii="Calibri" w:hAnsi="Calibri" w:cs="Calibri"/>
@@ -24939,7 +24983,7 @@
         </w:rPr>
         <w:t xml:space="preserve">. Six meaningful hero anatomies, five editorial/story anatomies, five campaign/promotion anatomies and three evidence-grounded proof/service anatomies are registered, PageBlueprint-selectable, deterministically generated, snapshot/publish preserved and rendered through one shared implementation. Focused deterministic coverage and a zero-provider Chromium scenario retain evidence at 375, 768, 1024 and 1440 px. See </w:t>
       </w:r>
-      <w:hyperlink r:id="rIdHyperlink50" w:history="1">
+      <w:hyperlink r:id="rIdHyperlink52" w:history="1">
         <w:r>
           <w:rPr>
             <w:rFonts w:ascii="Calibri" w:hAnsi="Calibri" w:cs="Calibri"/>
@@ -24988,7 +25032,7 @@
         </w:rPr>
         <w:t xml:space="preserve"> Baseline. One fingerprinted authority and renderer now serve homepage merchandising, collection/results, related products, and legacy compatibility. Five meaningful anatomies preserve canonical facts and P10B-04 media lineage through plan, proposal, snapshot, save/reload, publish, and responsive browser evidence. See </w:t>
       </w:r>
-      <w:hyperlink r:id="rIdHyperlink51" w:history="1">
+      <w:hyperlink r:id="rIdHyperlink53" w:history="1">
         <w:r>
           <w:rPr>
             <w:rFonts w:ascii="Calibri" w:hAnsi="Calibri" w:cs="Calibri"/>
@@ -25205,7 +25249,7 @@
         </w:rPr>
         <w:t xml:space="preserve"> Baseline. Six versioned, structurally fingerprinted homepage PageBlueprint profiles compose current shared-frame, commercial storytelling, canonical product-card, approved-media, and Design DNA authority. Evidence/cardinality guards fail closed; deterministic lifecycle and 24 retained four-width browser images pass. See </w:t>
       </w:r>
-      <w:hyperlink r:id="rIdHyperlink52" w:history="1">
+      <w:hyperlink r:id="rIdHyperlink54" w:history="1">
         <w:r>
           <w:rPr>
             <w:rFonts w:ascii="Calibri" w:hAnsi="Calibri" w:cs="Calibri"/>
@@ -25436,7 +25480,7 @@
         </w:rPr>
         <w:t xml:space="preserve"> anatomy, P10B-08 canonical card anatomy, and P10B-04 approved media treatment. Exact canonical catalogue bindings preserve product membership/order, facts, product media, filters/sort state, and child-collection order. Campaign media is approved collection/editorial media, not a product-media replacement. A transient revision-checked zero-result context keeps the query without fabricating products. Deterministic lifecycle and 16-view Chromium evidence pass with zero provider calls. See </w:t>
       </w:r>
-      <w:hyperlink r:id="rIdHyperlink53" w:history="1">
+      <w:hyperlink r:id="rIdHyperlink55" w:history="1">
         <w:r>
           <w:rPr>
             <w:rFonts w:ascii="Calibri" w:hAnsi="Calibri" w:cs="Calibri"/>
@@ -25966,7 +26010,7 @@
         </w:rPr>
         <w:t xml:space="preserve">. Fifteen structurally distinct registered profiles resolve exact current approved brief evidence into strict localized fact documents. P10B-05 preserves page-set, route, locale, and transitive navigation authority; P10B-06 frames and P10B-07 editorial/campaign renderers are reused. Snapshot save/reload and deterministic publication preserve the exact document. See </w:t>
       </w:r>
-      <w:hyperlink r:id="rIdHyperlink54" w:history="1">
+      <w:hyperlink r:id="rIdHyperlink56" w:history="1">
         <w:r>
           <w:rPr>
             <w:rFonts w:ascii="Calibri" w:hAnsi="Calibri" w:cs="Calibri"/>
@@ -26177,7 +26221,7 @@
         </w:rPr>
         <w:t xml:space="preserve"> component through the P10B-05 family page; registered loading state renders on its pending route instead of replacing the 404 singleton. Read-only runtime state supplies canonical cart facts, checkout continuation, P10B-10 query/filter context, and bounded recovery actions while the snapshot preserves presentation only. Shared-frame/Design DNA, save/reload, publication, four- width browser evidence, and no-provider behavior are covered under </w:t>
       </w:r>
-      <w:hyperlink r:id="rIdHyperlink55" w:history="1">
+      <w:hyperlink r:id="rIdHyperlink57" w:history="1">
         <w:r>
           <w:rPr>
             <w:rFonts w:ascii="Calibri" w:hAnsi="Calibri" w:cs="Calibri"/>
@@ -26388,7 +26432,7 @@
         </w:rPr>
         <w:t xml:space="preserve"> frame span all pages; simple/configurable PDP, factual content, utility states, 15 four-width/representative screenshots and the passing 160-scenario human record are retained in </w:t>
       </w:r>
-      <w:hyperlink r:id="rIdHyperlink56" w:history="1">
+      <w:hyperlink r:id="rIdHyperlink58" w:history="1">
         <w:r>
           <w:rPr>
             <w:rFonts w:ascii="Calibri" w:hAnsi="Calibri" w:cs="Calibri"/>
@@ -26599,7 +26643,7 @@
         </w:rPr>
         <w:t xml:space="preserve"> One versioned deterministic synthesis contract binds exact merchant, evidence, commerce, asset, Design DNA, site-map, frame, PageBlueprint/profile, component/anatomy, narrative, density, art-direction, responsive, planner, registry and recipe authority. The same approved fixture produces editorial-heavy, commerce/discovery-heavy and restrained/minimal complete 17-route stores through the existing whole-storefront proposal, snapshot, save/reload, renderer and immutable publication chain. Details are retained in </w:t>
       </w:r>
-      <w:hyperlink r:id="rIdHyperlink57" w:history="1">
+      <w:hyperlink r:id="rIdHyperlink59" w:history="1">
         <w:r>
           <w:rPr>
             <w:rFonts w:ascii="Calibri" w:hAnsi="Calibri" w:cs="Calibri"/>
@@ -26844,7 +26888,7 @@
         </w:rPr>
         <w:t xml:space="preserve"> 31 focused unit/integration cases; nine representative complete outcomes; exact save/reload and compiled publication; protected commerce/evidence/media parity; dedicated 375/768/1024/1440 browser coverage; three retained human commercial reviews and one exact evidence manifest. See </w:t>
       </w:r>
-      <w:hyperlink r:id="rIdHyperlink58" w:history="1">
+      <w:hyperlink r:id="rIdHyperlink60" w:history="1">
         <w:r>
           <w:rPr>
             <w:rFonts w:ascii="Calibri" w:hAnsi="Calibri" w:cs="Calibri"/>
@@ -27021,7 +27065,7 @@
         </w:rPr>
         <w:t xml:space="preserve"> A compact route inventory, four collection/search archetypes, four maintained PDP profiles plus generic fallback, exact collection and product-type mappings, bounded matching rules, transient editor/runtime projection, deterministic legacy convergence, and complete snapshot/lifecycle/publication preservation. Exact primary and related-product bindings survive convergence. A server-owned, storefront-scoped proposal transition binds legacy and reviewed canonical projections for deterministic acceptance replay. Storefront Studio lists archetypes rather than one page per commerce URL; representative context is not persisted. See </w:t>
       </w:r>
-      <w:hyperlink r:id="rIdHyperlink59" w:history="1">
+      <w:hyperlink r:id="rIdHyperlink61" w:history="1">
         <w:r>
           <w:rPr>
             <w:rFonts w:ascii="Calibri" w:hAnsi="Calibri" w:cs="Calibri"/>
@@ -27489,7 +27533,7 @@
         </w:rPr>
         <w:t xml:space="preserve"> </w:t>
       </w:r>
-      <w:hyperlink r:id="rIdHyperlink60" w:history="1">
+      <w:hyperlink r:id="rIdHyperlink62" w:history="1">
         <w:r>
           <w:rPr>
             <w:rFonts w:ascii="Calibri" w:hAnsi="Calibri" w:cs="Calibri"/>
@@ -27950,7 +27994,7 @@
         </w:rPr>
         <w:t xml:space="preserve">. Completed 15 August 2026; see </w:t>
       </w:r>
-      <w:hyperlink r:id="rIdHyperlink43" w:history="1">
+      <w:hyperlink r:id="rIdHyperlink45" w:history="1">
         <w:r>
           <w:rPr>
             <w:rFonts w:ascii="Calibri" w:hAnsi="Calibri" w:cs="Calibri"/>
@@ -29212,7 +29256,7 @@
         </w:rPr>
         <w:t xml:space="preserve">. Accepted by the product owner on 16 August 2026 under </w:t>
       </w:r>
-      <w:hyperlink r:id="rIdHyperlink61" w:history="1">
+      <w:hyperlink r:id="rIdHyperlink63" w:history="1">
         <w:r>
           <w:rPr>
             <w:rFonts w:ascii="Calibri" w:hAnsi="Calibri" w:cs="Calibri"/>
@@ -29570,7 +29614,7 @@
         </w:rPr>
         <w:t xml:space="preserve">. Accepted by the product owner on 17 August 2026 under </w:t>
       </w:r>
-      <w:hyperlink r:id="rIdHyperlink61" w:history="1">
+      <w:hyperlink r:id="rIdHyperlink63" w:history="1">
         <w:r>
           <w:rPr>
             <w:rFonts w:ascii="Calibri" w:hAnsi="Calibri" w:cs="Calibri"/>
@@ -32710,7 +32754,7 @@
         </w:rPr>
         <w:t xml:space="preserve"> </w:t>
       </w:r>
-      <w:hyperlink r:id="rIdHyperlink62" w:history="1">
+      <w:hyperlink r:id="rIdHyperlink64" w:history="1">
         <w:r>
           <w:rPr>
             <w:rFonts w:ascii="Calibri" w:hAnsi="Calibri" w:cs="Calibri"/>
@@ -32726,7 +32770,7 @@
         </w:rPr>
         <w:t xml:space="preserve"> and </w:t>
       </w:r>
-      <w:hyperlink r:id="rIdHyperlink63" w:history="1">
+      <w:hyperlink r:id="rIdHyperlink65" w:history="1">
         <w:r>
           <w:rPr>
             <w:rFonts w:ascii="Calibri" w:hAnsi="Calibri" w:cs="Calibri"/>

</xml_diff>

<commit_message>
feat: bind compiled composition to canonical snapshot versions
</commit_message>
<xml_diff>
--- a/docs/VESKIFY_DEVELOPMENT_DELIVERY_TRACKER_v1.3.0.docx
+++ b/docs/VESKIFY_DEVELOPMENT_DELIVERY_TRACKER_v1.3.0.docx
@@ -51,7 +51,7 @@
         <w:rPr>
           <w:rFonts w:ascii="Calibri" w:hAnsi="Calibri" w:cs="Calibri"/>
         </w:rPr>
-        <w:t>AR-02 and AR-02A through AR-02M Baseline / closed; AR-03 and AR-03A through AR-03E remain closed; AR-04 Baseline / closed; AR-05 Partial pending AR-05B nesting/version dispatch; AR-05A Baseline / closed effective upon accepted merge; AR-06 depends on AR-05 and owns positive dynamic composition proof before enablement; AR-23 eligible / unstarted; BATCH-10 complete; BATCH-11 complete; BATCH-12 complete upon AR-05A acceptance/merge and safe closeout; no next task</w:t>
+        <w:t>AR-02 and AR-02A through AR-02M Baseline / closed; AR-03 and AR-03A through AR-03E remain closed; AR-04 Baseline / closed; AR-05A Baseline / closed; AR-05B and AR-05 Baseline / closed effective upon accepted merge; AR-06 remains unstarted and owns renderer, round-trip, four-width, and positive dynamic composition proof; AR-23 eligible / unstarted; BATCH-10 complete; BATCH-11 complete; BATCH-12 complete; BATCH-13 complete upon AR-05B acceptance/merge and safe closeout; no next task</w:t>
       </w:r>
     </w:p>
     <w:p>
@@ -118,7 +118,7 @@
           <w:b/>
           <w:bCs/>
         </w:rPr>
-        <w:t>Candidate status effective upon explicit owner acceptance/merge of AR-05A:</w:t>
+        <w:t>Candidate status effective upon explicit owner acceptance/merge of AR-05B:</w:t>
       </w:r>
       <w:r>
         <w:rPr>
@@ -362,7 +362,7 @@
         <w:rPr>
           <w:rFonts w:ascii="Calibri" w:hAnsi="Calibri" w:cs="Calibri"/>
         </w:rPr>
-        <w:t xml:space="preserve">; complete original acceptance is mapped in AR_02_BOUNDARY_ACCEPTANCE.md. AR-04 is Baseline / closed. AR-05 is Partial; canonical nesting/version dispatch remains AR-05B work. AR-05A is Baseline / closed effective upon accepted merge. AR-06 remains dependent on AR-05; positive collection/search and PDP composition must be proven by its executable commerce support before enablement. AR-03 is </w:t>
+        <w:t xml:space="preserve">; complete original acceptance is mapped in AR_02_BOUNDARY_ACCEPTANCE.md. AR-04 is Baseline / closed. AR-05A is Baseline / closed. AR-05B is Baseline / closed effective upon accepted merge. AR-05 is Baseline / closed effective upon accepted merge of AR-05B; original T01/T02 acceptance is mapped in AR_05_CANONICAL_ACCEPTANCE.md. AR-06 remains unstarted and must provide the shared registered renderer, lossless Puck/save/history/publication integration, four-width evidence, and positive collection/search and PDP executable-commerce proof before enablement. AR-03 is </w:t>
       </w:r>
       <w:r>
         <w:rPr>
@@ -460,7 +460,7 @@
         <w:rPr>
           <w:rFonts w:ascii="Calibri" w:hAnsi="Calibri" w:cs="Calibri"/>
         </w:rPr>
-        <w:t xml:space="preserve">. AR-23 depends on AR-01 and is not serialized behind visual work. BATCH-03 is complete. BATCH-04 is complete. BATCH-05 is complete. BATCH-06 is complete. BATCH-07 is complete. BATCH-08 is complete. BATCH-09 is complete. BATCH-10 is complete. BATCH-11 is complete. BATCH-12 is complete upon AR-05A acceptance/merge and safe closeout. No next reset task is selected. No third task is authorized. This tracker owns current status; the roadmap owns dependency order. Retained B01 exact-next, fixed-two-call/mandatory-three-concept, transient-only, and 73-child future-sequence statements are </w:t>
+        <w:t xml:space="preserve">. AR-23 depends on AR-01 and is not serialized behind visual work. BATCH-03 is complete. BATCH-04 is complete. BATCH-05 is complete. BATCH-06 is complete. BATCH-07 is complete. BATCH-08 is complete. BATCH-09 is complete. BATCH-10 is complete. BATCH-11 is complete. BATCH-12 is complete. BATCH-13 is complete upon AR-05B acceptance/merge and safe closeout. No next reset task is selected. No third task is authorized. This tracker owns current status; the roadmap owns dependency order. Retained B01 exact-next, fixed-two-call/mandatory-three-concept, transient-only, and 73-child future-sequence statements are </w:t>
       </w:r>
       <w:r>
         <w:rPr>
@@ -518,7 +518,7 @@
         <w:rPr>
           <w:rFonts w:ascii="Calibri" w:hAnsi="Calibri" w:cs="Calibri"/>
         </w:rPr>
-        <w:t xml:space="preserve"> cover the strict compiled value, positive static binding and specific rejection of current indivisible dynamic inventories. T01/T02 snapshot nesting, explicit version dispatch and combined fingerprint participation remain AR-05B obligations. AR-06 executable commerce support, or its explicitly scoped child, must prove positive collection/search and PDP composition before composed dynamic templates are enabled. No dynamic or rendered-fidelity proof is claimed by A, and no successor implementation is authorized.</w:t>
+        <w:t xml:space="preserve"> cover the strict compiled value, positive static binding and specific rejection of current indivisible dynamic inventories. AR-05B supplies snapshot nesting, explicit version dispatch and combined fingerprint participation. AR-05A+B map original T01/T02 only upon accepted merge; AR-06 remains unstarted and must provide the shared renderer, lossless Puck/save/history/ publication integration, four-width evidence, and positive collection/search and PDP executable commerce proof before dynamic enablement. No rendered-fidelity or dynamic-positive proof is claimed.</w:t>
       </w:r>
     </w:p>
     <w:p>

</xml_diff>

<commit_message>
AR-05B: bind compiled composition to canonical snapshot versions (#258)
* feat: bind compiled composition to canonical snapshot versions

* fix: enforce canonical metadata before composition acceptance
</commit_message>
<xml_diff>
--- a/docs/VESKIFY_DEVELOPMENT_DELIVERY_TRACKER_v1.3.0.docx
+++ b/docs/VESKIFY_DEVELOPMENT_DELIVERY_TRACKER_v1.3.0.docx
@@ -51,7 +51,7 @@
         <w:rPr>
           <w:rFonts w:ascii="Calibri" w:hAnsi="Calibri" w:cs="Calibri"/>
         </w:rPr>
-        <w:t>AR-02 and AR-02A through AR-02M Baseline / closed; AR-03 and AR-03A through AR-03E remain closed; AR-04 Baseline / closed; AR-05 Partial pending AR-05B nesting/version dispatch; AR-05A Baseline / closed effective upon accepted merge; AR-06 depends on AR-05 and owns positive dynamic composition proof before enablement; AR-23 eligible / unstarted; BATCH-10 complete; BATCH-11 complete; BATCH-12 complete upon AR-05A acceptance/merge and safe closeout; no next task</w:t>
+        <w:t>AR-02 and AR-02A through AR-02M Baseline / closed; AR-03 and AR-03A through AR-03E remain closed; AR-04 Baseline / closed; AR-05A Baseline / closed; AR-05B and AR-05 Baseline / closed effective upon accepted merge; AR-06 remains unstarted and owns renderer, round-trip, four-width, and positive dynamic composition proof; AR-23 eligible / unstarted; BATCH-10 complete; BATCH-11 complete; BATCH-12 complete; BATCH-13 complete upon AR-05B acceptance/merge and safe closeout; no next task</w:t>
       </w:r>
     </w:p>
     <w:p>
@@ -118,7 +118,7 @@
           <w:b/>
           <w:bCs/>
         </w:rPr>
-        <w:t>Candidate status effective upon explicit owner acceptance/merge of AR-05A:</w:t>
+        <w:t>Candidate status effective upon explicit owner acceptance/merge of AR-05B:</w:t>
       </w:r>
       <w:r>
         <w:rPr>
@@ -362,7 +362,7 @@
         <w:rPr>
           <w:rFonts w:ascii="Calibri" w:hAnsi="Calibri" w:cs="Calibri"/>
         </w:rPr>
-        <w:t xml:space="preserve">; complete original acceptance is mapped in AR_02_BOUNDARY_ACCEPTANCE.md. AR-04 is Baseline / closed. AR-05 is Partial; canonical nesting/version dispatch remains AR-05B work. AR-05A is Baseline / closed effective upon accepted merge. AR-06 remains dependent on AR-05; positive collection/search and PDP composition must be proven by its executable commerce support before enablement. AR-03 is </w:t>
+        <w:t xml:space="preserve">; complete original acceptance is mapped in AR_02_BOUNDARY_ACCEPTANCE.md. AR-04 is Baseline / closed. AR-05A is Baseline / closed. AR-05B is Baseline / closed effective upon accepted merge. AR-05 is Baseline / closed effective upon accepted merge of AR-05B; original T01/T02 acceptance is mapped in AR_05_CANONICAL_ACCEPTANCE.md. AR-06 remains unstarted and must provide the shared registered renderer, lossless Puck/save/history/publication integration, four-width evidence, and positive collection/search and PDP executable-commerce proof before enablement. AR-03 is </w:t>
       </w:r>
       <w:r>
         <w:rPr>
@@ -460,7 +460,7 @@
         <w:rPr>
           <w:rFonts w:ascii="Calibri" w:hAnsi="Calibri" w:cs="Calibri"/>
         </w:rPr>
-        <w:t xml:space="preserve">. AR-23 depends on AR-01 and is not serialized behind visual work. BATCH-03 is complete. BATCH-04 is complete. BATCH-05 is complete. BATCH-06 is complete. BATCH-07 is complete. BATCH-08 is complete. BATCH-09 is complete. BATCH-10 is complete. BATCH-11 is complete. BATCH-12 is complete upon AR-05A acceptance/merge and safe closeout. No next reset task is selected. No third task is authorized. This tracker owns current status; the roadmap owns dependency order. Retained B01 exact-next, fixed-two-call/mandatory-three-concept, transient-only, and 73-child future-sequence statements are </w:t>
+        <w:t xml:space="preserve">. AR-23 depends on AR-01 and is not serialized behind visual work. BATCH-03 is complete. BATCH-04 is complete. BATCH-05 is complete. BATCH-06 is complete. BATCH-07 is complete. BATCH-08 is complete. BATCH-09 is complete. BATCH-10 is complete. BATCH-11 is complete. BATCH-12 is complete. BATCH-13 is complete upon AR-05B acceptance/merge and safe closeout. No next reset task is selected. No third task is authorized. This tracker owns current status; the roadmap owns dependency order. Retained B01 exact-next, fixed-two-call/mandatory-three-concept, transient-only, and 73-child future-sequence statements are </w:t>
       </w:r>
       <w:r>
         <w:rPr>
@@ -518,7 +518,7 @@
         <w:rPr>
           <w:rFonts w:ascii="Calibri" w:hAnsi="Calibri" w:cs="Calibri"/>
         </w:rPr>
-        <w:t xml:space="preserve"> cover the strict compiled value, positive static binding and specific rejection of current indivisible dynamic inventories. T01/T02 snapshot nesting, explicit version dispatch and combined fingerprint participation remain AR-05B obligations. AR-06 executable commerce support, or its explicitly scoped child, must prove positive collection/search and PDP composition before composed dynamic templates are enabled. No dynamic or rendered-fidelity proof is claimed by A, and no successor implementation is authorized.</w:t>
+        <w:t xml:space="preserve"> cover the strict compiled value, positive static binding and specific rejection of current indivisible dynamic inventories. AR-05B supplies snapshot nesting, explicit version dispatch and combined fingerprint participation. AR-05A+B map original T01/T02 only upon accepted merge; AR-06 remains unstarted and must provide the shared renderer, lossless Puck/save/history/ publication integration, four-width evidence, and positive collection/search and PDP executable commerce proof before dynamic enablement. No rendered-fidelity or dynamic-positive proof is claimed.</w:t>
       </w:r>
     </w:p>
     <w:p>

</xml_diff>

<commit_message>
feat: render validated static storefront compositions (AR-06A)
</commit_message>
<xml_diff>
--- a/docs/VESKIFY_DEVELOPMENT_DELIVERY_TRACKER_v1.3.0.docx
+++ b/docs/VESKIFY_DEVELOPMENT_DELIVERY_TRACKER_v1.3.0.docx
@@ -51,7 +51,7 @@
         <w:rPr>
           <w:rFonts w:ascii="Calibri" w:hAnsi="Calibri" w:cs="Calibri"/>
         </w:rPr>
-        <w:t>AR-02 and AR-02A through AR-02M Baseline / closed; AR-03 and AR-03A through AR-03E remain closed; AR-04 Baseline / closed; AR-05A Baseline / closed; AR-05B and AR-05 Baseline / closed effective upon accepted merge; AR-06 remains unstarted and owns renderer, round-trip, four-width, and positive dynamic composition proof; AR-23 eligible / unstarted; BATCH-10 complete; BATCH-11 complete; BATCH-12 complete; BATCH-13 complete upon AR-05B acceptance/merge and safe closeout; no next task</w:t>
+        <w:t>AR-02 and AR-02A through AR-02M Baseline / closed; AR-03 and AR-03A through AR-03E remain closed; AR-04 Baseline / closed; AR-05A Baseline / closed; AR-05B and AR-05 Baseline / closed; AR-06A Baseline / closed effective upon accepted merge; AR-06 Partial pending editor/lifecycle/publication and executable-commerce proof; AR-23 eligible / unstarted; BATCH-10 complete; BATCH-11 complete; BATCH-12 complete; BATCH-13 complete; BATCH-14 complete upon AR-06A acceptance/merge and safe closeout; no next task</w:t>
       </w:r>
     </w:p>
     <w:p>
@@ -118,7 +118,7 @@
           <w:b/>
           <w:bCs/>
         </w:rPr>
-        <w:t>Candidate status effective upon explicit owner acceptance/merge of AR-05B:</w:t>
+        <w:t>Candidate status effective upon explicit owner acceptance/merge of AR-06A:</w:t>
       </w:r>
       <w:r>
         <w:rPr>
@@ -362,7 +362,7 @@
         <w:rPr>
           <w:rFonts w:ascii="Calibri" w:hAnsi="Calibri" w:cs="Calibri"/>
         </w:rPr>
-        <w:t xml:space="preserve">; complete original acceptance is mapped in AR_02_BOUNDARY_ACCEPTANCE.md. AR-04 is Baseline / closed. AR-05A is Baseline / closed. AR-05B is Baseline / closed effective upon accepted merge. AR-05 is Baseline / closed effective upon accepted merge of AR-05B; original T01/T02 acceptance is mapped in AR_05_CANONICAL_ACCEPTANCE.md. AR-06 remains unstarted and must provide the shared registered renderer, lossless Puck/save/history/publication integration, four-width evidence, and positive collection/search and PDP executable-commerce proof before enablement. AR-03 is </w:t>
+        <w:t xml:space="preserve">; complete original acceptance is mapped in AR_02_BOUNDARY_ACCEPTANCE.md. AR-04 is Baseline / closed. AR-05A is Baseline / closed. AR-05B is Baseline / closed. AR-05 is Baseline / closed; original T01/T02 acceptance is mapped in AR_05_CANONICAL_ACCEPTANCE.md. AR-06A is Baseline / closed effective upon accepted merge. AR-06 is Partial; static rendering evidence is mapped in AR_06_RENDERING_ACCEPTANCE.md. Lossless Puck/save/history/publication integration, positive collection/search and PDP executable-commerce proof, and the shared collection/search context decision remain required before enablement. AR-03 is </w:t>
       </w:r>
       <w:r>
         <w:rPr>
@@ -460,7 +460,7 @@
         <w:rPr>
           <w:rFonts w:ascii="Calibri" w:hAnsi="Calibri" w:cs="Calibri"/>
         </w:rPr>
-        <w:t xml:space="preserve">. AR-23 depends on AR-01 and is not serialized behind visual work. BATCH-03 is complete. BATCH-04 is complete. BATCH-05 is complete. BATCH-06 is complete. BATCH-07 is complete. BATCH-08 is complete. BATCH-09 is complete. BATCH-10 is complete. BATCH-11 is complete. BATCH-12 is complete. BATCH-13 is complete upon AR-05B acceptance/merge and safe closeout. No next reset task is selected. No third task is authorized. This tracker owns current status; the roadmap owns dependency order. Retained B01 exact-next, fixed-two-call/mandatory-three-concept, transient-only, and 73-child future-sequence statements are </w:t>
+        <w:t xml:space="preserve">. AR-23 depends on AR-01 and is not serialized behind visual work. BATCH-03 is complete. BATCH-04 is complete. BATCH-05 is complete. BATCH-06 is complete. BATCH-07 is complete. BATCH-08 is complete. BATCH-09 is complete. BATCH-10 is complete. BATCH-11 is complete. BATCH-12 is complete. BATCH-13 is complete. BATCH-14 is complete upon AR-06A acceptance/merge and safe closeout. No next reset task is selected. No third task is authorized. This tracker owns current status; the roadmap owns dependency order. Retained B01 exact-next, fixed-two-call/mandatory-three-concept, transient-only, and 73-child future-sequence statements are </w:t>
       </w:r>
       <w:r>
         <w:rPr>
@@ -518,7 +518,23 @@
         <w:rPr>
           <w:rFonts w:ascii="Calibri" w:hAnsi="Calibri" w:cs="Calibri"/>
         </w:rPr>
-        <w:t xml:space="preserve"> cover the strict compiled value, positive static binding and specific rejection of current indivisible dynamic inventories. AR-05B supplies snapshot nesting, explicit version dispatch and combined fingerprint participation. AR-05A+B map original T01/T02 only upon accepted merge; AR-06 remains unstarted and must provide the shared renderer, lossless Puck/save/history/ publication integration, four-width evidence, and positive collection/search and PDP executable commerce proof before dynamic enablement. No rendered-fidelity or dynamic-positive proof is claimed.</w:t>
+        <w:t xml:space="preserve"> cover the strict compiled value, positive static binding and specific rejection of current indivisible dynamic inventories. AR-05B supplies snapshot nesting, explicit version dispatch and combined fingerprint participation. Accepted AR-05A+B satisfy original T01/T02 representation acceptance. </w:t>
+      </w:r>
+      <w:hyperlink r:id="rIdHyperlink3" w:history="1">
+        <w:r>
+          <w:rPr>
+            <w:rFonts w:ascii="Calibri" w:hAnsi="Calibri" w:cs="Calibri"/>
+            <w:color w:val="2E74B5"/>
+            <w:u w:val="single"/>
+          </w:rPr>
+          <w:t>AR-06A</w:t>
+        </w:r>
+      </w:hyperlink>
+      <w:r>
+        <w:rPr>
+          <w:rFonts w:ascii="Calibri" w:hAnsi="Calibri" w:cs="Calibri"/>
+        </w:rPr>
+        <w:t xml:space="preserve"> adds the actual shared static renderer and bounded four-width proof, effective upon its accepted merge. AR-06 remains Partial: Puck editing, save/history/publication integration, dynamic executable commerce and the shared collection/search context decision remain unproven.</w:t>
       </w:r>
     </w:p>
     <w:p>
@@ -816,7 +832,7 @@
               <w:pStyle w:val="TableText"/>
               <w:widowControl/>
             </w:pPr>
-            <w:hyperlink r:id="rIdHyperlink3" w:history="1">
+            <w:hyperlink r:id="rIdHyperlink4" w:history="1">
               <w:r>
                 <w:rPr>
                   <w:rFonts w:ascii="Calibri" w:hAnsi="Calibri" w:cs="Calibri"/>
@@ -861,7 +877,7 @@
               <w:pStyle w:val="TableText"/>
               <w:widowControl/>
             </w:pPr>
-            <w:hyperlink r:id="rIdHyperlink4" w:history="1">
+            <w:hyperlink r:id="rIdHyperlink5" w:history="1">
               <w:r>
                 <w:rPr>
                   <w:rFonts w:ascii="Calibri" w:hAnsi="Calibri" w:cs="Calibri"/>
@@ -1102,7 +1118,7 @@
               </w:rPr>
               <w:t xml:space="preserve">Separate live renderer observation and composition; </w:t>
             </w:r>
-            <w:hyperlink r:id="rIdHyperlink5" w:history="1">
+            <w:hyperlink r:id="rIdHyperlink6" w:history="1">
               <w:r>
                 <w:rPr>
                   <w:rFonts w:ascii="Calibri" w:hAnsi="Calibri" w:cs="Calibri"/>
@@ -1118,7 +1134,7 @@
               </w:rPr>
               <w:t xml:space="preserve">, </w:t>
             </w:r>
-            <w:hyperlink r:id="rIdHyperlink6" w:history="1">
+            <w:hyperlink r:id="rIdHyperlink7" w:history="1">
               <w:r>
                 <w:rPr>
                   <w:rFonts w:ascii="Calibri" w:hAnsi="Calibri" w:cs="Calibri"/>
@@ -1208,7 +1224,7 @@
               </w:rPr>
               <w:t xml:space="preserve">Extract renderer-free deterministic conformance evaluation; </w:t>
             </w:r>
-            <w:hyperlink r:id="rIdHyperlink7" w:history="1">
+            <w:hyperlink r:id="rIdHyperlink8" w:history="1">
               <w:r>
                 <w:rPr>
                   <w:rFonts w:ascii="Calibri" w:hAnsi="Calibri" w:cs="Calibri"/>
@@ -1224,7 +1240,7 @@
               </w:rPr>
               <w:t xml:space="preserve">, </w:t>
             </w:r>
-            <w:hyperlink r:id="rIdHyperlink8" w:history="1">
+            <w:hyperlink r:id="rIdHyperlink9" w:history="1">
               <w:r>
                 <w:rPr>
                   <w:rFonts w:ascii="Calibri" w:hAnsi="Calibri" w:cs="Calibri"/>
@@ -1314,7 +1330,7 @@
               </w:rPr>
               <w:t xml:space="preserve">Extract route matching and errors; </w:t>
             </w:r>
-            <w:hyperlink r:id="rIdHyperlink9" w:history="1">
+            <w:hyperlink r:id="rIdHyperlink10" w:history="1">
               <w:r>
                 <w:rPr>
                   <w:rFonts w:ascii="Calibri" w:hAnsi="Calibri" w:cs="Calibri"/>
@@ -1330,7 +1346,7 @@
               </w:rPr>
               <w:t xml:space="preserve">, </w:t>
             </w:r>
-            <w:hyperlink r:id="rIdHyperlink10" w:history="1">
+            <w:hyperlink r:id="rIdHyperlink11" w:history="1">
               <w:r>
                 <w:rPr>
                   <w:rFonts w:ascii="Calibri" w:hAnsi="Calibri" w:cs="Calibri"/>
@@ -1420,7 +1436,7 @@
               </w:rPr>
               <w:t xml:space="preserve">Extract utility metadata and remove the supported-vocabulary renderer edge; </w:t>
             </w:r>
-            <w:hyperlink r:id="rIdHyperlink11" w:history="1">
+            <w:hyperlink r:id="rIdHyperlink12" w:history="1">
               <w:r>
                 <w:rPr>
                   <w:rFonts w:ascii="Calibri" w:hAnsi="Calibri" w:cs="Calibri"/>
@@ -1436,7 +1452,7 @@
               </w:rPr>
               <w:t xml:space="preserve">, </w:t>
             </w:r>
-            <w:hyperlink r:id="rIdHyperlink12" w:history="1">
+            <w:hyperlink r:id="rIdHyperlink13" w:history="1">
               <w:r>
                 <w:rPr>
                   <w:rFonts w:ascii="Calibri" w:hAnsi="Calibri" w:cs="Calibri"/>
@@ -1526,7 +1542,7 @@
               </w:rPr>
               <w:t xml:space="preserve">Extract homepage and hero renderer-free metadata; </w:t>
             </w:r>
-            <w:hyperlink r:id="rIdHyperlink13" w:history="1">
+            <w:hyperlink r:id="rIdHyperlink14" w:history="1">
               <w:r>
                 <w:rPr>
                   <w:rFonts w:ascii="Calibri" w:hAnsi="Calibri" w:cs="Calibri"/>
@@ -1542,7 +1558,7 @@
               </w:rPr>
               <w:t xml:space="preserve">, </w:t>
             </w:r>
-            <w:hyperlink r:id="rIdHyperlink14" w:history="1">
+            <w:hyperlink r:id="rIdHyperlink15" w:history="1">
               <w:r>
                 <w:rPr>
                   <w:rFonts w:ascii="Calibri" w:hAnsi="Calibri" w:cs="Calibri"/>
@@ -1632,7 +1648,7 @@
               </w:rPr>
               <w:t xml:space="preserve">Extract collection and product renderer-free metadata; </w:t>
             </w:r>
-            <w:hyperlink r:id="rIdHyperlink15" w:history="1">
+            <w:hyperlink r:id="rIdHyperlink16" w:history="1">
               <w:r>
                 <w:rPr>
                   <w:rFonts w:ascii="Calibri" w:hAnsi="Calibri" w:cs="Calibri"/>
@@ -1648,7 +1664,7 @@
               </w:rPr>
               <w:t xml:space="preserve">, </w:t>
             </w:r>
-            <w:hyperlink r:id="rIdHyperlink16" w:history="1">
+            <w:hyperlink r:id="rIdHyperlink17" w:history="1">
               <w:r>
                 <w:rPr>
                   <w:rFonts w:ascii="Calibri" w:hAnsi="Calibri" w:cs="Calibri"/>
@@ -1738,7 +1754,7 @@
               </w:rPr>
               <w:t xml:space="preserve">Adapt V2 definitions from shared renderer-free metadata; </w:t>
             </w:r>
-            <w:hyperlink r:id="rIdHyperlink17" w:history="1">
+            <w:hyperlink r:id="rIdHyperlink18" w:history="1">
               <w:r>
                 <w:rPr>
                   <w:rFonts w:ascii="Calibri" w:hAnsi="Calibri" w:cs="Calibri"/>
@@ -1754,7 +1770,7 @@
               </w:rPr>
               <w:t xml:space="preserve">, </w:t>
             </w:r>
-            <w:hyperlink r:id="rIdHyperlink18" w:history="1">
+            <w:hyperlink r:id="rIdHyperlink19" w:history="1">
               <w:r>
                 <w:rPr>
                   <w:rFonts w:ascii="Calibri" w:hAnsi="Calibri" w:cs="Calibri"/>
@@ -1844,7 +1860,7 @@
               </w:rPr>
               <w:t xml:space="preserve">Renderer-free template capability boundary and explicit utility historical-source transition; </w:t>
             </w:r>
-            <w:hyperlink r:id="rIdHyperlink19" w:history="1">
+            <w:hyperlink r:id="rIdHyperlink20" w:history="1">
               <w:r>
                 <w:rPr>
                   <w:rFonts w:ascii="Calibri" w:hAnsi="Calibri" w:cs="Calibri"/>
@@ -1860,7 +1876,7 @@
               </w:rPr>
               <w:t xml:space="preserve">, </w:t>
             </w:r>
-            <w:hyperlink r:id="rIdHyperlink20" w:history="1">
+            <w:hyperlink r:id="rIdHyperlink21" w:history="1">
               <w:r>
                 <w:rPr>
                   <w:rFonts w:ascii="Calibri" w:hAnsi="Calibri" w:cs="Calibri"/>
@@ -1950,7 +1966,7 @@
               </w:rPr>
               <w:t xml:space="preserve">Semantic request boundary and explicit direction historical-source transition; </w:t>
             </w:r>
-            <w:hyperlink r:id="rIdHyperlink21" w:history="1">
+            <w:hyperlink r:id="rIdHyperlink22" w:history="1">
               <w:r>
                 <w:rPr>
                   <w:rFonts w:ascii="Calibri" w:hAnsi="Calibri" w:cs="Calibri"/>
@@ -1966,7 +1982,7 @@
               </w:rPr>
               <w:t xml:space="preserve">, </w:t>
             </w:r>
-            <w:hyperlink r:id="rIdHyperlink22" w:history="1">
+            <w:hyperlink r:id="rIdHyperlink23" w:history="1">
               <w:r>
                 <w:rPr>
                   <w:rFonts w:ascii="Calibri" w:hAnsi="Calibri" w:cs="Calibri"/>
@@ -2056,7 +2072,7 @@
               </w:rPr>
               <w:t xml:space="preserve">Renderer-free existing planner, recipe and provider metadata consumption; </w:t>
             </w:r>
-            <w:hyperlink r:id="rIdHyperlink23" w:history="1">
+            <w:hyperlink r:id="rIdHyperlink24" w:history="1">
               <w:r>
                 <w:rPr>
                   <w:rFonts w:ascii="Calibri" w:hAnsi="Calibri" w:cs="Calibri"/>
@@ -2072,7 +2088,7 @@
               </w:rPr>
               <w:t xml:space="preserve">, </w:t>
             </w:r>
-            <w:hyperlink r:id="rIdHyperlink24" w:history="1">
+            <w:hyperlink r:id="rIdHyperlink25" w:history="1">
               <w:r>
                 <w:rPr>
                   <w:rFonts w:ascii="Calibri" w:hAnsi="Calibri" w:cs="Calibri"/>
@@ -2088,7 +2104,7 @@
               </w:rPr>
               <w:t xml:space="preserve">, </w:t>
             </w:r>
-            <w:hyperlink r:id="rIdHyperlink25" w:history="1">
+            <w:hyperlink r:id="rIdHyperlink26" w:history="1">
               <w:r>
                 <w:rPr>
                   <w:rFonts w:ascii="Calibri" w:hAnsi="Calibri" w:cs="Calibri"/>
@@ -2178,7 +2194,7 @@
               </w:rPr>
               <w:t xml:space="preserve">Renderer-free actual provider descriptions and operation schemas; </w:t>
             </w:r>
-            <w:hyperlink r:id="rIdHyperlink26" w:history="1">
+            <w:hyperlink r:id="rIdHyperlink27" w:history="1">
               <w:r>
                 <w:rPr>
                   <w:rFonts w:ascii="Calibri" w:hAnsi="Calibri" w:cs="Calibri"/>
@@ -2194,7 +2210,7 @@
               </w:rPr>
               <w:t xml:space="preserve">, </w:t>
             </w:r>
-            <w:hyperlink r:id="rIdHyperlink27" w:history="1">
+            <w:hyperlink r:id="rIdHyperlink28" w:history="1">
               <w:r>
                 <w:rPr>
                   <w:rFonts w:ascii="Calibri" w:hAnsi="Calibri" w:cs="Calibri"/>
@@ -2284,7 +2300,7 @@
               </w:rPr>
               <w:t xml:space="preserve">Renderer-free actual governed capability and commercial grammar consumers; </w:t>
             </w:r>
-            <w:hyperlink r:id="rIdHyperlink28" w:history="1">
+            <w:hyperlink r:id="rIdHyperlink29" w:history="1">
               <w:r>
                 <w:rPr>
                   <w:rFonts w:ascii="Calibri" w:hAnsi="Calibri" w:cs="Calibri"/>
@@ -2300,7 +2316,7 @@
               </w:rPr>
               <w:t xml:space="preserve">, </w:t>
             </w:r>
-            <w:hyperlink r:id="rIdHyperlink29" w:history="1">
+            <w:hyperlink r:id="rIdHyperlink30" w:history="1">
               <w:r>
                 <w:rPr>
                   <w:rFonts w:ascii="Calibri" w:hAnsi="Calibri" w:cs="Calibri"/>
@@ -2390,7 +2406,7 @@
               </w:rPr>
               <w:t xml:space="preserve">Renderer-free semantic feature metadata; </w:t>
             </w:r>
-            <w:hyperlink r:id="rIdHyperlink30" w:history="1">
+            <w:hyperlink r:id="rIdHyperlink31" w:history="1">
               <w:r>
                 <w:rPr>
                   <w:rFonts w:ascii="Calibri" w:hAnsi="Calibri" w:cs="Calibri"/>
@@ -2406,7 +2422,7 @@
               </w:rPr>
               <w:t xml:space="preserve">, </w:t>
             </w:r>
-            <w:hyperlink r:id="rIdHyperlink31" w:history="1">
+            <w:hyperlink r:id="rIdHyperlink32" w:history="1">
               <w:r>
                 <w:rPr>
                   <w:rFonts w:ascii="Calibri" w:hAnsi="Calibri" w:cs="Calibri"/>
@@ -2496,7 +2512,7 @@
               </w:rPr>
               <w:t xml:space="preserve">Coordinated schema, direction, eligibility and actual semantic resolver metadata; </w:t>
             </w:r>
-            <w:hyperlink r:id="rIdHyperlink32" w:history="1">
+            <w:hyperlink r:id="rIdHyperlink33" w:history="1">
               <w:r>
                 <w:rPr>
                   <w:rFonts w:ascii="Calibri" w:hAnsi="Calibri" w:cs="Calibri"/>
@@ -2512,7 +2528,7 @@
               </w:rPr>
               <w:t xml:space="preserve">, </w:t>
             </w:r>
-            <w:hyperlink r:id="rIdHyperlink33" w:history="1">
+            <w:hyperlink r:id="rIdHyperlink34" w:history="1">
               <w:r>
                 <w:rPr>
                   <w:rFonts w:ascii="Calibri" w:hAnsi="Calibri" w:cs="Calibri"/>
@@ -2528,7 +2544,7 @@
               </w:rPr>
               <w:t xml:space="preserve">, </w:t>
             </w:r>
-            <w:hyperlink r:id="rIdHyperlink25" w:history="1">
+            <w:hyperlink r:id="rIdHyperlink26" w:history="1">
               <w:r>
                 <w:rPr>
                   <w:rFonts w:ascii="Calibri" w:hAnsi="Calibri" w:cs="Calibri"/>
@@ -2618,7 +2634,7 @@
               </w:rPr>
               <w:t xml:space="preserve">Renderer-free presentation construction and exact historical compatibility; </w:t>
             </w:r>
-            <w:hyperlink r:id="rIdHyperlink34" w:history="1">
+            <w:hyperlink r:id="rIdHyperlink35" w:history="1">
               <w:r>
                 <w:rPr>
                   <w:rFonts w:ascii="Calibri" w:hAnsi="Calibri" w:cs="Calibri"/>
@@ -2634,7 +2650,7 @@
               </w:rPr>
               <w:t xml:space="preserve">, </w:t>
             </w:r>
-            <w:hyperlink r:id="rIdHyperlink35" w:history="1">
+            <w:hyperlink r:id="rIdHyperlink36" w:history="1">
               <w:r>
                 <w:rPr>
                   <w:rFonts w:ascii="Calibri" w:hAnsi="Calibri" w:cs="Calibri"/>
@@ -2724,7 +2740,7 @@
               </w:rPr>
               <w:t xml:space="preserve">Current-authority validation, route projection/resolution and four preview import cutovers; </w:t>
             </w:r>
-            <w:hyperlink r:id="rIdHyperlink36" w:history="1">
+            <w:hyperlink r:id="rIdHyperlink37" w:history="1">
               <w:r>
                 <w:rPr>
                   <w:rFonts w:ascii="Calibri" w:hAnsi="Calibri" w:cs="Calibri"/>
@@ -2740,7 +2756,7 @@
               </w:rPr>
               <w:t xml:space="preserve">, </w:t>
             </w:r>
-            <w:hyperlink r:id="rIdHyperlink37" w:history="1">
+            <w:hyperlink r:id="rIdHyperlink38" w:history="1">
               <w:r>
                 <w:rPr>
                   <w:rFonts w:ascii="Calibri" w:hAnsi="Calibri" w:cs="Calibri"/>
@@ -2830,7 +2846,7 @@
               </w:rPr>
               <w:t xml:space="preserve">Design-selection contracts/operations and editor projection with three named consumer cutovers; </w:t>
             </w:r>
-            <w:hyperlink r:id="rIdHyperlink38" w:history="1">
+            <w:hyperlink r:id="rIdHyperlink39" w:history="1">
               <w:r>
                 <w:rPr>
                   <w:rFonts w:ascii="Calibri" w:hAnsi="Calibri" w:cs="Calibri"/>
@@ -2846,7 +2862,7 @@
               </w:rPr>
               <w:t xml:space="preserve">, </w:t>
             </w:r>
-            <w:hyperlink r:id="rIdHyperlink39" w:history="1">
+            <w:hyperlink r:id="rIdHyperlink40" w:history="1">
               <w:r>
                 <w:rPr>
                   <w:rFonts w:ascii="Calibri" w:hAnsi="Calibri" w:cs="Calibri"/>
@@ -2936,7 +2952,7 @@
               </w:rPr>
               <w:t xml:space="preserve">Legacy migration, distinct transient projections and shared bridge schemas; </w:t>
             </w:r>
-            <w:hyperlink r:id="rIdHyperlink40" w:history="1">
+            <w:hyperlink r:id="rIdHyperlink41" w:history="1">
               <w:r>
                 <w:rPr>
                   <w:rFonts w:ascii="Calibri" w:hAnsi="Calibri" w:cs="Calibri"/>
@@ -2952,7 +2968,7 @@
               </w:rPr>
               <w:t xml:space="preserve">, </w:t>
             </w:r>
-            <w:hyperlink r:id="rIdHyperlink41" w:history="1">
+            <w:hyperlink r:id="rIdHyperlink42" w:history="1">
               <w:r>
                 <w:rPr>
                   <w:rFonts w:ascii="Calibri" w:hAnsi="Calibri" w:cs="Calibri"/>
@@ -2968,7 +2984,7 @@
               </w:rPr>
               <w:t xml:space="preserve">, </w:t>
             </w:r>
-            <w:hyperlink r:id="rIdHyperlink42" w:history="1">
+            <w:hyperlink r:id="rIdHyperlink43" w:history="1">
               <w:r>
                 <w:rPr>
                   <w:rFonts w:ascii="Calibri" w:hAnsi="Calibri" w:cs="Calibri"/>
@@ -3008,6 +3024,80 @@
         <w:pStyle w:val="Normal"/>
         <w:widowControl/>
       </w:pPr>
+    </w:p>
+    <w:p>
+      <w:pPr>
+        <w:pStyle w:val="Normal"/>
+        <w:widowControl/>
+      </w:pPr>
+      <w:r>
+        <w:rPr>
+          <w:rFonts w:ascii="Calibri" w:hAnsi="Calibri" w:cs="Calibri"/>
+        </w:rPr>
+        <w:t xml:space="preserve">| AR-06A | AR-06 | Shared static renderer and stack/offset proof in EN/FI at four widths; </w:t>
+      </w:r>
+      <w:hyperlink r:id="rIdHyperlink44" w:history="1">
+        <w:r>
+          <w:rPr>
+            <w:rFonts w:ascii="Calibri" w:hAnsi="Calibri" w:cs="Calibri"/>
+            <w:color w:val="2E74B5"/>
+            <w:u w:val="single"/>
+          </w:rPr>
+          <w:t>contract</w:t>
+        </w:r>
+      </w:hyperlink>
+      <w:r>
+        <w:rPr>
+          <w:rFonts w:ascii="Calibri" w:hAnsi="Calibri" w:cs="Calibri"/>
+        </w:rPr>
+        <w:t xml:space="preserve">, </w:t>
+      </w:r>
+      <w:hyperlink r:id="rIdHyperlink45" w:history="1">
+        <w:r>
+          <w:rPr>
+            <w:rFonts w:ascii="Calibri" w:hAnsi="Calibri" w:cs="Calibri"/>
+            <w:color w:val="2E74B5"/>
+            <w:u w:val="single"/>
+          </w:rPr>
+          <w:t>report</w:t>
+        </w:r>
+      </w:hyperlink>
+      <w:r>
+        <w:rPr>
+          <w:rFonts w:ascii="Calibri" w:hAnsi="Calibri" w:cs="Calibri"/>
+        </w:rPr>
+        <w:t xml:space="preserve">, </w:t>
+      </w:r>
+      <w:hyperlink r:id="rIdHyperlink3" w:history="1">
+        <w:r>
+          <w:rPr>
+            <w:rFonts w:ascii="Calibri" w:hAnsi="Calibri" w:cs="Calibri"/>
+            <w:color w:val="2E74B5"/>
+            <w:u w:val="single"/>
+          </w:rPr>
+          <w:t>parent evidence</w:t>
+        </w:r>
+      </w:hyperlink>
+      <w:r>
+        <w:rPr>
+          <w:rFonts w:ascii="Calibri" w:hAnsi="Calibri" w:cs="Calibri"/>
+        </w:rPr>
+        <w:t xml:space="preserve"> | </w:t>
+      </w:r>
+      <w:r>
+        <w:rPr>
+          <w:rFonts w:ascii="Calibri" w:hAnsi="Calibri" w:cs="Calibri"/>
+          <w:b/>
+          <w:bCs/>
+        </w:rPr>
+        <w:t>Baseline / closed effective upon accepted merge</w:t>
+      </w:r>
+      <w:r>
+        <w:rPr>
+          <w:rFonts w:ascii="Calibri" w:hAnsi="Calibri" w:cs="Calibri"/>
+        </w:rPr>
+        <w:t xml:space="preserve"> |</w:t>
+      </w:r>
     </w:p>
     <w:p>
       <w:pPr>
@@ -22933,7 +23023,7 @@
         </w:rPr>
         <w:t xml:space="preserve">. Completed 7 August 2026; see </w:t>
       </w:r>
-      <w:hyperlink r:id="rIdHyperlink43" w:history="1">
+      <w:hyperlink r:id="rIdHyperlink46" w:history="1">
         <w:r>
           <w:rPr>
             <w:rFonts w:ascii="Calibri" w:hAnsi="Calibri" w:cs="Calibri"/>
@@ -23070,7 +23160,7 @@
         </w:rPr>
         <w:t xml:space="preserve">The binding details and minimum coverage are in </w:t>
       </w:r>
-      <w:hyperlink r:id="rIdHyperlink44" w:history="1">
+      <w:hyperlink r:id="rIdHyperlink47" w:history="1">
         <w:r>
           <w:rPr>
             <w:rFonts w:ascii="Calibri" w:hAnsi="Calibri" w:cs="Calibri"/>
@@ -23268,7 +23358,7 @@
         </w:rPr>
         <w:t xml:space="preserve">. P10B-16P-04 acceptance evidence is retained in </w:t>
       </w:r>
-      <w:hyperlink r:id="rIdHyperlink45" w:history="1">
+      <w:hyperlink r:id="rIdHyperlink48" w:history="1">
         <w:r>
           <w:rPr>
             <w:rFonts w:ascii="Calibri" w:hAnsi="Calibri" w:cs="Calibri"/>
@@ -23517,7 +23607,7 @@
         </w:rPr>
         <w:t xml:space="preserve">. See </w:t>
       </w:r>
-      <w:hyperlink r:id="rIdHyperlink46" w:history="1">
+      <w:hyperlink r:id="rIdHyperlink49" w:history="1">
         <w:r>
           <w:rPr>
             <w:rFonts w:ascii="Calibri" w:hAnsi="Calibri" w:cs="Calibri"/>
@@ -23766,7 +23856,7 @@
         </w:rPr>
         <w:t xml:space="preserve">. See </w:t>
       </w:r>
-      <w:hyperlink r:id="rIdHyperlink47" w:history="1">
+      <w:hyperlink r:id="rIdHyperlink50" w:history="1">
         <w:r>
           <w:rPr>
             <w:rFonts w:ascii="Calibri" w:hAnsi="Calibri" w:cs="Calibri"/>
@@ -24015,7 +24105,7 @@
         </w:rPr>
         <w:t xml:space="preserve">. At P10B-03 delivery, all then-current 25 V2 definitions and 91 variants were classified explicitly without false commercial-ready promotion. Later family tasks extend that same authority rather than replacing it. See </w:t>
       </w:r>
-      <w:hyperlink r:id="rIdHyperlink48" w:history="1">
+      <w:hyperlink r:id="rIdHyperlink51" w:history="1">
         <w:r>
           <w:rPr>
             <w:rFonts w:ascii="Calibri" w:hAnsi="Calibri" w:cs="Calibri"/>
@@ -24264,7 +24354,7 @@
         </w:rPr>
         <w:t xml:space="preserve"> embeds exact lineage and bounded treatment in the existing approved presentation, consumes Design DNA and registered anatomy, projects protected same-product media, preserves authority through lifecycle/compiler boundaries, and renders semantic four-breakpoint evidence. Production CDN transforms and retained commercial visual acceptance remain deferred. See </w:t>
       </w:r>
-      <w:hyperlink r:id="rIdHyperlink49" w:history="1">
+      <w:hyperlink r:id="rIdHyperlink52" w:history="1">
         <w:r>
           <w:rPr>
             <w:rFonts w:ascii="Calibri" w:hAnsi="Calibri" w:cs="Calibri"/>
@@ -24513,7 +24603,7 @@
         </w:rPr>
         <w:t xml:space="preserve">. See </w:t>
       </w:r>
-      <w:hyperlink r:id="rIdHyperlink50" w:history="1">
+      <w:hyperlink r:id="rIdHyperlink53" w:history="1">
         <w:r>
           <w:rPr>
             <w:rFonts w:ascii="Calibri" w:hAnsi="Calibri" w:cs="Calibri"/>
@@ -24748,7 +24838,7 @@
         </w:rPr>
         <w:t xml:space="preserve">. Four exact root-frame profiles, three mobile modes, and four footer compositions preserve canonical navigation and frame identity through snapshot, save/reload, Puck root, preview, publication compilation, EN/FI, and 375/768/1024/1440 px evidence. See </w:t>
       </w:r>
-      <w:hyperlink r:id="rIdHyperlink51" w:history="1">
+      <w:hyperlink r:id="rIdHyperlink54" w:history="1">
         <w:r>
           <w:rPr>
             <w:rFonts w:ascii="Calibri" w:hAnsi="Calibri" w:cs="Calibri"/>
@@ -24983,7 +25073,7 @@
         </w:rPr>
         <w:t xml:space="preserve">. Six meaningful hero anatomies, five editorial/story anatomies, five campaign/promotion anatomies and three evidence-grounded proof/service anatomies are registered, PageBlueprint-selectable, deterministically generated, snapshot/publish preserved and rendered through one shared implementation. Focused deterministic coverage and a zero-provider Chromium scenario retain evidence at 375, 768, 1024 and 1440 px. See </w:t>
       </w:r>
-      <w:hyperlink r:id="rIdHyperlink52" w:history="1">
+      <w:hyperlink r:id="rIdHyperlink55" w:history="1">
         <w:r>
           <w:rPr>
             <w:rFonts w:ascii="Calibri" w:hAnsi="Calibri" w:cs="Calibri"/>
@@ -25032,7 +25122,7 @@
         </w:rPr>
         <w:t xml:space="preserve"> Baseline. One fingerprinted authority and renderer now serve homepage merchandising, collection/results, related products, and legacy compatibility. Five meaningful anatomies preserve canonical facts and P10B-04 media lineage through plan, proposal, snapshot, save/reload, publish, and responsive browser evidence. See </w:t>
       </w:r>
-      <w:hyperlink r:id="rIdHyperlink53" w:history="1">
+      <w:hyperlink r:id="rIdHyperlink56" w:history="1">
         <w:r>
           <w:rPr>
             <w:rFonts w:ascii="Calibri" w:hAnsi="Calibri" w:cs="Calibri"/>
@@ -25249,7 +25339,7 @@
         </w:rPr>
         <w:t xml:space="preserve"> Baseline. Six versioned, structurally fingerprinted homepage PageBlueprint profiles compose current shared-frame, commercial storytelling, canonical product-card, approved-media, and Design DNA authority. Evidence/cardinality guards fail closed; deterministic lifecycle and 24 retained four-width browser images pass. See </w:t>
       </w:r>
-      <w:hyperlink r:id="rIdHyperlink54" w:history="1">
+      <w:hyperlink r:id="rIdHyperlink57" w:history="1">
         <w:r>
           <w:rPr>
             <w:rFonts w:ascii="Calibri" w:hAnsi="Calibri" w:cs="Calibri"/>
@@ -25480,7 +25570,7 @@
         </w:rPr>
         <w:t xml:space="preserve"> anatomy, P10B-08 canonical card anatomy, and P10B-04 approved media treatment. Exact canonical catalogue bindings preserve product membership/order, facts, product media, filters/sort state, and child-collection order. Campaign media is approved collection/editorial media, not a product-media replacement. A transient revision-checked zero-result context keeps the query without fabricating products. Deterministic lifecycle and 16-view Chromium evidence pass with zero provider calls. See </w:t>
       </w:r>
-      <w:hyperlink r:id="rIdHyperlink55" w:history="1">
+      <w:hyperlink r:id="rIdHyperlink58" w:history="1">
         <w:r>
           <w:rPr>
             <w:rFonts w:ascii="Calibri" w:hAnsi="Calibri" w:cs="Calibri"/>
@@ -26010,7 +26100,7 @@
         </w:rPr>
         <w:t xml:space="preserve">. Fifteen structurally distinct registered profiles resolve exact current approved brief evidence into strict localized fact documents. P10B-05 preserves page-set, route, locale, and transitive navigation authority; P10B-06 frames and P10B-07 editorial/campaign renderers are reused. Snapshot save/reload and deterministic publication preserve the exact document. See </w:t>
       </w:r>
-      <w:hyperlink r:id="rIdHyperlink56" w:history="1">
+      <w:hyperlink r:id="rIdHyperlink59" w:history="1">
         <w:r>
           <w:rPr>
             <w:rFonts w:ascii="Calibri" w:hAnsi="Calibri" w:cs="Calibri"/>
@@ -26221,7 +26311,7 @@
         </w:rPr>
         <w:t xml:space="preserve"> component through the P10B-05 family page; registered loading state renders on its pending route instead of replacing the 404 singleton. Read-only runtime state supplies canonical cart facts, checkout continuation, P10B-10 query/filter context, and bounded recovery actions while the snapshot preserves presentation only. Shared-frame/Design DNA, save/reload, publication, four- width browser evidence, and no-provider behavior are covered under </w:t>
       </w:r>
-      <w:hyperlink r:id="rIdHyperlink57" w:history="1">
+      <w:hyperlink r:id="rIdHyperlink60" w:history="1">
         <w:r>
           <w:rPr>
             <w:rFonts w:ascii="Calibri" w:hAnsi="Calibri" w:cs="Calibri"/>
@@ -26432,7 +26522,7 @@
         </w:rPr>
         <w:t xml:space="preserve"> frame span all pages; simple/configurable PDP, factual content, utility states, 15 four-width/representative screenshots and the passing 160-scenario human record are retained in </w:t>
       </w:r>
-      <w:hyperlink r:id="rIdHyperlink58" w:history="1">
+      <w:hyperlink r:id="rIdHyperlink61" w:history="1">
         <w:r>
           <w:rPr>
             <w:rFonts w:ascii="Calibri" w:hAnsi="Calibri" w:cs="Calibri"/>
@@ -26643,7 +26733,7 @@
         </w:rPr>
         <w:t xml:space="preserve"> One versioned deterministic synthesis contract binds exact merchant, evidence, commerce, asset, Design DNA, site-map, frame, PageBlueprint/profile, component/anatomy, narrative, density, art-direction, responsive, planner, registry and recipe authority. The same approved fixture produces editorial-heavy, commerce/discovery-heavy and restrained/minimal complete 17-route stores through the existing whole-storefront proposal, snapshot, save/reload, renderer and immutable publication chain. Details are retained in </w:t>
       </w:r>
-      <w:hyperlink r:id="rIdHyperlink59" w:history="1">
+      <w:hyperlink r:id="rIdHyperlink62" w:history="1">
         <w:r>
           <w:rPr>
             <w:rFonts w:ascii="Calibri" w:hAnsi="Calibri" w:cs="Calibri"/>
@@ -26888,7 +26978,7 @@
         </w:rPr>
         <w:t xml:space="preserve"> 31 focused unit/integration cases; nine representative complete outcomes; exact save/reload and compiled publication; protected commerce/evidence/media parity; dedicated 375/768/1024/1440 browser coverage; three retained human commercial reviews and one exact evidence manifest. See </w:t>
       </w:r>
-      <w:hyperlink r:id="rIdHyperlink60" w:history="1">
+      <w:hyperlink r:id="rIdHyperlink63" w:history="1">
         <w:r>
           <w:rPr>
             <w:rFonts w:ascii="Calibri" w:hAnsi="Calibri" w:cs="Calibri"/>
@@ -27065,7 +27155,7 @@
         </w:rPr>
         <w:t xml:space="preserve"> A compact route inventory, four collection/search archetypes, four maintained PDP profiles plus generic fallback, exact collection and product-type mappings, bounded matching rules, transient editor/runtime projection, deterministic legacy convergence, and complete snapshot/lifecycle/publication preservation. Exact primary and related-product bindings survive convergence. A server-owned, storefront-scoped proposal transition binds legacy and reviewed canonical projections for deterministic acceptance replay. Storefront Studio lists archetypes rather than one page per commerce URL; representative context is not persisted. See </w:t>
       </w:r>
-      <w:hyperlink r:id="rIdHyperlink61" w:history="1">
+      <w:hyperlink r:id="rIdHyperlink64" w:history="1">
         <w:r>
           <w:rPr>
             <w:rFonts w:ascii="Calibri" w:hAnsi="Calibri" w:cs="Calibri"/>
@@ -27533,7 +27623,7 @@
         </w:rPr>
         <w:t xml:space="preserve"> </w:t>
       </w:r>
-      <w:hyperlink r:id="rIdHyperlink62" w:history="1">
+      <w:hyperlink r:id="rIdHyperlink65" w:history="1">
         <w:r>
           <w:rPr>
             <w:rFonts w:ascii="Calibri" w:hAnsi="Calibri" w:cs="Calibri"/>
@@ -27994,7 +28084,7 @@
         </w:rPr>
         <w:t xml:space="preserve">. Completed 15 August 2026; see </w:t>
       </w:r>
-      <w:hyperlink r:id="rIdHyperlink45" w:history="1">
+      <w:hyperlink r:id="rIdHyperlink48" w:history="1">
         <w:r>
           <w:rPr>
             <w:rFonts w:ascii="Calibri" w:hAnsi="Calibri" w:cs="Calibri"/>
@@ -29256,7 +29346,7 @@
         </w:rPr>
         <w:t xml:space="preserve">. Accepted by the product owner on 16 August 2026 under </w:t>
       </w:r>
-      <w:hyperlink r:id="rIdHyperlink63" w:history="1">
+      <w:hyperlink r:id="rIdHyperlink66" w:history="1">
         <w:r>
           <w:rPr>
             <w:rFonts w:ascii="Calibri" w:hAnsi="Calibri" w:cs="Calibri"/>
@@ -29614,7 +29704,7 @@
         </w:rPr>
         <w:t xml:space="preserve">. Accepted by the product owner on 17 August 2026 under </w:t>
       </w:r>
-      <w:hyperlink r:id="rIdHyperlink63" w:history="1">
+      <w:hyperlink r:id="rIdHyperlink66" w:history="1">
         <w:r>
           <w:rPr>
             <w:rFonts w:ascii="Calibri" w:hAnsi="Calibri" w:cs="Calibri"/>
@@ -32754,7 +32844,7 @@
         </w:rPr>
         <w:t xml:space="preserve"> </w:t>
       </w:r>
-      <w:hyperlink r:id="rIdHyperlink64" w:history="1">
+      <w:hyperlink r:id="rIdHyperlink67" w:history="1">
         <w:r>
           <w:rPr>
             <w:rFonts w:ascii="Calibri" w:hAnsi="Calibri" w:cs="Calibri"/>
@@ -32770,7 +32860,7 @@
         </w:rPr>
         <w:t xml:space="preserve"> and </w:t>
       </w:r>
-      <w:hyperlink r:id="rIdHyperlink65" w:history="1">
+      <w:hyperlink r:id="rIdHyperlink68" w:history="1">
         <w:r>
           <w:rPr>
             <w:rFonts w:ascii="Calibri" w:hAnsi="Calibri" w:cs="Calibri"/>

</xml_diff>

<commit_message>
AR-06A: render validated static storefront compositions (#259)
* feat: render validated static storefront compositions (AR-06A)

* fix(ar-06a): retain validated authority and scope source guard

* fix(ar-06a): preserve the complete historical test pin chain
</commit_message>
<xml_diff>
--- a/docs/VESKIFY_DEVELOPMENT_DELIVERY_TRACKER_v1.3.0.docx
+++ b/docs/VESKIFY_DEVELOPMENT_DELIVERY_TRACKER_v1.3.0.docx
@@ -51,7 +51,7 @@
         <w:rPr>
           <w:rFonts w:ascii="Calibri" w:hAnsi="Calibri" w:cs="Calibri"/>
         </w:rPr>
-        <w:t>AR-02 and AR-02A through AR-02M Baseline / closed; AR-03 and AR-03A through AR-03E remain closed; AR-04 Baseline / closed; AR-05A Baseline / closed; AR-05B and AR-05 Baseline / closed effective upon accepted merge; AR-06 remains unstarted and owns renderer, round-trip, four-width, and positive dynamic composition proof; AR-23 eligible / unstarted; BATCH-10 complete; BATCH-11 complete; BATCH-12 complete; BATCH-13 complete upon AR-05B acceptance/merge and safe closeout; no next task</w:t>
+        <w:t>AR-02 and AR-02A through AR-02M Baseline / closed; AR-03 and AR-03A through AR-03E remain closed; AR-04 Baseline / closed; AR-05A Baseline / closed; AR-05B and AR-05 Baseline / closed; AR-06A Baseline / closed effective upon accepted merge; AR-06 Partial pending editor/lifecycle/publication and executable-commerce proof; AR-23 eligible / unstarted; BATCH-10 complete; BATCH-11 complete; BATCH-12 complete; BATCH-13 complete; BATCH-14 complete upon AR-06A acceptance/merge and safe closeout; no next task</w:t>
       </w:r>
     </w:p>
     <w:p>
@@ -118,7 +118,7 @@
           <w:b/>
           <w:bCs/>
         </w:rPr>
-        <w:t>Candidate status effective upon explicit owner acceptance/merge of AR-05B:</w:t>
+        <w:t>Candidate status effective upon explicit owner acceptance/merge of AR-06A:</w:t>
       </w:r>
       <w:r>
         <w:rPr>
@@ -362,7 +362,7 @@
         <w:rPr>
           <w:rFonts w:ascii="Calibri" w:hAnsi="Calibri" w:cs="Calibri"/>
         </w:rPr>
-        <w:t xml:space="preserve">; complete original acceptance is mapped in AR_02_BOUNDARY_ACCEPTANCE.md. AR-04 is Baseline / closed. AR-05A is Baseline / closed. AR-05B is Baseline / closed effective upon accepted merge. AR-05 is Baseline / closed effective upon accepted merge of AR-05B; original T01/T02 acceptance is mapped in AR_05_CANONICAL_ACCEPTANCE.md. AR-06 remains unstarted and must provide the shared registered renderer, lossless Puck/save/history/publication integration, four-width evidence, and positive collection/search and PDP executable-commerce proof before enablement. AR-03 is </w:t>
+        <w:t xml:space="preserve">; complete original acceptance is mapped in AR_02_BOUNDARY_ACCEPTANCE.md. AR-04 is Baseline / closed. AR-05A is Baseline / closed. AR-05B is Baseline / closed. AR-05 is Baseline / closed; original T01/T02 acceptance is mapped in AR_05_CANONICAL_ACCEPTANCE.md. AR-06A is Baseline / closed effective upon accepted merge. AR-06 is Partial; static rendering evidence is mapped in AR_06_RENDERING_ACCEPTANCE.md. Lossless Puck/save/history/publication integration, positive collection/search and PDP executable-commerce proof, and the shared collection/search context decision remain required before enablement. AR-03 is </w:t>
       </w:r>
       <w:r>
         <w:rPr>
@@ -460,7 +460,7 @@
         <w:rPr>
           <w:rFonts w:ascii="Calibri" w:hAnsi="Calibri" w:cs="Calibri"/>
         </w:rPr>
-        <w:t xml:space="preserve">. AR-23 depends on AR-01 and is not serialized behind visual work. BATCH-03 is complete. BATCH-04 is complete. BATCH-05 is complete. BATCH-06 is complete. BATCH-07 is complete. BATCH-08 is complete. BATCH-09 is complete. BATCH-10 is complete. BATCH-11 is complete. BATCH-12 is complete. BATCH-13 is complete upon AR-05B acceptance/merge and safe closeout. No next reset task is selected. No third task is authorized. This tracker owns current status; the roadmap owns dependency order. Retained B01 exact-next, fixed-two-call/mandatory-three-concept, transient-only, and 73-child future-sequence statements are </w:t>
+        <w:t xml:space="preserve">. AR-23 depends on AR-01 and is not serialized behind visual work. BATCH-03 is complete. BATCH-04 is complete. BATCH-05 is complete. BATCH-06 is complete. BATCH-07 is complete. BATCH-08 is complete. BATCH-09 is complete. BATCH-10 is complete. BATCH-11 is complete. BATCH-12 is complete. BATCH-13 is complete. BATCH-14 is complete upon AR-06A acceptance/merge and safe closeout. No next reset task is selected. No third task is authorized. This tracker owns current status; the roadmap owns dependency order. Retained B01 exact-next, fixed-two-call/mandatory-three-concept, transient-only, and 73-child future-sequence statements are </w:t>
       </w:r>
       <w:r>
         <w:rPr>
@@ -518,7 +518,23 @@
         <w:rPr>
           <w:rFonts w:ascii="Calibri" w:hAnsi="Calibri" w:cs="Calibri"/>
         </w:rPr>
-        <w:t xml:space="preserve"> cover the strict compiled value, positive static binding and specific rejection of current indivisible dynamic inventories. AR-05B supplies snapshot nesting, explicit version dispatch and combined fingerprint participation. AR-05A+B map original T01/T02 only upon accepted merge; AR-06 remains unstarted and must provide the shared renderer, lossless Puck/save/history/ publication integration, four-width evidence, and positive collection/search and PDP executable commerce proof before dynamic enablement. No rendered-fidelity or dynamic-positive proof is claimed.</w:t>
+        <w:t xml:space="preserve"> cover the strict compiled value, positive static binding and specific rejection of current indivisible dynamic inventories. AR-05B supplies snapshot nesting, explicit version dispatch and combined fingerprint participation. Accepted AR-05A+B satisfy original T01/T02 representation acceptance. </w:t>
+      </w:r>
+      <w:hyperlink r:id="rIdHyperlink3" w:history="1">
+        <w:r>
+          <w:rPr>
+            <w:rFonts w:ascii="Calibri" w:hAnsi="Calibri" w:cs="Calibri"/>
+            <w:color w:val="2E74B5"/>
+            <w:u w:val="single"/>
+          </w:rPr>
+          <w:t>AR-06A</w:t>
+        </w:r>
+      </w:hyperlink>
+      <w:r>
+        <w:rPr>
+          <w:rFonts w:ascii="Calibri" w:hAnsi="Calibri" w:cs="Calibri"/>
+        </w:rPr>
+        <w:t xml:space="preserve"> adds the actual shared static renderer and bounded four-width proof, effective upon its accepted merge. AR-06 remains Partial: Puck editing, save/history/publication integration, dynamic executable commerce and the shared collection/search context decision remain unproven.</w:t>
       </w:r>
     </w:p>
     <w:p>
@@ -816,7 +832,7 @@
               <w:pStyle w:val="TableText"/>
               <w:widowControl/>
             </w:pPr>
-            <w:hyperlink r:id="rIdHyperlink3" w:history="1">
+            <w:hyperlink r:id="rIdHyperlink4" w:history="1">
               <w:r>
                 <w:rPr>
                   <w:rFonts w:ascii="Calibri" w:hAnsi="Calibri" w:cs="Calibri"/>
@@ -861,7 +877,7 @@
               <w:pStyle w:val="TableText"/>
               <w:widowControl/>
             </w:pPr>
-            <w:hyperlink r:id="rIdHyperlink4" w:history="1">
+            <w:hyperlink r:id="rIdHyperlink5" w:history="1">
               <w:r>
                 <w:rPr>
                   <w:rFonts w:ascii="Calibri" w:hAnsi="Calibri" w:cs="Calibri"/>
@@ -1102,7 +1118,7 @@
               </w:rPr>
               <w:t xml:space="preserve">Separate live renderer observation and composition; </w:t>
             </w:r>
-            <w:hyperlink r:id="rIdHyperlink5" w:history="1">
+            <w:hyperlink r:id="rIdHyperlink6" w:history="1">
               <w:r>
                 <w:rPr>
                   <w:rFonts w:ascii="Calibri" w:hAnsi="Calibri" w:cs="Calibri"/>
@@ -1118,7 +1134,7 @@
               </w:rPr>
               <w:t xml:space="preserve">, </w:t>
             </w:r>
-            <w:hyperlink r:id="rIdHyperlink6" w:history="1">
+            <w:hyperlink r:id="rIdHyperlink7" w:history="1">
               <w:r>
                 <w:rPr>
                   <w:rFonts w:ascii="Calibri" w:hAnsi="Calibri" w:cs="Calibri"/>
@@ -1208,7 +1224,7 @@
               </w:rPr>
               <w:t xml:space="preserve">Extract renderer-free deterministic conformance evaluation; </w:t>
             </w:r>
-            <w:hyperlink r:id="rIdHyperlink7" w:history="1">
+            <w:hyperlink r:id="rIdHyperlink8" w:history="1">
               <w:r>
                 <w:rPr>
                   <w:rFonts w:ascii="Calibri" w:hAnsi="Calibri" w:cs="Calibri"/>
@@ -1224,7 +1240,7 @@
               </w:rPr>
               <w:t xml:space="preserve">, </w:t>
             </w:r>
-            <w:hyperlink r:id="rIdHyperlink8" w:history="1">
+            <w:hyperlink r:id="rIdHyperlink9" w:history="1">
               <w:r>
                 <w:rPr>
                   <w:rFonts w:ascii="Calibri" w:hAnsi="Calibri" w:cs="Calibri"/>
@@ -1314,7 +1330,7 @@
               </w:rPr>
               <w:t xml:space="preserve">Extract route matching and errors; </w:t>
             </w:r>
-            <w:hyperlink r:id="rIdHyperlink9" w:history="1">
+            <w:hyperlink r:id="rIdHyperlink10" w:history="1">
               <w:r>
                 <w:rPr>
                   <w:rFonts w:ascii="Calibri" w:hAnsi="Calibri" w:cs="Calibri"/>
@@ -1330,7 +1346,7 @@
               </w:rPr>
               <w:t xml:space="preserve">, </w:t>
             </w:r>
-            <w:hyperlink r:id="rIdHyperlink10" w:history="1">
+            <w:hyperlink r:id="rIdHyperlink11" w:history="1">
               <w:r>
                 <w:rPr>
                   <w:rFonts w:ascii="Calibri" w:hAnsi="Calibri" w:cs="Calibri"/>
@@ -1420,7 +1436,7 @@
               </w:rPr>
               <w:t xml:space="preserve">Extract utility metadata and remove the supported-vocabulary renderer edge; </w:t>
             </w:r>
-            <w:hyperlink r:id="rIdHyperlink11" w:history="1">
+            <w:hyperlink r:id="rIdHyperlink12" w:history="1">
               <w:r>
                 <w:rPr>
                   <w:rFonts w:ascii="Calibri" w:hAnsi="Calibri" w:cs="Calibri"/>
@@ -1436,7 +1452,7 @@
               </w:rPr>
               <w:t xml:space="preserve">, </w:t>
             </w:r>
-            <w:hyperlink r:id="rIdHyperlink12" w:history="1">
+            <w:hyperlink r:id="rIdHyperlink13" w:history="1">
               <w:r>
                 <w:rPr>
                   <w:rFonts w:ascii="Calibri" w:hAnsi="Calibri" w:cs="Calibri"/>
@@ -1526,7 +1542,7 @@
               </w:rPr>
               <w:t xml:space="preserve">Extract homepage and hero renderer-free metadata; </w:t>
             </w:r>
-            <w:hyperlink r:id="rIdHyperlink13" w:history="1">
+            <w:hyperlink r:id="rIdHyperlink14" w:history="1">
               <w:r>
                 <w:rPr>
                   <w:rFonts w:ascii="Calibri" w:hAnsi="Calibri" w:cs="Calibri"/>
@@ -1542,7 +1558,7 @@
               </w:rPr>
               <w:t xml:space="preserve">, </w:t>
             </w:r>
-            <w:hyperlink r:id="rIdHyperlink14" w:history="1">
+            <w:hyperlink r:id="rIdHyperlink15" w:history="1">
               <w:r>
                 <w:rPr>
                   <w:rFonts w:ascii="Calibri" w:hAnsi="Calibri" w:cs="Calibri"/>
@@ -1632,7 +1648,7 @@
               </w:rPr>
               <w:t xml:space="preserve">Extract collection and product renderer-free metadata; </w:t>
             </w:r>
-            <w:hyperlink r:id="rIdHyperlink15" w:history="1">
+            <w:hyperlink r:id="rIdHyperlink16" w:history="1">
               <w:r>
                 <w:rPr>
                   <w:rFonts w:ascii="Calibri" w:hAnsi="Calibri" w:cs="Calibri"/>
@@ -1648,7 +1664,7 @@
               </w:rPr>
               <w:t xml:space="preserve">, </w:t>
             </w:r>
-            <w:hyperlink r:id="rIdHyperlink16" w:history="1">
+            <w:hyperlink r:id="rIdHyperlink17" w:history="1">
               <w:r>
                 <w:rPr>
                   <w:rFonts w:ascii="Calibri" w:hAnsi="Calibri" w:cs="Calibri"/>
@@ -1738,7 +1754,7 @@
               </w:rPr>
               <w:t xml:space="preserve">Adapt V2 definitions from shared renderer-free metadata; </w:t>
             </w:r>
-            <w:hyperlink r:id="rIdHyperlink17" w:history="1">
+            <w:hyperlink r:id="rIdHyperlink18" w:history="1">
               <w:r>
                 <w:rPr>
                   <w:rFonts w:ascii="Calibri" w:hAnsi="Calibri" w:cs="Calibri"/>
@@ -1754,7 +1770,7 @@
               </w:rPr>
               <w:t xml:space="preserve">, </w:t>
             </w:r>
-            <w:hyperlink r:id="rIdHyperlink18" w:history="1">
+            <w:hyperlink r:id="rIdHyperlink19" w:history="1">
               <w:r>
                 <w:rPr>
                   <w:rFonts w:ascii="Calibri" w:hAnsi="Calibri" w:cs="Calibri"/>
@@ -1844,7 +1860,7 @@
               </w:rPr>
               <w:t xml:space="preserve">Renderer-free template capability boundary and explicit utility historical-source transition; </w:t>
             </w:r>
-            <w:hyperlink r:id="rIdHyperlink19" w:history="1">
+            <w:hyperlink r:id="rIdHyperlink20" w:history="1">
               <w:r>
                 <w:rPr>
                   <w:rFonts w:ascii="Calibri" w:hAnsi="Calibri" w:cs="Calibri"/>
@@ -1860,7 +1876,7 @@
               </w:rPr>
               <w:t xml:space="preserve">, </w:t>
             </w:r>
-            <w:hyperlink r:id="rIdHyperlink20" w:history="1">
+            <w:hyperlink r:id="rIdHyperlink21" w:history="1">
               <w:r>
                 <w:rPr>
                   <w:rFonts w:ascii="Calibri" w:hAnsi="Calibri" w:cs="Calibri"/>
@@ -1950,7 +1966,7 @@
               </w:rPr>
               <w:t xml:space="preserve">Semantic request boundary and explicit direction historical-source transition; </w:t>
             </w:r>
-            <w:hyperlink r:id="rIdHyperlink21" w:history="1">
+            <w:hyperlink r:id="rIdHyperlink22" w:history="1">
               <w:r>
                 <w:rPr>
                   <w:rFonts w:ascii="Calibri" w:hAnsi="Calibri" w:cs="Calibri"/>
@@ -1966,7 +1982,7 @@
               </w:rPr>
               <w:t xml:space="preserve">, </w:t>
             </w:r>
-            <w:hyperlink r:id="rIdHyperlink22" w:history="1">
+            <w:hyperlink r:id="rIdHyperlink23" w:history="1">
               <w:r>
                 <w:rPr>
                   <w:rFonts w:ascii="Calibri" w:hAnsi="Calibri" w:cs="Calibri"/>
@@ -2056,7 +2072,7 @@
               </w:rPr>
               <w:t xml:space="preserve">Renderer-free existing planner, recipe and provider metadata consumption; </w:t>
             </w:r>
-            <w:hyperlink r:id="rIdHyperlink23" w:history="1">
+            <w:hyperlink r:id="rIdHyperlink24" w:history="1">
               <w:r>
                 <w:rPr>
                   <w:rFonts w:ascii="Calibri" w:hAnsi="Calibri" w:cs="Calibri"/>
@@ -2072,7 +2088,7 @@
               </w:rPr>
               <w:t xml:space="preserve">, </w:t>
             </w:r>
-            <w:hyperlink r:id="rIdHyperlink24" w:history="1">
+            <w:hyperlink r:id="rIdHyperlink25" w:history="1">
               <w:r>
                 <w:rPr>
                   <w:rFonts w:ascii="Calibri" w:hAnsi="Calibri" w:cs="Calibri"/>
@@ -2088,7 +2104,7 @@
               </w:rPr>
               <w:t xml:space="preserve">, </w:t>
             </w:r>
-            <w:hyperlink r:id="rIdHyperlink25" w:history="1">
+            <w:hyperlink r:id="rIdHyperlink26" w:history="1">
               <w:r>
                 <w:rPr>
                   <w:rFonts w:ascii="Calibri" w:hAnsi="Calibri" w:cs="Calibri"/>
@@ -2178,7 +2194,7 @@
               </w:rPr>
               <w:t xml:space="preserve">Renderer-free actual provider descriptions and operation schemas; </w:t>
             </w:r>
-            <w:hyperlink r:id="rIdHyperlink26" w:history="1">
+            <w:hyperlink r:id="rIdHyperlink27" w:history="1">
               <w:r>
                 <w:rPr>
                   <w:rFonts w:ascii="Calibri" w:hAnsi="Calibri" w:cs="Calibri"/>
@@ -2194,7 +2210,7 @@
               </w:rPr>
               <w:t xml:space="preserve">, </w:t>
             </w:r>
-            <w:hyperlink r:id="rIdHyperlink27" w:history="1">
+            <w:hyperlink r:id="rIdHyperlink28" w:history="1">
               <w:r>
                 <w:rPr>
                   <w:rFonts w:ascii="Calibri" w:hAnsi="Calibri" w:cs="Calibri"/>
@@ -2284,7 +2300,7 @@
               </w:rPr>
               <w:t xml:space="preserve">Renderer-free actual governed capability and commercial grammar consumers; </w:t>
             </w:r>
-            <w:hyperlink r:id="rIdHyperlink28" w:history="1">
+            <w:hyperlink r:id="rIdHyperlink29" w:history="1">
               <w:r>
                 <w:rPr>
                   <w:rFonts w:ascii="Calibri" w:hAnsi="Calibri" w:cs="Calibri"/>
@@ -2300,7 +2316,7 @@
               </w:rPr>
               <w:t xml:space="preserve">, </w:t>
             </w:r>
-            <w:hyperlink r:id="rIdHyperlink29" w:history="1">
+            <w:hyperlink r:id="rIdHyperlink30" w:history="1">
               <w:r>
                 <w:rPr>
                   <w:rFonts w:ascii="Calibri" w:hAnsi="Calibri" w:cs="Calibri"/>
@@ -2390,7 +2406,7 @@
               </w:rPr>
               <w:t xml:space="preserve">Renderer-free semantic feature metadata; </w:t>
             </w:r>
-            <w:hyperlink r:id="rIdHyperlink30" w:history="1">
+            <w:hyperlink r:id="rIdHyperlink31" w:history="1">
               <w:r>
                 <w:rPr>
                   <w:rFonts w:ascii="Calibri" w:hAnsi="Calibri" w:cs="Calibri"/>
@@ -2406,7 +2422,7 @@
               </w:rPr>
               <w:t xml:space="preserve">, </w:t>
             </w:r>
-            <w:hyperlink r:id="rIdHyperlink31" w:history="1">
+            <w:hyperlink r:id="rIdHyperlink32" w:history="1">
               <w:r>
                 <w:rPr>
                   <w:rFonts w:ascii="Calibri" w:hAnsi="Calibri" w:cs="Calibri"/>
@@ -2496,7 +2512,7 @@
               </w:rPr>
               <w:t xml:space="preserve">Coordinated schema, direction, eligibility and actual semantic resolver metadata; </w:t>
             </w:r>
-            <w:hyperlink r:id="rIdHyperlink32" w:history="1">
+            <w:hyperlink r:id="rIdHyperlink33" w:history="1">
               <w:r>
                 <w:rPr>
                   <w:rFonts w:ascii="Calibri" w:hAnsi="Calibri" w:cs="Calibri"/>
@@ -2512,7 +2528,7 @@
               </w:rPr>
               <w:t xml:space="preserve">, </w:t>
             </w:r>
-            <w:hyperlink r:id="rIdHyperlink33" w:history="1">
+            <w:hyperlink r:id="rIdHyperlink34" w:history="1">
               <w:r>
                 <w:rPr>
                   <w:rFonts w:ascii="Calibri" w:hAnsi="Calibri" w:cs="Calibri"/>
@@ -2528,7 +2544,7 @@
               </w:rPr>
               <w:t xml:space="preserve">, </w:t>
             </w:r>
-            <w:hyperlink r:id="rIdHyperlink25" w:history="1">
+            <w:hyperlink r:id="rIdHyperlink26" w:history="1">
               <w:r>
                 <w:rPr>
                   <w:rFonts w:ascii="Calibri" w:hAnsi="Calibri" w:cs="Calibri"/>
@@ -2618,7 +2634,7 @@
               </w:rPr>
               <w:t xml:space="preserve">Renderer-free presentation construction and exact historical compatibility; </w:t>
             </w:r>
-            <w:hyperlink r:id="rIdHyperlink34" w:history="1">
+            <w:hyperlink r:id="rIdHyperlink35" w:history="1">
               <w:r>
                 <w:rPr>
                   <w:rFonts w:ascii="Calibri" w:hAnsi="Calibri" w:cs="Calibri"/>
@@ -2634,7 +2650,7 @@
               </w:rPr>
               <w:t xml:space="preserve">, </w:t>
             </w:r>
-            <w:hyperlink r:id="rIdHyperlink35" w:history="1">
+            <w:hyperlink r:id="rIdHyperlink36" w:history="1">
               <w:r>
                 <w:rPr>
                   <w:rFonts w:ascii="Calibri" w:hAnsi="Calibri" w:cs="Calibri"/>
@@ -2724,7 +2740,7 @@
               </w:rPr>
               <w:t xml:space="preserve">Current-authority validation, route projection/resolution and four preview import cutovers; </w:t>
             </w:r>
-            <w:hyperlink r:id="rIdHyperlink36" w:history="1">
+            <w:hyperlink r:id="rIdHyperlink37" w:history="1">
               <w:r>
                 <w:rPr>
                   <w:rFonts w:ascii="Calibri" w:hAnsi="Calibri" w:cs="Calibri"/>
@@ -2740,7 +2756,7 @@
               </w:rPr>
               <w:t xml:space="preserve">, </w:t>
             </w:r>
-            <w:hyperlink r:id="rIdHyperlink37" w:history="1">
+            <w:hyperlink r:id="rIdHyperlink38" w:history="1">
               <w:r>
                 <w:rPr>
                   <w:rFonts w:ascii="Calibri" w:hAnsi="Calibri" w:cs="Calibri"/>
@@ -2830,7 +2846,7 @@
               </w:rPr>
               <w:t xml:space="preserve">Design-selection contracts/operations and editor projection with three named consumer cutovers; </w:t>
             </w:r>
-            <w:hyperlink r:id="rIdHyperlink38" w:history="1">
+            <w:hyperlink r:id="rIdHyperlink39" w:history="1">
               <w:r>
                 <w:rPr>
                   <w:rFonts w:ascii="Calibri" w:hAnsi="Calibri" w:cs="Calibri"/>
@@ -2846,7 +2862,7 @@
               </w:rPr>
               <w:t xml:space="preserve">, </w:t>
             </w:r>
-            <w:hyperlink r:id="rIdHyperlink39" w:history="1">
+            <w:hyperlink r:id="rIdHyperlink40" w:history="1">
               <w:r>
                 <w:rPr>
                   <w:rFonts w:ascii="Calibri" w:hAnsi="Calibri" w:cs="Calibri"/>
@@ -2936,7 +2952,7 @@
               </w:rPr>
               <w:t xml:space="preserve">Legacy migration, distinct transient projections and shared bridge schemas; </w:t>
             </w:r>
-            <w:hyperlink r:id="rIdHyperlink40" w:history="1">
+            <w:hyperlink r:id="rIdHyperlink41" w:history="1">
               <w:r>
                 <w:rPr>
                   <w:rFonts w:ascii="Calibri" w:hAnsi="Calibri" w:cs="Calibri"/>
@@ -2952,7 +2968,7 @@
               </w:rPr>
               <w:t xml:space="preserve">, </w:t>
             </w:r>
-            <w:hyperlink r:id="rIdHyperlink41" w:history="1">
+            <w:hyperlink r:id="rIdHyperlink42" w:history="1">
               <w:r>
                 <w:rPr>
                   <w:rFonts w:ascii="Calibri" w:hAnsi="Calibri" w:cs="Calibri"/>
@@ -2968,7 +2984,7 @@
               </w:rPr>
               <w:t xml:space="preserve">, </w:t>
             </w:r>
-            <w:hyperlink r:id="rIdHyperlink42" w:history="1">
+            <w:hyperlink r:id="rIdHyperlink43" w:history="1">
               <w:r>
                 <w:rPr>
                   <w:rFonts w:ascii="Calibri" w:hAnsi="Calibri" w:cs="Calibri"/>
@@ -3008,6 +3024,80 @@
         <w:pStyle w:val="Normal"/>
         <w:widowControl/>
       </w:pPr>
+    </w:p>
+    <w:p>
+      <w:pPr>
+        <w:pStyle w:val="Normal"/>
+        <w:widowControl/>
+      </w:pPr>
+      <w:r>
+        <w:rPr>
+          <w:rFonts w:ascii="Calibri" w:hAnsi="Calibri" w:cs="Calibri"/>
+        </w:rPr>
+        <w:t xml:space="preserve">| AR-06A | AR-06 | Shared static renderer and stack/offset proof in EN/FI at four widths; </w:t>
+      </w:r>
+      <w:hyperlink r:id="rIdHyperlink44" w:history="1">
+        <w:r>
+          <w:rPr>
+            <w:rFonts w:ascii="Calibri" w:hAnsi="Calibri" w:cs="Calibri"/>
+            <w:color w:val="2E74B5"/>
+            <w:u w:val="single"/>
+          </w:rPr>
+          <w:t>contract</w:t>
+        </w:r>
+      </w:hyperlink>
+      <w:r>
+        <w:rPr>
+          <w:rFonts w:ascii="Calibri" w:hAnsi="Calibri" w:cs="Calibri"/>
+        </w:rPr>
+        <w:t xml:space="preserve">, </w:t>
+      </w:r>
+      <w:hyperlink r:id="rIdHyperlink45" w:history="1">
+        <w:r>
+          <w:rPr>
+            <w:rFonts w:ascii="Calibri" w:hAnsi="Calibri" w:cs="Calibri"/>
+            <w:color w:val="2E74B5"/>
+            <w:u w:val="single"/>
+          </w:rPr>
+          <w:t>report</w:t>
+        </w:r>
+      </w:hyperlink>
+      <w:r>
+        <w:rPr>
+          <w:rFonts w:ascii="Calibri" w:hAnsi="Calibri" w:cs="Calibri"/>
+        </w:rPr>
+        <w:t xml:space="preserve">, </w:t>
+      </w:r>
+      <w:hyperlink r:id="rIdHyperlink3" w:history="1">
+        <w:r>
+          <w:rPr>
+            <w:rFonts w:ascii="Calibri" w:hAnsi="Calibri" w:cs="Calibri"/>
+            <w:color w:val="2E74B5"/>
+            <w:u w:val="single"/>
+          </w:rPr>
+          <w:t>parent evidence</w:t>
+        </w:r>
+      </w:hyperlink>
+      <w:r>
+        <w:rPr>
+          <w:rFonts w:ascii="Calibri" w:hAnsi="Calibri" w:cs="Calibri"/>
+        </w:rPr>
+        <w:t xml:space="preserve"> | </w:t>
+      </w:r>
+      <w:r>
+        <w:rPr>
+          <w:rFonts w:ascii="Calibri" w:hAnsi="Calibri" w:cs="Calibri"/>
+          <w:b/>
+          <w:bCs/>
+        </w:rPr>
+        <w:t>Baseline / closed effective upon accepted merge</w:t>
+      </w:r>
+      <w:r>
+        <w:rPr>
+          <w:rFonts w:ascii="Calibri" w:hAnsi="Calibri" w:cs="Calibri"/>
+        </w:rPr>
+        <w:t xml:space="preserve"> |</w:t>
+      </w:r>
     </w:p>
     <w:p>
       <w:pPr>
@@ -22933,7 +23023,7 @@
         </w:rPr>
         <w:t xml:space="preserve">. Completed 7 August 2026; see </w:t>
       </w:r>
-      <w:hyperlink r:id="rIdHyperlink43" w:history="1">
+      <w:hyperlink r:id="rIdHyperlink46" w:history="1">
         <w:r>
           <w:rPr>
             <w:rFonts w:ascii="Calibri" w:hAnsi="Calibri" w:cs="Calibri"/>
@@ -23070,7 +23160,7 @@
         </w:rPr>
         <w:t xml:space="preserve">The binding details and minimum coverage are in </w:t>
       </w:r>
-      <w:hyperlink r:id="rIdHyperlink44" w:history="1">
+      <w:hyperlink r:id="rIdHyperlink47" w:history="1">
         <w:r>
           <w:rPr>
             <w:rFonts w:ascii="Calibri" w:hAnsi="Calibri" w:cs="Calibri"/>
@@ -23268,7 +23358,7 @@
         </w:rPr>
         <w:t xml:space="preserve">. P10B-16P-04 acceptance evidence is retained in </w:t>
       </w:r>
-      <w:hyperlink r:id="rIdHyperlink45" w:history="1">
+      <w:hyperlink r:id="rIdHyperlink48" w:history="1">
         <w:r>
           <w:rPr>
             <w:rFonts w:ascii="Calibri" w:hAnsi="Calibri" w:cs="Calibri"/>
@@ -23517,7 +23607,7 @@
         </w:rPr>
         <w:t xml:space="preserve">. See </w:t>
       </w:r>
-      <w:hyperlink r:id="rIdHyperlink46" w:history="1">
+      <w:hyperlink r:id="rIdHyperlink49" w:history="1">
         <w:r>
           <w:rPr>
             <w:rFonts w:ascii="Calibri" w:hAnsi="Calibri" w:cs="Calibri"/>
@@ -23766,7 +23856,7 @@
         </w:rPr>
         <w:t xml:space="preserve">. See </w:t>
       </w:r>
-      <w:hyperlink r:id="rIdHyperlink47" w:history="1">
+      <w:hyperlink r:id="rIdHyperlink50" w:history="1">
         <w:r>
           <w:rPr>
             <w:rFonts w:ascii="Calibri" w:hAnsi="Calibri" w:cs="Calibri"/>
@@ -24015,7 +24105,7 @@
         </w:rPr>
         <w:t xml:space="preserve">. At P10B-03 delivery, all then-current 25 V2 definitions and 91 variants were classified explicitly without false commercial-ready promotion. Later family tasks extend that same authority rather than replacing it. See </w:t>
       </w:r>
-      <w:hyperlink r:id="rIdHyperlink48" w:history="1">
+      <w:hyperlink r:id="rIdHyperlink51" w:history="1">
         <w:r>
           <w:rPr>
             <w:rFonts w:ascii="Calibri" w:hAnsi="Calibri" w:cs="Calibri"/>
@@ -24264,7 +24354,7 @@
         </w:rPr>
         <w:t xml:space="preserve"> embeds exact lineage and bounded treatment in the existing approved presentation, consumes Design DNA and registered anatomy, projects protected same-product media, preserves authority through lifecycle/compiler boundaries, and renders semantic four-breakpoint evidence. Production CDN transforms and retained commercial visual acceptance remain deferred. See </w:t>
       </w:r>
-      <w:hyperlink r:id="rIdHyperlink49" w:history="1">
+      <w:hyperlink r:id="rIdHyperlink52" w:history="1">
         <w:r>
           <w:rPr>
             <w:rFonts w:ascii="Calibri" w:hAnsi="Calibri" w:cs="Calibri"/>
@@ -24513,7 +24603,7 @@
         </w:rPr>
         <w:t xml:space="preserve">. See </w:t>
       </w:r>
-      <w:hyperlink r:id="rIdHyperlink50" w:history="1">
+      <w:hyperlink r:id="rIdHyperlink53" w:history="1">
         <w:r>
           <w:rPr>
             <w:rFonts w:ascii="Calibri" w:hAnsi="Calibri" w:cs="Calibri"/>
@@ -24748,7 +24838,7 @@
         </w:rPr>
         <w:t xml:space="preserve">. Four exact root-frame profiles, three mobile modes, and four footer compositions preserve canonical navigation and frame identity through snapshot, save/reload, Puck root, preview, publication compilation, EN/FI, and 375/768/1024/1440 px evidence. See </w:t>
       </w:r>
-      <w:hyperlink r:id="rIdHyperlink51" w:history="1">
+      <w:hyperlink r:id="rIdHyperlink54" w:history="1">
         <w:r>
           <w:rPr>
             <w:rFonts w:ascii="Calibri" w:hAnsi="Calibri" w:cs="Calibri"/>
@@ -24983,7 +25073,7 @@
         </w:rPr>
         <w:t xml:space="preserve">. Six meaningful hero anatomies, five editorial/story anatomies, five campaign/promotion anatomies and three evidence-grounded proof/service anatomies are registered, PageBlueprint-selectable, deterministically generated, snapshot/publish preserved and rendered through one shared implementation. Focused deterministic coverage and a zero-provider Chromium scenario retain evidence at 375, 768, 1024 and 1440 px. See </w:t>
       </w:r>
-      <w:hyperlink r:id="rIdHyperlink52" w:history="1">
+      <w:hyperlink r:id="rIdHyperlink55" w:history="1">
         <w:r>
           <w:rPr>
             <w:rFonts w:ascii="Calibri" w:hAnsi="Calibri" w:cs="Calibri"/>
@@ -25032,7 +25122,7 @@
         </w:rPr>
         <w:t xml:space="preserve"> Baseline. One fingerprinted authority and renderer now serve homepage merchandising, collection/results, related products, and legacy compatibility. Five meaningful anatomies preserve canonical facts and P10B-04 media lineage through plan, proposal, snapshot, save/reload, publish, and responsive browser evidence. See </w:t>
       </w:r>
-      <w:hyperlink r:id="rIdHyperlink53" w:history="1">
+      <w:hyperlink r:id="rIdHyperlink56" w:history="1">
         <w:r>
           <w:rPr>
             <w:rFonts w:ascii="Calibri" w:hAnsi="Calibri" w:cs="Calibri"/>
@@ -25249,7 +25339,7 @@
         </w:rPr>
         <w:t xml:space="preserve"> Baseline. Six versioned, structurally fingerprinted homepage PageBlueprint profiles compose current shared-frame, commercial storytelling, canonical product-card, approved-media, and Design DNA authority. Evidence/cardinality guards fail closed; deterministic lifecycle and 24 retained four-width browser images pass. See </w:t>
       </w:r>
-      <w:hyperlink r:id="rIdHyperlink54" w:history="1">
+      <w:hyperlink r:id="rIdHyperlink57" w:history="1">
         <w:r>
           <w:rPr>
             <w:rFonts w:ascii="Calibri" w:hAnsi="Calibri" w:cs="Calibri"/>
@@ -25480,7 +25570,7 @@
         </w:rPr>
         <w:t xml:space="preserve"> anatomy, P10B-08 canonical card anatomy, and P10B-04 approved media treatment. Exact canonical catalogue bindings preserve product membership/order, facts, product media, filters/sort state, and child-collection order. Campaign media is approved collection/editorial media, not a product-media replacement. A transient revision-checked zero-result context keeps the query without fabricating products. Deterministic lifecycle and 16-view Chromium evidence pass with zero provider calls. See </w:t>
       </w:r>
-      <w:hyperlink r:id="rIdHyperlink55" w:history="1">
+      <w:hyperlink r:id="rIdHyperlink58" w:history="1">
         <w:r>
           <w:rPr>
             <w:rFonts w:ascii="Calibri" w:hAnsi="Calibri" w:cs="Calibri"/>
@@ -26010,7 +26100,7 @@
         </w:rPr>
         <w:t xml:space="preserve">. Fifteen structurally distinct registered profiles resolve exact current approved brief evidence into strict localized fact documents. P10B-05 preserves page-set, route, locale, and transitive navigation authority; P10B-06 frames and P10B-07 editorial/campaign renderers are reused. Snapshot save/reload and deterministic publication preserve the exact document. See </w:t>
       </w:r>
-      <w:hyperlink r:id="rIdHyperlink56" w:history="1">
+      <w:hyperlink r:id="rIdHyperlink59" w:history="1">
         <w:r>
           <w:rPr>
             <w:rFonts w:ascii="Calibri" w:hAnsi="Calibri" w:cs="Calibri"/>
@@ -26221,7 +26311,7 @@
         </w:rPr>
         <w:t xml:space="preserve"> component through the P10B-05 family page; registered loading state renders on its pending route instead of replacing the 404 singleton. Read-only runtime state supplies canonical cart facts, checkout continuation, P10B-10 query/filter context, and bounded recovery actions while the snapshot preserves presentation only. Shared-frame/Design DNA, save/reload, publication, four- width browser evidence, and no-provider behavior are covered under </w:t>
       </w:r>
-      <w:hyperlink r:id="rIdHyperlink57" w:history="1">
+      <w:hyperlink r:id="rIdHyperlink60" w:history="1">
         <w:r>
           <w:rPr>
             <w:rFonts w:ascii="Calibri" w:hAnsi="Calibri" w:cs="Calibri"/>
@@ -26432,7 +26522,7 @@
         </w:rPr>
         <w:t xml:space="preserve"> frame span all pages; simple/configurable PDP, factual content, utility states, 15 four-width/representative screenshots and the passing 160-scenario human record are retained in </w:t>
       </w:r>
-      <w:hyperlink r:id="rIdHyperlink58" w:history="1">
+      <w:hyperlink r:id="rIdHyperlink61" w:history="1">
         <w:r>
           <w:rPr>
             <w:rFonts w:ascii="Calibri" w:hAnsi="Calibri" w:cs="Calibri"/>
@@ -26643,7 +26733,7 @@
         </w:rPr>
         <w:t xml:space="preserve"> One versioned deterministic synthesis contract binds exact merchant, evidence, commerce, asset, Design DNA, site-map, frame, PageBlueprint/profile, component/anatomy, narrative, density, art-direction, responsive, planner, registry and recipe authority. The same approved fixture produces editorial-heavy, commerce/discovery-heavy and restrained/minimal complete 17-route stores through the existing whole-storefront proposal, snapshot, save/reload, renderer and immutable publication chain. Details are retained in </w:t>
       </w:r>
-      <w:hyperlink r:id="rIdHyperlink59" w:history="1">
+      <w:hyperlink r:id="rIdHyperlink62" w:history="1">
         <w:r>
           <w:rPr>
             <w:rFonts w:ascii="Calibri" w:hAnsi="Calibri" w:cs="Calibri"/>
@@ -26888,7 +26978,7 @@
         </w:rPr>
         <w:t xml:space="preserve"> 31 focused unit/integration cases; nine representative complete outcomes; exact save/reload and compiled publication; protected commerce/evidence/media parity; dedicated 375/768/1024/1440 browser coverage; three retained human commercial reviews and one exact evidence manifest. See </w:t>
       </w:r>
-      <w:hyperlink r:id="rIdHyperlink60" w:history="1">
+      <w:hyperlink r:id="rIdHyperlink63" w:history="1">
         <w:r>
           <w:rPr>
             <w:rFonts w:ascii="Calibri" w:hAnsi="Calibri" w:cs="Calibri"/>
@@ -27065,7 +27155,7 @@
         </w:rPr>
         <w:t xml:space="preserve"> A compact route inventory, four collection/search archetypes, four maintained PDP profiles plus generic fallback, exact collection and product-type mappings, bounded matching rules, transient editor/runtime projection, deterministic legacy convergence, and complete snapshot/lifecycle/publication preservation. Exact primary and related-product bindings survive convergence. A server-owned, storefront-scoped proposal transition binds legacy and reviewed canonical projections for deterministic acceptance replay. Storefront Studio lists archetypes rather than one page per commerce URL; representative context is not persisted. See </w:t>
       </w:r>
-      <w:hyperlink r:id="rIdHyperlink61" w:history="1">
+      <w:hyperlink r:id="rIdHyperlink64" w:history="1">
         <w:r>
           <w:rPr>
             <w:rFonts w:ascii="Calibri" w:hAnsi="Calibri" w:cs="Calibri"/>
@@ -27533,7 +27623,7 @@
         </w:rPr>
         <w:t xml:space="preserve"> </w:t>
       </w:r>
-      <w:hyperlink r:id="rIdHyperlink62" w:history="1">
+      <w:hyperlink r:id="rIdHyperlink65" w:history="1">
         <w:r>
           <w:rPr>
             <w:rFonts w:ascii="Calibri" w:hAnsi="Calibri" w:cs="Calibri"/>
@@ -27994,7 +28084,7 @@
         </w:rPr>
         <w:t xml:space="preserve">. Completed 15 August 2026; see </w:t>
       </w:r>
-      <w:hyperlink r:id="rIdHyperlink45" w:history="1">
+      <w:hyperlink r:id="rIdHyperlink48" w:history="1">
         <w:r>
           <w:rPr>
             <w:rFonts w:ascii="Calibri" w:hAnsi="Calibri" w:cs="Calibri"/>
@@ -29256,7 +29346,7 @@
         </w:rPr>
         <w:t xml:space="preserve">. Accepted by the product owner on 16 August 2026 under </w:t>
       </w:r>
-      <w:hyperlink r:id="rIdHyperlink63" w:history="1">
+      <w:hyperlink r:id="rIdHyperlink66" w:history="1">
         <w:r>
           <w:rPr>
             <w:rFonts w:ascii="Calibri" w:hAnsi="Calibri" w:cs="Calibri"/>
@@ -29614,7 +29704,7 @@
         </w:rPr>
         <w:t xml:space="preserve">. Accepted by the product owner on 17 August 2026 under </w:t>
       </w:r>
-      <w:hyperlink r:id="rIdHyperlink63" w:history="1">
+      <w:hyperlink r:id="rIdHyperlink66" w:history="1">
         <w:r>
           <w:rPr>
             <w:rFonts w:ascii="Calibri" w:hAnsi="Calibri" w:cs="Calibri"/>
@@ -32754,7 +32844,7 @@
         </w:rPr>
         <w:t xml:space="preserve"> </w:t>
       </w:r>
-      <w:hyperlink r:id="rIdHyperlink64" w:history="1">
+      <w:hyperlink r:id="rIdHyperlink67" w:history="1">
         <w:r>
           <w:rPr>
             <w:rFonts w:ascii="Calibri" w:hAnsi="Calibri" w:cs="Calibri"/>
@@ -32770,7 +32860,7 @@
         </w:rPr>
         <w:t xml:space="preserve"> and </w:t>
       </w:r>
-      <w:hyperlink r:id="rIdHyperlink65" w:history="1">
+      <w:hyperlink r:id="rIdHyperlink68" w:history="1">
         <w:r>
           <w:rPr>
             <w:rFonts w:ascii="Calibri" w:hAnsi="Calibri" w:cs="Calibri"/>

</xml_diff>

<commit_message>
feat(ar-06b): support canonical composed-page Puck editing
</commit_message>
<xml_diff>
--- a/docs/VESKIFY_DEVELOPMENT_DELIVERY_TRACKER_v1.3.0.docx
+++ b/docs/VESKIFY_DEVELOPMENT_DELIVERY_TRACKER_v1.3.0.docx
@@ -51,7 +51,7 @@
         <w:rPr>
           <w:rFonts w:ascii="Calibri" w:hAnsi="Calibri" w:cs="Calibri"/>
         </w:rPr>
-        <w:t>AR-02 and AR-02A through AR-02M Baseline / closed; AR-03 and AR-03A through AR-03E remain closed; AR-04 Baseline / closed; AR-05A Baseline / closed; AR-05B and AR-05 Baseline / closed; AR-06A Baseline / closed effective upon accepted merge; AR-06 Partial pending editor/lifecycle/publication and executable-commerce proof; AR-23 eligible / unstarted; BATCH-10 complete; BATCH-11 complete; BATCH-12 complete; BATCH-13 complete; BATCH-14 complete upon AR-06A acceptance/merge and safe closeout; no next task</w:t>
+        <w:t>AR-02 and AR-02A through AR-02M Baseline / closed; AR-03 and AR-03A through AR-03E remain closed; AR-04 Baseline / closed; AR-05A Baseline / closed; AR-05B and AR-05 Baseline / closed; AR-06A Baseline / closed verified at bc209f4bdfed9626605b8c699aaabb547d5d2025; AR-06B Baseline / closed effective upon accepted merge; AR-06 Partial pending editor/lifecycle/publication and executable-commerce proof; AR-23 eligible / unstarted; BATCH-10 through BATCH-14 complete; BATCH-15 closes only upon accepted AR-06B delivery and safe closeout; no successor</w:t>
       </w:r>
     </w:p>
     <w:p>
@@ -118,7 +118,7 @@
           <w:b/>
           <w:bCs/>
         </w:rPr>
-        <w:t>Candidate status effective upon explicit owner acceptance/merge of AR-06A:</w:t>
+        <w:t>Candidate status effective upon accepted AR-06B merge after AR-06A verification:</w:t>
       </w:r>
       <w:r>
         <w:rPr>
@@ -362,7 +362,7 @@
         <w:rPr>
           <w:rFonts w:ascii="Calibri" w:hAnsi="Calibri" w:cs="Calibri"/>
         </w:rPr>
-        <w:t xml:space="preserve">; complete original acceptance is mapped in AR_02_BOUNDARY_ACCEPTANCE.md. AR-04 is Baseline / closed. AR-05A is Baseline / closed. AR-05B is Baseline / closed. AR-05 is Baseline / closed; original T01/T02 acceptance is mapped in AR_05_CANONICAL_ACCEPTANCE.md. AR-06A is Baseline / closed effective upon accepted merge. AR-06 is Partial; static rendering evidence is mapped in AR_06_RENDERING_ACCEPTANCE.md. Lossless Puck/save/history/publication integration, positive collection/search and PDP executable-commerce proof, and the shared collection/search context decision remain required before enablement. AR-03 is </w:t>
+        <w:t xml:space="preserve">; complete original acceptance is mapped in AR_02_BOUNDARY_ACCEPTANCE.md. AR-04 is Baseline / closed. AR-05A is Baseline / closed. AR-05B is Baseline / closed. AR-05 is Baseline / closed; original T01/T02 acceptance is mapped in AR_05_CANONICAL_ACCEPTANCE.md. AR-06A is Baseline / closed. Its accepted merge is bc209f4bdfed9626605b8c699aaabb547d5d2025. AR-06B is Baseline / closed effective upon accepted merge; this candidate does not assert delivery. AR-06 is Partial; rendering and editing evidence is mapped in AR_06_RENDERING_ACCEPTANCE.md. Lossless Puck/save/history/publication integration, positive collection/search and PDP executable-commerce proof, and the shared collection/search context decision remain required before enablement. AR-03 is </w:t>
       </w:r>
       <w:r>
         <w:rPr>
@@ -460,7 +460,7 @@
         <w:rPr>
           <w:rFonts w:ascii="Calibri" w:hAnsi="Calibri" w:cs="Calibri"/>
         </w:rPr>
-        <w:t xml:space="preserve">. AR-23 depends on AR-01 and is not serialized behind visual work. BATCH-03 is complete. BATCH-04 is complete. BATCH-05 is complete. BATCH-06 is complete. BATCH-07 is complete. BATCH-08 is complete. BATCH-09 is complete. BATCH-10 is complete. BATCH-11 is complete. BATCH-12 is complete. BATCH-13 is complete. BATCH-14 is complete upon AR-06A acceptance/merge and safe closeout. No next reset task is selected. No third task is authorized. This tracker owns current status; the roadmap owns dependency order. Retained B01 exact-next, fixed-two-call/mandatory-three-concept, transient-only, and 73-child future-sequence statements are </w:t>
+        <w:t xml:space="preserve">. AR-23 depends on AR-01 and is not serialized behind visual work. BATCH-03 is complete. BATCH-04 is complete. BATCH-05 is complete. BATCH-06 is complete. BATCH-07 is complete. BATCH-08 is complete. BATCH-09 is complete. BATCH-10 is complete. BATCH-11 is complete. BATCH-12 is complete. BATCH-13 is complete. BATCH-14 is complete. BATCH-15 closes only upon accepted AR-06B delivery and safe closeout. No successor implementation is authorized. This tracker owns current status; the roadmap owns dependency order. Retained B01 exact-next, fixed-two-call/mandatory-three-concept, transient-only, and 73-child future-sequence statements are </w:t>
       </w:r>
       <w:r>
         <w:rPr>
@@ -3090,7 +3090,69 @@
           <w:b/>
           <w:bCs/>
         </w:rPr>
-        <w:t>Baseline / closed effective upon accepted merge</w:t>
+        <w:t>Baseline / closed, verified at `bc209f4bdfed9626605b8c699aaabb547d5d2025`</w:t>
+      </w:r>
+      <w:r>
+        <w:rPr>
+          <w:rFonts w:ascii="Calibri" w:hAnsi="Calibri" w:cs="Calibri"/>
+        </w:rPr>
+        <w:t xml:space="preserve"> | | AR-06B | AR-06 | Guarded unsaved Puck editing for the AR-06A static composition; </w:t>
+      </w:r>
+      <w:hyperlink r:id="rIdHyperlink46" w:history="1">
+        <w:r>
+          <w:rPr>
+            <w:rFonts w:ascii="Calibri" w:hAnsi="Calibri" w:cs="Calibri"/>
+            <w:color w:val="2E74B5"/>
+            <w:u w:val="single"/>
+          </w:rPr>
+          <w:t>contract</w:t>
+        </w:r>
+      </w:hyperlink>
+      <w:r>
+        <w:rPr>
+          <w:rFonts w:ascii="Calibri" w:hAnsi="Calibri" w:cs="Calibri"/>
+        </w:rPr>
+        <w:t xml:space="preserve">, </w:t>
+      </w:r>
+      <w:hyperlink r:id="rIdHyperlink47" w:history="1">
+        <w:r>
+          <w:rPr>
+            <w:rFonts w:ascii="Calibri" w:hAnsi="Calibri" w:cs="Calibri"/>
+            <w:color w:val="2E74B5"/>
+            <w:u w:val="single"/>
+          </w:rPr>
+          <w:t>report</w:t>
+        </w:r>
+      </w:hyperlink>
+      <w:r>
+        <w:rPr>
+          <w:rFonts w:ascii="Calibri" w:hAnsi="Calibri" w:cs="Calibri"/>
+        </w:rPr>
+        <w:t xml:space="preserve">, </w:t>
+      </w:r>
+      <w:hyperlink r:id="rIdHyperlink3" w:history="1">
+        <w:r>
+          <w:rPr>
+            <w:rFonts w:ascii="Calibri" w:hAnsi="Calibri" w:cs="Calibri"/>
+            <w:color w:val="2E74B5"/>
+            <w:u w:val="single"/>
+          </w:rPr>
+          <w:t>parent evidence</w:t>
+        </w:r>
+      </w:hyperlink>
+      <w:r>
+        <w:rPr>
+          <w:rFonts w:ascii="Calibri" w:hAnsi="Calibri" w:cs="Calibri"/>
+        </w:rPr>
+        <w:t xml:space="preserve"> | </w:t>
+      </w:r>
+      <w:r>
+        <w:rPr>
+          <w:rFonts w:ascii="Calibri" w:hAnsi="Calibri" w:cs="Calibri"/>
+          <w:b/>
+          <w:bCs/>
+        </w:rPr>
+        <w:t>Baseline / closed effective upon accepted merge; candidate evidence remains pending</w:t>
       </w:r>
       <w:r>
         <w:rPr>
@@ -23023,7 +23085,7 @@
         </w:rPr>
         <w:t xml:space="preserve">. Completed 7 August 2026; see </w:t>
       </w:r>
-      <w:hyperlink r:id="rIdHyperlink46" w:history="1">
+      <w:hyperlink r:id="rIdHyperlink48" w:history="1">
         <w:r>
           <w:rPr>
             <w:rFonts w:ascii="Calibri" w:hAnsi="Calibri" w:cs="Calibri"/>
@@ -23160,7 +23222,7 @@
         </w:rPr>
         <w:t xml:space="preserve">The binding details and minimum coverage are in </w:t>
       </w:r>
-      <w:hyperlink r:id="rIdHyperlink47" w:history="1">
+      <w:hyperlink r:id="rIdHyperlink49" w:history="1">
         <w:r>
           <w:rPr>
             <w:rFonts w:ascii="Calibri" w:hAnsi="Calibri" w:cs="Calibri"/>
@@ -23358,7 +23420,7 @@
         </w:rPr>
         <w:t xml:space="preserve">. P10B-16P-04 acceptance evidence is retained in </w:t>
       </w:r>
-      <w:hyperlink r:id="rIdHyperlink48" w:history="1">
+      <w:hyperlink r:id="rIdHyperlink50" w:history="1">
         <w:r>
           <w:rPr>
             <w:rFonts w:ascii="Calibri" w:hAnsi="Calibri" w:cs="Calibri"/>
@@ -23607,7 +23669,7 @@
         </w:rPr>
         <w:t xml:space="preserve">. See </w:t>
       </w:r>
-      <w:hyperlink r:id="rIdHyperlink49" w:history="1">
+      <w:hyperlink r:id="rIdHyperlink51" w:history="1">
         <w:r>
           <w:rPr>
             <w:rFonts w:ascii="Calibri" w:hAnsi="Calibri" w:cs="Calibri"/>
@@ -23856,7 +23918,7 @@
         </w:rPr>
         <w:t xml:space="preserve">. See </w:t>
       </w:r>
-      <w:hyperlink r:id="rIdHyperlink50" w:history="1">
+      <w:hyperlink r:id="rIdHyperlink52" w:history="1">
         <w:r>
           <w:rPr>
             <w:rFonts w:ascii="Calibri" w:hAnsi="Calibri" w:cs="Calibri"/>
@@ -24105,7 +24167,7 @@
         </w:rPr>
         <w:t xml:space="preserve">. At P10B-03 delivery, all then-current 25 V2 definitions and 91 variants were classified explicitly without false commercial-ready promotion. Later family tasks extend that same authority rather than replacing it. See </w:t>
       </w:r>
-      <w:hyperlink r:id="rIdHyperlink51" w:history="1">
+      <w:hyperlink r:id="rIdHyperlink53" w:history="1">
         <w:r>
           <w:rPr>
             <w:rFonts w:ascii="Calibri" w:hAnsi="Calibri" w:cs="Calibri"/>
@@ -24354,7 +24416,7 @@
         </w:rPr>
         <w:t xml:space="preserve"> embeds exact lineage and bounded treatment in the existing approved presentation, consumes Design DNA and registered anatomy, projects protected same-product media, preserves authority through lifecycle/compiler boundaries, and renders semantic four-breakpoint evidence. Production CDN transforms and retained commercial visual acceptance remain deferred. See </w:t>
       </w:r>
-      <w:hyperlink r:id="rIdHyperlink52" w:history="1">
+      <w:hyperlink r:id="rIdHyperlink54" w:history="1">
         <w:r>
           <w:rPr>
             <w:rFonts w:ascii="Calibri" w:hAnsi="Calibri" w:cs="Calibri"/>
@@ -24603,7 +24665,7 @@
         </w:rPr>
         <w:t xml:space="preserve">. See </w:t>
       </w:r>
-      <w:hyperlink r:id="rIdHyperlink53" w:history="1">
+      <w:hyperlink r:id="rIdHyperlink55" w:history="1">
         <w:r>
           <w:rPr>
             <w:rFonts w:ascii="Calibri" w:hAnsi="Calibri" w:cs="Calibri"/>
@@ -24838,7 +24900,7 @@
         </w:rPr>
         <w:t xml:space="preserve">. Four exact root-frame profiles, three mobile modes, and four footer compositions preserve canonical navigation and frame identity through snapshot, save/reload, Puck root, preview, publication compilation, EN/FI, and 375/768/1024/1440 px evidence. See </w:t>
       </w:r>
-      <w:hyperlink r:id="rIdHyperlink54" w:history="1">
+      <w:hyperlink r:id="rIdHyperlink56" w:history="1">
         <w:r>
           <w:rPr>
             <w:rFonts w:ascii="Calibri" w:hAnsi="Calibri" w:cs="Calibri"/>
@@ -25073,7 +25135,7 @@
         </w:rPr>
         <w:t xml:space="preserve">. Six meaningful hero anatomies, five editorial/story anatomies, five campaign/promotion anatomies and three evidence-grounded proof/service anatomies are registered, PageBlueprint-selectable, deterministically generated, snapshot/publish preserved and rendered through one shared implementation. Focused deterministic coverage and a zero-provider Chromium scenario retain evidence at 375, 768, 1024 and 1440 px. See </w:t>
       </w:r>
-      <w:hyperlink r:id="rIdHyperlink55" w:history="1">
+      <w:hyperlink r:id="rIdHyperlink57" w:history="1">
         <w:r>
           <w:rPr>
             <w:rFonts w:ascii="Calibri" w:hAnsi="Calibri" w:cs="Calibri"/>
@@ -25122,7 +25184,7 @@
         </w:rPr>
         <w:t xml:space="preserve"> Baseline. One fingerprinted authority and renderer now serve homepage merchandising, collection/results, related products, and legacy compatibility. Five meaningful anatomies preserve canonical facts and P10B-04 media lineage through plan, proposal, snapshot, save/reload, publish, and responsive browser evidence. See </w:t>
       </w:r>
-      <w:hyperlink r:id="rIdHyperlink56" w:history="1">
+      <w:hyperlink r:id="rIdHyperlink58" w:history="1">
         <w:r>
           <w:rPr>
             <w:rFonts w:ascii="Calibri" w:hAnsi="Calibri" w:cs="Calibri"/>
@@ -25339,7 +25401,7 @@
         </w:rPr>
         <w:t xml:space="preserve"> Baseline. Six versioned, structurally fingerprinted homepage PageBlueprint profiles compose current shared-frame, commercial storytelling, canonical product-card, approved-media, and Design DNA authority. Evidence/cardinality guards fail closed; deterministic lifecycle and 24 retained four-width browser images pass. See </w:t>
       </w:r>
-      <w:hyperlink r:id="rIdHyperlink57" w:history="1">
+      <w:hyperlink r:id="rIdHyperlink59" w:history="1">
         <w:r>
           <w:rPr>
             <w:rFonts w:ascii="Calibri" w:hAnsi="Calibri" w:cs="Calibri"/>
@@ -25570,7 +25632,7 @@
         </w:rPr>
         <w:t xml:space="preserve"> anatomy, P10B-08 canonical card anatomy, and P10B-04 approved media treatment. Exact canonical catalogue bindings preserve product membership/order, facts, product media, filters/sort state, and child-collection order. Campaign media is approved collection/editorial media, not a product-media replacement. A transient revision-checked zero-result context keeps the query without fabricating products. Deterministic lifecycle and 16-view Chromium evidence pass with zero provider calls. See </w:t>
       </w:r>
-      <w:hyperlink r:id="rIdHyperlink58" w:history="1">
+      <w:hyperlink r:id="rIdHyperlink60" w:history="1">
         <w:r>
           <w:rPr>
             <w:rFonts w:ascii="Calibri" w:hAnsi="Calibri" w:cs="Calibri"/>
@@ -26100,7 +26162,7 @@
         </w:rPr>
         <w:t xml:space="preserve">. Fifteen structurally distinct registered profiles resolve exact current approved brief evidence into strict localized fact documents. P10B-05 preserves page-set, route, locale, and transitive navigation authority; P10B-06 frames and P10B-07 editorial/campaign renderers are reused. Snapshot save/reload and deterministic publication preserve the exact document. See </w:t>
       </w:r>
-      <w:hyperlink r:id="rIdHyperlink59" w:history="1">
+      <w:hyperlink r:id="rIdHyperlink61" w:history="1">
         <w:r>
           <w:rPr>
             <w:rFonts w:ascii="Calibri" w:hAnsi="Calibri" w:cs="Calibri"/>
@@ -26311,7 +26373,7 @@
         </w:rPr>
         <w:t xml:space="preserve"> component through the P10B-05 family page; registered loading state renders on its pending route instead of replacing the 404 singleton. Read-only runtime state supplies canonical cart facts, checkout continuation, P10B-10 query/filter context, and bounded recovery actions while the snapshot preserves presentation only. Shared-frame/Design DNA, save/reload, publication, four- width browser evidence, and no-provider behavior are covered under </w:t>
       </w:r>
-      <w:hyperlink r:id="rIdHyperlink60" w:history="1">
+      <w:hyperlink r:id="rIdHyperlink62" w:history="1">
         <w:r>
           <w:rPr>
             <w:rFonts w:ascii="Calibri" w:hAnsi="Calibri" w:cs="Calibri"/>
@@ -26522,7 +26584,7 @@
         </w:rPr>
         <w:t xml:space="preserve"> frame span all pages; simple/configurable PDP, factual content, utility states, 15 four-width/representative screenshots and the passing 160-scenario human record are retained in </w:t>
       </w:r>
-      <w:hyperlink r:id="rIdHyperlink61" w:history="1">
+      <w:hyperlink r:id="rIdHyperlink63" w:history="1">
         <w:r>
           <w:rPr>
             <w:rFonts w:ascii="Calibri" w:hAnsi="Calibri" w:cs="Calibri"/>
@@ -26733,7 +26795,7 @@
         </w:rPr>
         <w:t xml:space="preserve"> One versioned deterministic synthesis contract binds exact merchant, evidence, commerce, asset, Design DNA, site-map, frame, PageBlueprint/profile, component/anatomy, narrative, density, art-direction, responsive, planner, registry and recipe authority. The same approved fixture produces editorial-heavy, commerce/discovery-heavy and restrained/minimal complete 17-route stores through the existing whole-storefront proposal, snapshot, save/reload, renderer and immutable publication chain. Details are retained in </w:t>
       </w:r>
-      <w:hyperlink r:id="rIdHyperlink62" w:history="1">
+      <w:hyperlink r:id="rIdHyperlink64" w:history="1">
         <w:r>
           <w:rPr>
             <w:rFonts w:ascii="Calibri" w:hAnsi="Calibri" w:cs="Calibri"/>
@@ -26978,7 +27040,7 @@
         </w:rPr>
         <w:t xml:space="preserve"> 31 focused unit/integration cases; nine representative complete outcomes; exact save/reload and compiled publication; protected commerce/evidence/media parity; dedicated 375/768/1024/1440 browser coverage; three retained human commercial reviews and one exact evidence manifest. See </w:t>
       </w:r>
-      <w:hyperlink r:id="rIdHyperlink63" w:history="1">
+      <w:hyperlink r:id="rIdHyperlink65" w:history="1">
         <w:r>
           <w:rPr>
             <w:rFonts w:ascii="Calibri" w:hAnsi="Calibri" w:cs="Calibri"/>
@@ -27155,7 +27217,7 @@
         </w:rPr>
         <w:t xml:space="preserve"> A compact route inventory, four collection/search archetypes, four maintained PDP profiles plus generic fallback, exact collection and product-type mappings, bounded matching rules, transient editor/runtime projection, deterministic legacy convergence, and complete snapshot/lifecycle/publication preservation. Exact primary and related-product bindings survive convergence. A server-owned, storefront-scoped proposal transition binds legacy and reviewed canonical projections for deterministic acceptance replay. Storefront Studio lists archetypes rather than one page per commerce URL; representative context is not persisted. See </w:t>
       </w:r>
-      <w:hyperlink r:id="rIdHyperlink64" w:history="1">
+      <w:hyperlink r:id="rIdHyperlink66" w:history="1">
         <w:r>
           <w:rPr>
             <w:rFonts w:ascii="Calibri" w:hAnsi="Calibri" w:cs="Calibri"/>
@@ -27623,7 +27685,7 @@
         </w:rPr>
         <w:t xml:space="preserve"> </w:t>
       </w:r>
-      <w:hyperlink r:id="rIdHyperlink65" w:history="1">
+      <w:hyperlink r:id="rIdHyperlink67" w:history="1">
         <w:r>
           <w:rPr>
             <w:rFonts w:ascii="Calibri" w:hAnsi="Calibri" w:cs="Calibri"/>
@@ -28084,7 +28146,7 @@
         </w:rPr>
         <w:t xml:space="preserve">. Completed 15 August 2026; see </w:t>
       </w:r>
-      <w:hyperlink r:id="rIdHyperlink48" w:history="1">
+      <w:hyperlink r:id="rIdHyperlink50" w:history="1">
         <w:r>
           <w:rPr>
             <w:rFonts w:ascii="Calibri" w:hAnsi="Calibri" w:cs="Calibri"/>
@@ -29346,7 +29408,7 @@
         </w:rPr>
         <w:t xml:space="preserve">. Accepted by the product owner on 16 August 2026 under </w:t>
       </w:r>
-      <w:hyperlink r:id="rIdHyperlink66" w:history="1">
+      <w:hyperlink r:id="rIdHyperlink68" w:history="1">
         <w:r>
           <w:rPr>
             <w:rFonts w:ascii="Calibri" w:hAnsi="Calibri" w:cs="Calibri"/>
@@ -29704,7 +29766,7 @@
         </w:rPr>
         <w:t xml:space="preserve">. Accepted by the product owner on 17 August 2026 under </w:t>
       </w:r>
-      <w:hyperlink r:id="rIdHyperlink66" w:history="1">
+      <w:hyperlink r:id="rIdHyperlink68" w:history="1">
         <w:r>
           <w:rPr>
             <w:rFonts w:ascii="Calibri" w:hAnsi="Calibri" w:cs="Calibri"/>
@@ -32844,7 +32906,7 @@
         </w:rPr>
         <w:t xml:space="preserve"> </w:t>
       </w:r>
-      <w:hyperlink r:id="rIdHyperlink67" w:history="1">
+      <w:hyperlink r:id="rIdHyperlink69" w:history="1">
         <w:r>
           <w:rPr>
             <w:rFonts w:ascii="Calibri" w:hAnsi="Calibri" w:cs="Calibri"/>
@@ -32860,7 +32922,7 @@
         </w:rPr>
         <w:t xml:space="preserve"> and </w:t>
       </w:r>
-      <w:hyperlink r:id="rIdHyperlink68" w:history="1">
+      <w:hyperlink r:id="rIdHyperlink70" w:history="1">
         <w:r>
           <w:rPr>
             <w:rFonts w:ascii="Calibri" w:hAnsi="Calibri" w:cs="Calibri"/>

</xml_diff>

<commit_message>
AR-06B: canonical composed-page Puck editing (#260)
* feat(ar-06b): support canonical composed-page Puck editing

* fix(puck): bind fields and preserve accepted edits

* test: await completed legacy editor undo and redo
</commit_message>
<xml_diff>
--- a/docs/VESKIFY_DEVELOPMENT_DELIVERY_TRACKER_v1.3.0.docx
+++ b/docs/VESKIFY_DEVELOPMENT_DELIVERY_TRACKER_v1.3.0.docx
@@ -51,7 +51,7 @@
         <w:rPr>
           <w:rFonts w:ascii="Calibri" w:hAnsi="Calibri" w:cs="Calibri"/>
         </w:rPr>
-        <w:t>AR-02 and AR-02A through AR-02M Baseline / closed; AR-03 and AR-03A through AR-03E remain closed; AR-04 Baseline / closed; AR-05A Baseline / closed; AR-05B and AR-05 Baseline / closed; AR-06A Baseline / closed effective upon accepted merge; AR-06 Partial pending editor/lifecycle/publication and executable-commerce proof; AR-23 eligible / unstarted; BATCH-10 complete; BATCH-11 complete; BATCH-12 complete; BATCH-13 complete; BATCH-14 complete upon AR-06A acceptance/merge and safe closeout; no next task</w:t>
+        <w:t>AR-02 and AR-02A through AR-02M Baseline / closed; AR-03 and AR-03A through AR-03E remain closed; AR-04 Baseline / closed; AR-05A Baseline / closed; AR-05B and AR-05 Baseline / closed; AR-06A Baseline / closed verified at bc209f4bdfed9626605b8c699aaabb547d5d2025; AR-06B Baseline / closed effective upon accepted merge; AR-06 Partial pending editor/lifecycle/publication and executable-commerce proof; AR-23 eligible / unstarted; BATCH-10 through BATCH-14 complete; BATCH-15 closes only upon accepted AR-06B delivery and safe closeout; no successor</w:t>
       </w:r>
     </w:p>
     <w:p>
@@ -118,7 +118,7 @@
           <w:b/>
           <w:bCs/>
         </w:rPr>
-        <w:t>Candidate status effective upon explicit owner acceptance/merge of AR-06A:</w:t>
+        <w:t>Candidate status effective upon accepted AR-06B merge after AR-06A verification:</w:t>
       </w:r>
       <w:r>
         <w:rPr>
@@ -362,7 +362,7 @@
         <w:rPr>
           <w:rFonts w:ascii="Calibri" w:hAnsi="Calibri" w:cs="Calibri"/>
         </w:rPr>
-        <w:t xml:space="preserve">; complete original acceptance is mapped in AR_02_BOUNDARY_ACCEPTANCE.md. AR-04 is Baseline / closed. AR-05A is Baseline / closed. AR-05B is Baseline / closed. AR-05 is Baseline / closed; original T01/T02 acceptance is mapped in AR_05_CANONICAL_ACCEPTANCE.md. AR-06A is Baseline / closed effective upon accepted merge. AR-06 is Partial; static rendering evidence is mapped in AR_06_RENDERING_ACCEPTANCE.md. Lossless Puck/save/history/publication integration, positive collection/search and PDP executable-commerce proof, and the shared collection/search context decision remain required before enablement. AR-03 is </w:t>
+        <w:t xml:space="preserve">; complete original acceptance is mapped in AR_02_BOUNDARY_ACCEPTANCE.md. AR-04 is Baseline / closed. AR-05A is Baseline / closed. AR-05B is Baseline / closed. AR-05 is Baseline / closed; original T01/T02 acceptance is mapped in AR_05_CANONICAL_ACCEPTANCE.md. AR-06A is Baseline / closed. Its accepted merge is bc209f4bdfed9626605b8c699aaabb547d5d2025. AR-06B is Baseline / closed effective upon accepted merge; this candidate does not assert delivery. AR-06 is Partial; rendering and editing evidence is mapped in AR_06_RENDERING_ACCEPTANCE.md. Lossless Puck/save/history/publication integration, positive collection/search and PDP executable-commerce proof, and the shared collection/search context decision remain required before enablement. AR-03 is </w:t>
       </w:r>
       <w:r>
         <w:rPr>
@@ -460,7 +460,7 @@
         <w:rPr>
           <w:rFonts w:ascii="Calibri" w:hAnsi="Calibri" w:cs="Calibri"/>
         </w:rPr>
-        <w:t xml:space="preserve">. AR-23 depends on AR-01 and is not serialized behind visual work. BATCH-03 is complete. BATCH-04 is complete. BATCH-05 is complete. BATCH-06 is complete. BATCH-07 is complete. BATCH-08 is complete. BATCH-09 is complete. BATCH-10 is complete. BATCH-11 is complete. BATCH-12 is complete. BATCH-13 is complete. BATCH-14 is complete upon AR-06A acceptance/merge and safe closeout. No next reset task is selected. No third task is authorized. This tracker owns current status; the roadmap owns dependency order. Retained B01 exact-next, fixed-two-call/mandatory-three-concept, transient-only, and 73-child future-sequence statements are </w:t>
+        <w:t xml:space="preserve">. AR-23 depends on AR-01 and is not serialized behind visual work. BATCH-03 is complete. BATCH-04 is complete. BATCH-05 is complete. BATCH-06 is complete. BATCH-07 is complete. BATCH-08 is complete. BATCH-09 is complete. BATCH-10 is complete. BATCH-11 is complete. BATCH-12 is complete. BATCH-13 is complete. BATCH-14 is complete. BATCH-15 closes only upon accepted AR-06B delivery and safe closeout. No successor implementation is authorized. This tracker owns current status; the roadmap owns dependency order. Retained B01 exact-next, fixed-two-call/mandatory-three-concept, transient-only, and 73-child future-sequence statements are </w:t>
       </w:r>
       <w:r>
         <w:rPr>
@@ -3090,7 +3090,69 @@
           <w:b/>
           <w:bCs/>
         </w:rPr>
-        <w:t>Baseline / closed effective upon accepted merge</w:t>
+        <w:t>Baseline / closed, verified at `bc209f4bdfed9626605b8c699aaabb547d5d2025`</w:t>
+      </w:r>
+      <w:r>
+        <w:rPr>
+          <w:rFonts w:ascii="Calibri" w:hAnsi="Calibri" w:cs="Calibri"/>
+        </w:rPr>
+        <w:t xml:space="preserve"> | | AR-06B | AR-06 | Guarded unsaved Puck editing for the AR-06A static composition; </w:t>
+      </w:r>
+      <w:hyperlink r:id="rIdHyperlink46" w:history="1">
+        <w:r>
+          <w:rPr>
+            <w:rFonts w:ascii="Calibri" w:hAnsi="Calibri" w:cs="Calibri"/>
+            <w:color w:val="2E74B5"/>
+            <w:u w:val="single"/>
+          </w:rPr>
+          <w:t>contract</w:t>
+        </w:r>
+      </w:hyperlink>
+      <w:r>
+        <w:rPr>
+          <w:rFonts w:ascii="Calibri" w:hAnsi="Calibri" w:cs="Calibri"/>
+        </w:rPr>
+        <w:t xml:space="preserve">, </w:t>
+      </w:r>
+      <w:hyperlink r:id="rIdHyperlink47" w:history="1">
+        <w:r>
+          <w:rPr>
+            <w:rFonts w:ascii="Calibri" w:hAnsi="Calibri" w:cs="Calibri"/>
+            <w:color w:val="2E74B5"/>
+            <w:u w:val="single"/>
+          </w:rPr>
+          <w:t>report</w:t>
+        </w:r>
+      </w:hyperlink>
+      <w:r>
+        <w:rPr>
+          <w:rFonts w:ascii="Calibri" w:hAnsi="Calibri" w:cs="Calibri"/>
+        </w:rPr>
+        <w:t xml:space="preserve">, </w:t>
+      </w:r>
+      <w:hyperlink r:id="rIdHyperlink3" w:history="1">
+        <w:r>
+          <w:rPr>
+            <w:rFonts w:ascii="Calibri" w:hAnsi="Calibri" w:cs="Calibri"/>
+            <w:color w:val="2E74B5"/>
+            <w:u w:val="single"/>
+          </w:rPr>
+          <w:t>parent evidence</w:t>
+        </w:r>
+      </w:hyperlink>
+      <w:r>
+        <w:rPr>
+          <w:rFonts w:ascii="Calibri" w:hAnsi="Calibri" w:cs="Calibri"/>
+        </w:rPr>
+        <w:t xml:space="preserve"> | </w:t>
+      </w:r>
+      <w:r>
+        <w:rPr>
+          <w:rFonts w:ascii="Calibri" w:hAnsi="Calibri" w:cs="Calibri"/>
+          <w:b/>
+          <w:bCs/>
+        </w:rPr>
+        <w:t>Baseline / closed effective upon accepted merge; candidate evidence remains pending</w:t>
       </w:r>
       <w:r>
         <w:rPr>
@@ -23023,7 +23085,7 @@
         </w:rPr>
         <w:t xml:space="preserve">. Completed 7 August 2026; see </w:t>
       </w:r>
-      <w:hyperlink r:id="rIdHyperlink46" w:history="1">
+      <w:hyperlink r:id="rIdHyperlink48" w:history="1">
         <w:r>
           <w:rPr>
             <w:rFonts w:ascii="Calibri" w:hAnsi="Calibri" w:cs="Calibri"/>
@@ -23160,7 +23222,7 @@
         </w:rPr>
         <w:t xml:space="preserve">The binding details and minimum coverage are in </w:t>
       </w:r>
-      <w:hyperlink r:id="rIdHyperlink47" w:history="1">
+      <w:hyperlink r:id="rIdHyperlink49" w:history="1">
         <w:r>
           <w:rPr>
             <w:rFonts w:ascii="Calibri" w:hAnsi="Calibri" w:cs="Calibri"/>
@@ -23358,7 +23420,7 @@
         </w:rPr>
         <w:t xml:space="preserve">. P10B-16P-04 acceptance evidence is retained in </w:t>
       </w:r>
-      <w:hyperlink r:id="rIdHyperlink48" w:history="1">
+      <w:hyperlink r:id="rIdHyperlink50" w:history="1">
         <w:r>
           <w:rPr>
             <w:rFonts w:ascii="Calibri" w:hAnsi="Calibri" w:cs="Calibri"/>
@@ -23607,7 +23669,7 @@
         </w:rPr>
         <w:t xml:space="preserve">. See </w:t>
       </w:r>
-      <w:hyperlink r:id="rIdHyperlink49" w:history="1">
+      <w:hyperlink r:id="rIdHyperlink51" w:history="1">
         <w:r>
           <w:rPr>
             <w:rFonts w:ascii="Calibri" w:hAnsi="Calibri" w:cs="Calibri"/>
@@ -23856,7 +23918,7 @@
         </w:rPr>
         <w:t xml:space="preserve">. See </w:t>
       </w:r>
-      <w:hyperlink r:id="rIdHyperlink50" w:history="1">
+      <w:hyperlink r:id="rIdHyperlink52" w:history="1">
         <w:r>
           <w:rPr>
             <w:rFonts w:ascii="Calibri" w:hAnsi="Calibri" w:cs="Calibri"/>
@@ -24105,7 +24167,7 @@
         </w:rPr>
         <w:t xml:space="preserve">. At P10B-03 delivery, all then-current 25 V2 definitions and 91 variants were classified explicitly without false commercial-ready promotion. Later family tasks extend that same authority rather than replacing it. See </w:t>
       </w:r>
-      <w:hyperlink r:id="rIdHyperlink51" w:history="1">
+      <w:hyperlink r:id="rIdHyperlink53" w:history="1">
         <w:r>
           <w:rPr>
             <w:rFonts w:ascii="Calibri" w:hAnsi="Calibri" w:cs="Calibri"/>
@@ -24354,7 +24416,7 @@
         </w:rPr>
         <w:t xml:space="preserve"> embeds exact lineage and bounded treatment in the existing approved presentation, consumes Design DNA and registered anatomy, projects protected same-product media, preserves authority through lifecycle/compiler boundaries, and renders semantic four-breakpoint evidence. Production CDN transforms and retained commercial visual acceptance remain deferred. See </w:t>
       </w:r>
-      <w:hyperlink r:id="rIdHyperlink52" w:history="1">
+      <w:hyperlink r:id="rIdHyperlink54" w:history="1">
         <w:r>
           <w:rPr>
             <w:rFonts w:ascii="Calibri" w:hAnsi="Calibri" w:cs="Calibri"/>
@@ -24603,7 +24665,7 @@
         </w:rPr>
         <w:t xml:space="preserve">. See </w:t>
       </w:r>
-      <w:hyperlink r:id="rIdHyperlink53" w:history="1">
+      <w:hyperlink r:id="rIdHyperlink55" w:history="1">
         <w:r>
           <w:rPr>
             <w:rFonts w:ascii="Calibri" w:hAnsi="Calibri" w:cs="Calibri"/>
@@ -24838,7 +24900,7 @@
         </w:rPr>
         <w:t xml:space="preserve">. Four exact root-frame profiles, three mobile modes, and four footer compositions preserve canonical navigation and frame identity through snapshot, save/reload, Puck root, preview, publication compilation, EN/FI, and 375/768/1024/1440 px evidence. See </w:t>
       </w:r>
-      <w:hyperlink r:id="rIdHyperlink54" w:history="1">
+      <w:hyperlink r:id="rIdHyperlink56" w:history="1">
         <w:r>
           <w:rPr>
             <w:rFonts w:ascii="Calibri" w:hAnsi="Calibri" w:cs="Calibri"/>
@@ -25073,7 +25135,7 @@
         </w:rPr>
         <w:t xml:space="preserve">. Six meaningful hero anatomies, five editorial/story anatomies, five campaign/promotion anatomies and three evidence-grounded proof/service anatomies are registered, PageBlueprint-selectable, deterministically generated, snapshot/publish preserved and rendered through one shared implementation. Focused deterministic coverage and a zero-provider Chromium scenario retain evidence at 375, 768, 1024 and 1440 px. See </w:t>
       </w:r>
-      <w:hyperlink r:id="rIdHyperlink55" w:history="1">
+      <w:hyperlink r:id="rIdHyperlink57" w:history="1">
         <w:r>
           <w:rPr>
             <w:rFonts w:ascii="Calibri" w:hAnsi="Calibri" w:cs="Calibri"/>
@@ -25122,7 +25184,7 @@
         </w:rPr>
         <w:t xml:space="preserve"> Baseline. One fingerprinted authority and renderer now serve homepage merchandising, collection/results, related products, and legacy compatibility. Five meaningful anatomies preserve canonical facts and P10B-04 media lineage through plan, proposal, snapshot, save/reload, publish, and responsive browser evidence. See </w:t>
       </w:r>
-      <w:hyperlink r:id="rIdHyperlink56" w:history="1">
+      <w:hyperlink r:id="rIdHyperlink58" w:history="1">
         <w:r>
           <w:rPr>
             <w:rFonts w:ascii="Calibri" w:hAnsi="Calibri" w:cs="Calibri"/>
@@ -25339,7 +25401,7 @@
         </w:rPr>
         <w:t xml:space="preserve"> Baseline. Six versioned, structurally fingerprinted homepage PageBlueprint profiles compose current shared-frame, commercial storytelling, canonical product-card, approved-media, and Design DNA authority. Evidence/cardinality guards fail closed; deterministic lifecycle and 24 retained four-width browser images pass. See </w:t>
       </w:r>
-      <w:hyperlink r:id="rIdHyperlink57" w:history="1">
+      <w:hyperlink r:id="rIdHyperlink59" w:history="1">
         <w:r>
           <w:rPr>
             <w:rFonts w:ascii="Calibri" w:hAnsi="Calibri" w:cs="Calibri"/>
@@ -25570,7 +25632,7 @@
         </w:rPr>
         <w:t xml:space="preserve"> anatomy, P10B-08 canonical card anatomy, and P10B-04 approved media treatment. Exact canonical catalogue bindings preserve product membership/order, facts, product media, filters/sort state, and child-collection order. Campaign media is approved collection/editorial media, not a product-media replacement. A transient revision-checked zero-result context keeps the query without fabricating products. Deterministic lifecycle and 16-view Chromium evidence pass with zero provider calls. See </w:t>
       </w:r>
-      <w:hyperlink r:id="rIdHyperlink58" w:history="1">
+      <w:hyperlink r:id="rIdHyperlink60" w:history="1">
         <w:r>
           <w:rPr>
             <w:rFonts w:ascii="Calibri" w:hAnsi="Calibri" w:cs="Calibri"/>
@@ -26100,7 +26162,7 @@
         </w:rPr>
         <w:t xml:space="preserve">. Fifteen structurally distinct registered profiles resolve exact current approved brief evidence into strict localized fact documents. P10B-05 preserves page-set, route, locale, and transitive navigation authority; P10B-06 frames and P10B-07 editorial/campaign renderers are reused. Snapshot save/reload and deterministic publication preserve the exact document. See </w:t>
       </w:r>
-      <w:hyperlink r:id="rIdHyperlink59" w:history="1">
+      <w:hyperlink r:id="rIdHyperlink61" w:history="1">
         <w:r>
           <w:rPr>
             <w:rFonts w:ascii="Calibri" w:hAnsi="Calibri" w:cs="Calibri"/>
@@ -26311,7 +26373,7 @@
         </w:rPr>
         <w:t xml:space="preserve"> component through the P10B-05 family page; registered loading state renders on its pending route instead of replacing the 404 singleton. Read-only runtime state supplies canonical cart facts, checkout continuation, P10B-10 query/filter context, and bounded recovery actions while the snapshot preserves presentation only. Shared-frame/Design DNA, save/reload, publication, four- width browser evidence, and no-provider behavior are covered under </w:t>
       </w:r>
-      <w:hyperlink r:id="rIdHyperlink60" w:history="1">
+      <w:hyperlink r:id="rIdHyperlink62" w:history="1">
         <w:r>
           <w:rPr>
             <w:rFonts w:ascii="Calibri" w:hAnsi="Calibri" w:cs="Calibri"/>
@@ -26522,7 +26584,7 @@
         </w:rPr>
         <w:t xml:space="preserve"> frame span all pages; simple/configurable PDP, factual content, utility states, 15 four-width/representative screenshots and the passing 160-scenario human record are retained in </w:t>
       </w:r>
-      <w:hyperlink r:id="rIdHyperlink61" w:history="1">
+      <w:hyperlink r:id="rIdHyperlink63" w:history="1">
         <w:r>
           <w:rPr>
             <w:rFonts w:ascii="Calibri" w:hAnsi="Calibri" w:cs="Calibri"/>
@@ -26733,7 +26795,7 @@
         </w:rPr>
         <w:t xml:space="preserve"> One versioned deterministic synthesis contract binds exact merchant, evidence, commerce, asset, Design DNA, site-map, frame, PageBlueprint/profile, component/anatomy, narrative, density, art-direction, responsive, planner, registry and recipe authority. The same approved fixture produces editorial-heavy, commerce/discovery-heavy and restrained/minimal complete 17-route stores through the existing whole-storefront proposal, snapshot, save/reload, renderer and immutable publication chain. Details are retained in </w:t>
       </w:r>
-      <w:hyperlink r:id="rIdHyperlink62" w:history="1">
+      <w:hyperlink r:id="rIdHyperlink64" w:history="1">
         <w:r>
           <w:rPr>
             <w:rFonts w:ascii="Calibri" w:hAnsi="Calibri" w:cs="Calibri"/>
@@ -26978,7 +27040,7 @@
         </w:rPr>
         <w:t xml:space="preserve"> 31 focused unit/integration cases; nine representative complete outcomes; exact save/reload and compiled publication; protected commerce/evidence/media parity; dedicated 375/768/1024/1440 browser coverage; three retained human commercial reviews and one exact evidence manifest. See </w:t>
       </w:r>
-      <w:hyperlink r:id="rIdHyperlink63" w:history="1">
+      <w:hyperlink r:id="rIdHyperlink65" w:history="1">
         <w:r>
           <w:rPr>
             <w:rFonts w:ascii="Calibri" w:hAnsi="Calibri" w:cs="Calibri"/>
@@ -27155,7 +27217,7 @@
         </w:rPr>
         <w:t xml:space="preserve"> A compact route inventory, four collection/search archetypes, four maintained PDP profiles plus generic fallback, exact collection and product-type mappings, bounded matching rules, transient editor/runtime projection, deterministic legacy convergence, and complete snapshot/lifecycle/publication preservation. Exact primary and related-product bindings survive convergence. A server-owned, storefront-scoped proposal transition binds legacy and reviewed canonical projections for deterministic acceptance replay. Storefront Studio lists archetypes rather than one page per commerce URL; representative context is not persisted. See </w:t>
       </w:r>
-      <w:hyperlink r:id="rIdHyperlink64" w:history="1">
+      <w:hyperlink r:id="rIdHyperlink66" w:history="1">
         <w:r>
           <w:rPr>
             <w:rFonts w:ascii="Calibri" w:hAnsi="Calibri" w:cs="Calibri"/>
@@ -27623,7 +27685,7 @@
         </w:rPr>
         <w:t xml:space="preserve"> </w:t>
       </w:r>
-      <w:hyperlink r:id="rIdHyperlink65" w:history="1">
+      <w:hyperlink r:id="rIdHyperlink67" w:history="1">
         <w:r>
           <w:rPr>
             <w:rFonts w:ascii="Calibri" w:hAnsi="Calibri" w:cs="Calibri"/>
@@ -28084,7 +28146,7 @@
         </w:rPr>
         <w:t xml:space="preserve">. Completed 15 August 2026; see </w:t>
       </w:r>
-      <w:hyperlink r:id="rIdHyperlink48" w:history="1">
+      <w:hyperlink r:id="rIdHyperlink50" w:history="1">
         <w:r>
           <w:rPr>
             <w:rFonts w:ascii="Calibri" w:hAnsi="Calibri" w:cs="Calibri"/>
@@ -29346,7 +29408,7 @@
         </w:rPr>
         <w:t xml:space="preserve">. Accepted by the product owner on 16 August 2026 under </w:t>
       </w:r>
-      <w:hyperlink r:id="rIdHyperlink66" w:history="1">
+      <w:hyperlink r:id="rIdHyperlink68" w:history="1">
         <w:r>
           <w:rPr>
             <w:rFonts w:ascii="Calibri" w:hAnsi="Calibri" w:cs="Calibri"/>
@@ -29704,7 +29766,7 @@
         </w:rPr>
         <w:t xml:space="preserve">. Accepted by the product owner on 17 August 2026 under </w:t>
       </w:r>
-      <w:hyperlink r:id="rIdHyperlink66" w:history="1">
+      <w:hyperlink r:id="rIdHyperlink68" w:history="1">
         <w:r>
           <w:rPr>
             <w:rFonts w:ascii="Calibri" w:hAnsi="Calibri" w:cs="Calibri"/>
@@ -32844,7 +32906,7 @@
         </w:rPr>
         <w:t xml:space="preserve"> </w:t>
       </w:r>
-      <w:hyperlink r:id="rIdHyperlink67" w:history="1">
+      <w:hyperlink r:id="rIdHyperlink69" w:history="1">
         <w:r>
           <w:rPr>
             <w:rFonts w:ascii="Calibri" w:hAnsi="Calibri" w:cs="Calibri"/>
@@ -32860,7 +32922,7 @@
         </w:rPr>
         <w:t xml:space="preserve"> and </w:t>
       </w:r>
-      <w:hyperlink r:id="rIdHyperlink68" w:history="1">
+      <w:hyperlink r:id="rIdHyperlink70" w:history="1">
         <w:r>
           <w:rPr>
             <w:rFonts w:ascii="Calibri" w:hAnsi="Calibri" w:cs="Calibri"/>

</xml_diff>

<commit_message>
feat(storage): save and reopen composed static drafts
</commit_message>
<xml_diff>
--- a/docs/VESKIFY_DEVELOPMENT_DELIVERY_TRACKER_v1.3.0.docx
+++ b/docs/VESKIFY_DEVELOPMENT_DELIVERY_TRACKER_v1.3.0.docx
@@ -51,7 +51,7 @@
         <w:rPr>
           <w:rFonts w:ascii="Calibri" w:hAnsi="Calibri" w:cs="Calibri"/>
         </w:rPr>
-        <w:t>AR-02 and AR-02A through AR-02M Baseline / closed; AR-03 and AR-03A through AR-03E remain closed; AR-04 Baseline / closed; AR-05A Baseline / closed; AR-05B and AR-05 Baseline / closed; AR-06A Baseline / closed verified at bc209f4bdfed9626605b8c699aaabb547d5d2025; AR-06B Baseline / closed effective upon accepted merge; AR-06 Partial pending editor/lifecycle/publication and executable-commerce proof; AR-23 eligible / unstarted; BATCH-10 through BATCH-14 complete; BATCH-15 closes only upon accepted AR-06B delivery and safe closeout; no successor</w:t>
+        <w:t>AR-02 and AR-02A through AR-02M Baseline / closed; AR-03 and AR-03A through AR-03E remain closed; AR-04 Baseline / closed; AR-05A Baseline / closed; AR-05B and AR-05 Baseline / closed; AR-06A Baseline / closed verified at bc209f4bdfed9626605b8c699aaabb547d5d2025; AR-06B Baseline / closed accepted at e2addffc29f7719e23e9e7856ecf7c739924501f; AR-06C independently verified persistence candidate pending accepted delivery; AR-06 Partial pending lifecycle/publication, normal rollout and executable-commerce proof; AR-23 eligible / unstarted; BATCH-10 through BATCH-15 complete; BATCH-16 closes only upon accepted AR-06C delivery and safe closeout; no successor</w:t>
       </w:r>
     </w:p>
     <w:p>
@@ -118,7 +118,7 @@
           <w:b/>
           <w:bCs/>
         </w:rPr>
-        <w:t>Candidate status effective upon accepted AR-06B merge after AR-06A verification:</w:t>
+        <w:t>AR-06C candidate status after accepted AR-06B merge:</w:t>
       </w:r>
       <w:r>
         <w:rPr>
@@ -362,7 +362,7 @@
         <w:rPr>
           <w:rFonts w:ascii="Calibri" w:hAnsi="Calibri" w:cs="Calibri"/>
         </w:rPr>
-        <w:t xml:space="preserve">; complete original acceptance is mapped in AR_02_BOUNDARY_ACCEPTANCE.md. AR-04 is Baseline / closed. AR-05A is Baseline / closed. AR-05B is Baseline / closed. AR-05 is Baseline / closed; original T01/T02 acceptance is mapped in AR_05_CANONICAL_ACCEPTANCE.md. AR-06A is Baseline / closed. Its accepted merge is bc209f4bdfed9626605b8c699aaabb547d5d2025. AR-06B is Baseline / closed effective upon accepted merge; this candidate does not assert delivery. AR-06 is Partial; rendering and editing evidence is mapped in AR_06_RENDERING_ACCEPTANCE.md. Lossless Puck/save/history/publication integration, positive collection/search and PDP executable-commerce proof, and the shared collection/search context decision remain required before enablement. AR-03 is </w:t>
+        <w:t xml:space="preserve">; complete original acceptance is mapped in AR_02_BOUNDARY_ACCEPTANCE.md. AR-04 is Baseline / closed. AR-05A is Baseline / closed. AR-05B is Baseline / closed. AR-05 is Baseline / closed; original T01/T02 acceptance is mapped in AR_05_CANONICAL_ACCEPTANCE.md. AR-06A is Baseline / closed. Its accepted merge is bc209f4bdfed9626605b8c699aaabb547d5d2025. AR-06B is Baseline / closed. Its accepted merge is e2addffc29f7719e23e9e7856ecf7c739924501f. AR-06C is a guarded composed static-draft persistence candidate with independent verification complete, pending final-head CI and accepted delivery. AR-06 is Partial; rendering, editing and save/reload evidence is mapped in AR_06_RENDERING_ACCEPTANCE.md. History/lifecycle/publication integration, positive collection/search and PDP executable-commerce proof, and the shared collection/search context decision remain required before enablement. AR-03 is </w:t>
       </w:r>
       <w:r>
         <w:rPr>
@@ -460,7 +460,7 @@
         <w:rPr>
           <w:rFonts w:ascii="Calibri" w:hAnsi="Calibri" w:cs="Calibri"/>
         </w:rPr>
-        <w:t xml:space="preserve">. AR-23 depends on AR-01 and is not serialized behind visual work. BATCH-03 is complete. BATCH-04 is complete. BATCH-05 is complete. BATCH-06 is complete. BATCH-07 is complete. BATCH-08 is complete. BATCH-09 is complete. BATCH-10 is complete. BATCH-11 is complete. BATCH-12 is complete. BATCH-13 is complete. BATCH-14 is complete. BATCH-15 closes only upon accepted AR-06B delivery and safe closeout. No successor implementation is authorized. This tracker owns current status; the roadmap owns dependency order. Retained B01 exact-next, fixed-two-call/mandatory-three-concept, transient-only, and 73-child future-sequence statements are </w:t>
+        <w:t xml:space="preserve">. AR-23 depends on AR-01 and is not serialized behind visual work. BATCH-03 is complete. BATCH-04 is complete. BATCH-05 is complete. BATCH-06 is complete. BATCH-07 is complete. BATCH-08 is complete. BATCH-09 is complete. BATCH-10 is complete. BATCH-11 is complete. BATCH-12 is complete. BATCH-13 is complete. BATCH-14 is complete. BATCH-15 is complete. BATCH-16 closes only upon accepted AR-06C delivery and safe closeout. No successor implementation is authorized. This tracker owns current status; the roadmap owns dependency order. Retained B01 exact-next, fixed-two-call/mandatory-three-concept, transient-only, and 73-child future-sequence statements are </w:t>
       </w:r>
       <w:r>
         <w:rPr>
@@ -534,7 +534,7 @@
         <w:rPr>
           <w:rFonts w:ascii="Calibri" w:hAnsi="Calibri" w:cs="Calibri"/>
         </w:rPr>
-        <w:t xml:space="preserve"> adds the actual shared static renderer and bounded four-width proof, effective upon its accepted merge. AR-06 remains Partial: Puck editing, save/history/publication integration, dynamic executable commerce and the shared collection/search context decision remain unproven.</w:t>
+        <w:t xml:space="preserve"> adds the actual shared static renderer and bounded four-width proof. Accepted AR-06B adds guarded Puck editing and canonical round trip. AR-06 remains Partial: composed save/reload acceptance, history/publication integration, normal Studio rollout, dynamic executable commerce and the shared collection/search context decision remain unproven.</w:t>
       </w:r>
     </w:p>
     <w:p>
@@ -3152,7 +3152,53 @@
           <w:b/>
           <w:bCs/>
         </w:rPr>
-        <w:t>Baseline / closed effective upon accepted merge; candidate evidence remains pending</w:t>
+        <w:t>Baseline / closed; accepted PR #260</w:t>
+      </w:r>
+      <w:r>
+        <w:rPr>
+          <w:rFonts w:ascii="Calibri" w:hAnsi="Calibri" w:cs="Calibri"/>
+        </w:rPr>
+        <w:t xml:space="preserve"> | | AR-06C | AR-06 | Guarded canonical static-draft save and real IndexedDB reopen; </w:t>
+      </w:r>
+      <w:hyperlink r:id="rIdHyperlink48" w:history="1">
+        <w:r>
+          <w:rPr>
+            <w:rFonts w:ascii="Calibri" w:hAnsi="Calibri" w:cs="Calibri"/>
+            <w:color w:val="2E74B5"/>
+            <w:u w:val="single"/>
+          </w:rPr>
+          <w:t>contract</w:t>
+        </w:r>
+      </w:hyperlink>
+      <w:r>
+        <w:rPr>
+          <w:rFonts w:ascii="Calibri" w:hAnsi="Calibri" w:cs="Calibri"/>
+        </w:rPr>
+        <w:t xml:space="preserve">, </w:t>
+      </w:r>
+      <w:hyperlink r:id="rIdHyperlink49" w:history="1">
+        <w:r>
+          <w:rPr>
+            <w:rFonts w:ascii="Calibri" w:hAnsi="Calibri" w:cs="Calibri"/>
+            <w:color w:val="2E74B5"/>
+            <w:u w:val="single"/>
+          </w:rPr>
+          <w:t>report</w:t>
+        </w:r>
+      </w:hyperlink>
+      <w:r>
+        <w:rPr>
+          <w:rFonts w:ascii="Calibri" w:hAnsi="Calibri" w:cs="Calibri"/>
+        </w:rPr>
+        <w:t xml:space="preserve"> | </w:t>
+      </w:r>
+      <w:r>
+        <w:rPr>
+          <w:rFonts w:ascii="Calibri" w:hAnsi="Calibri" w:cs="Calibri"/>
+          <w:b/>
+          <w:bCs/>
+        </w:rPr>
+        <w:t>Independently verified; closes upon accepted PR merge</w:t>
       </w:r>
       <w:r>
         <w:rPr>
@@ -23085,7 +23131,7 @@
         </w:rPr>
         <w:t xml:space="preserve">. Completed 7 August 2026; see </w:t>
       </w:r>
-      <w:hyperlink r:id="rIdHyperlink48" w:history="1">
+      <w:hyperlink r:id="rIdHyperlink50" w:history="1">
         <w:r>
           <w:rPr>
             <w:rFonts w:ascii="Calibri" w:hAnsi="Calibri" w:cs="Calibri"/>
@@ -23222,7 +23268,7 @@
         </w:rPr>
         <w:t xml:space="preserve">The binding details and minimum coverage are in </w:t>
       </w:r>
-      <w:hyperlink r:id="rIdHyperlink49" w:history="1">
+      <w:hyperlink r:id="rIdHyperlink51" w:history="1">
         <w:r>
           <w:rPr>
             <w:rFonts w:ascii="Calibri" w:hAnsi="Calibri" w:cs="Calibri"/>
@@ -23420,7 +23466,7 @@
         </w:rPr>
         <w:t xml:space="preserve">. P10B-16P-04 acceptance evidence is retained in </w:t>
       </w:r>
-      <w:hyperlink r:id="rIdHyperlink50" w:history="1">
+      <w:hyperlink r:id="rIdHyperlink52" w:history="1">
         <w:r>
           <w:rPr>
             <w:rFonts w:ascii="Calibri" w:hAnsi="Calibri" w:cs="Calibri"/>
@@ -23669,7 +23715,7 @@
         </w:rPr>
         <w:t xml:space="preserve">. See </w:t>
       </w:r>
-      <w:hyperlink r:id="rIdHyperlink51" w:history="1">
+      <w:hyperlink r:id="rIdHyperlink53" w:history="1">
         <w:r>
           <w:rPr>
             <w:rFonts w:ascii="Calibri" w:hAnsi="Calibri" w:cs="Calibri"/>
@@ -23918,7 +23964,7 @@
         </w:rPr>
         <w:t xml:space="preserve">. See </w:t>
       </w:r>
-      <w:hyperlink r:id="rIdHyperlink52" w:history="1">
+      <w:hyperlink r:id="rIdHyperlink54" w:history="1">
         <w:r>
           <w:rPr>
             <w:rFonts w:ascii="Calibri" w:hAnsi="Calibri" w:cs="Calibri"/>
@@ -24167,7 +24213,7 @@
         </w:rPr>
         <w:t xml:space="preserve">. At P10B-03 delivery, all then-current 25 V2 definitions and 91 variants were classified explicitly without false commercial-ready promotion. Later family tasks extend that same authority rather than replacing it. See </w:t>
       </w:r>
-      <w:hyperlink r:id="rIdHyperlink53" w:history="1">
+      <w:hyperlink r:id="rIdHyperlink55" w:history="1">
         <w:r>
           <w:rPr>
             <w:rFonts w:ascii="Calibri" w:hAnsi="Calibri" w:cs="Calibri"/>
@@ -24416,7 +24462,7 @@
         </w:rPr>
         <w:t xml:space="preserve"> embeds exact lineage and bounded treatment in the existing approved presentation, consumes Design DNA and registered anatomy, projects protected same-product media, preserves authority through lifecycle/compiler boundaries, and renders semantic four-breakpoint evidence. Production CDN transforms and retained commercial visual acceptance remain deferred. See </w:t>
       </w:r>
-      <w:hyperlink r:id="rIdHyperlink54" w:history="1">
+      <w:hyperlink r:id="rIdHyperlink56" w:history="1">
         <w:r>
           <w:rPr>
             <w:rFonts w:ascii="Calibri" w:hAnsi="Calibri" w:cs="Calibri"/>
@@ -24665,7 +24711,7 @@
         </w:rPr>
         <w:t xml:space="preserve">. See </w:t>
       </w:r>
-      <w:hyperlink r:id="rIdHyperlink55" w:history="1">
+      <w:hyperlink r:id="rIdHyperlink57" w:history="1">
         <w:r>
           <w:rPr>
             <w:rFonts w:ascii="Calibri" w:hAnsi="Calibri" w:cs="Calibri"/>
@@ -24900,7 +24946,7 @@
         </w:rPr>
         <w:t xml:space="preserve">. Four exact root-frame profiles, three mobile modes, and four footer compositions preserve canonical navigation and frame identity through snapshot, save/reload, Puck root, preview, publication compilation, EN/FI, and 375/768/1024/1440 px evidence. See </w:t>
       </w:r>
-      <w:hyperlink r:id="rIdHyperlink56" w:history="1">
+      <w:hyperlink r:id="rIdHyperlink58" w:history="1">
         <w:r>
           <w:rPr>
             <w:rFonts w:ascii="Calibri" w:hAnsi="Calibri" w:cs="Calibri"/>
@@ -25135,7 +25181,7 @@
         </w:rPr>
         <w:t xml:space="preserve">. Six meaningful hero anatomies, five editorial/story anatomies, five campaign/promotion anatomies and three evidence-grounded proof/service anatomies are registered, PageBlueprint-selectable, deterministically generated, snapshot/publish preserved and rendered through one shared implementation. Focused deterministic coverage and a zero-provider Chromium scenario retain evidence at 375, 768, 1024 and 1440 px. See </w:t>
       </w:r>
-      <w:hyperlink r:id="rIdHyperlink57" w:history="1">
+      <w:hyperlink r:id="rIdHyperlink59" w:history="1">
         <w:r>
           <w:rPr>
             <w:rFonts w:ascii="Calibri" w:hAnsi="Calibri" w:cs="Calibri"/>
@@ -25184,7 +25230,7 @@
         </w:rPr>
         <w:t xml:space="preserve"> Baseline. One fingerprinted authority and renderer now serve homepage merchandising, collection/results, related products, and legacy compatibility. Five meaningful anatomies preserve canonical facts and P10B-04 media lineage through plan, proposal, snapshot, save/reload, publish, and responsive browser evidence. See </w:t>
       </w:r>
-      <w:hyperlink r:id="rIdHyperlink58" w:history="1">
+      <w:hyperlink r:id="rIdHyperlink60" w:history="1">
         <w:r>
           <w:rPr>
             <w:rFonts w:ascii="Calibri" w:hAnsi="Calibri" w:cs="Calibri"/>
@@ -25401,7 +25447,7 @@
         </w:rPr>
         <w:t xml:space="preserve"> Baseline. Six versioned, structurally fingerprinted homepage PageBlueprint profiles compose current shared-frame, commercial storytelling, canonical product-card, approved-media, and Design DNA authority. Evidence/cardinality guards fail closed; deterministic lifecycle and 24 retained four-width browser images pass. See </w:t>
       </w:r>
-      <w:hyperlink r:id="rIdHyperlink59" w:history="1">
+      <w:hyperlink r:id="rIdHyperlink61" w:history="1">
         <w:r>
           <w:rPr>
             <w:rFonts w:ascii="Calibri" w:hAnsi="Calibri" w:cs="Calibri"/>
@@ -25632,7 +25678,7 @@
         </w:rPr>
         <w:t xml:space="preserve"> anatomy, P10B-08 canonical card anatomy, and P10B-04 approved media treatment. Exact canonical catalogue bindings preserve product membership/order, facts, product media, filters/sort state, and child-collection order. Campaign media is approved collection/editorial media, not a product-media replacement. A transient revision-checked zero-result context keeps the query without fabricating products. Deterministic lifecycle and 16-view Chromium evidence pass with zero provider calls. See </w:t>
       </w:r>
-      <w:hyperlink r:id="rIdHyperlink60" w:history="1">
+      <w:hyperlink r:id="rIdHyperlink62" w:history="1">
         <w:r>
           <w:rPr>
             <w:rFonts w:ascii="Calibri" w:hAnsi="Calibri" w:cs="Calibri"/>
@@ -26162,7 +26208,7 @@
         </w:rPr>
         <w:t xml:space="preserve">. Fifteen structurally distinct registered profiles resolve exact current approved brief evidence into strict localized fact documents. P10B-05 preserves page-set, route, locale, and transitive navigation authority; P10B-06 frames and P10B-07 editorial/campaign renderers are reused. Snapshot save/reload and deterministic publication preserve the exact document. See </w:t>
       </w:r>
-      <w:hyperlink r:id="rIdHyperlink61" w:history="1">
+      <w:hyperlink r:id="rIdHyperlink63" w:history="1">
         <w:r>
           <w:rPr>
             <w:rFonts w:ascii="Calibri" w:hAnsi="Calibri" w:cs="Calibri"/>
@@ -26373,7 +26419,7 @@
         </w:rPr>
         <w:t xml:space="preserve"> component through the P10B-05 family page; registered loading state renders on its pending route instead of replacing the 404 singleton. Read-only runtime state supplies canonical cart facts, checkout continuation, P10B-10 query/filter context, and bounded recovery actions while the snapshot preserves presentation only. Shared-frame/Design DNA, save/reload, publication, four- width browser evidence, and no-provider behavior are covered under </w:t>
       </w:r>
-      <w:hyperlink r:id="rIdHyperlink62" w:history="1">
+      <w:hyperlink r:id="rIdHyperlink64" w:history="1">
         <w:r>
           <w:rPr>
             <w:rFonts w:ascii="Calibri" w:hAnsi="Calibri" w:cs="Calibri"/>
@@ -26584,7 +26630,7 @@
         </w:rPr>
         <w:t xml:space="preserve"> frame span all pages; simple/configurable PDP, factual content, utility states, 15 four-width/representative screenshots and the passing 160-scenario human record are retained in </w:t>
       </w:r>
-      <w:hyperlink r:id="rIdHyperlink63" w:history="1">
+      <w:hyperlink r:id="rIdHyperlink65" w:history="1">
         <w:r>
           <w:rPr>
             <w:rFonts w:ascii="Calibri" w:hAnsi="Calibri" w:cs="Calibri"/>
@@ -26795,7 +26841,7 @@
         </w:rPr>
         <w:t xml:space="preserve"> One versioned deterministic synthesis contract binds exact merchant, evidence, commerce, asset, Design DNA, site-map, frame, PageBlueprint/profile, component/anatomy, narrative, density, art-direction, responsive, planner, registry and recipe authority. The same approved fixture produces editorial-heavy, commerce/discovery-heavy and restrained/minimal complete 17-route stores through the existing whole-storefront proposal, snapshot, save/reload, renderer and immutable publication chain. Details are retained in </w:t>
       </w:r>
-      <w:hyperlink r:id="rIdHyperlink64" w:history="1">
+      <w:hyperlink r:id="rIdHyperlink66" w:history="1">
         <w:r>
           <w:rPr>
             <w:rFonts w:ascii="Calibri" w:hAnsi="Calibri" w:cs="Calibri"/>
@@ -27040,7 +27086,7 @@
         </w:rPr>
         <w:t xml:space="preserve"> 31 focused unit/integration cases; nine representative complete outcomes; exact save/reload and compiled publication; protected commerce/evidence/media parity; dedicated 375/768/1024/1440 browser coverage; three retained human commercial reviews and one exact evidence manifest. See </w:t>
       </w:r>
-      <w:hyperlink r:id="rIdHyperlink65" w:history="1">
+      <w:hyperlink r:id="rIdHyperlink67" w:history="1">
         <w:r>
           <w:rPr>
             <w:rFonts w:ascii="Calibri" w:hAnsi="Calibri" w:cs="Calibri"/>
@@ -27217,7 +27263,7 @@
         </w:rPr>
         <w:t xml:space="preserve"> A compact route inventory, four collection/search archetypes, four maintained PDP profiles plus generic fallback, exact collection and product-type mappings, bounded matching rules, transient editor/runtime projection, deterministic legacy convergence, and complete snapshot/lifecycle/publication preservation. Exact primary and related-product bindings survive convergence. A server-owned, storefront-scoped proposal transition binds legacy and reviewed canonical projections for deterministic acceptance replay. Storefront Studio lists archetypes rather than one page per commerce URL; representative context is not persisted. See </w:t>
       </w:r>
-      <w:hyperlink r:id="rIdHyperlink66" w:history="1">
+      <w:hyperlink r:id="rIdHyperlink68" w:history="1">
         <w:r>
           <w:rPr>
             <w:rFonts w:ascii="Calibri" w:hAnsi="Calibri" w:cs="Calibri"/>
@@ -27685,7 +27731,7 @@
         </w:rPr>
         <w:t xml:space="preserve"> </w:t>
       </w:r>
-      <w:hyperlink r:id="rIdHyperlink67" w:history="1">
+      <w:hyperlink r:id="rIdHyperlink69" w:history="1">
         <w:r>
           <w:rPr>
             <w:rFonts w:ascii="Calibri" w:hAnsi="Calibri" w:cs="Calibri"/>
@@ -28146,7 +28192,7 @@
         </w:rPr>
         <w:t xml:space="preserve">. Completed 15 August 2026; see </w:t>
       </w:r>
-      <w:hyperlink r:id="rIdHyperlink50" w:history="1">
+      <w:hyperlink r:id="rIdHyperlink52" w:history="1">
         <w:r>
           <w:rPr>
             <w:rFonts w:ascii="Calibri" w:hAnsi="Calibri" w:cs="Calibri"/>
@@ -29408,7 +29454,7 @@
         </w:rPr>
         <w:t xml:space="preserve">. Accepted by the product owner on 16 August 2026 under </w:t>
       </w:r>
-      <w:hyperlink r:id="rIdHyperlink68" w:history="1">
+      <w:hyperlink r:id="rIdHyperlink70" w:history="1">
         <w:r>
           <w:rPr>
             <w:rFonts w:ascii="Calibri" w:hAnsi="Calibri" w:cs="Calibri"/>
@@ -29766,7 +29812,7 @@
         </w:rPr>
         <w:t xml:space="preserve">. Accepted by the product owner on 17 August 2026 under </w:t>
       </w:r>
-      <w:hyperlink r:id="rIdHyperlink68" w:history="1">
+      <w:hyperlink r:id="rIdHyperlink70" w:history="1">
         <w:r>
           <w:rPr>
             <w:rFonts w:ascii="Calibri" w:hAnsi="Calibri" w:cs="Calibri"/>
@@ -32906,7 +32952,7 @@
         </w:rPr>
         <w:t xml:space="preserve"> </w:t>
       </w:r>
-      <w:hyperlink r:id="rIdHyperlink69" w:history="1">
+      <w:hyperlink r:id="rIdHyperlink71" w:history="1">
         <w:r>
           <w:rPr>
             <w:rFonts w:ascii="Calibri" w:hAnsi="Calibri" w:cs="Calibri"/>
@@ -32922,7 +32968,7 @@
         </w:rPr>
         <w:t xml:space="preserve"> and </w:t>
       </w:r>
-      <w:hyperlink r:id="rIdHyperlink70" w:history="1">
+      <w:hyperlink r:id="rIdHyperlink72" w:history="1">
         <w:r>
           <w:rPr>
             <w:rFonts w:ascii="Calibri" w:hAnsi="Calibri" w:cs="Calibri"/>

</xml_diff>

<commit_message>
feat(storage): save and reopen composed static drafts (#261)
* feat(storage): save and reopen composed static drafts

* test(storage): use field replacement in draft persistence checks
</commit_message>
<xml_diff>
--- a/docs/VESKIFY_DEVELOPMENT_DELIVERY_TRACKER_v1.3.0.docx
+++ b/docs/VESKIFY_DEVELOPMENT_DELIVERY_TRACKER_v1.3.0.docx
@@ -51,7 +51,7 @@
         <w:rPr>
           <w:rFonts w:ascii="Calibri" w:hAnsi="Calibri" w:cs="Calibri"/>
         </w:rPr>
-        <w:t>AR-02 and AR-02A through AR-02M Baseline / closed; AR-03 and AR-03A through AR-03E remain closed; AR-04 Baseline / closed; AR-05A Baseline / closed; AR-05B and AR-05 Baseline / closed; AR-06A Baseline / closed verified at bc209f4bdfed9626605b8c699aaabb547d5d2025; AR-06B Baseline / closed effective upon accepted merge; AR-06 Partial pending editor/lifecycle/publication and executable-commerce proof; AR-23 eligible / unstarted; BATCH-10 through BATCH-14 complete; BATCH-15 closes only upon accepted AR-06B delivery and safe closeout; no successor</w:t>
+        <w:t>AR-02 and AR-02A through AR-02M Baseline / closed; AR-03 and AR-03A through AR-03E remain closed; AR-04 Baseline / closed; AR-05A Baseline / closed; AR-05B and AR-05 Baseline / closed; AR-06A Baseline / closed verified at bc209f4bdfed9626605b8c699aaabb547d5d2025; AR-06B Baseline / closed accepted at e2addffc29f7719e23e9e7856ecf7c739924501f; AR-06C independently verified persistence candidate pending accepted delivery; AR-06 Partial pending lifecycle/publication, normal rollout and executable-commerce proof; AR-23 eligible / unstarted; BATCH-10 through BATCH-15 complete; BATCH-16 closes only upon accepted AR-06C delivery and safe closeout; no successor</w:t>
       </w:r>
     </w:p>
     <w:p>
@@ -118,7 +118,7 @@
           <w:b/>
           <w:bCs/>
         </w:rPr>
-        <w:t>Candidate status effective upon accepted AR-06B merge after AR-06A verification:</w:t>
+        <w:t>AR-06C candidate status after accepted AR-06B merge:</w:t>
       </w:r>
       <w:r>
         <w:rPr>
@@ -362,7 +362,7 @@
         <w:rPr>
           <w:rFonts w:ascii="Calibri" w:hAnsi="Calibri" w:cs="Calibri"/>
         </w:rPr>
-        <w:t xml:space="preserve">; complete original acceptance is mapped in AR_02_BOUNDARY_ACCEPTANCE.md. AR-04 is Baseline / closed. AR-05A is Baseline / closed. AR-05B is Baseline / closed. AR-05 is Baseline / closed; original T01/T02 acceptance is mapped in AR_05_CANONICAL_ACCEPTANCE.md. AR-06A is Baseline / closed. Its accepted merge is bc209f4bdfed9626605b8c699aaabb547d5d2025. AR-06B is Baseline / closed effective upon accepted merge; this candidate does not assert delivery. AR-06 is Partial; rendering and editing evidence is mapped in AR_06_RENDERING_ACCEPTANCE.md. Lossless Puck/save/history/publication integration, positive collection/search and PDP executable-commerce proof, and the shared collection/search context decision remain required before enablement. AR-03 is </w:t>
+        <w:t xml:space="preserve">; complete original acceptance is mapped in AR_02_BOUNDARY_ACCEPTANCE.md. AR-04 is Baseline / closed. AR-05A is Baseline / closed. AR-05B is Baseline / closed. AR-05 is Baseline / closed; original T01/T02 acceptance is mapped in AR_05_CANONICAL_ACCEPTANCE.md. AR-06A is Baseline / closed. Its accepted merge is bc209f4bdfed9626605b8c699aaabb547d5d2025. AR-06B is Baseline / closed. Its accepted merge is e2addffc29f7719e23e9e7856ecf7c739924501f. AR-06C is a guarded composed static-draft persistence candidate with independent verification complete, pending final-head CI and accepted delivery. AR-06 is Partial; rendering, editing and save/reload evidence is mapped in AR_06_RENDERING_ACCEPTANCE.md. History/lifecycle/publication integration, positive collection/search and PDP executable-commerce proof, and the shared collection/search context decision remain required before enablement. AR-03 is </w:t>
       </w:r>
       <w:r>
         <w:rPr>
@@ -460,7 +460,7 @@
         <w:rPr>
           <w:rFonts w:ascii="Calibri" w:hAnsi="Calibri" w:cs="Calibri"/>
         </w:rPr>
-        <w:t xml:space="preserve">. AR-23 depends on AR-01 and is not serialized behind visual work. BATCH-03 is complete. BATCH-04 is complete. BATCH-05 is complete. BATCH-06 is complete. BATCH-07 is complete. BATCH-08 is complete. BATCH-09 is complete. BATCH-10 is complete. BATCH-11 is complete. BATCH-12 is complete. BATCH-13 is complete. BATCH-14 is complete. BATCH-15 closes only upon accepted AR-06B delivery and safe closeout. No successor implementation is authorized. This tracker owns current status; the roadmap owns dependency order. Retained B01 exact-next, fixed-two-call/mandatory-three-concept, transient-only, and 73-child future-sequence statements are </w:t>
+        <w:t xml:space="preserve">. AR-23 depends on AR-01 and is not serialized behind visual work. BATCH-03 is complete. BATCH-04 is complete. BATCH-05 is complete. BATCH-06 is complete. BATCH-07 is complete. BATCH-08 is complete. BATCH-09 is complete. BATCH-10 is complete. BATCH-11 is complete. BATCH-12 is complete. BATCH-13 is complete. BATCH-14 is complete. BATCH-15 is complete. BATCH-16 closes only upon accepted AR-06C delivery and safe closeout. No successor implementation is authorized. This tracker owns current status; the roadmap owns dependency order. Retained B01 exact-next, fixed-two-call/mandatory-three-concept, transient-only, and 73-child future-sequence statements are </w:t>
       </w:r>
       <w:r>
         <w:rPr>
@@ -534,7 +534,7 @@
         <w:rPr>
           <w:rFonts w:ascii="Calibri" w:hAnsi="Calibri" w:cs="Calibri"/>
         </w:rPr>
-        <w:t xml:space="preserve"> adds the actual shared static renderer and bounded four-width proof, effective upon its accepted merge. AR-06 remains Partial: Puck editing, save/history/publication integration, dynamic executable commerce and the shared collection/search context decision remain unproven.</w:t>
+        <w:t xml:space="preserve"> adds the actual shared static renderer and bounded four-width proof. Accepted AR-06B adds guarded Puck editing and canonical round trip. AR-06 remains Partial: composed save/reload acceptance, history/publication integration, normal Studio rollout, dynamic executable commerce and the shared collection/search context decision remain unproven.</w:t>
       </w:r>
     </w:p>
     <w:p>
@@ -3152,7 +3152,53 @@
           <w:b/>
           <w:bCs/>
         </w:rPr>
-        <w:t>Baseline / closed effective upon accepted merge; candidate evidence remains pending</w:t>
+        <w:t>Baseline / closed; accepted PR #260</w:t>
+      </w:r>
+      <w:r>
+        <w:rPr>
+          <w:rFonts w:ascii="Calibri" w:hAnsi="Calibri" w:cs="Calibri"/>
+        </w:rPr>
+        <w:t xml:space="preserve"> | | AR-06C | AR-06 | Guarded canonical static-draft save and real IndexedDB reopen; </w:t>
+      </w:r>
+      <w:hyperlink r:id="rIdHyperlink48" w:history="1">
+        <w:r>
+          <w:rPr>
+            <w:rFonts w:ascii="Calibri" w:hAnsi="Calibri" w:cs="Calibri"/>
+            <w:color w:val="2E74B5"/>
+            <w:u w:val="single"/>
+          </w:rPr>
+          <w:t>contract</w:t>
+        </w:r>
+      </w:hyperlink>
+      <w:r>
+        <w:rPr>
+          <w:rFonts w:ascii="Calibri" w:hAnsi="Calibri" w:cs="Calibri"/>
+        </w:rPr>
+        <w:t xml:space="preserve">, </w:t>
+      </w:r>
+      <w:hyperlink r:id="rIdHyperlink49" w:history="1">
+        <w:r>
+          <w:rPr>
+            <w:rFonts w:ascii="Calibri" w:hAnsi="Calibri" w:cs="Calibri"/>
+            <w:color w:val="2E74B5"/>
+            <w:u w:val="single"/>
+          </w:rPr>
+          <w:t>report</w:t>
+        </w:r>
+      </w:hyperlink>
+      <w:r>
+        <w:rPr>
+          <w:rFonts w:ascii="Calibri" w:hAnsi="Calibri" w:cs="Calibri"/>
+        </w:rPr>
+        <w:t xml:space="preserve"> | </w:t>
+      </w:r>
+      <w:r>
+        <w:rPr>
+          <w:rFonts w:ascii="Calibri" w:hAnsi="Calibri" w:cs="Calibri"/>
+          <w:b/>
+          <w:bCs/>
+        </w:rPr>
+        <w:t>Independently verified; closes upon accepted PR merge</w:t>
       </w:r>
       <w:r>
         <w:rPr>
@@ -23085,7 +23131,7 @@
         </w:rPr>
         <w:t xml:space="preserve">. Completed 7 August 2026; see </w:t>
       </w:r>
-      <w:hyperlink r:id="rIdHyperlink48" w:history="1">
+      <w:hyperlink r:id="rIdHyperlink50" w:history="1">
         <w:r>
           <w:rPr>
             <w:rFonts w:ascii="Calibri" w:hAnsi="Calibri" w:cs="Calibri"/>
@@ -23222,7 +23268,7 @@
         </w:rPr>
         <w:t xml:space="preserve">The binding details and minimum coverage are in </w:t>
       </w:r>
-      <w:hyperlink r:id="rIdHyperlink49" w:history="1">
+      <w:hyperlink r:id="rIdHyperlink51" w:history="1">
         <w:r>
           <w:rPr>
             <w:rFonts w:ascii="Calibri" w:hAnsi="Calibri" w:cs="Calibri"/>
@@ -23420,7 +23466,7 @@
         </w:rPr>
         <w:t xml:space="preserve">. P10B-16P-04 acceptance evidence is retained in </w:t>
       </w:r>
-      <w:hyperlink r:id="rIdHyperlink50" w:history="1">
+      <w:hyperlink r:id="rIdHyperlink52" w:history="1">
         <w:r>
           <w:rPr>
             <w:rFonts w:ascii="Calibri" w:hAnsi="Calibri" w:cs="Calibri"/>
@@ -23669,7 +23715,7 @@
         </w:rPr>
         <w:t xml:space="preserve">. See </w:t>
       </w:r>
-      <w:hyperlink r:id="rIdHyperlink51" w:history="1">
+      <w:hyperlink r:id="rIdHyperlink53" w:history="1">
         <w:r>
           <w:rPr>
             <w:rFonts w:ascii="Calibri" w:hAnsi="Calibri" w:cs="Calibri"/>
@@ -23918,7 +23964,7 @@
         </w:rPr>
         <w:t xml:space="preserve">. See </w:t>
       </w:r>
-      <w:hyperlink r:id="rIdHyperlink52" w:history="1">
+      <w:hyperlink r:id="rIdHyperlink54" w:history="1">
         <w:r>
           <w:rPr>
             <w:rFonts w:ascii="Calibri" w:hAnsi="Calibri" w:cs="Calibri"/>
@@ -24167,7 +24213,7 @@
         </w:rPr>
         <w:t xml:space="preserve">. At P10B-03 delivery, all then-current 25 V2 definitions and 91 variants were classified explicitly without false commercial-ready promotion. Later family tasks extend that same authority rather than replacing it. See </w:t>
       </w:r>
-      <w:hyperlink r:id="rIdHyperlink53" w:history="1">
+      <w:hyperlink r:id="rIdHyperlink55" w:history="1">
         <w:r>
           <w:rPr>
             <w:rFonts w:ascii="Calibri" w:hAnsi="Calibri" w:cs="Calibri"/>
@@ -24416,7 +24462,7 @@
         </w:rPr>
         <w:t xml:space="preserve"> embeds exact lineage and bounded treatment in the existing approved presentation, consumes Design DNA and registered anatomy, projects protected same-product media, preserves authority through lifecycle/compiler boundaries, and renders semantic four-breakpoint evidence. Production CDN transforms and retained commercial visual acceptance remain deferred. See </w:t>
       </w:r>
-      <w:hyperlink r:id="rIdHyperlink54" w:history="1">
+      <w:hyperlink r:id="rIdHyperlink56" w:history="1">
         <w:r>
           <w:rPr>
             <w:rFonts w:ascii="Calibri" w:hAnsi="Calibri" w:cs="Calibri"/>
@@ -24665,7 +24711,7 @@
         </w:rPr>
         <w:t xml:space="preserve">. See </w:t>
       </w:r>
-      <w:hyperlink r:id="rIdHyperlink55" w:history="1">
+      <w:hyperlink r:id="rIdHyperlink57" w:history="1">
         <w:r>
           <w:rPr>
             <w:rFonts w:ascii="Calibri" w:hAnsi="Calibri" w:cs="Calibri"/>
@@ -24900,7 +24946,7 @@
         </w:rPr>
         <w:t xml:space="preserve">. Four exact root-frame profiles, three mobile modes, and four footer compositions preserve canonical navigation and frame identity through snapshot, save/reload, Puck root, preview, publication compilation, EN/FI, and 375/768/1024/1440 px evidence. See </w:t>
       </w:r>
-      <w:hyperlink r:id="rIdHyperlink56" w:history="1">
+      <w:hyperlink r:id="rIdHyperlink58" w:history="1">
         <w:r>
           <w:rPr>
             <w:rFonts w:ascii="Calibri" w:hAnsi="Calibri" w:cs="Calibri"/>
@@ -25135,7 +25181,7 @@
         </w:rPr>
         <w:t xml:space="preserve">. Six meaningful hero anatomies, five editorial/story anatomies, five campaign/promotion anatomies and three evidence-grounded proof/service anatomies are registered, PageBlueprint-selectable, deterministically generated, snapshot/publish preserved and rendered through one shared implementation. Focused deterministic coverage and a zero-provider Chromium scenario retain evidence at 375, 768, 1024 and 1440 px. See </w:t>
       </w:r>
-      <w:hyperlink r:id="rIdHyperlink57" w:history="1">
+      <w:hyperlink r:id="rIdHyperlink59" w:history="1">
         <w:r>
           <w:rPr>
             <w:rFonts w:ascii="Calibri" w:hAnsi="Calibri" w:cs="Calibri"/>
@@ -25184,7 +25230,7 @@
         </w:rPr>
         <w:t xml:space="preserve"> Baseline. One fingerprinted authority and renderer now serve homepage merchandising, collection/results, related products, and legacy compatibility. Five meaningful anatomies preserve canonical facts and P10B-04 media lineage through plan, proposal, snapshot, save/reload, publish, and responsive browser evidence. See </w:t>
       </w:r>
-      <w:hyperlink r:id="rIdHyperlink58" w:history="1">
+      <w:hyperlink r:id="rIdHyperlink60" w:history="1">
         <w:r>
           <w:rPr>
             <w:rFonts w:ascii="Calibri" w:hAnsi="Calibri" w:cs="Calibri"/>
@@ -25401,7 +25447,7 @@
         </w:rPr>
         <w:t xml:space="preserve"> Baseline. Six versioned, structurally fingerprinted homepage PageBlueprint profiles compose current shared-frame, commercial storytelling, canonical product-card, approved-media, and Design DNA authority. Evidence/cardinality guards fail closed; deterministic lifecycle and 24 retained four-width browser images pass. See </w:t>
       </w:r>
-      <w:hyperlink r:id="rIdHyperlink59" w:history="1">
+      <w:hyperlink r:id="rIdHyperlink61" w:history="1">
         <w:r>
           <w:rPr>
             <w:rFonts w:ascii="Calibri" w:hAnsi="Calibri" w:cs="Calibri"/>
@@ -25632,7 +25678,7 @@
         </w:rPr>
         <w:t xml:space="preserve"> anatomy, P10B-08 canonical card anatomy, and P10B-04 approved media treatment. Exact canonical catalogue bindings preserve product membership/order, facts, product media, filters/sort state, and child-collection order. Campaign media is approved collection/editorial media, not a product-media replacement. A transient revision-checked zero-result context keeps the query without fabricating products. Deterministic lifecycle and 16-view Chromium evidence pass with zero provider calls. See </w:t>
       </w:r>
-      <w:hyperlink r:id="rIdHyperlink60" w:history="1">
+      <w:hyperlink r:id="rIdHyperlink62" w:history="1">
         <w:r>
           <w:rPr>
             <w:rFonts w:ascii="Calibri" w:hAnsi="Calibri" w:cs="Calibri"/>
@@ -26162,7 +26208,7 @@
         </w:rPr>
         <w:t xml:space="preserve">. Fifteen structurally distinct registered profiles resolve exact current approved brief evidence into strict localized fact documents. P10B-05 preserves page-set, route, locale, and transitive navigation authority; P10B-06 frames and P10B-07 editorial/campaign renderers are reused. Snapshot save/reload and deterministic publication preserve the exact document. See </w:t>
       </w:r>
-      <w:hyperlink r:id="rIdHyperlink61" w:history="1">
+      <w:hyperlink r:id="rIdHyperlink63" w:history="1">
         <w:r>
           <w:rPr>
             <w:rFonts w:ascii="Calibri" w:hAnsi="Calibri" w:cs="Calibri"/>
@@ -26373,7 +26419,7 @@
         </w:rPr>
         <w:t xml:space="preserve"> component through the P10B-05 family page; registered loading state renders on its pending route instead of replacing the 404 singleton. Read-only runtime state supplies canonical cart facts, checkout continuation, P10B-10 query/filter context, and bounded recovery actions while the snapshot preserves presentation only. Shared-frame/Design DNA, save/reload, publication, four- width browser evidence, and no-provider behavior are covered under </w:t>
       </w:r>
-      <w:hyperlink r:id="rIdHyperlink62" w:history="1">
+      <w:hyperlink r:id="rIdHyperlink64" w:history="1">
         <w:r>
           <w:rPr>
             <w:rFonts w:ascii="Calibri" w:hAnsi="Calibri" w:cs="Calibri"/>
@@ -26584,7 +26630,7 @@
         </w:rPr>
         <w:t xml:space="preserve"> frame span all pages; simple/configurable PDP, factual content, utility states, 15 four-width/representative screenshots and the passing 160-scenario human record are retained in </w:t>
       </w:r>
-      <w:hyperlink r:id="rIdHyperlink63" w:history="1">
+      <w:hyperlink r:id="rIdHyperlink65" w:history="1">
         <w:r>
           <w:rPr>
             <w:rFonts w:ascii="Calibri" w:hAnsi="Calibri" w:cs="Calibri"/>
@@ -26795,7 +26841,7 @@
         </w:rPr>
         <w:t xml:space="preserve"> One versioned deterministic synthesis contract binds exact merchant, evidence, commerce, asset, Design DNA, site-map, frame, PageBlueprint/profile, component/anatomy, narrative, density, art-direction, responsive, planner, registry and recipe authority. The same approved fixture produces editorial-heavy, commerce/discovery-heavy and restrained/minimal complete 17-route stores through the existing whole-storefront proposal, snapshot, save/reload, renderer and immutable publication chain. Details are retained in </w:t>
       </w:r>
-      <w:hyperlink r:id="rIdHyperlink64" w:history="1">
+      <w:hyperlink r:id="rIdHyperlink66" w:history="1">
         <w:r>
           <w:rPr>
             <w:rFonts w:ascii="Calibri" w:hAnsi="Calibri" w:cs="Calibri"/>
@@ -27040,7 +27086,7 @@
         </w:rPr>
         <w:t xml:space="preserve"> 31 focused unit/integration cases; nine representative complete outcomes; exact save/reload and compiled publication; protected commerce/evidence/media parity; dedicated 375/768/1024/1440 browser coverage; three retained human commercial reviews and one exact evidence manifest. See </w:t>
       </w:r>
-      <w:hyperlink r:id="rIdHyperlink65" w:history="1">
+      <w:hyperlink r:id="rIdHyperlink67" w:history="1">
         <w:r>
           <w:rPr>
             <w:rFonts w:ascii="Calibri" w:hAnsi="Calibri" w:cs="Calibri"/>
@@ -27217,7 +27263,7 @@
         </w:rPr>
         <w:t xml:space="preserve"> A compact route inventory, four collection/search archetypes, four maintained PDP profiles plus generic fallback, exact collection and product-type mappings, bounded matching rules, transient editor/runtime projection, deterministic legacy convergence, and complete snapshot/lifecycle/publication preservation. Exact primary and related-product bindings survive convergence. A server-owned, storefront-scoped proposal transition binds legacy and reviewed canonical projections for deterministic acceptance replay. Storefront Studio lists archetypes rather than one page per commerce URL; representative context is not persisted. See </w:t>
       </w:r>
-      <w:hyperlink r:id="rIdHyperlink66" w:history="1">
+      <w:hyperlink r:id="rIdHyperlink68" w:history="1">
         <w:r>
           <w:rPr>
             <w:rFonts w:ascii="Calibri" w:hAnsi="Calibri" w:cs="Calibri"/>
@@ -27685,7 +27731,7 @@
         </w:rPr>
         <w:t xml:space="preserve"> </w:t>
       </w:r>
-      <w:hyperlink r:id="rIdHyperlink67" w:history="1">
+      <w:hyperlink r:id="rIdHyperlink69" w:history="1">
         <w:r>
           <w:rPr>
             <w:rFonts w:ascii="Calibri" w:hAnsi="Calibri" w:cs="Calibri"/>
@@ -28146,7 +28192,7 @@
         </w:rPr>
         <w:t xml:space="preserve">. Completed 15 August 2026; see </w:t>
       </w:r>
-      <w:hyperlink r:id="rIdHyperlink50" w:history="1">
+      <w:hyperlink r:id="rIdHyperlink52" w:history="1">
         <w:r>
           <w:rPr>
             <w:rFonts w:ascii="Calibri" w:hAnsi="Calibri" w:cs="Calibri"/>
@@ -29408,7 +29454,7 @@
         </w:rPr>
         <w:t xml:space="preserve">. Accepted by the product owner on 16 August 2026 under </w:t>
       </w:r>
-      <w:hyperlink r:id="rIdHyperlink68" w:history="1">
+      <w:hyperlink r:id="rIdHyperlink70" w:history="1">
         <w:r>
           <w:rPr>
             <w:rFonts w:ascii="Calibri" w:hAnsi="Calibri" w:cs="Calibri"/>
@@ -29766,7 +29812,7 @@
         </w:rPr>
         <w:t xml:space="preserve">. Accepted by the product owner on 17 August 2026 under </w:t>
       </w:r>
-      <w:hyperlink r:id="rIdHyperlink68" w:history="1">
+      <w:hyperlink r:id="rIdHyperlink70" w:history="1">
         <w:r>
           <w:rPr>
             <w:rFonts w:ascii="Calibri" w:hAnsi="Calibri" w:cs="Calibri"/>
@@ -32906,7 +32952,7 @@
         </w:rPr>
         <w:t xml:space="preserve"> </w:t>
       </w:r>
-      <w:hyperlink r:id="rIdHyperlink69" w:history="1">
+      <w:hyperlink r:id="rIdHyperlink71" w:history="1">
         <w:r>
           <w:rPr>
             <w:rFonts w:ascii="Calibri" w:hAnsi="Calibri" w:cs="Calibri"/>
@@ -32922,7 +32968,7 @@
         </w:rPr>
         <w:t xml:space="preserve"> and </w:t>
       </w:r>
-      <w:hyperlink r:id="rIdHyperlink70" w:history="1">
+      <w:hyperlink r:id="rIdHyperlink72" w:history="1">
         <w:r>
           <w:rPr>
             <w:rFonts w:ascii="Calibri" w:hAnsi="Calibri" w:cs="Calibri"/>

</xml_diff>

<commit_message>
docs: adopt visual-feedback-led delivery (AR-00B)
</commit_message>
<xml_diff>
--- a/docs/VESKIFY_DEVELOPMENT_DELIVERY_TRACKER_v1.3.0.docx
+++ b/docs/VESKIFY_DEVELOPMENT_DELIVERY_TRACKER_v1.3.0.docx
@@ -51,7 +51,7 @@
         <w:rPr>
           <w:rFonts w:ascii="Calibri" w:hAnsi="Calibri" w:cs="Calibri"/>
         </w:rPr>
-        <w:t>AR-02 and AR-02A through AR-02M Baseline / closed; AR-03 and AR-03A through AR-03E remain closed; AR-04 Baseline / closed; AR-05A Baseline / closed; AR-05B and AR-05 Baseline / closed; AR-06A Baseline / closed verified at bc209f4bdfed9626605b8c699aaabb547d5d2025; AR-06B Baseline / closed accepted at e2addffc29f7719e23e9e7856ecf7c739924501f; AR-06C independently verified persistence candidate pending accepted delivery; AR-06 Partial pending lifecycle/publication, normal rollout and executable-commerce proof; AR-23 eligible / unstarted; BATCH-10 through BATCH-15 complete; BATCH-16 closes only upon accepted AR-06C delivery and safe closeout; no successor</w:t>
+        <w:t>AR-02 and AR-02A through AR-02M Baseline / closed; AR-03 and AR-03A through AR-03E remain closed; AR-04 Baseline / closed; AR-05A Baseline / closed; AR-05B and AR-05 Baseline / closed; AR-06A Baseline / closed verified at bc209f4bdfed9626605b8c699aaabb547d5d2025; AR-06B Baseline / closed accepted at e2addffc29f7719e23e9e7856ecf7c739924501f; AR-06C Baseline / closed at PR #261 merge de0faeba0d40bd36ac83f25d533a3428f83501cc; AR-06 Partial pending lifecycle/publication and executable-commerce proof; AR-00B policy amendment under review; AR-06D selected / unstarted; AR-23 eligible / unstarted; BATCH-10 through BATCH-16 complete; no successor implementation authorized</w:t>
       </w:r>
     </w:p>
     <w:p>
@@ -118,13 +118,13 @@
           <w:b/>
           <w:bCs/>
         </w:rPr>
-        <w:t>AR-06C candidate status after accepted AR-06B merge:</w:t>
-      </w:r>
-      <w:r>
-        <w:rPr>
-          <w:rFonts w:ascii="Calibri" w:hAnsi="Calibri" w:cs="Calibri"/>
-        </w:rPr>
-        <w:t xml:space="preserve"> This projection does not claim that this PR has merged or that owner acceptance has occurred. </w:t>
+        <w:t>AR-00B visual-feedback policy amendment:</w:t>
+      </w:r>
+      <w:r>
+        <w:rPr>
+          <w:rFonts w:ascii="Calibri" w:hAnsi="Calibri" w:cs="Calibri"/>
+        </w:rPr>
+        <w:t xml:space="preserve"> Accepted AR-06C delivery is verified; AR-00B remains under review until its own accepted merge. AR-06D is the selected unstarted child and not authorized to begin. </w:t>
       </w:r>
       <w:r>
         <w:rPr>
@@ -362,7 +362,7 @@
         <w:rPr>
           <w:rFonts w:ascii="Calibri" w:hAnsi="Calibri" w:cs="Calibri"/>
         </w:rPr>
-        <w:t xml:space="preserve">; complete original acceptance is mapped in AR_02_BOUNDARY_ACCEPTANCE.md. AR-04 is Baseline / closed. AR-05A is Baseline / closed. AR-05B is Baseline / closed. AR-05 is Baseline / closed; original T01/T02 acceptance is mapped in AR_05_CANONICAL_ACCEPTANCE.md. AR-06A is Baseline / closed. Its accepted merge is bc209f4bdfed9626605b8c699aaabb547d5d2025. AR-06B is Baseline / closed. Its accepted merge is e2addffc29f7719e23e9e7856ecf7c739924501f. AR-06C is a guarded composed static-draft persistence candidate with independent verification complete, pending final-head CI and accepted delivery. AR-06 is Partial; rendering, editing and save/reload evidence is mapped in AR_06_RENDERING_ACCEPTANCE.md. History/lifecycle/publication integration, positive collection/search and PDP executable-commerce proof, and the shared collection/search context decision remain required before enablement. AR-03 is </w:t>
+        <w:t xml:space="preserve">; complete original acceptance is mapped in AR_02_BOUNDARY_ACCEPTANCE.md. AR-04 is Baseline / closed. AR-05A is Baseline / closed. AR-05B is Baseline / closed. AR-05 is Baseline / closed; original T01/T02 acceptance is mapped in AR_05_CANONICAL_ACCEPTANCE.md. AR-06A is Baseline / closed. Its accepted merge is bc209f4bdfed9626605b8c699aaabb547d5d2025. AR-06B is Baseline / closed. Its accepted merge is e2addffc29f7719e23e9e7856ecf7c739924501f. AR-06C is Baseline / closed. Its accepted PR #261 head is af75994f2a4e1186b4429db6b93cb1bf51d2e048, merged as de0faeba0d40bd36ac83f25d533a3428f83501cc. AR-06 is Partial; rendering, editing and save/reload evidence is mapped in AR_06_RENDERING_ACCEPTANCE.md. History/lifecycle/publication integration, positive collection/search and PDP executable-commerce proof, and the shared collection/search context decision remain required before enablement. AR-03 is </w:t>
       </w:r>
       <w:r>
         <w:rPr>
@@ -460,7 +460,7 @@
         <w:rPr>
           <w:rFonts w:ascii="Calibri" w:hAnsi="Calibri" w:cs="Calibri"/>
         </w:rPr>
-        <w:t xml:space="preserve">. AR-23 depends on AR-01 and is not serialized behind visual work. BATCH-03 is complete. BATCH-04 is complete. BATCH-05 is complete. BATCH-06 is complete. BATCH-07 is complete. BATCH-08 is complete. BATCH-09 is complete. BATCH-10 is complete. BATCH-11 is complete. BATCH-12 is complete. BATCH-13 is complete. BATCH-14 is complete. BATCH-15 is complete. BATCH-16 closes only upon accepted AR-06C delivery and safe closeout. No successor implementation is authorized. This tracker owns current status; the roadmap owns dependency order. Retained B01 exact-next, fixed-two-call/mandatory-three-concept, transient-only, and 73-child future-sequence statements are </w:t>
+        <w:t xml:space="preserve">. AR-23 depends on AR-01 and is not serialized behind visual work. BATCH-03 is complete. BATCH-04 is complete. BATCH-05 is complete. BATCH-06 is complete. BATCH-07 is complete. BATCH-08 is complete. BATCH-09 is complete. BATCH-10 is complete. BATCH-11 is complete. BATCH-12 is complete. BATCH-13 is complete. BATCH-14 is complete. BATCH-15 is complete. BATCH-16 is complete after accepted AR-06C delivery and safe closeout. AR-00B is a policy amendment under review until its accepted merge. AR-06D is the exact selected next child, Planned and unstarted; it requires a separate launch. No successor implementation is authorized. This tracker owns current status; the roadmap owns dependency order. Retained B01 exact-next, fixed-two-call/mandatory-three-concept, transient-only, and 73-child future-sequence statements are </w:t>
       </w:r>
       <w:r>
         <w:rPr>
@@ -534,7 +534,7 @@
         <w:rPr>
           <w:rFonts w:ascii="Calibri" w:hAnsi="Calibri" w:cs="Calibri"/>
         </w:rPr>
-        <w:t xml:space="preserve"> adds the actual shared static renderer and bounded four-width proof. Accepted AR-06B adds guarded Puck editing and canonical round trip. AR-06 remains Partial: composed save/reload acceptance, history/publication integration, normal Studio rollout, dynamic executable commerce and the shared collection/search context decision remain unproven.</w:t>
+        <w:t xml:space="preserve"> adds the actual shared static renderer and bounded four-width proof. Accepted AR-06B adds guarded Puck editing and canonical round trip. Accepted AR-06C adds explicit guarded static-draft persistence and fresh-page reload. AR-06 remains Partial: history/publication integration, normal Studio rollout, dynamic executable commerce and the shared collection/search context decision remain unproven.</w:t>
       </w:r>
     </w:p>
     <w:p>

</xml_diff>

<commit_message>
docs(ar-00b): resolve historical scheduling and status review findings
</commit_message>
<xml_diff>
--- a/docs/VESKIFY_DEVELOPMENT_DELIVERY_TRACKER_v1.3.0.docx
+++ b/docs/VESKIFY_DEVELOPMENT_DELIVERY_TRACKER_v1.3.0.docx
@@ -3198,7 +3198,7 @@
           <w:b/>
           <w:bCs/>
         </w:rPr>
-        <w:t>Independently verified; closes upon accepted PR merge</w:t>
+        <w:t>Baseline / closed; accepted PR #261, merge `de0faeba0d40bd36ac83f25d533a3428f83501cc`</w:t>
       </w:r>
       <w:r>
         <w:rPr>
@@ -15132,7 +15132,7 @@
                 <w:b/>
                 <w:bCs/>
               </w:rPr>
-              <w:t>Planned / exact next</w:t>
+              <w:t>Planned / historical pre-AR selection; not current eligibility</w:t>
             </w:r>
           </w:p>
         </w:tc>
@@ -15186,7 +15186,7 @@
               <w:rPr>
                 <w:rFonts w:ascii="Calibri" w:hAnsi="Calibri" w:cs="Calibri"/>
               </w:rPr>
-              <w:t>Begin only after A-10C merges; B-01 has not begun</w:t>
+              <w:t>Historical eligibility superseded by the AR roadmap; B-01 has not begun</w:t>
             </w:r>
           </w:p>
         </w:tc>
@@ -19559,7 +19559,7 @@
         <w:rPr>
           <w:rFonts w:ascii="Calibri" w:hAnsi="Calibri" w:cs="Calibri"/>
         </w:rPr>
-        <w:t xml:space="preserve">P10B remains Partial. DEVX-01A through DEVX-01G are Baseline, and DEVX-01 is Baseline / closed. P10B-19A-01 through P10B-19A-07, P10B-19A-08A through P10B-19A-08C, P10B-19A-09A through P10B-19A-09C, P10B-19A-10A, P10B-19A-10B1, P10B-19A-10B2 and P10B-19A-10C are Baseline; parents P10B-19A-08, P10B-19A-09, P10B-19A-10B, P10B-19A-10 and P10B-19A are Baseline / closed. P10B-19B-01 is the exact next implementation task and is Planned / exact next; it has not begun. P10B-19 and P10B remain Partial. DEVX-01C measured the serial gate, retained PR/ref-scoped cancellation and added compatible </w:t>
+        <w:t xml:space="preserve">Historical scheduling projection (pre-AR; superseded, not current eligibility): P10B remains Partial. DEVX-01A through DEVX-01G are Baseline, and DEVX-01 is Baseline / closed. P10B-19A-01 through P10B-19A-07, P10B-19A-08A through P10B-19A-08C, P10B-19A-09A through P10B-19A-09C, P10B-19A-10A, P10B-19A-10B1, P10B-19A-10B2 and P10B-19A-10C are Baseline; parents P10B-19A-08, P10B-19A-09, P10B-19A-10B, P10B-19A-10 and P10B-19A are Baseline / closed. P10B-19B-01 is the exact next implementation task and is Planned / exact next; it has not begun. P10B-19 and P10B remain Partial. DEVX-01C measured the serial gate, retained PR/ref-scoped cancellation and added compatible </w:t>
       </w:r>
       <w:r>
         <w:rPr>
@@ -20991,7 +20991,7 @@
         <w:rPr>
           <w:rFonts w:ascii="Calibri" w:hAnsi="Calibri" w:cs="Calibri"/>
         </w:rPr>
-        <w:t xml:space="preserve">P10B-19A-01 through P10B-19A-07 and P10B-19A-08A through P10B-19A-08C are </w:t>
+        <w:t xml:space="preserve">Historical scheduling projection (pre-AR; superseded, not current eligibility): P10B-19A-01 through P10B-19A-07 and P10B-19A-08A through P10B-19A-08C are </w:t>
       </w:r>
       <w:r>
         <w:rPr>
@@ -21903,7 +21903,7 @@
         <w:rPr>
           <w:rFonts w:ascii="Calibri" w:hAnsi="Calibri" w:cs="Calibri"/>
         </w:rPr>
-        <w:t>P10B-19A-10C is Baseline; P10B-19A-10 and P10B-19A are Baseline / closed. P10B-19B-01 is the exact next implementation task and is Planned / exact next; it has not begun. P10B-19 and P10B remain Partial.</w:t>
+        <w:t>Historical scheduling projection (pre-AR; superseded, not current eligibility): P10B-19A-10C is Baseline; P10B-19A-10 and P10B-19A are Baseline / closed. P10B-19B-01 is the exact next implementation task and is Planned / exact next; it has not begun. P10B-19 and P10B remain Partial.</w:t>
       </w:r>
     </w:p>
     <w:p>
@@ -23266,7 +23266,7 @@
         <w:rPr>
           <w:rFonts w:ascii="Calibri" w:hAnsi="Calibri" w:cs="Calibri"/>
         </w:rPr>
-        <w:t xml:space="preserve">The binding details and minimum coverage are in </w:t>
+        <w:t xml:space="preserve">Historical scheduling projection (pre-AR; superseded, not current eligibility): The binding details and minimum coverage are in </w:t>
       </w:r>
       <w:hyperlink r:id="rIdHyperlink51" w:history="1">
         <w:r>
@@ -28939,7 +28939,7 @@
         <w:rPr>
           <w:rFonts w:ascii="Calibri" w:hAnsi="Calibri" w:cs="Calibri"/>
         </w:rPr>
-        <w:t>P10B-18C and P10B-16P-05B are Baseline. P10B-18D is a Baseline diagnostic with live commercial quality rejected. P10B-18 and P10B remain Partial. P10B-19 PRE is Baseline. P10B-19A-01 through P10B-19A-07 and P10B-19A-08A through P10B-19A-08C are Baseline; parent P10B-19A-08 is Baseline / closed. P10B-19A-09A, P10B-19A-09B and P10B-19A-09C are Baseline; parent P10B-19A-09 is Baseline / closed. P10B-19A-10A, P10B-19A-10B1 and P10B-19A-10B2 are Baseline; parent P10B-19A-10B is Baseline / closed. P10B-19A-10C is Baseline; P10B-19A-10 and P10B-19A are Baseline / closed. P10B-19B-01 is the exact next implementation task and is Planned / exact next; it has not begun. P10B-19 and P10B remain Partial; P10B-19B through P10B-19J remain Planned.</w:t>
+        <w:t>Historical scheduling projection (pre-AR; superseded, not current eligibility): P10B-18C and P10B-16P-05B are Baseline. P10B-18D is a Baseline diagnostic with live commercial quality rejected. P10B-18 and P10B remain Partial. P10B-19 PRE is Baseline. P10B-19A-01 through P10B-19A-07 and P10B-19A-08A through P10B-19A-08C are Baseline; parent P10B-19A-08 is Baseline / closed. P10B-19A-09A, P10B-19A-09B and P10B-19A-09C are Baseline; parent P10B-19A-09 is Baseline / closed. P10B-19A-10A, P10B-19A-10B1 and P10B-19A-10B2 are Baseline; parent P10B-19A-10B is Baseline / closed. P10B-19A-10C is Baseline; P10B-19A-10 and P10B-19A are Baseline / closed. P10B-19B-01 is the exact next implementation task and is Planned / exact next; it has not begun. P10B-19 and P10B remain Partial; P10B-19B through P10B-19J remain Planned.</w:t>
       </w:r>
     </w:p>
     <w:p>
@@ -30998,7 +30998,7 @@
         <w:rPr>
           <w:rFonts w:ascii="Calibri" w:hAnsi="Calibri" w:cs="Calibri"/>
         </w:rPr>
-        <w:t xml:space="preserve">P10B-18 and P10B remain Partial. </w:t>
+        <w:t xml:space="preserve">Historical scheduling projection (pre-AR; superseded, not current eligibility): P10B-18 and P10B remain Partial. </w:t>
       </w:r>
       <w:r>
         <w:rPr>
@@ -35023,7 +35023,7 @@
         <w:rPr>
           <w:rFonts w:ascii="Calibri" w:hAnsi="Calibri" w:cs="Calibri"/>
         </w:rPr>
-        <w:t xml:space="preserve">The accepted deterministic gate uses nine catalogue/evidence shapes by fourteen semantic strata. All 126 cases compile and replay, the frozen 72 remains 39 topologies / 53 repeated memberships / largest seven / 19 singletons, protected commerce/media and external activity are zero, and the expanded matrix contains 54 normalized topologies. The deterministic selector retains 28 stores and the final complete manifest binds 280 captures across 375/768/1024/1440 and EN/FI. The final human verdict is </w:t>
+        <w:t xml:space="preserve">Historical scheduling projection (pre-AR; superseded, not current eligibility): The accepted deterministic gate uses nine catalogue/evidence shapes by fourteen semantic strata. All 126 cases compile and replay, the frozen 72 remains 39 topologies / 53 repeated memberships / largest seven / 19 singletons, protected commerce/media and external activity are zero, and the expanded matrix contains 54 normalized topologies. The deterministic selector retains 28 stores and the final complete manifest binds 280 captures across 375/768/1024/1440 and EN/FI. The final human verdict is </w:t>
       </w:r>
       <w:r>
         <w:rPr>
@@ -37025,7 +37025,7 @@
               <w:rPr>
                 <w:rFonts w:ascii="Calibri" w:hAnsi="Calibri" w:cs="Calibri"/>
               </w:rPr>
-              <w:t>Next</w:t>
+              <w:t>Historical next</w:t>
             </w:r>
           </w:p>
         </w:tc>
@@ -37063,7 +37063,7 @@
                 <w:b/>
                 <w:bCs/>
               </w:rPr>
-              <w:t>Planned / exact next</w:t>
+              <w:t>Planned / historical pre-AR selection; not current eligibility</w:t>
             </w:r>
           </w:p>
         </w:tc>
@@ -37196,6 +37196,18 @@
           <w:rFonts w:ascii="Calibri" w:hAnsi="Calibri" w:cs="Calibri"/>
         </w:rPr>
         <w:t>DEVX-01 CI matrix authority</w:t>
+      </w:r>
+    </w:p>
+    <w:p>
+      <w:pPr>
+        <w:pStyle w:val="Normal"/>
+        <w:widowControl/>
+      </w:pPr>
+      <w:r>
+        <w:rPr>
+          <w:rFonts w:ascii="Calibri" w:hAnsi="Calibri" w:cs="Calibri"/>
+        </w:rPr>
+        <w:t>Historical scheduling projection (pre-AR; superseded, not current eligibility):</w:t>
       </w:r>
     </w:p>
     <w:p>

</xml_diff>

<commit_message>
AR-00B: adopt visual-feedback-led delivery (#262)
* docs: adopt visual-feedback-led delivery (AR-00B)

* docs(ar-00b): resolve historical scheduling and status review findings

* test: retain bounded PDP server diagnostics for Linux CI

* test(ci): retain shared browser diagnostics and exact artifact controls
</commit_message>
<xml_diff>
--- a/docs/VESKIFY_DEVELOPMENT_DELIVERY_TRACKER_v1.3.0.docx
+++ b/docs/VESKIFY_DEVELOPMENT_DELIVERY_TRACKER_v1.3.0.docx
@@ -51,7 +51,7 @@
         <w:rPr>
           <w:rFonts w:ascii="Calibri" w:hAnsi="Calibri" w:cs="Calibri"/>
         </w:rPr>
-        <w:t>AR-02 and AR-02A through AR-02M Baseline / closed; AR-03 and AR-03A through AR-03E remain closed; AR-04 Baseline / closed; AR-05A Baseline / closed; AR-05B and AR-05 Baseline / closed; AR-06A Baseline / closed verified at bc209f4bdfed9626605b8c699aaabb547d5d2025; AR-06B Baseline / closed accepted at e2addffc29f7719e23e9e7856ecf7c739924501f; AR-06C independently verified persistence candidate pending accepted delivery; AR-06 Partial pending lifecycle/publication, normal rollout and executable-commerce proof; AR-23 eligible / unstarted; BATCH-10 through BATCH-15 complete; BATCH-16 closes only upon accepted AR-06C delivery and safe closeout; no successor</w:t>
+        <w:t>AR-02 and AR-02A through AR-02M Baseline / closed; AR-03 and AR-03A through AR-03E remain closed; AR-04 Baseline / closed; AR-05A Baseline / closed; AR-05B and AR-05 Baseline / closed; AR-06A Baseline / closed verified at bc209f4bdfed9626605b8c699aaabb547d5d2025; AR-06B Baseline / closed accepted at e2addffc29f7719e23e9e7856ecf7c739924501f; AR-06C Baseline / closed at PR #261 merge de0faeba0d40bd36ac83f25d533a3428f83501cc; AR-06 Partial pending lifecycle/publication and executable-commerce proof; AR-00B policy amendment under review; AR-06D selected / unstarted; AR-23 eligible / unstarted; BATCH-10 through BATCH-16 complete; no successor implementation authorized</w:t>
       </w:r>
     </w:p>
     <w:p>
@@ -118,13 +118,13 @@
           <w:b/>
           <w:bCs/>
         </w:rPr>
-        <w:t>AR-06C candidate status after accepted AR-06B merge:</w:t>
-      </w:r>
-      <w:r>
-        <w:rPr>
-          <w:rFonts w:ascii="Calibri" w:hAnsi="Calibri" w:cs="Calibri"/>
-        </w:rPr>
-        <w:t xml:space="preserve"> This projection does not claim that this PR has merged or that owner acceptance has occurred. </w:t>
+        <w:t>AR-00B visual-feedback policy amendment:</w:t>
+      </w:r>
+      <w:r>
+        <w:rPr>
+          <w:rFonts w:ascii="Calibri" w:hAnsi="Calibri" w:cs="Calibri"/>
+        </w:rPr>
+        <w:t xml:space="preserve"> Accepted AR-06C delivery is verified; AR-00B remains under review until its own accepted merge. AR-06D is the selected unstarted child and not authorized to begin. </w:t>
       </w:r>
       <w:r>
         <w:rPr>
@@ -362,7 +362,7 @@
         <w:rPr>
           <w:rFonts w:ascii="Calibri" w:hAnsi="Calibri" w:cs="Calibri"/>
         </w:rPr>
-        <w:t xml:space="preserve">; complete original acceptance is mapped in AR_02_BOUNDARY_ACCEPTANCE.md. AR-04 is Baseline / closed. AR-05A is Baseline / closed. AR-05B is Baseline / closed. AR-05 is Baseline / closed; original T01/T02 acceptance is mapped in AR_05_CANONICAL_ACCEPTANCE.md. AR-06A is Baseline / closed. Its accepted merge is bc209f4bdfed9626605b8c699aaabb547d5d2025. AR-06B is Baseline / closed. Its accepted merge is e2addffc29f7719e23e9e7856ecf7c739924501f. AR-06C is a guarded composed static-draft persistence candidate with independent verification complete, pending final-head CI and accepted delivery. AR-06 is Partial; rendering, editing and save/reload evidence is mapped in AR_06_RENDERING_ACCEPTANCE.md. History/lifecycle/publication integration, positive collection/search and PDP executable-commerce proof, and the shared collection/search context decision remain required before enablement. AR-03 is </w:t>
+        <w:t xml:space="preserve">; complete original acceptance is mapped in AR_02_BOUNDARY_ACCEPTANCE.md. AR-04 is Baseline / closed. AR-05A is Baseline / closed. AR-05B is Baseline / closed. AR-05 is Baseline / closed; original T01/T02 acceptance is mapped in AR_05_CANONICAL_ACCEPTANCE.md. AR-06A is Baseline / closed. Its accepted merge is bc209f4bdfed9626605b8c699aaabb547d5d2025. AR-06B is Baseline / closed. Its accepted merge is e2addffc29f7719e23e9e7856ecf7c739924501f. AR-06C is Baseline / closed. Its accepted PR #261 head is af75994f2a4e1186b4429db6b93cb1bf51d2e048, merged as de0faeba0d40bd36ac83f25d533a3428f83501cc. AR-06 is Partial; rendering, editing and save/reload evidence is mapped in AR_06_RENDERING_ACCEPTANCE.md. History/lifecycle/publication integration, positive collection/search and PDP executable-commerce proof, and the shared collection/search context decision remain required before enablement. AR-03 is </w:t>
       </w:r>
       <w:r>
         <w:rPr>
@@ -460,7 +460,7 @@
         <w:rPr>
           <w:rFonts w:ascii="Calibri" w:hAnsi="Calibri" w:cs="Calibri"/>
         </w:rPr>
-        <w:t xml:space="preserve">. AR-23 depends on AR-01 and is not serialized behind visual work. BATCH-03 is complete. BATCH-04 is complete. BATCH-05 is complete. BATCH-06 is complete. BATCH-07 is complete. BATCH-08 is complete. BATCH-09 is complete. BATCH-10 is complete. BATCH-11 is complete. BATCH-12 is complete. BATCH-13 is complete. BATCH-14 is complete. BATCH-15 is complete. BATCH-16 closes only upon accepted AR-06C delivery and safe closeout. No successor implementation is authorized. This tracker owns current status; the roadmap owns dependency order. Retained B01 exact-next, fixed-two-call/mandatory-three-concept, transient-only, and 73-child future-sequence statements are </w:t>
+        <w:t xml:space="preserve">. AR-23 depends on AR-01 and is not serialized behind visual work. BATCH-03 is complete. BATCH-04 is complete. BATCH-05 is complete. BATCH-06 is complete. BATCH-07 is complete. BATCH-08 is complete. BATCH-09 is complete. BATCH-10 is complete. BATCH-11 is complete. BATCH-12 is complete. BATCH-13 is complete. BATCH-14 is complete. BATCH-15 is complete. BATCH-16 is complete after accepted AR-06C delivery and safe closeout. AR-00B is a policy amendment under review until its accepted merge. AR-06D is the exact selected next child, Planned and unstarted; it requires a separate launch. No successor implementation is authorized. This tracker owns current status; the roadmap owns dependency order. Retained B01 exact-next, fixed-two-call/mandatory-three-concept, transient-only, and 73-child future-sequence statements are </w:t>
       </w:r>
       <w:r>
         <w:rPr>
@@ -534,7 +534,7 @@
         <w:rPr>
           <w:rFonts w:ascii="Calibri" w:hAnsi="Calibri" w:cs="Calibri"/>
         </w:rPr>
-        <w:t xml:space="preserve"> adds the actual shared static renderer and bounded four-width proof. Accepted AR-06B adds guarded Puck editing and canonical round trip. AR-06 remains Partial: composed save/reload acceptance, history/publication integration, normal Studio rollout, dynamic executable commerce and the shared collection/search context decision remain unproven.</w:t>
+        <w:t xml:space="preserve"> adds the actual shared static renderer and bounded four-width proof. Accepted AR-06B adds guarded Puck editing and canonical round trip. Accepted AR-06C adds explicit guarded static-draft persistence and fresh-page reload. AR-06 remains Partial: history/publication integration, normal Studio rollout, dynamic executable commerce and the shared collection/search context decision remain unproven.</w:t>
       </w:r>
     </w:p>
     <w:p>
@@ -3198,7 +3198,7 @@
           <w:b/>
           <w:bCs/>
         </w:rPr>
-        <w:t>Independently verified; closes upon accepted PR merge</w:t>
+        <w:t>Baseline / closed; accepted PR #261, merge `de0faeba0d40bd36ac83f25d533a3428f83501cc`</w:t>
       </w:r>
       <w:r>
         <w:rPr>
@@ -15132,7 +15132,7 @@
                 <w:b/>
                 <w:bCs/>
               </w:rPr>
-              <w:t>Planned / exact next</w:t>
+              <w:t>Planned / historical pre-AR selection; not current eligibility</w:t>
             </w:r>
           </w:p>
         </w:tc>
@@ -15186,7 +15186,7 @@
               <w:rPr>
                 <w:rFonts w:ascii="Calibri" w:hAnsi="Calibri" w:cs="Calibri"/>
               </w:rPr>
-              <w:t>Begin only after A-10C merges; B-01 has not begun</w:t>
+              <w:t>Historical eligibility superseded by the AR roadmap; B-01 has not begun</w:t>
             </w:r>
           </w:p>
         </w:tc>
@@ -19559,7 +19559,7 @@
         <w:rPr>
           <w:rFonts w:ascii="Calibri" w:hAnsi="Calibri" w:cs="Calibri"/>
         </w:rPr>
-        <w:t xml:space="preserve">P10B remains Partial. DEVX-01A through DEVX-01G are Baseline, and DEVX-01 is Baseline / closed. P10B-19A-01 through P10B-19A-07, P10B-19A-08A through P10B-19A-08C, P10B-19A-09A through P10B-19A-09C, P10B-19A-10A, P10B-19A-10B1, P10B-19A-10B2 and P10B-19A-10C are Baseline; parents P10B-19A-08, P10B-19A-09, P10B-19A-10B, P10B-19A-10 and P10B-19A are Baseline / closed. P10B-19B-01 is the exact next implementation task and is Planned / exact next; it has not begun. P10B-19 and P10B remain Partial. DEVX-01C measured the serial gate, retained PR/ref-scoped cancellation and added compatible </w:t>
+        <w:t xml:space="preserve">Historical scheduling projection (pre-AR; superseded, not current eligibility): P10B remains Partial. DEVX-01A through DEVX-01G are Baseline, and DEVX-01 is Baseline / closed. P10B-19A-01 through P10B-19A-07, P10B-19A-08A through P10B-19A-08C, P10B-19A-09A through P10B-19A-09C, P10B-19A-10A, P10B-19A-10B1, P10B-19A-10B2 and P10B-19A-10C are Baseline; parents P10B-19A-08, P10B-19A-09, P10B-19A-10B, P10B-19A-10 and P10B-19A are Baseline / closed. P10B-19B-01 is the exact next implementation task and is Planned / exact next; it has not begun. P10B-19 and P10B remain Partial. DEVX-01C measured the serial gate, retained PR/ref-scoped cancellation and added compatible </w:t>
       </w:r>
       <w:r>
         <w:rPr>
@@ -20991,7 +20991,7 @@
         <w:rPr>
           <w:rFonts w:ascii="Calibri" w:hAnsi="Calibri" w:cs="Calibri"/>
         </w:rPr>
-        <w:t xml:space="preserve">P10B-19A-01 through P10B-19A-07 and P10B-19A-08A through P10B-19A-08C are </w:t>
+        <w:t xml:space="preserve">Historical scheduling projection (pre-AR; superseded, not current eligibility): P10B-19A-01 through P10B-19A-07 and P10B-19A-08A through P10B-19A-08C are </w:t>
       </w:r>
       <w:r>
         <w:rPr>
@@ -21903,7 +21903,7 @@
         <w:rPr>
           <w:rFonts w:ascii="Calibri" w:hAnsi="Calibri" w:cs="Calibri"/>
         </w:rPr>
-        <w:t>P10B-19A-10C is Baseline; P10B-19A-10 and P10B-19A are Baseline / closed. P10B-19B-01 is the exact next implementation task and is Planned / exact next; it has not begun. P10B-19 and P10B remain Partial.</w:t>
+        <w:t>Historical scheduling projection (pre-AR; superseded, not current eligibility): P10B-19A-10C is Baseline; P10B-19A-10 and P10B-19A are Baseline / closed. P10B-19B-01 is the exact next implementation task and is Planned / exact next; it has not begun. P10B-19 and P10B remain Partial.</w:t>
       </w:r>
     </w:p>
     <w:p>
@@ -23266,7 +23266,7 @@
         <w:rPr>
           <w:rFonts w:ascii="Calibri" w:hAnsi="Calibri" w:cs="Calibri"/>
         </w:rPr>
-        <w:t xml:space="preserve">The binding details and minimum coverage are in </w:t>
+        <w:t xml:space="preserve">Historical scheduling projection (pre-AR; superseded, not current eligibility): The binding details and minimum coverage are in </w:t>
       </w:r>
       <w:hyperlink r:id="rIdHyperlink51" w:history="1">
         <w:r>
@@ -28939,7 +28939,7 @@
         <w:rPr>
           <w:rFonts w:ascii="Calibri" w:hAnsi="Calibri" w:cs="Calibri"/>
         </w:rPr>
-        <w:t>P10B-18C and P10B-16P-05B are Baseline. P10B-18D is a Baseline diagnostic with live commercial quality rejected. P10B-18 and P10B remain Partial. P10B-19 PRE is Baseline. P10B-19A-01 through P10B-19A-07 and P10B-19A-08A through P10B-19A-08C are Baseline; parent P10B-19A-08 is Baseline / closed. P10B-19A-09A, P10B-19A-09B and P10B-19A-09C are Baseline; parent P10B-19A-09 is Baseline / closed. P10B-19A-10A, P10B-19A-10B1 and P10B-19A-10B2 are Baseline; parent P10B-19A-10B is Baseline / closed. P10B-19A-10C is Baseline; P10B-19A-10 and P10B-19A are Baseline / closed. P10B-19B-01 is the exact next implementation task and is Planned / exact next; it has not begun. P10B-19 and P10B remain Partial; P10B-19B through P10B-19J remain Planned.</w:t>
+        <w:t>Historical scheduling projection (pre-AR; superseded, not current eligibility): P10B-18C and P10B-16P-05B are Baseline. P10B-18D is a Baseline diagnostic with live commercial quality rejected. P10B-18 and P10B remain Partial. P10B-19 PRE is Baseline. P10B-19A-01 through P10B-19A-07 and P10B-19A-08A through P10B-19A-08C are Baseline; parent P10B-19A-08 is Baseline / closed. P10B-19A-09A, P10B-19A-09B and P10B-19A-09C are Baseline; parent P10B-19A-09 is Baseline / closed. P10B-19A-10A, P10B-19A-10B1 and P10B-19A-10B2 are Baseline; parent P10B-19A-10B is Baseline / closed. P10B-19A-10C is Baseline; P10B-19A-10 and P10B-19A are Baseline / closed. P10B-19B-01 is the exact next implementation task and is Planned / exact next; it has not begun. P10B-19 and P10B remain Partial; P10B-19B through P10B-19J remain Planned.</w:t>
       </w:r>
     </w:p>
     <w:p>
@@ -30998,7 +30998,7 @@
         <w:rPr>
           <w:rFonts w:ascii="Calibri" w:hAnsi="Calibri" w:cs="Calibri"/>
         </w:rPr>
-        <w:t xml:space="preserve">P10B-18 and P10B remain Partial. </w:t>
+        <w:t xml:space="preserve">Historical scheduling projection (pre-AR; superseded, not current eligibility): P10B-18 and P10B remain Partial. </w:t>
       </w:r>
       <w:r>
         <w:rPr>
@@ -35023,7 +35023,7 @@
         <w:rPr>
           <w:rFonts w:ascii="Calibri" w:hAnsi="Calibri" w:cs="Calibri"/>
         </w:rPr>
-        <w:t xml:space="preserve">The accepted deterministic gate uses nine catalogue/evidence shapes by fourteen semantic strata. All 126 cases compile and replay, the frozen 72 remains 39 topologies / 53 repeated memberships / largest seven / 19 singletons, protected commerce/media and external activity are zero, and the expanded matrix contains 54 normalized topologies. The deterministic selector retains 28 stores and the final complete manifest binds 280 captures across 375/768/1024/1440 and EN/FI. The final human verdict is </w:t>
+        <w:t xml:space="preserve">Historical scheduling projection (pre-AR; superseded, not current eligibility): The accepted deterministic gate uses nine catalogue/evidence shapes by fourteen semantic strata. All 126 cases compile and replay, the frozen 72 remains 39 topologies / 53 repeated memberships / largest seven / 19 singletons, protected commerce/media and external activity are zero, and the expanded matrix contains 54 normalized topologies. The deterministic selector retains 28 stores and the final complete manifest binds 280 captures across 375/768/1024/1440 and EN/FI. The final human verdict is </w:t>
       </w:r>
       <w:r>
         <w:rPr>
@@ -37025,7 +37025,7 @@
               <w:rPr>
                 <w:rFonts w:ascii="Calibri" w:hAnsi="Calibri" w:cs="Calibri"/>
               </w:rPr>
-              <w:t>Next</w:t>
+              <w:t>Historical next</w:t>
             </w:r>
           </w:p>
         </w:tc>
@@ -37063,7 +37063,7 @@
                 <w:b/>
                 <w:bCs/>
               </w:rPr>
-              <w:t>Planned / exact next</w:t>
+              <w:t>Planned / historical pre-AR selection; not current eligibility</w:t>
             </w:r>
           </w:p>
         </w:tc>
@@ -37196,6 +37196,18 @@
           <w:rFonts w:ascii="Calibri" w:hAnsi="Calibri" w:cs="Calibri"/>
         </w:rPr>
         <w:t>DEVX-01 CI matrix authority</w:t>
+      </w:r>
+    </w:p>
+    <w:p>
+      <w:pPr>
+        <w:pStyle w:val="Normal"/>
+        <w:widowControl/>
+      </w:pPr>
+      <w:r>
+        <w:rPr>
+          <w:rFonts w:ascii="Calibri" w:hAnsi="Calibri" w:cs="Calibri"/>
+        </w:rPr>
+        <w:t>Historical scheduling projection (pre-AR; superseded, not current eligibility):</w:t>
       </w:r>
     </w:p>
     <w:p>

</xml_diff>

<commit_message>
feat: add guarded generated storefront baseline review
</commit_message>
<xml_diff>
--- a/docs/VESKIFY_DEVELOPMENT_DELIVERY_TRACKER_v1.3.0.docx
+++ b/docs/VESKIFY_DEVELOPMENT_DELIVERY_TRACKER_v1.3.0.docx
@@ -51,7 +51,7 @@
         <w:rPr>
           <w:rFonts w:ascii="Calibri" w:hAnsi="Calibri" w:cs="Calibri"/>
         </w:rPr>
-        <w:t>AR-02 and AR-02A through AR-02M Baseline / closed; AR-03 and AR-03A through AR-03E remain closed; AR-04 Baseline / closed; AR-05A Baseline / closed; AR-05B and AR-05 Baseline / closed; AR-06A Baseline / closed verified at bc209f4bdfed9626605b8c699aaabb547d5d2025; AR-06B Baseline / closed accepted at e2addffc29f7719e23e9e7856ecf7c739924501f; AR-06C Baseline / closed at PR #261 merge de0faeba0d40bd36ac83f25d533a3428f83501cc; AR-06 Partial pending lifecycle/publication and executable-commerce proof; AR-00B policy amendment under review; AR-06D selected / unstarted; AR-23 eligible / unstarted; BATCH-10 through BATCH-16 complete; no successor implementation authorized</w:t>
+        <w:t>AR-02 and AR-02A through AR-02M Baseline / closed; AR-03 and AR-03A through AR-03E remain closed; AR-04 Baseline / closed; AR-05A Baseline / closed; AR-05B and AR-05 Baseline / closed; AR-06A Baseline / closed verified at bc209f4bdfed9626605b8c699aaabb547d5d2025; AR-06B Baseline / closed accepted at e2addffc29f7719e23e9e7856ecf7c739924501f; AR-06C Baseline / closed at PR #261 merge de0faeba0d40bd36ac83f25d533a3428f83501cc; AR-06 Partial pending lifecycle/publication and executable-commerce proof; AR-00B Baseline / closed at fa6c200; AR-06D in progress under BATCH-18 with one real model call and one official input-count request; owner technical-baseline acceptance recorded with visual quality below target; final review, CI and merge pending; AR-23 eligible / unstarted; BATCH-10 through BATCH-16 complete; BATCH-19 authorizes AR-10A only after accepted AR-06D merge; implementation unstarted</w:t>
       </w:r>
     </w:p>
     <w:p>
@@ -124,7 +124,21 @@
         <w:rPr>
           <w:rFonts w:ascii="Calibri" w:hAnsi="Calibri" w:cs="Calibri"/>
         </w:rPr>
-        <w:t xml:space="preserve"> Accepted AR-06C delivery is verified; AR-00B remains under review until its own accepted merge. AR-06D is the selected unstarted child and not authorized to begin. </w:t>
+        <w:t xml:space="preserve"> Accepted at merge </w:t>
+      </w:r>
+      <w:r>
+        <w:rPr>
+          <w:rFonts w:ascii="Consolas" w:hAnsi="Consolas" w:cs="Consolas"/>
+          <w:sz w:val="19"/>
+          <w:szCs w:val="19"/>
+        </w:rPr>
+        <w:t>fa6c200</w:t>
+      </w:r>
+      <w:r>
+        <w:rPr>
+          <w:rFonts w:ascii="Calibri" w:hAnsi="Calibri" w:cs="Calibri"/>
+        </w:rPr>
+        <w:t xml:space="preserve">. BATCH-18 launches AR-06D; one real model call and one official input-count request have executed, and the owner has accepted the technical baseline only; final review, CI and merge remain pending. </w:t>
       </w:r>
       <w:r>
         <w:rPr>
@@ -460,7 +474,7 @@
         <w:rPr>
           <w:rFonts w:ascii="Calibri" w:hAnsi="Calibri" w:cs="Calibri"/>
         </w:rPr>
-        <w:t xml:space="preserve">. AR-23 depends on AR-01 and is not serialized behind visual work. BATCH-03 is complete. BATCH-04 is complete. BATCH-05 is complete. BATCH-06 is complete. BATCH-07 is complete. BATCH-08 is complete. BATCH-09 is complete. BATCH-10 is complete. BATCH-11 is complete. BATCH-12 is complete. BATCH-13 is complete. BATCH-14 is complete. BATCH-15 is complete. BATCH-16 is complete after accepted AR-06C delivery and safe closeout. AR-00B is a policy amendment under review until its accepted merge. AR-06D is the exact selected next child, Planned and unstarted; it requires a separate launch. No successor implementation is authorized. This tracker owns current status; the roadmap owns dependency order. Retained B01 exact-next, fixed-two-call/mandatory-three-concept, transient-only, and 73-child future-sequence statements are </w:t>
+        <w:t xml:space="preserve">. AR-23 depends on AR-01 and is not serialized behind visual work. BATCH-03 is complete. BATCH-04 is complete. BATCH-05 is complete. BATCH-06 is complete. BATCH-07 is complete. BATCH-08 is complete. BATCH-09 is complete. BATCH-10 is complete. BATCH-11 is complete. BATCH-12 is complete. BATCH-13 is complete. BATCH-14 is complete. BATCH-15 is complete. BATCH-16 is complete after accepted AR-06C delivery and safe closeout. AR-00B is Baseline / closed. Its accepted merge is fa6c200. AR-06D is In progress under BATCH-18 launch. One real model call and one official input-count request have executed. The owner accepts the honest technical baseline; visual quality remains below target. This is not commercial-quality acceptance or production approval. Final review, CI and merge remain pending. BATCH-19 authorizes AR-10A only after accepted AR-06D merge; implementation remains unstarted. This tracker owns current status; the roadmap owns dependency order. Retained B01 exact-next, fixed-two-call/mandatory-three-concept, transient-only, and 73-child future-sequence statements are </w:t>
       </w:r>
       <w:r>
         <w:rPr>

</xml_diff>

<commit_message>
feat: add guarded generated storefront baseline review (#263)
</commit_message>
<xml_diff>
--- a/docs/VESKIFY_DEVELOPMENT_DELIVERY_TRACKER_v1.3.0.docx
+++ b/docs/VESKIFY_DEVELOPMENT_DELIVERY_TRACKER_v1.3.0.docx
@@ -51,7 +51,7 @@
         <w:rPr>
           <w:rFonts w:ascii="Calibri" w:hAnsi="Calibri" w:cs="Calibri"/>
         </w:rPr>
-        <w:t>AR-02 and AR-02A through AR-02M Baseline / closed; AR-03 and AR-03A through AR-03E remain closed; AR-04 Baseline / closed; AR-05A Baseline / closed; AR-05B and AR-05 Baseline / closed; AR-06A Baseline / closed verified at bc209f4bdfed9626605b8c699aaabb547d5d2025; AR-06B Baseline / closed accepted at e2addffc29f7719e23e9e7856ecf7c739924501f; AR-06C Baseline / closed at PR #261 merge de0faeba0d40bd36ac83f25d533a3428f83501cc; AR-06 Partial pending lifecycle/publication and executable-commerce proof; AR-00B policy amendment under review; AR-06D selected / unstarted; AR-23 eligible / unstarted; BATCH-10 through BATCH-16 complete; no successor implementation authorized</w:t>
+        <w:t>AR-02 and AR-02A through AR-02M Baseline / closed; AR-03 and AR-03A through AR-03E remain closed; AR-04 Baseline / closed; AR-05A Baseline / closed; AR-05B and AR-05 Baseline / closed; AR-06A Baseline / closed verified at bc209f4bdfed9626605b8c699aaabb547d5d2025; AR-06B Baseline / closed accepted at e2addffc29f7719e23e9e7856ecf7c739924501f; AR-06C Baseline / closed at PR #261 merge de0faeba0d40bd36ac83f25d533a3428f83501cc; AR-06 Partial pending lifecycle/publication and executable-commerce proof; AR-00B Baseline / closed at fa6c200; AR-06D in progress under BATCH-18 with one real model call and one official input-count request; owner technical-baseline acceptance recorded with visual quality below target; final review, CI and merge pending; AR-23 eligible / unstarted; BATCH-10 through BATCH-16 complete; BATCH-19 authorizes AR-10A only after accepted AR-06D merge; implementation unstarted</w:t>
       </w:r>
     </w:p>
     <w:p>
@@ -124,7 +124,21 @@
         <w:rPr>
           <w:rFonts w:ascii="Calibri" w:hAnsi="Calibri" w:cs="Calibri"/>
         </w:rPr>
-        <w:t xml:space="preserve"> Accepted AR-06C delivery is verified; AR-00B remains under review until its own accepted merge. AR-06D is the selected unstarted child and not authorized to begin. </w:t>
+        <w:t xml:space="preserve"> Accepted at merge </w:t>
+      </w:r>
+      <w:r>
+        <w:rPr>
+          <w:rFonts w:ascii="Consolas" w:hAnsi="Consolas" w:cs="Consolas"/>
+          <w:sz w:val="19"/>
+          <w:szCs w:val="19"/>
+        </w:rPr>
+        <w:t>fa6c200</w:t>
+      </w:r>
+      <w:r>
+        <w:rPr>
+          <w:rFonts w:ascii="Calibri" w:hAnsi="Calibri" w:cs="Calibri"/>
+        </w:rPr>
+        <w:t xml:space="preserve">. BATCH-18 launches AR-06D; one real model call and one official input-count request have executed, and the owner has accepted the technical baseline only; final review, CI and merge remain pending. </w:t>
       </w:r>
       <w:r>
         <w:rPr>
@@ -460,7 +474,7 @@
         <w:rPr>
           <w:rFonts w:ascii="Calibri" w:hAnsi="Calibri" w:cs="Calibri"/>
         </w:rPr>
-        <w:t xml:space="preserve">. AR-23 depends on AR-01 and is not serialized behind visual work. BATCH-03 is complete. BATCH-04 is complete. BATCH-05 is complete. BATCH-06 is complete. BATCH-07 is complete. BATCH-08 is complete. BATCH-09 is complete. BATCH-10 is complete. BATCH-11 is complete. BATCH-12 is complete. BATCH-13 is complete. BATCH-14 is complete. BATCH-15 is complete. BATCH-16 is complete after accepted AR-06C delivery and safe closeout. AR-00B is a policy amendment under review until its accepted merge. AR-06D is the exact selected next child, Planned and unstarted; it requires a separate launch. No successor implementation is authorized. This tracker owns current status; the roadmap owns dependency order. Retained B01 exact-next, fixed-two-call/mandatory-three-concept, transient-only, and 73-child future-sequence statements are </w:t>
+        <w:t xml:space="preserve">. AR-23 depends on AR-01 and is not serialized behind visual work. BATCH-03 is complete. BATCH-04 is complete. BATCH-05 is complete. BATCH-06 is complete. BATCH-07 is complete. BATCH-08 is complete. BATCH-09 is complete. BATCH-10 is complete. BATCH-11 is complete. BATCH-12 is complete. BATCH-13 is complete. BATCH-14 is complete. BATCH-15 is complete. BATCH-16 is complete after accepted AR-06C delivery and safe closeout. AR-00B is Baseline / closed. Its accepted merge is fa6c200. AR-06D is In progress under BATCH-18 launch. One real model call and one official input-count request have executed. The owner accepts the honest technical baseline; visual quality remains below target. This is not commercial-quality acceptance or production approval. Final review, CI and merge remain pending. BATCH-19 authorizes AR-10A only after accepted AR-06D merge; implementation remains unstarted. This tracker owns current status; the roadmap owns dependency order. Retained B01 exact-next, fixed-two-call/mandatory-three-concept, transient-only, and 73-child future-sequence statements are </w:t>
       </w:r>
       <w:r>
         <w:rPr>

</xml_diff>

<commit_message>
Improve generated storefront hierarchy and card proportions
</commit_message>
<xml_diff>
--- a/docs/VESKIFY_DEVELOPMENT_DELIVERY_TRACKER_v1.3.0.docx
+++ b/docs/VESKIFY_DEVELOPMENT_DELIVERY_TRACKER_v1.3.0.docx
@@ -51,7 +51,7 @@
         <w:rPr>
           <w:rFonts w:ascii="Calibri" w:hAnsi="Calibri" w:cs="Calibri"/>
         </w:rPr>
-        <w:t>AR-02 and AR-02A through AR-02M Baseline / closed; AR-03 and AR-03A through AR-03E remain closed; AR-04 Baseline / closed; AR-05A Baseline / closed; AR-05B and AR-05 Baseline / closed; AR-06A Baseline / closed verified at bc209f4bdfed9626605b8c699aaabb547d5d2025; AR-06B Baseline / closed accepted at e2addffc29f7719e23e9e7856ecf7c739924501f; AR-06C Baseline / closed at PR #261 merge de0faeba0d40bd36ac83f25d533a3428f83501cc; AR-06 Partial pending lifecycle/publication and executable-commerce proof; AR-00B Baseline / closed at fa6c200; AR-06D in progress under BATCH-18 with one real model call and one official input-count request; owner technical-baseline acceptance recorded with visual quality below target; final review, CI and merge pending; AR-23 eligible / unstarted; BATCH-10 through BATCH-16 complete; BATCH-19 authorizes AR-10A only after accepted AR-06D merge; implementation unstarted</w:t>
+        <w:t>AR-02 and AR-02A through AR-02M Baseline / closed; AR-03 and AR-03A through AR-03E remain closed; AR-04 Baseline / closed; AR-05A Baseline / closed; AR-05B and AR-05 Baseline / closed; AR-06A Baseline / closed verified at bc209f4bdfed9626605b8c699aaabb547d5d2025; AR-06B Baseline / closed accepted at e2addffc29f7719e23e9e7856ecf7c739924501f; AR-06C Baseline / closed at PR #261 merge de0faeba0d40bd36ac83f25d533a3428f83501cc; AR-06 Partial pending lifecycle/publication and executable-commerce proof; AR-00B Baseline / closed at fa6c200; AR-06D Baseline / closed at PR #263 merge 970b6cd00a7df90cd7b2ff1008916e8c602127d0 with one real model call and one official input-count request; technical baseline accepted, visual quality below target; commercial and production acceptance absent; AR-23 eligible / unstarted; BATCH-10 through BATCH-16 complete; BATCH-18 complete; AR-10A in progress under BATCH-19 on accepted D merge; zero additional paid calls; its own visual disposition and delivery gates remain required</w:t>
       </w:r>
     </w:p>
     <w:p>
@@ -138,7 +138,7 @@
         <w:rPr>
           <w:rFonts w:ascii="Calibri" w:hAnsi="Calibri" w:cs="Calibri"/>
         </w:rPr>
-        <w:t xml:space="preserve">. BATCH-18 launches AR-06D; one real model call and one official input-count request have executed, and the owner has accepted the technical baseline only; final review, CI and merge remain pending. </w:t>
+        <w:t xml:space="preserve">. BATCH-18 / AR-06D was accepted and merged at 970b6cd00a7df90cd7b2ff1008916e8c602127d0. Its one real model call and one official input-count request remain the original generation attribution. BATCH-19 / AR-10A continues with zero additional paid calls and a separate owner visual checkpoint before merge. </w:t>
       </w:r>
       <w:r>
         <w:rPr>
@@ -474,7 +474,7 @@
         <w:rPr>
           <w:rFonts w:ascii="Calibri" w:hAnsi="Calibri" w:cs="Calibri"/>
         </w:rPr>
-        <w:t xml:space="preserve">. AR-23 depends on AR-01 and is not serialized behind visual work. BATCH-03 is complete. BATCH-04 is complete. BATCH-05 is complete. BATCH-06 is complete. BATCH-07 is complete. BATCH-08 is complete. BATCH-09 is complete. BATCH-10 is complete. BATCH-11 is complete. BATCH-12 is complete. BATCH-13 is complete. BATCH-14 is complete. BATCH-15 is complete. BATCH-16 is complete after accepted AR-06C delivery and safe closeout. AR-00B is Baseline / closed. Its accepted merge is fa6c200. AR-06D is In progress under BATCH-18 launch. One real model call and one official input-count request have executed. The owner accepts the honest technical baseline; visual quality remains below target. This is not commercial-quality acceptance or production approval. Final review, CI and merge remain pending. BATCH-19 authorizes AR-10A only after accepted AR-06D merge; implementation remains unstarted. This tracker owns current status; the roadmap owns dependency order. Retained B01 exact-next, fixed-two-call/mandatory-three-concept, transient-only, and 73-child future-sequence statements are </w:t>
+        <w:t xml:space="preserve">. AR-23 depends on AR-01 and is not serialized behind visual work. BATCH-03 is complete. BATCH-04 is complete. BATCH-05 is complete. BATCH-06 is complete. BATCH-07 is complete. BATCH-08 is complete. BATCH-09 is complete. BATCH-10 is complete. BATCH-11 is complete. BATCH-12 is complete. BATCH-13 is complete. BATCH-14 is complete. BATCH-15 is complete. BATCH-16 is complete after accepted AR-06C delivery and safe closeout. AR-00B is Baseline / closed. Its accepted merge is fa6c200. AR-06D is Baseline / closed. Its accepted PR #263 head is 496664011c0b7553233ee160b70e2d89fc795eb2, merged as 970b6cd00a7df90cd7b2ff1008916e8c602127d0. One real model call and one official input-count request have executed. The owner accepts the honest technical baseline; visual quality remains below target. This is not commercial-quality acceptance or production approval. BATCH-18 delivery is complete. AR-10A is In progress under BATCH-19 launch on the accepted AR-06D merge. It uses the preserved generated candidate with zero additional paid calls; its own visual disposition, independent verification, review, CI and merge remain required. This tracker owns current status; the roadmap owns dependency order. Retained B01 exact-next, fixed-two-call/mandatory-three-concept, transient-only, and 73-child future-sequence statements are </w:t>
       </w:r>
       <w:r>
         <w:rPr>

</xml_diff>

<commit_message>
feat: preserve independent regional design choices through canonical proposals
</commit_message>
<xml_diff>
--- a/docs/VESKIFY_DEVELOPMENT_DELIVERY_TRACKER_v1.3.0.docx
+++ b/docs/VESKIFY_DEVELOPMENT_DELIVERY_TRACKER_v1.3.0.docx
@@ -51,7 +51,7 @@
         <w:rPr>
           <w:rFonts w:ascii="Calibri" w:hAnsi="Calibri" w:cs="Calibri"/>
         </w:rPr>
-        <w:t>AR-02 and AR-02A through AR-02M Baseline / closed; AR-03 and AR-03A through AR-03E remain closed; AR-04 Baseline / closed; AR-05A Baseline / closed; AR-05B and AR-05 Baseline / closed; AR-06A Baseline / closed verified at bc209f4bdfed9626605b8c699aaabb547d5d2025; AR-06B Baseline / closed accepted at e2addffc29f7719e23e9e7856ecf7c739924501f; AR-06C Baseline / closed at PR #261 merge de0faeba0d40bd36ac83f25d533a3428f83501cc; AR-06 Partial pending lifecycle/publication and executable-commerce proof; AR-00B Baseline / closed at fa6c200; AR-06D Baseline / closed at PR #263 merge 970b6cd00a7df90cd7b2ff1008916e8c602127d0 with one real model call and one official input-count request; technical baseline accepted, visual quality below target; commercial and production acceptance absent; AR-23 eligible / unstarted; BATCH-10 through BATCH-16 complete; BATCH-18 complete; AR-10A in progress under BATCH-19 on accepted D merge; zero additional paid calls; its own visual disposition and delivery gates remain required</w:t>
+        <w:t>AR-02 and AR-02A through AR-02M Baseline / closed; AR-03 and AR-03A through AR-03E remain closed; AR-04 Baseline / closed; AR-05A Baseline / closed; AR-05B and AR-05 Baseline / closed; AR-06A Baseline / closed verified at bc209f4bdfed9626605b8c699aaabb547d5d2025; AR-06B Baseline / closed accepted at e2addffc29f7719e23e9e7856ecf7c739924501f; AR-06C Baseline / closed at PR #261 merge de0faeba0d40bd36ac83f25d533a3428f83501cc; AR-06 Partial pending lifecycle/publication and executable-commerce proof; AR-00B Baseline / closed at fa6c200; AR-06D Baseline / closed at PR #263 merge 970b6cd00a7df90cd7b2ff1008916e8c602127d0 with one real model call and one official input-count request; technical baseline accepted, visual quality below target; commercial and production acceptance absent; AR-23 eligible / unstarted; BATCH-10 through BATCH-16 complete; BATCH-18 complete; AR-10A Baseline / closed at PR #264 merge ea8d077c4eaa6f5e19d04965ad77efefda5d3571 as a bounded renderer improvement, not commercial quality; BATCH-19 complete; BATCH-20 / VQ-01 active; AR-09A in progress on accepted AR-10A merge; immediate AR-10B integrated target unstarted; final owner visual acceptance required</w:t>
       </w:r>
     </w:p>
     <w:p>
@@ -138,7 +138,7 @@
         <w:rPr>
           <w:rFonts w:ascii="Calibri" w:hAnsi="Calibri" w:cs="Calibri"/>
         </w:rPr>
-        <w:t xml:space="preserve">. BATCH-18 / AR-06D was accepted and merged at 970b6cd00a7df90cd7b2ff1008916e8c602127d0. Its one real model call and one official input-count request remain the original generation attribution. BATCH-19 / AR-10A continues with zero additional paid calls and a separate owner visual checkpoint before merge. </w:t>
+        <w:t xml:space="preserve">. BATCH-18 / AR-06D was accepted and merged at 970b6cd00a7df90cd7b2ff1008916e8c602127d0. Its one real model call and one official input-count request remain the original generation attribution. BATCH-19 delivered AR-10A with acceptance as a bounded renderer improvement, not commercial quality. BATCH-20 / VQ-01 now develops the complete generated-storefront quality phase; the tracker owns its current status. </w:t>
       </w:r>
       <w:r>
         <w:rPr>
@@ -474,7 +474,7 @@
         <w:rPr>
           <w:rFonts w:ascii="Calibri" w:hAnsi="Calibri" w:cs="Calibri"/>
         </w:rPr>
-        <w:t xml:space="preserve">. AR-23 depends on AR-01 and is not serialized behind visual work. BATCH-03 is complete. BATCH-04 is complete. BATCH-05 is complete. BATCH-06 is complete. BATCH-07 is complete. BATCH-08 is complete. BATCH-09 is complete. BATCH-10 is complete. BATCH-11 is complete. BATCH-12 is complete. BATCH-13 is complete. BATCH-14 is complete. BATCH-15 is complete. BATCH-16 is complete after accepted AR-06C delivery and safe closeout. AR-00B is Baseline / closed. Its accepted merge is fa6c200. AR-06D is Baseline / closed. Its accepted PR #263 head is 496664011c0b7553233ee160b70e2d89fc795eb2, merged as 970b6cd00a7df90cd7b2ff1008916e8c602127d0. One real model call and one official input-count request have executed. The owner accepts the honest technical baseline; visual quality remains below target. This is not commercial-quality acceptance or production approval. BATCH-18 delivery is complete. AR-10A is In progress under BATCH-19 launch on the accepted AR-06D merge. It uses the preserved generated candidate with zero additional paid calls; its own visual disposition, independent verification, review, CI and merge remain required. This tracker owns current status; the roadmap owns dependency order. Retained B01 exact-next, fixed-two-call/mandatory-three-concept, transient-only, and 73-child future-sequence statements are </w:t>
+        <w:t xml:space="preserve">. AR-23 depends on AR-01 and is not serialized behind visual work. BATCH-03 is complete. BATCH-04 is complete. BATCH-05 is complete. BATCH-06 is complete. BATCH-07 is complete. BATCH-08 is complete. BATCH-09 is complete. BATCH-10 is complete. BATCH-11 is complete. BATCH-12 is complete. BATCH-13 is complete. BATCH-14 is complete. BATCH-15 is complete. BATCH-16 is complete after accepted AR-06C delivery and safe closeout. AR-00B is Baseline / closed. Its accepted merge is fa6c200. AR-06D is Baseline / closed. Its accepted PR #263 head is 496664011c0b7553233ee160b70e2d89fc795eb2, merged as 970b6cd00a7df90cd7b2ff1008916e8c602127d0. One real model call and one official input-count request have executed. The owner accepts the honest technical baseline; visual quality remains below target. This is not commercial-quality acceptance or production approval. BATCH-18 delivery is complete. AR-10A is Baseline / closed. Its accepted merge is ea8d077c4eaa6f5e19d04965ad77efefda5d3571. BATCH-19 is complete. BATCH-20 / VQ-01 is active. AR-09A is In progress under BATCH-20 / VQ-01 on the accepted AR-10A merge. It is the first atomic AR-09 child for versioned regional design-intent propagation; AR-10B remains unstarted. AR-06 remains Partial. This tracker owns current status; the roadmap owns dependency order. Retained B01 exact-next, fixed-two-call/mandatory-three-concept, transient-only, and 73-child future-sequence statements are </w:t>
       </w:r>
       <w:r>
         <w:rPr>

</xml_diff>

<commit_message>
docs(cr-00): reconcile specification and corrective delivery order
</commit_message>
<xml_diff>
--- a/docs/VESKIFY_DEVELOPMENT_DELIVERY_TRACKER_v1.3.0.docx
+++ b/docs/VESKIFY_DEVELOPMENT_DELIVERY_TRACKER_v1.3.0.docx
@@ -51,7 +51,7 @@
         <w:rPr>
           <w:rFonts w:ascii="Calibri" w:hAnsi="Calibri" w:cs="Calibri"/>
         </w:rPr>
-        <w:t>AR-02 and AR-02A through AR-02M Baseline / closed; AR-03 and AR-03A through AR-03E remain closed; AR-04 Baseline / closed; AR-05A Baseline / closed; AR-05B and AR-05 Baseline / closed; AR-06A Baseline / closed verified at bc209f4bdfed9626605b8c699aaabb547d5d2025; AR-06B Baseline / closed accepted at e2addffc29f7719e23e9e7856ecf7c739924501f; AR-06C Baseline / closed at PR #261 merge de0faeba0d40bd36ac83f25d533a3428f83501cc; AR-06 Partial pending lifecycle/publication and executable-commerce proof; AR-00B Baseline / closed at fa6c200; AR-06D Baseline / closed at PR #263 merge 970b6cd00a7df90cd7b2ff1008916e8c602127d0 with one real model call and one official input-count request; technical baseline accepted, visual quality below target; commercial and production acceptance absent; AR-23 eligible / unstarted; BATCH-10 through BATCH-16 complete; BATCH-18 complete; AR-10A Baseline / closed at PR #264 merge ea8d077c4eaa6f5e19d04965ad77efefda5d3571 as a bounded renderer improvement, not commercial quality; BATCH-19 complete; BATCH-20 / VQ-01 active; AR-09A in progress on accepted AR-10A merge; immediate AR-10B integrated target unstarted; final owner visual acceptance required</w:t>
+        <w:t>CR-00 Prepared — adoption/owner merge pending; CR-01/CR-02 Planned — separate launch required; CR-03 through CR-19 Planned. AR-02/03/04/05 and accepted AR-06 children remain closed; AR-06 remains Partial. AR-09A is Baseline / closed at 7d01380b70455b7e28e836248bb385a20d6f54f3. BATCH-20 / VQ-01 is PAUSED and AR-10B is preserved uncommitted/not visually accepted. The tracker owns current status; the corrective roadmap owns dependency order. Historical BATCH/AR detail remains retained evidence only.</w:t>
       </w:r>
     </w:p>
     <w:p>
@@ -118,13 +118,83 @@
           <w:b/>
           <w:bCs/>
         </w:rPr>
-        <w:t>AR-00B visual-feedback policy amendment:</w:t>
-      </w:r>
-      <w:r>
-        <w:rPr>
-          <w:rFonts w:ascii="Calibri" w:hAnsi="Calibri" w:cs="Calibri"/>
-        </w:rPr>
-        <w:t xml:space="preserve"> Accepted at merge </w:t>
+        <w:t>CR-00 current status block (proposed; owner adoption/merge pending):</w:t>
+      </w:r>
+      <w:r>
+        <w:rPr>
+          <w:rFonts w:ascii="Calibri" w:hAnsi="Calibri" w:cs="Calibri"/>
+        </w:rPr>
+        <w:t xml:space="preserve"> This block is the sole current status authority on adoption. CR-00 is </w:t>
+      </w:r>
+      <w:r>
+        <w:rPr>
+          <w:rFonts w:ascii="Calibri" w:hAnsi="Calibri" w:cs="Calibri"/>
+          <w:b/>
+          <w:bCs/>
+        </w:rPr>
+        <w:t>Prepared — adoption/owner merge pending</w:t>
+      </w:r>
+      <w:r>
+        <w:rPr>
+          <w:rFonts w:ascii="Calibri" w:hAnsi="Calibri" w:cs="Calibri"/>
+        </w:rPr>
+        <w:t xml:space="preserve">; CR-01 and CR-02 are </w:t>
+      </w:r>
+      <w:r>
+        <w:rPr>
+          <w:rFonts w:ascii="Calibri" w:hAnsi="Calibri" w:cs="Calibri"/>
+          <w:b/>
+          <w:bCs/>
+        </w:rPr>
+        <w:t>Planned — separate launch required</w:t>
+      </w:r>
+      <w:r>
+        <w:rPr>
+          <w:rFonts w:ascii="Calibri" w:hAnsi="Calibri" w:cs="Calibri"/>
+        </w:rPr>
+        <w:t xml:space="preserve">; CR-03 through CR-19 are </w:t>
+      </w:r>
+      <w:r>
+        <w:rPr>
+          <w:rFonts w:ascii="Calibri" w:hAnsi="Calibri" w:cs="Calibri"/>
+          <w:b/>
+          <w:bCs/>
+        </w:rPr>
+        <w:t>Planned</w:t>
+      </w:r>
+      <w:r>
+        <w:rPr>
+          <w:rFonts w:ascii="Calibri" w:hAnsi="Calibri" w:cs="Calibri"/>
+        </w:rPr>
+        <w:t xml:space="preserve">. BATCH-20 / VQ-01 is </w:t>
+      </w:r>
+      <w:r>
+        <w:rPr>
+          <w:rFonts w:ascii="Calibri" w:hAnsi="Calibri" w:cs="Calibri"/>
+          <w:b/>
+          <w:bCs/>
+        </w:rPr>
+        <w:t>PAUSED</w:t>
+      </w:r>
+      <w:r>
+        <w:rPr>
+          <w:rFonts w:ascii="Calibri" w:hAnsi="Calibri" w:cs="Calibri"/>
+        </w:rPr>
+        <w:t xml:space="preserve">. AR-10B is Paused; its local uncommitted work is </w:t>
+      </w:r>
+      <w:r>
+        <w:rPr>
+          <w:rFonts w:ascii="Calibri" w:hAnsi="Calibri" w:cs="Calibri"/>
+          <w:b/>
+          <w:bCs/>
+        </w:rPr>
+        <w:t>not visually accepted</w:t>
+      </w:r>
+      <w:r>
+        <w:rPr>
+          <w:rFonts w:ascii="Calibri" w:hAnsi="Calibri" w:cs="Calibri"/>
+        </w:rPr>
+        <w:t xml:space="preserve">. It does not establish accepted/merged work or authority to resume. AR-09A is Baseline / closed. Its accepted merge is </w:t>
       </w:r>
       <w:r>
         <w:rPr>
@@ -132,6 +202,108 @@
           <w:sz w:val="19"/>
           <w:szCs w:val="19"/>
         </w:rPr>
+        <w:t>7d01380b70455b7e28e836248bb385a20d6f54f3</w:t>
+      </w:r>
+      <w:r>
+        <w:rPr>
+          <w:rFonts w:ascii="Calibri" w:hAnsi="Calibri" w:cs="Calibri"/>
+        </w:rPr>
+        <w:t xml:space="preserve">.  AR-02, AR-03, AR-04 and AR-05 are </w:t>
+      </w:r>
+      <w:r>
+        <w:rPr>
+          <w:rFonts w:ascii="Calibri" w:hAnsi="Calibri" w:cs="Calibri"/>
+          <w:b/>
+          <w:bCs/>
+        </w:rPr>
+        <w:t>Baseline / closed</w:t>
+      </w:r>
+      <w:r>
+        <w:rPr>
+          <w:rFonts w:ascii="Calibri" w:hAnsi="Calibri" w:cs="Calibri"/>
+        </w:rPr>
+        <w:t>. Accepted AR-06A/B/C/D and AR-09A children are closed at their recorded merges; AR-06 is Partial; its retained lifecycle, dynamic-commerce, normal-Studio and publication obligations. No historical exact-next statement, including the BATCH-20 schedule below, is current eligibility. The roadmap is the one current corrective order; no CR task is complete or launched by this adoption. The tracker owns current status; the roadmap owns dependency order.</w:t>
+      </w:r>
+    </w:p>
+    <w:p>
+      <w:pPr>
+        <w:pStyle w:val="Quote"/>
+        <w:ind w:left="360"/>
+        <w:pBdr>
+          <w:left w:val="single" w:sz="18" w:space="12" w:color="2E74B5"/>
+        </w:pBdr>
+        <w:shd w:val="clear" w:fill="F4F6F9"/>
+        <w:widowControl/>
+      </w:pPr>
+      <w:r>
+        <w:rPr>
+          <w:rFonts w:ascii="Calibri" w:hAnsi="Calibri" w:cs="Calibri"/>
+          <w:b/>
+          <w:bCs/>
+        </w:rPr>
+        <w:t>Historical status record:</w:t>
+      </w:r>
+      <w:r>
+        <w:rPr>
+          <w:rFonts w:ascii="Calibri" w:hAnsi="Calibri" w:cs="Calibri"/>
+        </w:rPr>
+        <w:t xml:space="preserve"> The following AR-00B/BATCH-20 text is retained for its original attribution and evidence. It is not the current status block and must not be read as authorization to resume BATCH-20 or as visual acceptance of AR-10B. The tracker owns current status; the roadmap owns dependency order.</w:t>
+      </w:r>
+    </w:p>
+    <w:p>
+      <w:pPr>
+        <w:pStyle w:val="Normal"/>
+        <w:widowControl/>
+      </w:pPr>
+      <w:r>
+        <w:rPr>
+          <w:rFonts w:ascii="Calibri" w:hAnsi="Calibri" w:cs="Calibri"/>
+        </w:rPr>
+        <w:t>&lt;!-- CR00 retained-history begin --&gt;</w:t>
+      </w:r>
+    </w:p>
+    <w:p>
+      <w:pPr>
+        <w:pStyle w:val="Normal"/>
+        <w:widowControl/>
+      </w:pPr>
+      <w:r>
+        <w:rPr>
+          <w:rFonts w:ascii="Calibri" w:hAnsi="Calibri" w:cs="Calibri"/>
+        </w:rPr>
+        <w:t>Historical record: retained verbatim; current scheduling is governed by the corrective roadmap and tracker.</w:t>
+      </w:r>
+    </w:p>
+    <w:p>
+      <w:pPr>
+        <w:pStyle w:val="Quote"/>
+        <w:ind w:left="360"/>
+        <w:pBdr>
+          <w:left w:val="single" w:sz="18" w:space="12" w:color="2E74B5"/>
+        </w:pBdr>
+        <w:shd w:val="clear" w:fill="F4F6F9"/>
+        <w:widowControl/>
+      </w:pPr>
+      <w:r>
+        <w:rPr>
+          <w:rFonts w:ascii="Calibri" w:hAnsi="Calibri" w:cs="Calibri"/>
+          <w:b/>
+          <w:bCs/>
+        </w:rPr>
+        <w:t>AR-00B visual-feedback policy amendment:</w:t>
+      </w:r>
+      <w:r>
+        <w:rPr>
+          <w:rFonts w:ascii="Calibri" w:hAnsi="Calibri" w:cs="Calibri"/>
+        </w:rPr>
+        <w:t xml:space="preserve"> Accepted at merge </w:t>
+      </w:r>
+      <w:r>
+        <w:rPr>
+          <w:rFonts w:ascii="Consolas" w:hAnsi="Consolas" w:cs="Consolas"/>
+          <w:sz w:val="19"/>
+          <w:szCs w:val="19"/>
+        </w:rPr>
         <w:t>fa6c200</w:t>
       </w:r>
       <w:r>
@@ -489,6 +661,18 @@
           <w:rFonts w:ascii="Calibri" w:hAnsi="Calibri" w:cs="Calibri"/>
         </w:rPr>
         <w:t xml:space="preserve"> superseded by the incorporated addendum; accepted history, functional requirements, and current capability truth remain binding.</w:t>
+      </w:r>
+    </w:p>
+    <w:p>
+      <w:pPr>
+        <w:pStyle w:val="Normal"/>
+        <w:widowControl/>
+      </w:pPr>
+      <w:r>
+        <w:rPr>
+          <w:rFonts w:ascii="Calibri" w:hAnsi="Calibri" w:cs="Calibri"/>
+        </w:rPr>
+        <w:t>&lt;!-- CR00 retained-history end --&gt;</w:t>
       </w:r>
     </w:p>
     <w:p>

</xml_diff>